<commit_message>
The introduction is created; The list of sources are started(added two sources)
</commit_message>
<xml_diff>
--- a/docs/Note.docx
+++ b/docs/Note.docx
@@ -1001,7 +1001,7 @@
         <w:rPr>
           <w:rFonts w:eastAsia="Times New Roman" w:cs="Times New Roman"/>
           <w:szCs w:val="24"/>
-          <w:lang w:eastAsia="ru-RU"/>
+          <w:lang w:val="en-US" w:eastAsia="ru-RU"/>
         </w:rPr>
       </w:pPr>
     </w:p>
@@ -1053,6 +1053,526 @@
           <w:lang w:eastAsia="ru-RU"/>
         </w:rPr>
         <w:t>6</w:t>
+      </w:r>
+    </w:p>
+    <w:p>
+      <w:pPr>
+        <w:pStyle w:val="1"/>
+        <w:ind w:left="0"/>
+      </w:pPr>
+      <w:bookmarkStart w:id="1" w:name="_Toc223367489"/>
+      <w:r>
+        <w:lastRenderedPageBreak/>
+        <w:t>Введение</w:t>
+      </w:r>
+      <w:bookmarkEnd w:id="1"/>
+    </w:p>
+    <w:p>
+      <w:pPr>
+        <w:spacing w:line="21" w:lineRule="atLeast"/>
+        <w:ind w:firstLine="0"/>
+        <w:rPr>
+          <w:lang w:val="ru"/>
+        </w:rPr>
+      </w:pPr>
+    </w:p>
+    <w:p>
+      <w:pPr>
+        <w:rPr>
+          <w:rFonts w:eastAsia="Times New Roman" w:cs="Times New Roman"/>
+          <w:szCs w:val="28"/>
+        </w:rPr>
+      </w:pPr>
+      <w:r>
+        <w:rPr>
+          <w:rFonts w:eastAsia="Times New Roman" w:cs="Times New Roman"/>
+          <w:szCs w:val="28"/>
+        </w:rPr>
+        <w:t xml:space="preserve">В условиях активного развития цифровой экономики и финансовых технологий особую значимость приобретают инновационные подходы к организации финансовых взаимодействий между пользователями. Одним из таких направлений является </w:t>
+      </w:r>
+      <w:proofErr w:type="spellStart"/>
+      <w:r>
+        <w:rPr>
+          <w:rFonts w:eastAsia="Times New Roman" w:cs="Times New Roman"/>
+          <w:szCs w:val="28"/>
+        </w:rPr>
+        <w:t>peer-to-peer</w:t>
+      </w:r>
+      <w:proofErr w:type="spellEnd"/>
+      <w:r>
+        <w:rPr>
+          <w:rFonts w:eastAsia="Times New Roman" w:cs="Times New Roman"/>
+          <w:szCs w:val="28"/>
+        </w:rPr>
+        <w:t xml:space="preserve"> (P2P) кредитование, представляющее собой модель прямого взаимодействия между заемщиками и кредиторами без участия традиционных финансовых посредников, таких как банки</w:t>
+      </w:r>
+      <w:r>
+        <w:rPr>
+          <w:rFonts w:eastAsia="Times New Roman" w:cs="Times New Roman"/>
+          <w:szCs w:val="28"/>
+        </w:rPr>
+        <w:t xml:space="preserve"> </w:t>
+      </w:r>
+      <w:r>
+        <w:rPr>
+          <w:rFonts w:eastAsia="Times New Roman" w:cs="Times New Roman"/>
+          <w:szCs w:val="28"/>
+        </w:rPr>
+        <w:t>[1</w:t>
+      </w:r>
+      <w:r>
+        <w:rPr>
+          <w:rFonts w:eastAsia="Times New Roman" w:cs="Times New Roman"/>
+          <w:szCs w:val="28"/>
+        </w:rPr>
+        <w:t>]</w:t>
+      </w:r>
+      <w:r>
+        <w:rPr>
+          <w:rFonts w:eastAsia="Times New Roman" w:cs="Times New Roman"/>
+          <w:szCs w:val="28"/>
+        </w:rPr>
+        <w:t>. Данная модель позволяет существенно упростить процесс получения и предоставления займов, снизить транзакционные издержки и повысить доступность финансовых ресурсов для различных категорий пользователей</w:t>
+      </w:r>
+      <w:r>
+        <w:rPr>
+          <w:rFonts w:eastAsia="Times New Roman" w:cs="Times New Roman"/>
+          <w:szCs w:val="28"/>
+        </w:rPr>
+        <w:t>.</w:t>
+      </w:r>
+    </w:p>
+    <w:p>
+      <w:pPr>
+        <w:rPr>
+          <w:rFonts w:eastAsia="Times New Roman" w:cs="Times New Roman"/>
+          <w:szCs w:val="28"/>
+        </w:rPr>
+      </w:pPr>
+      <w:r>
+        <w:rPr>
+          <w:rFonts w:eastAsia="Times New Roman" w:cs="Times New Roman"/>
+          <w:szCs w:val="28"/>
+        </w:rPr>
+        <w:t xml:space="preserve">Студенты являются особой социальной группой, которая зачастую сталкивается с ограниченным доступом к традиционным финансовым инструментам. Это обусловлено отсутствием стабильного дохода, кредитной истории или достаточных гарантий возврата заемных средств. В то же время потребность в финансовой поддержке у студентов остается высокой, что делает актуальной задачу создания специализированных цифровых платформ, ориентированных на данную категорию пользователей. </w:t>
+      </w:r>
+      <w:r>
+        <w:rPr>
+          <w:rFonts w:eastAsia="Times New Roman" w:cs="Times New Roman"/>
+          <w:szCs w:val="28"/>
+        </w:rPr>
+        <w:t>Р</w:t>
+      </w:r>
+      <w:r>
+        <w:rPr>
+          <w:rFonts w:eastAsia="Times New Roman" w:cs="Times New Roman"/>
+          <w:szCs w:val="28"/>
+        </w:rPr>
+        <w:t>азработка платформы P2P-кредитования студентов становится важным направлением, способствующим решению проблемы доступности финансовых ресурсов.</w:t>
+      </w:r>
+    </w:p>
+    <w:p>
+      <w:pPr>
+        <w:rPr>
+          <w:rFonts w:eastAsia="Times New Roman" w:cs="Times New Roman"/>
+          <w:szCs w:val="28"/>
+        </w:rPr>
+      </w:pPr>
+      <w:r>
+        <w:rPr>
+          <w:rFonts w:eastAsia="Times New Roman" w:cs="Times New Roman"/>
+          <w:szCs w:val="28"/>
+        </w:rPr>
+        <w:t>Информационная работа в сфере P2P-кредитования включает в себя выполнение комплекса задач, направленных на обеспечение эффективного и безопасного взаимодействия между участниками платформы. К таким задачам относятся регистрация и аутентификация пользователей, обработка заявок на получение займов, управление предложениями кредиторов, а также контроль за выполнением обязательств по возврату средств. Особую роль играет механизм оценки надежности заемщиков, который позволяет минимизировать риски невозврата средств и повысить доверие между участниками системы.</w:t>
+      </w:r>
+    </w:p>
+    <w:p>
+      <w:pPr>
+        <w:rPr>
+          <w:rFonts w:eastAsia="Times New Roman" w:cs="Times New Roman"/>
+          <w:szCs w:val="28"/>
+        </w:rPr>
+      </w:pPr>
+      <w:r>
+        <w:rPr>
+          <w:rFonts w:eastAsia="Times New Roman" w:cs="Times New Roman"/>
+          <w:szCs w:val="28"/>
+        </w:rPr>
+        <w:t>Кроме того, важным элементом предлагаемого решения является разработка системы гарантий возврата займов. Она может включать в себя различные механизмы, такие как рейтинговая система пользователей, формирование резервных фондов, привлечение поручителей или использование алгоритмов скоринга. Внедрение подобных инструментов позволит повысить уровень безопасности платформы и снизить вероятность финансовых потерь для кредиторов, что, в свою очередь, будет способствовать росту доверия к системе и увеличению числа ее пользователей.</w:t>
+      </w:r>
+    </w:p>
+    <w:p>
+      <w:pPr>
+        <w:rPr>
+          <w:rFonts w:eastAsia="Times New Roman" w:cs="Times New Roman"/>
+          <w:szCs w:val="28"/>
+        </w:rPr>
+      </w:pPr>
+      <w:r>
+        <w:rPr>
+          <w:rFonts w:eastAsia="Times New Roman" w:cs="Times New Roman"/>
+          <w:szCs w:val="28"/>
+        </w:rPr>
+        <w:t xml:space="preserve">Использование современных веб-технологий и архитектурных подходов, таких как </w:t>
+      </w:r>
+      <w:proofErr w:type="spellStart"/>
+      <w:r>
+        <w:rPr>
+          <w:rFonts w:eastAsia="Times New Roman" w:cs="Times New Roman"/>
+          <w:szCs w:val="28"/>
+        </w:rPr>
+        <w:t>микросервисная</w:t>
+      </w:r>
+      <w:proofErr w:type="spellEnd"/>
+      <w:r>
+        <w:rPr>
+          <w:rFonts w:eastAsia="Times New Roman" w:cs="Times New Roman"/>
+          <w:szCs w:val="28"/>
+        </w:rPr>
+        <w:t xml:space="preserve"> архитектура, </w:t>
+      </w:r>
+      <w:proofErr w:type="spellStart"/>
+      <w:r>
+        <w:rPr>
+          <w:rFonts w:eastAsia="Times New Roman" w:cs="Times New Roman"/>
+          <w:szCs w:val="28"/>
+        </w:rPr>
+        <w:t>RESTful</w:t>
+      </w:r>
+      <w:proofErr w:type="spellEnd"/>
+      <w:r>
+        <w:rPr>
+          <w:rFonts w:eastAsia="Times New Roman" w:cs="Times New Roman"/>
+          <w:szCs w:val="28"/>
+        </w:rPr>
+        <w:t xml:space="preserve"> API и клиент-серверное взаимодействие, позволяет создать масштабируемое и надежное программное средство, способное обрабатывать большое количество запросов </w:t>
+      </w:r>
+      <w:r>
+        <w:rPr>
+          <w:rFonts w:eastAsia="Times New Roman" w:cs="Times New Roman"/>
+          <w:szCs w:val="28"/>
+        </w:rPr>
+        <w:lastRenderedPageBreak/>
+        <w:t>и обеспечивать высокую производительность системы. Разработка платформы в виде веб-приложения с разделением на серверную и клиентскую части обеспечивает гибкость, удобство сопровождения и возможность дальнейшего расширения функциональности.</w:t>
+      </w:r>
+    </w:p>
+    <w:p>
+      <w:pPr>
+        <w:rPr>
+          <w:rFonts w:eastAsia="Times New Roman" w:cs="Times New Roman"/>
+          <w:szCs w:val="28"/>
+        </w:rPr>
+      </w:pPr>
+      <w:r>
+        <w:rPr>
+          <w:rFonts w:eastAsia="Times New Roman" w:cs="Times New Roman"/>
+          <w:szCs w:val="28"/>
+        </w:rPr>
+        <w:t>Автоматизация процессов, связанных с обработкой заявок, анализом данных и управлением финансовыми операциями, позволяет существенно сократить временные и трудовые затраты пользователей. Кроме того, цифровизация данных процессов способствует снижению количества ошибок, повышению прозрачности операций и улучшению качества принимаемых решений. Таким образом, внедрение специализированной платформы P2P-кредитования студентов является актуальным и перспективным направлением в области разработки распределенных информационных систем.</w:t>
+      </w:r>
+    </w:p>
+    <w:p>
+      <w:pPr>
+        <w:rPr>
+          <w:rFonts w:eastAsia="Times New Roman" w:cs="Times New Roman"/>
+          <w:szCs w:val="28"/>
+        </w:rPr>
+      </w:pPr>
+      <w:r>
+        <w:rPr>
+          <w:rFonts w:eastAsia="Times New Roman" w:cs="Times New Roman"/>
+          <w:szCs w:val="28"/>
+        </w:rPr>
+        <w:t>Предметом исследования в рамках данного курсового проекта являются процессы организации и управления P2P-кредитованием студентов с использованием цифровых платформ. Объектом исследования выступает деятельность пользователей системы, направленная на получение и предоставление займов, а также механизмы оценки надежности и обеспечения возврата средств.</w:t>
+      </w:r>
+    </w:p>
+    <w:p>
+      <w:pPr>
+        <w:rPr>
+          <w:rFonts w:eastAsia="Times New Roman" w:cs="Times New Roman"/>
+          <w:szCs w:val="28"/>
+        </w:rPr>
+      </w:pPr>
+      <w:r>
+        <w:rPr>
+          <w:rFonts w:eastAsia="Times New Roman" w:cs="Times New Roman"/>
+          <w:szCs w:val="28"/>
+        </w:rPr>
+        <w:t>Целью данного курсового проекта является проектирование и разработка программного средства, реализующего платформу P2P-кредитования студентов с модулем проверки успеваемости и системой гарантий возврата займов.</w:t>
+      </w:r>
+    </w:p>
+    <w:p>
+      <w:pPr>
+        <w:rPr>
+          <w:rFonts w:eastAsia="Times New Roman" w:cs="Times New Roman"/>
+          <w:szCs w:val="28"/>
+        </w:rPr>
+      </w:pPr>
+      <w:r>
+        <w:rPr>
+          <w:rFonts w:eastAsia="Times New Roman" w:cs="Times New Roman"/>
+          <w:szCs w:val="28"/>
+        </w:rPr>
+        <w:t>Для достижения поставленной цели необходимо решить следующие задачи: провести анализ предметной области и существующих аналогов, разработать модель предметной области и сформулировать требования к программному средству, спроектировать архитектуру системы и реализовать основные функциональные модули, выполнить тестирование программного средства, а также разработать документацию по его использованию и развертыванию.</w:t>
+      </w:r>
+    </w:p>
+    <w:p>
+      <w:pPr>
+        <w:rPr>
+          <w:rFonts w:eastAsia="Times New Roman" w:cs="Times New Roman"/>
+          <w:szCs w:val="28"/>
+        </w:rPr>
+      </w:pPr>
+      <w:r>
+        <w:rPr>
+          <w:rFonts w:eastAsia="Times New Roman" w:cs="Times New Roman"/>
+          <w:szCs w:val="28"/>
+        </w:rPr>
+        <w:t>Актуальность данной работы обусловлена необходимостью расширения доступа студентов к финансовым ресурсам, а также повышением эффективности и безопасности процессов кредитования за счет использования современных информационных технологий. Разработка подобной платформы позволит объединить пользователей в единой цифровой среде, обеспечить прозрачность финансовых операций и создать эффективный механизм взаимодействия между заемщиками и кредиторами.</w:t>
+      </w:r>
+    </w:p>
+    <w:p>
+      <w:pPr>
+        <w:rPr>
+          <w:rFonts w:eastAsia="Times New Roman" w:cs="Times New Roman"/>
+          <w:szCs w:val="28"/>
+        </w:rPr>
+      </w:pPr>
+      <w:r>
+        <w:rPr>
+          <w:rFonts w:eastAsia="Times New Roman" w:cs="Times New Roman"/>
+          <w:szCs w:val="28"/>
+        </w:rPr>
+        <w:t>Курсовой проект выполнен самостоятельно, проверен в системе «Антиплагиат»</w:t>
+      </w:r>
+      <w:r>
+        <w:rPr>
+          <w:rFonts w:eastAsia="Times New Roman" w:cs="Times New Roman"/>
+          <w:szCs w:val="28"/>
+        </w:rPr>
+        <w:t xml:space="preserve"> </w:t>
+      </w:r>
+      <w:r>
+        <w:rPr>
+          <w:rFonts w:eastAsia="Times New Roman" w:cs="Times New Roman"/>
+          <w:szCs w:val="28"/>
+        </w:rPr>
+        <w:t>[2]</w:t>
+      </w:r>
+      <w:r>
+        <w:rPr>
+          <w:rFonts w:eastAsia="Times New Roman" w:cs="Times New Roman"/>
+          <w:szCs w:val="28"/>
+        </w:rPr>
+        <w:t>. Цитирования обозначены ссылками на публикации, указанными в «Списке использованных источников».</w:t>
+      </w:r>
+    </w:p>
+    <w:p>
+      <w:r>
+        <w:t>Скриншот приведен в приложении А на рисунке А.1.</w:t>
+      </w:r>
+      <w:r>
+        <w:br w:type="page"/>
+      </w:r>
+    </w:p>
+    <w:p>
+      <w:pPr>
+        <w:pStyle w:val="1"/>
+        <w:ind w:left="0"/>
+        <w:rPr>
+          <w:lang w:val="en-US"/>
+        </w:rPr>
+      </w:pPr>
+      <w:bookmarkStart w:id="2" w:name="_Toc223367497"/>
+      <w:r>
+        <w:lastRenderedPageBreak/>
+        <w:t>Список</w:t>
+      </w:r>
+      <w:r>
+        <w:rPr>
+          <w:lang w:val="en-US"/>
+        </w:rPr>
+        <w:t xml:space="preserve"> </w:t>
+      </w:r>
+      <w:r>
+        <w:t>использованных</w:t>
+      </w:r>
+      <w:r>
+        <w:rPr>
+          <w:lang w:val="en-US"/>
+        </w:rPr>
+        <w:t xml:space="preserve"> </w:t>
+      </w:r>
+      <w:r>
+        <w:t>источников</w:t>
+      </w:r>
+      <w:bookmarkEnd w:id="2"/>
+    </w:p>
+    <w:p>
+      <w:pPr>
+        <w:ind w:firstLine="0"/>
+        <w:rPr>
+          <w:lang w:val="en-US"/>
+        </w:rPr>
+      </w:pPr>
+    </w:p>
+    <w:p>
+      <w:pPr>
+        <w:rPr>
+          <w:lang w:val="en-US"/>
+        </w:rPr>
+      </w:pPr>
+      <w:r>
+        <w:rPr>
+          <w:lang w:val="en-US"/>
+        </w:rPr>
+        <w:t xml:space="preserve">[1] </w:t>
+      </w:r>
+      <w:r>
+        <w:rPr>
+          <w:lang w:val="en-US"/>
+        </w:rPr>
+        <w:t xml:space="preserve">Lin M., Viswanathan S., </w:t>
+      </w:r>
+      <w:proofErr w:type="spellStart"/>
+      <w:r>
+        <w:rPr>
+          <w:lang w:val="en-US"/>
+        </w:rPr>
+        <w:t>Prabhala</w:t>
+      </w:r>
+      <w:proofErr w:type="spellEnd"/>
+      <w:r>
+        <w:rPr>
+          <w:lang w:val="en-US"/>
+        </w:rPr>
+        <w:t xml:space="preserve"> N. Judging Borrowers by the Company They Keep: Friendship Networks and Information Asymmetry in Online Peer-to-Peer Lending // Management Science. – 2013. – Vol. 59, No. 1. – P. 17–35.</w:t>
+      </w:r>
+      <w:r>
+        <w:rPr>
+          <w:lang w:val="en-US"/>
+        </w:rPr>
+        <w:t xml:space="preserve"> </w:t>
+      </w:r>
+    </w:p>
+    <w:p>
+      <w:r>
+        <w:t>[</w:t>
+      </w:r>
+      <w:r>
+        <w:t>2</w:t>
+      </w:r>
+      <w:r>
+        <w:t xml:space="preserve">] </w:t>
+      </w:r>
+      <w:r>
+        <w:t>Антиплагиат</w:t>
+      </w:r>
+      <w:r>
+        <w:t xml:space="preserve"> [</w:t>
+      </w:r>
+      <w:r>
+        <w:t>Электронный</w:t>
+      </w:r>
+      <w:r>
+        <w:t xml:space="preserve"> </w:t>
+      </w:r>
+      <w:r>
+        <w:t>ресурс</w:t>
+      </w:r>
+      <w:r>
+        <w:t xml:space="preserve">]. – </w:t>
+      </w:r>
+      <w:r>
+        <w:t>Режим</w:t>
+      </w:r>
+      <w:r>
+        <w:t xml:space="preserve"> </w:t>
+      </w:r>
+      <w:r>
+        <w:t>доступа</w:t>
+      </w:r>
+      <w:r>
+        <w:t xml:space="preserve">: </w:t>
+      </w:r>
+      <w:r>
+        <w:rPr>
+          <w:lang w:val="en-US"/>
+        </w:rPr>
+        <w:t>https</w:t>
+      </w:r>
+      <w:r>
+        <w:t>://</w:t>
+      </w:r>
+      <w:proofErr w:type="spellStart"/>
+      <w:r>
+        <w:rPr>
+          <w:lang w:val="en-US"/>
+        </w:rPr>
+        <w:t>antiplagiat</w:t>
+      </w:r>
+      <w:proofErr w:type="spellEnd"/>
+      <w:r>
+        <w:t>.</w:t>
+      </w:r>
+      <w:proofErr w:type="spellStart"/>
+      <w:r>
+        <w:rPr>
+          <w:lang w:val="en-US"/>
+        </w:rPr>
+        <w:t>ru</w:t>
+      </w:r>
+      <w:proofErr w:type="spellEnd"/>
+      <w:r>
+        <w:t xml:space="preserve"> </w:t>
+      </w:r>
+      <w:r>
+        <w:t xml:space="preserve">– </w:t>
+      </w:r>
+      <w:r>
+        <w:t>Дата</w:t>
+      </w:r>
+      <w:r>
+        <w:t xml:space="preserve"> </w:t>
+      </w:r>
+      <w:r>
+        <w:t>обращения</w:t>
+      </w:r>
+      <w:r>
+        <w:t xml:space="preserve">: </w:t>
+      </w:r>
+      <w:r>
+        <w:rPr>
+          <w:highlight w:val="yellow"/>
+        </w:rPr>
+        <w:t>ХХ</w:t>
+      </w:r>
+      <w:r>
+        <w:rPr>
+          <w:highlight w:val="yellow"/>
+        </w:rPr>
+        <w:t>.</w:t>
+      </w:r>
+      <w:r>
+        <w:rPr>
+          <w:highlight w:val="yellow"/>
+        </w:rPr>
+        <w:t>ХХ</w:t>
+      </w:r>
+      <w:r>
+        <w:rPr>
+          <w:highlight w:val="yellow"/>
+        </w:rPr>
+        <w:t>.</w:t>
+      </w:r>
+      <w:r>
+        <w:rPr>
+          <w:highlight w:val="yellow"/>
+        </w:rPr>
+        <w:t>ХХХХ</w:t>
+      </w:r>
+      <w:r>
+        <w:t>.</w:t>
       </w:r>
     </w:p>
     <w:sectPr>

</xml_diff>

<commit_message>
The abstract is implemented
</commit_message>
<xml_diff>
--- a/docs/Note.docx
+++ b/docs/Note.docx
@@ -625,7 +625,7 @@
           <w:szCs w:val="24"/>
           <w:lang w:eastAsia="ru-RU"/>
         </w:rPr>
-        <w:t>кредитовавния студентов с модулем проверки успеваемости и системы гарантий возврата займовв</w:t>
+        <w:t>кредитовавния студентов с модулем проверки успеваемости и системы гарантий возврата займов</w:t>
       </w:r>
       <w:r>
         <w:rPr>
@@ -1057,6 +1057,546 @@
     </w:p>
     <w:p>
       <w:pPr>
+        <w:spacing w:line="21" w:lineRule="atLeast"/>
+        <w:ind w:firstLine="0"/>
+        <w:jc w:val="center"/>
+        <w:rPr>
+          <w:b/>
+          <w:caps/>
+        </w:rPr>
+      </w:pPr>
+      <w:r>
+        <w:rPr>
+          <w:b/>
+          <w:caps/>
+        </w:rPr>
+        <w:lastRenderedPageBreak/>
+        <w:t>Реферат</w:t>
+      </w:r>
+    </w:p>
+    <w:p>
+      <w:pPr>
+        <w:spacing w:line="21" w:lineRule="atLeast"/>
+        <w:ind w:firstLine="0"/>
+        <w:jc w:val="center"/>
+        <w:rPr>
+          <w:b/>
+          <w:caps/>
+        </w:rPr>
+      </w:pPr>
+    </w:p>
+    <w:p>
+      <w:pPr>
+        <w:spacing w:line="21" w:lineRule="atLeast"/>
+        <w:rPr>
+          <w:rFonts w:eastAsia="Times New Roman" w:cs="Times New Roman"/>
+          <w:szCs w:val="28"/>
+        </w:rPr>
+      </w:pPr>
+      <w:r>
+        <w:rPr>
+          <w:rFonts w:eastAsia="Times New Roman" w:cs="Times New Roman"/>
+          <w:szCs w:val="28"/>
+        </w:rPr>
+        <w:t xml:space="preserve">БГУИР </w:t>
+      </w:r>
+      <w:r>
+        <w:rPr>
+          <w:rFonts w:eastAsia="Times New Roman" w:cs="Times New Roman"/>
+          <w:szCs w:val="28"/>
+        </w:rPr>
+        <w:t xml:space="preserve">КР </w:t>
+      </w:r>
+      <w:r>
+        <w:rPr>
+          <w:rFonts w:eastAsia="Times New Roman" w:cs="Times New Roman"/>
+          <w:color w:val="000000"/>
+          <w:szCs w:val="24"/>
+          <w:lang w:eastAsia="ru-RU"/>
+        </w:rPr>
+        <w:t xml:space="preserve">6-05-0611-01 </w:t>
+      </w:r>
+      <w:r>
+        <w:rPr>
+          <w:rFonts w:eastAsia="Times New Roman" w:cs="Times New Roman"/>
+          <w:color w:val="000000"/>
+          <w:szCs w:val="24"/>
+          <w:lang w:eastAsia="ru-RU"/>
+        </w:rPr>
+        <w:t>118</w:t>
+      </w:r>
+      <w:r>
+        <w:rPr>
+          <w:rFonts w:eastAsia="Times New Roman" w:cs="Times New Roman"/>
+          <w:color w:val="000000"/>
+          <w:szCs w:val="24"/>
+          <w:lang w:eastAsia="ru-RU"/>
+        </w:rPr>
+        <w:t> </w:t>
+      </w:r>
+      <w:r>
+        <w:rPr>
+          <w:rFonts w:eastAsia="Times New Roman" w:cs="Times New Roman"/>
+          <w:szCs w:val="28"/>
+        </w:rPr>
+        <w:t>ПЗ</w:t>
+      </w:r>
+    </w:p>
+    <w:p>
+      <w:pPr>
+        <w:spacing w:line="21" w:lineRule="atLeast"/>
+        <w:rPr>
+          <w:rFonts w:eastAsia="Times New Roman" w:cs="Times New Roman"/>
+          <w:szCs w:val="28"/>
+        </w:rPr>
+      </w:pPr>
+    </w:p>
+    <w:p>
+      <w:pPr>
+        <w:ind w:firstLine="709"/>
+        <w:contextualSpacing/>
+      </w:pPr>
+      <w:r>
+        <w:rPr>
+          <w:b/>
+        </w:rPr>
+        <w:t>Летко</w:t>
+      </w:r>
+      <w:r>
+        <w:rPr>
+          <w:b/>
+        </w:rPr>
+        <w:t xml:space="preserve"> </w:t>
+      </w:r>
+      <w:r>
+        <w:rPr>
+          <w:b/>
+        </w:rPr>
+        <w:t>А</w:t>
+      </w:r>
+      <w:r>
+        <w:rPr>
+          <w:b/>
+        </w:rPr>
+        <w:t>.</w:t>
+      </w:r>
+      <w:r>
+        <w:rPr>
+          <w:b/>
+        </w:rPr>
+        <w:t>С</w:t>
+      </w:r>
+      <w:r>
+        <w:rPr>
+          <w:b/>
+        </w:rPr>
+        <w:t>.</w:t>
+      </w:r>
+      <w:r>
+        <w:t xml:space="preserve"> </w:t>
+      </w:r>
+      <w:r>
+        <w:t xml:space="preserve">Платформа для </w:t>
+      </w:r>
+      <w:r>
+        <w:rPr>
+          <w:lang w:val="en-US"/>
+        </w:rPr>
+        <w:t>peer</w:t>
+      </w:r>
+      <w:r>
+        <w:t>-</w:t>
+      </w:r>
+      <w:r>
+        <w:rPr>
+          <w:lang w:val="en-US"/>
+        </w:rPr>
+        <w:t>to</w:t>
+      </w:r>
+      <w:r>
+        <w:t>-</w:t>
+      </w:r>
+      <w:r>
+        <w:rPr>
+          <w:lang w:val="en-US"/>
+        </w:rPr>
+        <w:t>peer</w:t>
+      </w:r>
+      <w:r>
+        <w:t xml:space="preserve"> </w:t>
+      </w:r>
+      <w:r>
+        <w:t xml:space="preserve">кредитования студентов с модулем проверки успеваемости и системы гарантий возврата займов </w:t>
+      </w:r>
+      <w:r>
+        <w:t xml:space="preserve">/ </w:t>
+      </w:r>
+      <w:r>
+        <w:t>А</w:t>
+      </w:r>
+      <w:r>
+        <w:t>.</w:t>
+      </w:r>
+      <w:r>
+        <w:t>С</w:t>
+      </w:r>
+      <w:r>
+        <w:t>.</w:t>
+      </w:r>
+      <w:r>
+        <w:t xml:space="preserve"> </w:t>
+      </w:r>
+      <w:r>
+        <w:t>Летко</w:t>
+      </w:r>
+      <w:r>
+        <w:t>. – Минск: БГУИР, 202</w:t>
+      </w:r>
+      <w:r>
+        <w:t>6</w:t>
+      </w:r>
+      <w:r>
+        <w:t xml:space="preserve">, – </w:t>
+      </w:r>
+      <w:r>
+        <w:rPr>
+          <w:highlight w:val="yellow"/>
+          <w:lang w:val="en-US"/>
+        </w:rPr>
+        <w:t>XXX</w:t>
+      </w:r>
+      <w:r>
+        <w:t xml:space="preserve"> с.</w:t>
+      </w:r>
+    </w:p>
+    <w:p>
+      <w:pPr>
+        <w:spacing w:line="21" w:lineRule="atLeast"/>
+        <w:rPr>
+          <w:rFonts w:eastAsia="Times New Roman" w:cs="Times New Roman"/>
+          <w:szCs w:val="28"/>
+        </w:rPr>
+      </w:pPr>
+    </w:p>
+    <w:p>
+      <w:pPr>
+        <w:spacing w:line="21" w:lineRule="atLeast"/>
+        <w:rPr>
+          <w:rFonts w:eastAsia="Times New Roman" w:cs="Times New Roman"/>
+          <w:szCs w:val="28"/>
+        </w:rPr>
+      </w:pPr>
+      <w:r>
+        <w:rPr>
+          <w:rFonts w:eastAsia="Times New Roman" w:cs="Times New Roman"/>
+          <w:szCs w:val="28"/>
+        </w:rPr>
+        <w:t xml:space="preserve">Пояснительная записка </w:t>
+      </w:r>
+      <w:r>
+        <w:rPr>
+          <w:rFonts w:eastAsia="Times New Roman" w:cs="Times New Roman"/>
+          <w:szCs w:val="28"/>
+          <w:highlight w:val="yellow"/>
+          <w:lang w:val="en-US"/>
+        </w:rPr>
+        <w:t>XX</w:t>
+      </w:r>
+      <w:r>
+        <w:rPr>
+          <w:rFonts w:eastAsia="Times New Roman" w:cs="Times New Roman"/>
+          <w:szCs w:val="28"/>
+        </w:rPr>
+        <w:t xml:space="preserve"> с., </w:t>
+      </w:r>
+      <w:r>
+        <w:rPr>
+          <w:rFonts w:eastAsia="Times New Roman" w:cs="Times New Roman"/>
+          <w:szCs w:val="28"/>
+          <w:highlight w:val="yellow"/>
+          <w:lang w:val="en-US"/>
+        </w:rPr>
+        <w:t>XX</w:t>
+      </w:r>
+      <w:r>
+        <w:rPr>
+          <w:rFonts w:eastAsia="Times New Roman" w:cs="Times New Roman"/>
+          <w:szCs w:val="28"/>
+        </w:rPr>
+        <w:t xml:space="preserve"> рис., </w:t>
+      </w:r>
+      <w:r>
+        <w:rPr>
+          <w:rFonts w:eastAsia="Times New Roman" w:cs="Times New Roman"/>
+          <w:szCs w:val="28"/>
+          <w:highlight w:val="yellow"/>
+          <w:lang w:val="en-US"/>
+        </w:rPr>
+        <w:t>X</w:t>
+      </w:r>
+      <w:r>
+        <w:rPr>
+          <w:rFonts w:eastAsia="Times New Roman" w:cs="Times New Roman"/>
+          <w:szCs w:val="28"/>
+        </w:rPr>
+        <w:t xml:space="preserve"> табл., </w:t>
+      </w:r>
+      <w:r>
+        <w:rPr>
+          <w:rFonts w:eastAsia="Times New Roman" w:cs="Times New Roman"/>
+          <w:szCs w:val="28"/>
+          <w:highlight w:val="yellow"/>
+          <w:lang w:val="en-US"/>
+        </w:rPr>
+        <w:t>X</w:t>
+      </w:r>
+      <w:r>
+        <w:rPr>
+          <w:rFonts w:eastAsia="Times New Roman" w:cs="Times New Roman"/>
+          <w:szCs w:val="28"/>
+        </w:rPr>
+        <w:t xml:space="preserve"> источников, </w:t>
+      </w:r>
+      <w:r>
+        <w:rPr>
+          <w:rFonts w:eastAsia="Times New Roman" w:cs="Times New Roman"/>
+          <w:szCs w:val="28"/>
+          <w:highlight w:val="yellow"/>
+          <w:lang w:val="en-US"/>
+        </w:rPr>
+        <w:t>X</w:t>
+      </w:r>
+      <w:r>
+        <w:rPr>
+          <w:rFonts w:eastAsia="Times New Roman" w:cs="Times New Roman"/>
+          <w:szCs w:val="28"/>
+        </w:rPr>
+        <w:t xml:space="preserve"> приложения.</w:t>
+      </w:r>
+    </w:p>
+    <w:p>
+      <w:pPr>
+        <w:spacing w:line="21" w:lineRule="atLeast"/>
+        <w:rPr>
+          <w:rFonts w:eastAsia="Times New Roman" w:cs="Times New Roman"/>
+          <w:szCs w:val="28"/>
+        </w:rPr>
+      </w:pPr>
+    </w:p>
+    <w:p>
+      <w:pPr>
+        <w:spacing w:line="21" w:lineRule="atLeast"/>
+        <w:rPr>
+          <w:rFonts w:eastAsia="Times New Roman" w:cs="Times New Roman"/>
+          <w:szCs w:val="28"/>
+        </w:rPr>
+      </w:pPr>
+      <w:r>
+        <w:rPr>
+          <w:rFonts w:eastAsia="Times New Roman" w:cs="Times New Roman"/>
+          <w:szCs w:val="28"/>
+        </w:rPr>
+        <w:t xml:space="preserve">Ключевые слова: P2P-кредитование, веб-приложение, студенты заем, </w:t>
+      </w:r>
+      <w:proofErr w:type="spellStart"/>
+      <w:r>
+        <w:rPr>
+          <w:rFonts w:eastAsia="Times New Roman" w:cs="Times New Roman"/>
+          <w:szCs w:val="28"/>
+        </w:rPr>
+        <w:t>микросервисная</w:t>
+      </w:r>
+      <w:proofErr w:type="spellEnd"/>
+      <w:r>
+        <w:rPr>
+          <w:rFonts w:eastAsia="Times New Roman" w:cs="Times New Roman"/>
+          <w:szCs w:val="28"/>
+        </w:rPr>
+        <w:t xml:space="preserve"> архитектура, REST API, финансовые технологии.</w:t>
+      </w:r>
+    </w:p>
+    <w:p>
+      <w:pPr>
+        <w:spacing w:line="21" w:lineRule="atLeast"/>
+        <w:rPr>
+          <w:rFonts w:eastAsia="Times New Roman" w:cs="Times New Roman"/>
+          <w:szCs w:val="28"/>
+        </w:rPr>
+      </w:pPr>
+      <w:r>
+        <w:rPr>
+          <w:rFonts w:eastAsia="Times New Roman" w:cs="Times New Roman"/>
+          <w:i/>
+          <w:iCs/>
+          <w:szCs w:val="28"/>
+        </w:rPr>
+        <w:t>Целью данного курсового проекта</w:t>
+      </w:r>
+      <w:r>
+        <w:rPr>
+          <w:rFonts w:eastAsia="Times New Roman" w:cs="Times New Roman"/>
+          <w:szCs w:val="28"/>
+        </w:rPr>
+        <w:t xml:space="preserve"> является разработка платформы для </w:t>
+      </w:r>
+      <w:proofErr w:type="spellStart"/>
+      <w:r>
+        <w:rPr>
+          <w:rFonts w:eastAsia="Times New Roman" w:cs="Times New Roman"/>
+          <w:szCs w:val="28"/>
+        </w:rPr>
+        <w:t>peer-to-peer</w:t>
+      </w:r>
+      <w:proofErr w:type="spellEnd"/>
+      <w:r>
+        <w:rPr>
+          <w:rFonts w:eastAsia="Times New Roman" w:cs="Times New Roman"/>
+          <w:szCs w:val="28"/>
+        </w:rPr>
+        <w:t xml:space="preserve"> кредитования студентов с модулем проверки успеваемости и системой гарантий возврата займов. Разрабатываемое программное средство представляет собой веб-приложение, обеспечивающее взаимодействие между заемщиками и кредиторами без участия традиционных финансовых организаций. Система позволяет пользователям регистрироваться, подавать заявки на получение займов, инвестировать средства</w:t>
+      </w:r>
+      <w:r>
+        <w:rPr>
+          <w:rFonts w:eastAsia="Times New Roman" w:cs="Times New Roman"/>
+          <w:szCs w:val="28"/>
+        </w:rPr>
+        <w:t>.</w:t>
+      </w:r>
+    </w:p>
+    <w:p>
+      <w:pPr>
+        <w:spacing w:line="21" w:lineRule="atLeast"/>
+        <w:rPr>
+          <w:rFonts w:eastAsia="Times New Roman" w:cs="Times New Roman"/>
+          <w:szCs w:val="28"/>
+        </w:rPr>
+      </w:pPr>
+      <w:r>
+        <w:rPr>
+          <w:rFonts w:eastAsia="Times New Roman" w:cs="Times New Roman"/>
+          <w:i/>
+          <w:iCs/>
+          <w:szCs w:val="28"/>
+        </w:rPr>
+        <w:t>Объект исследования:</w:t>
+      </w:r>
+      <w:r>
+        <w:rPr>
+          <w:rFonts w:eastAsia="Times New Roman" w:cs="Times New Roman"/>
+          <w:szCs w:val="28"/>
+        </w:rPr>
+        <w:t xml:space="preserve"> процессы организации и функционирования P2P-кредитования студентов в цифровой среде.</w:t>
+      </w:r>
+    </w:p>
+    <w:p>
+      <w:pPr>
+        <w:spacing w:line="21" w:lineRule="atLeast"/>
+        <w:rPr>
+          <w:rFonts w:eastAsia="Times New Roman" w:cs="Times New Roman"/>
+          <w:szCs w:val="28"/>
+        </w:rPr>
+      </w:pPr>
+      <w:r>
+        <w:rPr>
+          <w:rFonts w:eastAsia="Times New Roman" w:cs="Times New Roman"/>
+          <w:i/>
+          <w:iCs/>
+          <w:szCs w:val="28"/>
+        </w:rPr>
+        <w:t>Предмет исследования:</w:t>
+      </w:r>
+      <w:r>
+        <w:rPr>
+          <w:rFonts w:eastAsia="Times New Roman" w:cs="Times New Roman"/>
+          <w:szCs w:val="28"/>
+        </w:rPr>
+        <w:t xml:space="preserve"> методы и средства разработки распределенных информационных систем для реализации платформ P2P-кредитования с механизмами оценки надежности заемщиков.</w:t>
+      </w:r>
+    </w:p>
+    <w:p>
+      <w:pPr>
+        <w:spacing w:line="21" w:lineRule="atLeast"/>
+        <w:rPr>
+          <w:rFonts w:eastAsia="Times New Roman" w:cs="Times New Roman"/>
+          <w:szCs w:val="28"/>
+        </w:rPr>
+      </w:pPr>
+      <w:r>
+        <w:rPr>
+          <w:rFonts w:eastAsia="Times New Roman" w:cs="Times New Roman"/>
+          <w:i/>
+          <w:iCs/>
+          <w:szCs w:val="28"/>
+        </w:rPr>
+        <w:t>Методология проведения работы:</w:t>
+      </w:r>
+      <w:r>
+        <w:rPr>
+          <w:rFonts w:eastAsia="Times New Roman" w:cs="Times New Roman"/>
+          <w:szCs w:val="28"/>
+        </w:rPr>
+        <w:t xml:space="preserve"> в процессе разработки использованы современные подходы к проектированию информационных систем, включая анализ предметной области, моделирование бизнес-процессов, применение принципов объектно-ориентированного программирования, а также использование UML-диаграмм для описания архитектуры системы.</w:t>
+      </w:r>
+    </w:p>
+    <w:p>
+      <w:pPr>
+        <w:spacing w:line="21" w:lineRule="atLeast"/>
+        <w:rPr>
+          <w:rFonts w:eastAsia="Times New Roman" w:cs="Times New Roman"/>
+          <w:szCs w:val="28"/>
+        </w:rPr>
+      </w:pPr>
+      <w:r>
+        <w:rPr>
+          <w:rFonts w:eastAsia="Times New Roman" w:cs="Times New Roman"/>
+          <w:i/>
+          <w:iCs/>
+          <w:szCs w:val="28"/>
+        </w:rPr>
+        <w:t>Результаты работы:</w:t>
+      </w:r>
+      <w:r>
+        <w:rPr>
+          <w:rFonts w:eastAsia="Times New Roman" w:cs="Times New Roman"/>
+          <w:szCs w:val="28"/>
+        </w:rPr>
+        <w:t xml:space="preserve"> в ходе выполнения курсового проекта были проанализированы особенности P2P-кредитования и выявлены ключевые требования к подобным системам. Разработано программное средство, реализующее платформу для взаимодействия студентов-заемщиков и кредиторов. В системе предусмотрен модуль проверки успеваемости пользователей, позволяющий оценивать их надежность, а также реализованы механизмы обеспечения возврата займов. Программное средство обладает удобным пользовательским интерфейсом и обеспечивает автоматизацию основных процессов кредитования.</w:t>
+      </w:r>
+    </w:p>
+    <w:p>
+      <w:pPr>
+        <w:spacing w:line="21" w:lineRule="atLeast"/>
+        <w:rPr>
+          <w:rFonts w:eastAsia="Times New Roman" w:cs="Times New Roman"/>
+          <w:szCs w:val="28"/>
+        </w:rPr>
+      </w:pPr>
+      <w:r>
+        <w:rPr>
+          <w:rFonts w:eastAsia="Times New Roman" w:cs="Times New Roman"/>
+          <w:i/>
+          <w:iCs/>
+          <w:szCs w:val="28"/>
+        </w:rPr>
+        <w:t>Область применения результатов:</w:t>
+      </w:r>
+      <w:r>
+        <w:rPr>
+          <w:rFonts w:eastAsia="Times New Roman" w:cs="Times New Roman"/>
+          <w:szCs w:val="28"/>
+        </w:rPr>
+        <w:t xml:space="preserve"> разработанное программное средство может быть использовано в образовательных учреждениях, а также в рамках онлайн-платформ для организации финансового взаимодействия между студентами.</w:t>
+      </w:r>
+      <w:r>
+        <w:rPr>
+          <w:rFonts w:eastAsia="Times New Roman" w:cs="Times New Roman"/>
+          <w:szCs w:val="28"/>
+        </w:rPr>
+        <w:br w:type="page"/>
+      </w:r>
+    </w:p>
+    <w:p>
+      <w:pPr>
         <w:pStyle w:val="1"/>
         <w:ind w:left="0"/>
       </w:pPr>
@@ -1426,150 +1966,32 @@
         <w:rPr>
           <w:lang w:val="en-US"/>
         </w:rPr>
-        <w:t xml:space="preserve">[1] </w:t>
-      </w:r>
+        <w:t xml:space="preserve">[1] Lin M., Viswanathan S., </w:t>
+      </w:r>
+      <w:proofErr w:type="spellStart"/>
       <w:r>
         <w:rPr>
           <w:lang w:val="en-US"/>
         </w:rPr>
-        <w:t xml:space="preserve">Lin M., Viswanathan S., </w:t>
-      </w:r>
-      <w:proofErr w:type="spellStart"/>
+        <w:t>Prabhala</w:t>
+      </w:r>
+      <w:proofErr w:type="spellEnd"/>
       <w:r>
         <w:rPr>
           <w:lang w:val="en-US"/>
         </w:rPr>
-        <w:t>Prabhala</w:t>
-      </w:r>
-      <w:proofErr w:type="spellEnd"/>
-      <w:r>
-        <w:rPr>
-          <w:lang w:val="en-US"/>
-        </w:rPr>
-        <w:t xml:space="preserve"> N. Judging Borrowers by the Company They Keep: Friendship Networks and Information Asymmetry in Online Peer-to-Peer Lending // Management Science. – 2013. – Vol. 59, No. 1. – P. 17–35.</w:t>
-      </w:r>
-      <w:r>
-        <w:rPr>
-          <w:lang w:val="en-US"/>
-        </w:rPr>
-        <w:t xml:space="preserve"> </w:t>
-      </w:r>
-    </w:p>
-    <w:p>
-      <w:r>
-        <w:t>[</w:t>
-      </w:r>
-      <w:r>
-        <w:t>2</w:t>
-      </w:r>
-      <w:r>
-        <w:t xml:space="preserve">] </w:t>
-      </w:r>
-      <w:r>
-        <w:t>Антиплагиат</w:t>
-      </w:r>
-      <w:r>
-        <w:t xml:space="preserve"> [</w:t>
-      </w:r>
-      <w:r>
-        <w:t>Электронный</w:t>
-      </w:r>
-      <w:r>
-        <w:t xml:space="preserve"> </w:t>
-      </w:r>
-      <w:r>
-        <w:t>ресурс</w:t>
-      </w:r>
-      <w:r>
-        <w:t xml:space="preserve">]. – </w:t>
-      </w:r>
-      <w:r>
-        <w:t>Режим</w:t>
-      </w:r>
-      <w:r>
-        <w:t xml:space="preserve"> </w:t>
-      </w:r>
-      <w:r>
-        <w:t>доступа</w:t>
-      </w:r>
-      <w:r>
-        <w:t xml:space="preserve">: </w:t>
-      </w:r>
-      <w:r>
-        <w:rPr>
-          <w:lang w:val="en-US"/>
-        </w:rPr>
-        <w:t>https</w:t>
-      </w:r>
-      <w:r>
-        <w:t>://</w:t>
-      </w:r>
-      <w:proofErr w:type="spellStart"/>
-      <w:r>
-        <w:rPr>
-          <w:lang w:val="en-US"/>
-        </w:rPr>
-        <w:t>antiplagiat</w:t>
-      </w:r>
-      <w:proofErr w:type="spellEnd"/>
-      <w:r>
-        <w:t>.</w:t>
-      </w:r>
-      <w:proofErr w:type="spellStart"/>
-      <w:r>
-        <w:rPr>
-          <w:lang w:val="en-US"/>
-        </w:rPr>
-        <w:t>ru</w:t>
-      </w:r>
-      <w:proofErr w:type="spellEnd"/>
-      <w:r>
-        <w:t xml:space="preserve"> </w:t>
-      </w:r>
-      <w:r>
-        <w:t xml:space="preserve">– </w:t>
-      </w:r>
-      <w:r>
-        <w:t>Дата</w:t>
-      </w:r>
-      <w:r>
-        <w:t xml:space="preserve"> </w:t>
-      </w:r>
-      <w:r>
-        <w:t>обращения</w:t>
-      </w:r>
-      <w:r>
-        <w:t xml:space="preserve">: </w:t>
+        <w:t xml:space="preserve"> N. Judging Borrowers by the Company They Keep: Friendship Networks and Information Asymmetry in Online Peer-to-Peer Lending // Management Science. – 2013. – Vol. 59, No. 1. – P. 17–35. </w:t>
+      </w:r>
+    </w:p>
+    <w:p>
+      <w:r>
+        <w:t xml:space="preserve">[2] Антиплагиат [Электронный ресурс]. – Режим доступа: https://antiplagiat.ru – Дата обращения: </w:t>
       </w:r>
       <w:r>
         <w:rPr>
           <w:highlight w:val="yellow"/>
         </w:rPr>
-        <w:t>ХХ</w:t>
-      </w:r>
-      <w:r>
-        <w:rPr>
-          <w:highlight w:val="yellow"/>
-        </w:rPr>
-        <w:t>.</w:t>
-      </w:r>
-      <w:r>
-        <w:rPr>
-          <w:highlight w:val="yellow"/>
-        </w:rPr>
-        <w:t>ХХ</w:t>
-      </w:r>
-      <w:r>
-        <w:rPr>
-          <w:highlight w:val="yellow"/>
-        </w:rPr>
-        <w:t>.</w:t>
-      </w:r>
-      <w:r>
-        <w:rPr>
-          <w:highlight w:val="yellow"/>
-        </w:rPr>
-        <w:t>ХХХХ</w:t>
+        <w:t>ХХ.ХХ.ХХХХ</w:t>
       </w:r>
       <w:r>
         <w:t>.</w:t>

</xml_diff>

<commit_message>
The content are started
</commit_message>
<xml_diff>
--- a/docs/Note.docx
+++ b/docs/Note.docx
@@ -1597,10 +1597,235 @@
     </w:p>
     <w:p>
       <w:pPr>
+        <w:spacing w:line="21" w:lineRule="atLeast"/>
+        <w:ind w:firstLine="0"/>
+        <w:jc w:val="center"/>
+        <w:rPr>
+          <w:b/>
+          <w:sz w:val="32"/>
+        </w:rPr>
+      </w:pPr>
+      <w:r>
+        <w:rPr>
+          <w:b/>
+          <w:sz w:val="32"/>
+        </w:rPr>
+        <w:lastRenderedPageBreak/>
+        <w:t>СОДЕРЖАНИЕ</w:t>
+      </w:r>
+    </w:p>
+    <w:p>
+      <w:pPr>
+        <w:spacing w:line="21" w:lineRule="atLeast"/>
+      </w:pPr>
+    </w:p>
+    <w:p>
+      <w:pPr>
+        <w:pStyle w:val="11"/>
+        <w:tabs>
+          <w:tab w:val="right" w:leader="dot" w:pos="9344"/>
+        </w:tabs>
+        <w:rPr>
+          <w:rFonts w:asciiTheme="minorHAnsi" w:eastAsiaTheme="minorEastAsia" w:hAnsiTheme="minorHAnsi"/>
+          <w:noProof/>
+          <w:sz w:val="22"/>
+          <w:lang w:val="ru-BY" w:eastAsia="ru-BY"/>
+        </w:rPr>
+      </w:pPr>
+      <w:r>
+        <w:fldChar w:fldCharType="begin"/>
+      </w:r>
+      <w:r>
+        <w:instrText xml:space="preserve"> TOC \o "1-2" \h \z \u </w:instrText>
+      </w:r>
+      <w:r>
+        <w:fldChar w:fldCharType="separate"/>
+      </w:r>
+      <w:hyperlink w:anchor="_Toc224918860" w:history="1">
+        <w:r>
+          <w:rPr>
+            <w:rStyle w:val="af2"/>
+            <w:noProof/>
+          </w:rPr>
+          <w:t>Введение</w:t>
+        </w:r>
+        <w:r>
+          <w:rPr>
+            <w:noProof/>
+            <w:webHidden/>
+          </w:rPr>
+          <w:tab/>
+        </w:r>
+        <w:r>
+          <w:rPr>
+            <w:noProof/>
+            <w:webHidden/>
+          </w:rPr>
+          <w:fldChar w:fldCharType="begin"/>
+        </w:r>
+        <w:r>
+          <w:rPr>
+            <w:noProof/>
+            <w:webHidden/>
+          </w:rPr>
+          <w:instrText xml:space="preserve"> PAGEREF _Toc224918860 \h </w:instrText>
+        </w:r>
+        <w:r>
+          <w:rPr>
+            <w:noProof/>
+            <w:webHidden/>
+          </w:rPr>
+        </w:r>
+        <w:r>
+          <w:rPr>
+            <w:noProof/>
+            <w:webHidden/>
+          </w:rPr>
+          <w:fldChar w:fldCharType="separate"/>
+        </w:r>
+        <w:r>
+          <w:rPr>
+            <w:noProof/>
+            <w:webHidden/>
+          </w:rPr>
+          <w:t>4</w:t>
+        </w:r>
+        <w:r>
+          <w:rPr>
+            <w:noProof/>
+            <w:webHidden/>
+          </w:rPr>
+          <w:fldChar w:fldCharType="end"/>
+        </w:r>
+      </w:hyperlink>
+    </w:p>
+    <w:p>
+      <w:pPr>
+        <w:pStyle w:val="11"/>
+        <w:tabs>
+          <w:tab w:val="right" w:leader="dot" w:pos="9344"/>
+        </w:tabs>
+        <w:rPr>
+          <w:rFonts w:asciiTheme="minorHAnsi" w:eastAsiaTheme="minorEastAsia" w:hAnsiTheme="minorHAnsi"/>
+          <w:noProof/>
+          <w:sz w:val="22"/>
+          <w:lang w:val="ru-BY" w:eastAsia="ru-BY"/>
+        </w:rPr>
+      </w:pPr>
+      <w:hyperlink w:anchor="_Toc224918861" w:history="1">
+        <w:r>
+          <w:rPr>
+            <w:rStyle w:val="af2"/>
+            <w:noProof/>
+          </w:rPr>
+          <w:t>Список</w:t>
+        </w:r>
+        <w:r>
+          <w:rPr>
+            <w:rStyle w:val="af2"/>
+            <w:noProof/>
+            <w:lang w:val="en-US"/>
+          </w:rPr>
+          <w:t xml:space="preserve"> </w:t>
+        </w:r>
+        <w:r>
+          <w:rPr>
+            <w:rStyle w:val="af2"/>
+            <w:noProof/>
+          </w:rPr>
+          <w:t>использованных</w:t>
+        </w:r>
+        <w:r>
+          <w:rPr>
+            <w:rStyle w:val="af2"/>
+            <w:noProof/>
+            <w:lang w:val="en-US"/>
+          </w:rPr>
+          <w:t xml:space="preserve"> </w:t>
+        </w:r>
+        <w:r>
+          <w:rPr>
+            <w:rStyle w:val="af2"/>
+            <w:noProof/>
+          </w:rPr>
+          <w:t>источников</w:t>
+        </w:r>
+        <w:r>
+          <w:rPr>
+            <w:noProof/>
+            <w:webHidden/>
+          </w:rPr>
+          <w:tab/>
+        </w:r>
+        <w:r>
+          <w:rPr>
+            <w:noProof/>
+            <w:webHidden/>
+          </w:rPr>
+          <w:fldChar w:fldCharType="begin"/>
+        </w:r>
+        <w:r>
+          <w:rPr>
+            <w:noProof/>
+            <w:webHidden/>
+          </w:rPr>
+          <w:instrText xml:space="preserve"> PAGEREF _Toc224918861 \h </w:instrText>
+        </w:r>
+        <w:r>
+          <w:rPr>
+            <w:noProof/>
+            <w:webHidden/>
+          </w:rPr>
+        </w:r>
+        <w:r>
+          <w:rPr>
+            <w:noProof/>
+            <w:webHidden/>
+          </w:rPr>
+          <w:fldChar w:fldCharType="separate"/>
+        </w:r>
+        <w:r>
+          <w:rPr>
+            <w:noProof/>
+            <w:webHidden/>
+          </w:rPr>
+          <w:t>7</w:t>
+        </w:r>
+        <w:r>
+          <w:rPr>
+            <w:noProof/>
+            <w:webHidden/>
+          </w:rPr>
+          <w:fldChar w:fldCharType="end"/>
+        </w:r>
+      </w:hyperlink>
+    </w:p>
+    <w:p>
+      <w:pPr>
+        <w:spacing w:line="21" w:lineRule="atLeast"/>
+        <w:ind w:firstLine="0"/>
+        <w:jc w:val="center"/>
+        <w:rPr>
+          <w:lang w:val="ru"/>
+        </w:rPr>
+      </w:pPr>
+      <w:r>
+        <w:fldChar w:fldCharType="end"/>
+      </w:r>
+      <w:r>
+        <w:rPr>
+          <w:rFonts w:eastAsia="Times New Roman"/>
+          <w:lang w:val="ru"/>
+        </w:rPr>
+        <w:br w:type="page"/>
+      </w:r>
+    </w:p>
+    <w:p>
+      <w:pPr>
         <w:pStyle w:val="1"/>
         <w:ind w:left="0"/>
       </w:pPr>
-      <w:bookmarkStart w:id="1" w:name="_Toc223367489"/>
+      <w:bookmarkStart w:id="1" w:name="_Toc224918860"/>
       <w:r>
         <w:lastRenderedPageBreak/>
         <w:t>Введение</w:t>
@@ -1915,6 +2140,12 @@
         <w:br w:type="page"/>
       </w:r>
     </w:p>
+    <w:p/>
+    <w:p>
+      <w:r>
+        <w:br w:type="page"/>
+      </w:r>
+    </w:p>
     <w:p>
       <w:pPr>
         <w:pStyle w:val="1"/>
@@ -1923,7 +2154,7 @@
           <w:lang w:val="en-US"/>
         </w:rPr>
       </w:pPr>
-      <w:bookmarkStart w:id="2" w:name="_Toc223367497"/>
+      <w:bookmarkStart w:id="2" w:name="_Toc224918861"/>
       <w:r>
         <w:lastRenderedPageBreak/>
         <w:t>Список</w:t>

</xml_diff>

<commit_message>
The first chapter is started:the first subchapter is implemented
</commit_message>
<xml_diff>
--- a/docs/Note.docx
+++ b/docs/Note.docx
@@ -359,21 +359,7 @@
               <w:rPr>
                 <w:szCs w:val="28"/>
               </w:rPr>
-              <w:t>__</w:t>
-            </w:r>
-            <w:proofErr w:type="gramStart"/>
-            <w:r>
-              <w:rPr>
-                <w:szCs w:val="28"/>
-              </w:rPr>
-              <w:t>_._</w:t>
-            </w:r>
-            <w:proofErr w:type="gramEnd"/>
-            <w:r>
-              <w:rPr>
-                <w:szCs w:val="28"/>
-              </w:rPr>
-              <w:t>___.20</w:t>
+              <w:t>___.____.20</w:t>
             </w:r>
             <w:r>
               <w:rPr>
@@ -888,23 +874,7 @@
                 <w:color w:val="000000"/>
                 <w:szCs w:val="28"/>
               </w:rPr>
-              <w:t>__</w:t>
-            </w:r>
-            <w:proofErr w:type="gramStart"/>
-            <w:r>
-              <w:rPr>
-                <w:color w:val="000000"/>
-                <w:szCs w:val="28"/>
-              </w:rPr>
-              <w:t>_._</w:t>
-            </w:r>
-            <w:proofErr w:type="gramEnd"/>
-            <w:r>
-              <w:rPr>
-                <w:color w:val="000000"/>
-                <w:szCs w:val="28"/>
-              </w:rPr>
-              <w:t>___.202</w:t>
+              <w:t>___.____.202</w:t>
             </w:r>
             <w:r>
               <w:rPr>
@@ -1641,7 +1611,7 @@
       <w:r>
         <w:fldChar w:fldCharType="separate"/>
       </w:r>
-      <w:hyperlink w:anchor="_Toc224918860" w:history="1">
+      <w:hyperlink w:anchor="_Toc224919809" w:history="1">
         <w:r>
           <w:rPr>
             <w:rStyle w:val="af2"/>
@@ -1668,7 +1638,7 @@
             <w:noProof/>
             <w:webHidden/>
           </w:rPr>
-          <w:instrText xml:space="preserve"> PAGEREF _Toc224918860 \h </w:instrText>
+          <w:instrText xml:space="preserve"> PAGEREF _Toc224919809 \h </w:instrText>
         </w:r>
         <w:r>
           <w:rPr>
@@ -1712,7 +1682,149 @@
           <w:lang w:val="ru-BY" w:eastAsia="ru-BY"/>
         </w:rPr>
       </w:pPr>
-      <w:hyperlink w:anchor="_Toc224918861" w:history="1">
+      <w:hyperlink w:anchor="_Toc224919810" w:history="1">
+        <w:r>
+          <w:rPr>
+            <w:rStyle w:val="af2"/>
+            <w:noProof/>
+          </w:rPr>
+          <w:t>1 Анализ литературных источников и программных решений по теме курсового проекта</w:t>
+        </w:r>
+        <w:r>
+          <w:rPr>
+            <w:noProof/>
+            <w:webHidden/>
+          </w:rPr>
+          <w:tab/>
+        </w:r>
+        <w:r>
+          <w:rPr>
+            <w:noProof/>
+            <w:webHidden/>
+          </w:rPr>
+          <w:fldChar w:fldCharType="begin"/>
+        </w:r>
+        <w:r>
+          <w:rPr>
+            <w:noProof/>
+            <w:webHidden/>
+          </w:rPr>
+          <w:instrText xml:space="preserve"> PAGEREF _Toc224919810 \h </w:instrText>
+        </w:r>
+        <w:r>
+          <w:rPr>
+            <w:noProof/>
+            <w:webHidden/>
+          </w:rPr>
+        </w:r>
+        <w:r>
+          <w:rPr>
+            <w:noProof/>
+            <w:webHidden/>
+          </w:rPr>
+          <w:fldChar w:fldCharType="separate"/>
+        </w:r>
+        <w:r>
+          <w:rPr>
+            <w:noProof/>
+            <w:webHidden/>
+          </w:rPr>
+          <w:t>6</w:t>
+        </w:r>
+        <w:r>
+          <w:rPr>
+            <w:noProof/>
+            <w:webHidden/>
+          </w:rPr>
+          <w:fldChar w:fldCharType="end"/>
+        </w:r>
+      </w:hyperlink>
+    </w:p>
+    <w:p>
+      <w:pPr>
+        <w:pStyle w:val="21"/>
+        <w:tabs>
+          <w:tab w:val="right" w:leader="dot" w:pos="9344"/>
+        </w:tabs>
+        <w:rPr>
+          <w:rFonts w:asciiTheme="minorHAnsi" w:eastAsiaTheme="minorEastAsia" w:hAnsiTheme="minorHAnsi"/>
+          <w:noProof/>
+          <w:sz w:val="22"/>
+          <w:lang w:val="ru-BY" w:eastAsia="ru-BY"/>
+        </w:rPr>
+      </w:pPr>
+      <w:hyperlink w:anchor="_Toc224919811" w:history="1">
+        <w:r>
+          <w:rPr>
+            <w:rStyle w:val="af2"/>
+            <w:noProof/>
+          </w:rPr>
+          <w:t>1.1 Описание и анализ предметной области</w:t>
+        </w:r>
+        <w:r>
+          <w:rPr>
+            <w:noProof/>
+            <w:webHidden/>
+          </w:rPr>
+          <w:tab/>
+        </w:r>
+        <w:r>
+          <w:rPr>
+            <w:noProof/>
+            <w:webHidden/>
+          </w:rPr>
+          <w:fldChar w:fldCharType="begin"/>
+        </w:r>
+        <w:r>
+          <w:rPr>
+            <w:noProof/>
+            <w:webHidden/>
+          </w:rPr>
+          <w:instrText xml:space="preserve"> PAGEREF _Toc224919811 \h </w:instrText>
+        </w:r>
+        <w:r>
+          <w:rPr>
+            <w:noProof/>
+            <w:webHidden/>
+          </w:rPr>
+        </w:r>
+        <w:r>
+          <w:rPr>
+            <w:noProof/>
+            <w:webHidden/>
+          </w:rPr>
+          <w:fldChar w:fldCharType="separate"/>
+        </w:r>
+        <w:r>
+          <w:rPr>
+            <w:noProof/>
+            <w:webHidden/>
+          </w:rPr>
+          <w:t>6</w:t>
+        </w:r>
+        <w:r>
+          <w:rPr>
+            <w:noProof/>
+            <w:webHidden/>
+          </w:rPr>
+          <w:fldChar w:fldCharType="end"/>
+        </w:r>
+      </w:hyperlink>
+    </w:p>
+    <w:p>
+      <w:pPr>
+        <w:pStyle w:val="11"/>
+        <w:tabs>
+          <w:tab w:val="right" w:leader="dot" w:pos="9344"/>
+        </w:tabs>
+        <w:rPr>
+          <w:rFonts w:asciiTheme="minorHAnsi" w:eastAsiaTheme="minorEastAsia" w:hAnsiTheme="minorHAnsi"/>
+          <w:noProof/>
+          <w:sz w:val="22"/>
+          <w:lang w:val="ru-BY" w:eastAsia="ru-BY"/>
+        </w:rPr>
+      </w:pPr>
+      <w:hyperlink w:anchor="_Toc224919812" w:history="1">
         <w:r>
           <w:rPr>
             <w:rStyle w:val="af2"/>
@@ -1769,7 +1881,7 @@
             <w:noProof/>
             <w:webHidden/>
           </w:rPr>
-          <w:instrText xml:space="preserve"> PAGEREF _Toc224918861 \h </w:instrText>
+          <w:instrText xml:space="preserve"> PAGEREF _Toc224919812 \h </w:instrText>
         </w:r>
         <w:r>
           <w:rPr>
@@ -1789,7 +1901,7 @@
             <w:noProof/>
             <w:webHidden/>
           </w:rPr>
-          <w:t>7</w:t>
+          <w:t>12</w:t>
         </w:r>
         <w:r>
           <w:rPr>
@@ -1825,7 +1937,7 @@
         <w:pStyle w:val="1"/>
         <w:ind w:left="0"/>
       </w:pPr>
-      <w:bookmarkStart w:id="1" w:name="_Toc224918860"/>
+      <w:bookmarkStart w:id="1" w:name="_Toc224919809"/>
       <w:r>
         <w:lastRenderedPageBreak/>
         <w:t>Введение</w:t>
@@ -2140,6 +2252,1016 @@
         <w:br w:type="page"/>
       </w:r>
     </w:p>
+    <w:p>
+      <w:pPr>
+        <w:pStyle w:val="1"/>
+        <w:ind w:left="720"/>
+        <w:jc w:val="both"/>
+      </w:pPr>
+      <w:bookmarkStart w:id="2" w:name="_Toc224919810"/>
+      <w:r>
+        <w:lastRenderedPageBreak/>
+        <w:t>1 Анализ литературных источников и программных решений по теме курсового проекта</w:t>
+      </w:r>
+      <w:bookmarkEnd w:id="2"/>
+    </w:p>
+    <w:p/>
+    <w:p>
+      <w:pPr>
+        <w:pStyle w:val="2"/>
+        <w:rPr>
+          <w:lang w:val="ru-RU"/>
+        </w:rPr>
+      </w:pPr>
+      <w:bookmarkStart w:id="3" w:name="_Toc224919811"/>
+      <w:r>
+        <w:rPr>
+          <w:lang w:val="ru-RU"/>
+        </w:rPr>
+        <w:t>Описание и анализ предметной области</w:t>
+      </w:r>
+      <w:bookmarkEnd w:id="3"/>
+    </w:p>
+    <w:p/>
+    <w:p>
+      <w:r>
+        <w:t xml:space="preserve">В современных условиях развития цифровых технологий и финансовых инструментов наблюдается активное распространение альтернативных моделей кредитования, среди которых особое место занимает </w:t>
+      </w:r>
+      <w:proofErr w:type="spellStart"/>
+      <w:r>
+        <w:t>peer-to-peer</w:t>
+      </w:r>
+      <w:proofErr w:type="spellEnd"/>
+      <w:r>
+        <w:t xml:space="preserve"> (P2P) кредитование. Данная модель представляет собой способ организации финансовых отношений, при котором заемщики и кредиторы взаимодействуют напрямую через специализированные онлайн-платформы, минуя традиционные финансовые учреждения. Это позволяет снизить транзакционные издержки, повысить доступность заемных средств и обеспечить более гибкие условия взаимодействия участников рынка [</w:t>
+      </w:r>
+      <w:r>
+        <w:t>3</w:t>
+      </w:r>
+      <w:r>
+        <w:t>].</w:t>
+      </w:r>
+    </w:p>
+    <w:p>
+      <w:r>
+        <w:t>P2P-кредитование активно развивается благодаря цифровизации экономики и росту доверия к онлайн-сервисам. В отличие от банковских систем, где процесс одобрения кредита может занимать значительное время и требует предоставления большого количества документов, P2P-платформы обеспечивают более быстрый и упрощенный процесс получения займа. Однако такая модель также сопряжена с определенными рисками, связанными с отсутствием централизованного контроля и повышенной вероятностью невозврата средств.</w:t>
+      </w:r>
+    </w:p>
+    <w:p>
+      <w:r>
+        <w:t>Особый интерес представляет применение P2P-кредитования в студенческой среде. Студенты, как правило, не обладают стабильным доходом и кредитной историей, что ограничивает их доступ к традиционным банковским продуктам. В то же время у них существует регулярная потребность в финансовых ресурсах для оплаты обучения, проживания, учебных материалов и других расходов. В связи с этим возникает необходимость разработки специализированных решений, учитывающих особенности данной категории пользователей.</w:t>
+      </w:r>
+    </w:p>
+    <w:p>
+      <w:r>
+        <w:t xml:space="preserve">Одной из ключевых проблем в предметной области является оценка надежности заемщика. В традиционных финансовых системах для этого используются кредитные рейтинги, история платежей и уровень дохода. Однако в случае студентов такие показатели либо отсутствуют, либо являются недостаточно информативными. В рамках данного курсового проекта предлагается использовать альтернативный подход </w:t>
+      </w:r>
+      <w:r>
+        <w:t>–</w:t>
+      </w:r>
+      <w:r>
+        <w:t xml:space="preserve"> анализ академической успеваемости как индикатора ответственности и дисциплины пользователя. Данный подход позволяет частично компенсировать отсутствие финансовой истории и повысить точность оценки рисков.</w:t>
+      </w:r>
+    </w:p>
+    <w:p>
+      <w:r>
+        <w:lastRenderedPageBreak/>
+        <w:t>Кроме того, важной задачей является обеспечение возврата заемных средств. В условиях отсутствия банковских гарантий необходимо реализовать дополнительные механизмы защиты интересов кредиторов. К таким механизмам могут относиться системы рейтингов пользователей, формирование резервных фондов, использование поручительства, а также применение алгоритмов скоринга, учитывающих различные параметры поведения пользователя на платформе [</w:t>
+      </w:r>
+      <w:r>
+        <w:t>4</w:t>
+      </w:r>
+      <w:r>
+        <w:t>].</w:t>
+      </w:r>
+    </w:p>
+    <w:p>
+      <w:r>
+        <w:t>Предметная область включает в себя несколько ключевых участников, каждый из которых выполняет определенную роль в системе. Основными субъектами являются заемщики (студенты), кредиторы (частные лица или организации) и администрация платформы. Заемщики размещают заявки на получение займов, указывая необходимую сумму, срок и цель кредита. Кредиторы, в свою очередь, анализируют доступные заявки и принимают решение о предоставлении средств. Администрация платформы обеспечивает функционирование системы, контролирует соблюдение правил и реализует механизмы безопасности.</w:t>
+      </w:r>
+    </w:p>
+    <w:p>
+      <w:r>
+        <w:t>Для более наглядного представления характеристик участников системы приведена таблица 4.1.</w:t>
+      </w:r>
+    </w:p>
+    <w:p>
+      <w:pPr>
+        <w:ind w:firstLine="0"/>
+      </w:pPr>
+    </w:p>
+    <w:p>
+      <w:pPr>
+        <w:ind w:firstLine="0"/>
+      </w:pPr>
+      <w:r>
+        <w:t>Таблица 4.1 – Характеристика участников P2P-платформы</w:t>
+      </w:r>
+    </w:p>
+    <w:tbl>
+      <w:tblPr>
+        <w:tblStyle w:val="afc"/>
+        <w:tblW w:w="0" w:type="auto"/>
+        <w:tblLook w:val="04A0" w:firstRow="1" w:lastRow="0" w:firstColumn="1" w:lastColumn="0" w:noHBand="0" w:noVBand="1"/>
+      </w:tblPr>
+      <w:tblGrid>
+        <w:gridCol w:w="2336"/>
+        <w:gridCol w:w="2336"/>
+        <w:gridCol w:w="2336"/>
+        <w:gridCol w:w="2336"/>
+      </w:tblGrid>
+      <w:tr>
+        <w:tc>
+          <w:tcPr>
+            <w:tcW w:w="2336" w:type="dxa"/>
+          </w:tcPr>
+          <w:p>
+            <w:pPr>
+              <w:ind w:firstLine="0"/>
+            </w:pPr>
+            <w:r>
+              <w:t>Участник</w:t>
+            </w:r>
+          </w:p>
+        </w:tc>
+        <w:tc>
+          <w:tcPr>
+            <w:tcW w:w="2336" w:type="dxa"/>
+          </w:tcPr>
+          <w:p>
+            <w:pPr>
+              <w:ind w:firstLine="0"/>
+            </w:pPr>
+            <w:r>
+              <w:t>Основные функции</w:t>
+            </w:r>
+          </w:p>
+        </w:tc>
+        <w:tc>
+          <w:tcPr>
+            <w:tcW w:w="2336" w:type="dxa"/>
+          </w:tcPr>
+          <w:p>
+            <w:pPr>
+              <w:ind w:firstLine="0"/>
+            </w:pPr>
+            <w:r>
+              <w:t>Цели участия</w:t>
+            </w:r>
+          </w:p>
+        </w:tc>
+        <w:tc>
+          <w:tcPr>
+            <w:tcW w:w="2336" w:type="dxa"/>
+          </w:tcPr>
+          <w:p>
+            <w:pPr>
+              <w:ind w:firstLine="0"/>
+            </w:pPr>
+            <w:r>
+              <w:t>Риски</w:t>
+            </w:r>
+          </w:p>
+        </w:tc>
+      </w:tr>
+      <w:tr>
+        <w:tc>
+          <w:tcPr>
+            <w:tcW w:w="2336" w:type="dxa"/>
+          </w:tcPr>
+          <w:p>
+            <w:pPr>
+              <w:ind w:firstLine="0"/>
+            </w:pPr>
+            <w:r>
+              <w:t>Заемщик (студент)</w:t>
+            </w:r>
+          </w:p>
+        </w:tc>
+        <w:tc>
+          <w:tcPr>
+            <w:tcW w:w="2336" w:type="dxa"/>
+          </w:tcPr>
+          <w:p>
+            <w:pPr>
+              <w:ind w:firstLine="0"/>
+            </w:pPr>
+            <w:r>
+              <w:t>Подача заявки на заем, возврат средств, предоставление данных об успеваемости</w:t>
+            </w:r>
+          </w:p>
+        </w:tc>
+        <w:tc>
+          <w:tcPr>
+            <w:tcW w:w="2336" w:type="dxa"/>
+          </w:tcPr>
+          <w:p>
+            <w:pPr>
+              <w:ind w:firstLine="0"/>
+            </w:pPr>
+            <w:r>
+              <w:t>Получение финансовых средств</w:t>
+            </w:r>
+          </w:p>
+        </w:tc>
+        <w:tc>
+          <w:tcPr>
+            <w:tcW w:w="2336" w:type="dxa"/>
+          </w:tcPr>
+          <w:p>
+            <w:pPr>
+              <w:ind w:firstLine="0"/>
+            </w:pPr>
+            <w:r>
+              <w:t>Отказ в займе, финансовая нагрузка</w:t>
+            </w:r>
+          </w:p>
+        </w:tc>
+      </w:tr>
+      <w:tr>
+        <w:tc>
+          <w:tcPr>
+            <w:tcW w:w="2336" w:type="dxa"/>
+          </w:tcPr>
+          <w:p>
+            <w:pPr>
+              <w:ind w:firstLine="0"/>
+            </w:pPr>
+            <w:r>
+              <w:t>Кредитор</w:t>
+            </w:r>
+          </w:p>
+        </w:tc>
+        <w:tc>
+          <w:tcPr>
+            <w:tcW w:w="2336" w:type="dxa"/>
+          </w:tcPr>
+          <w:p>
+            <w:pPr>
+              <w:ind w:firstLine="0"/>
+            </w:pPr>
+            <w:r>
+              <w:t>Анализ заявок, предоставление средств, контроль возврата</w:t>
+            </w:r>
+          </w:p>
+        </w:tc>
+        <w:tc>
+          <w:tcPr>
+            <w:tcW w:w="2336" w:type="dxa"/>
+          </w:tcPr>
+          <w:p>
+            <w:pPr>
+              <w:ind w:firstLine="0"/>
+            </w:pPr>
+            <w:r>
+              <w:t>Получение прибыли (проценты)</w:t>
+            </w:r>
+          </w:p>
+        </w:tc>
+        <w:tc>
+          <w:tcPr>
+            <w:tcW w:w="2336" w:type="dxa"/>
+          </w:tcPr>
+          <w:p>
+            <w:pPr>
+              <w:ind w:firstLine="0"/>
+            </w:pPr>
+            <w:r>
+              <w:t>Невозврат средств</w:t>
+            </w:r>
+          </w:p>
+        </w:tc>
+      </w:tr>
+      <w:tr>
+        <w:tc>
+          <w:tcPr>
+            <w:tcW w:w="2336" w:type="dxa"/>
+          </w:tcPr>
+          <w:p>
+            <w:pPr>
+              <w:ind w:firstLine="0"/>
+            </w:pPr>
+            <w:r>
+              <w:t>Администратор</w:t>
+            </w:r>
+          </w:p>
+        </w:tc>
+        <w:tc>
+          <w:tcPr>
+            <w:tcW w:w="2336" w:type="dxa"/>
+          </w:tcPr>
+          <w:p>
+            <w:pPr>
+              <w:ind w:firstLine="0"/>
+            </w:pPr>
+            <w:r>
+              <w:t>Управление системой, контроль операций, обеспечение безопасности</w:t>
+            </w:r>
+          </w:p>
+        </w:tc>
+        <w:tc>
+          <w:tcPr>
+            <w:tcW w:w="2336" w:type="dxa"/>
+          </w:tcPr>
+          <w:p>
+            <w:pPr>
+              <w:ind w:firstLine="0"/>
+            </w:pPr>
+            <w:r>
+              <w:t>Поддержка работы платформы</w:t>
+            </w:r>
+          </w:p>
+        </w:tc>
+        <w:tc>
+          <w:tcPr>
+            <w:tcW w:w="2336" w:type="dxa"/>
+          </w:tcPr>
+          <w:p>
+            <w:pPr>
+              <w:ind w:firstLine="0"/>
+            </w:pPr>
+            <w:r>
+              <w:t>Сбои системы, утечка данных</w:t>
+            </w:r>
+          </w:p>
+        </w:tc>
+      </w:tr>
+    </w:tbl>
+    <w:p>
+      <w:pPr>
+        <w:ind w:firstLine="0"/>
+      </w:pPr>
+    </w:p>
+    <w:p>
+      <w:pPr>
+        <w:ind w:firstLine="0"/>
+      </w:pPr>
+      <w:r>
+        <w:tab/>
+      </w:r>
+      <w:r>
+        <w:t xml:space="preserve">Функционирование платформы предполагает реализацию ряда бизнес-процессов, включая регистрацию пользователей, аутентификацию, подачу </w:t>
+      </w:r>
+      <w:r>
+        <w:lastRenderedPageBreak/>
+        <w:t>заявок на получение займа, их обработку, принятие решений кредиторами, а также контроль выполнения обязательств. Каждый из этих процессов должен быть автоматизирован и реализован с учетом требований безопасности, производительности и удобства использования.</w:t>
+      </w:r>
+    </w:p>
+    <w:p>
+      <w:r>
+        <w:t>Особое внимание в предметной области уделяется вопросам информационной безопасности. Поскольку система работает с персональными и финансовыми данными пользователей, необходимо обеспечить защиту информации от несанкционированного доступа, а также реализовать механизмы аутентификации и авторизации. Использование современных технологий, таких как JWT-аутентификация, шифрование данных и контроль доступа, позволяет значительно повысить уровень безопасности системы [</w:t>
+      </w:r>
+      <w:r>
+        <w:t>5</w:t>
+      </w:r>
+      <w:r>
+        <w:t>].</w:t>
+      </w:r>
+    </w:p>
+    <w:p>
+      <w:r>
+        <w:t xml:space="preserve">Также важным аспектом является интеграция с внешними системами. Для реализации модуля проверки успеваемости может потребоваться взаимодействие с образовательными платформами или внутренними системами учебных заведений. Кроме того, возможно использование сторонних сервисов для аутентификации пользователей (например, через </w:t>
+      </w:r>
+      <w:proofErr w:type="spellStart"/>
+      <w:r>
+        <w:t>OAuth</w:t>
+      </w:r>
+      <w:proofErr w:type="spellEnd"/>
+      <w:r>
+        <w:t xml:space="preserve"> 2.0), что упрощает процесс регистрации и повышает удобство использования системы.</w:t>
+      </w:r>
+    </w:p>
+    <w:p>
+      <w:r>
+        <w:t xml:space="preserve">С точки зрения архитектуры, разрабатываемое программное средство относится к классу распределенных информационных систем. Оно включает в себя серверную часть, реализующую бизнес-логику и обработку данных, и клиентскую часть, обеспечивающую взаимодействие с пользователем. Использование </w:t>
+      </w:r>
+      <w:proofErr w:type="spellStart"/>
+      <w:r>
+        <w:t>RESTful</w:t>
+      </w:r>
+      <w:proofErr w:type="spellEnd"/>
+      <w:r>
+        <w:t xml:space="preserve"> API и формата данных JSON позволяет обеспечить гибкость и масштабируемость системы, а также упростить интеграцию с другими сервисами.</w:t>
+      </w:r>
+    </w:p>
+    <w:p>
+      <w:r>
+        <w:t>Таким образом, анализ предметной области показывает, что разработка платформы P2P-кредитования студентов является сложной и многогранной задачей, требующей учета множества факторов, включая особенности пользователей, риски, требования к безопасности и архитектурные решения. Предлагаемый подход с использованием модуля проверки успеваемости и системы гарантий возврата займов позволяет повысить эффективность и надежность системы, что делает данный проект актуальным и востребованным в условиях современного цифрового общества.</w:t>
+      </w:r>
+    </w:p>
+    <w:p>
+      <w:r>
+        <w:t xml:space="preserve">Дополнительно следует отметить, что развитие P2P-кредитования тесно связано с концепцией децентрализации финансовых услуг, которая является одним из ключевых трендов современной цифровой экономики. В отличие от централизованных банковских систем, где все решения принимаются финансовыми учреждениями, P2P-платформы перераспределяют ответственность и риски между участниками системы. Это приводит к </w:t>
+      </w:r>
+      <w:r>
+        <w:lastRenderedPageBreak/>
+        <w:t>формированию новой модели доверия, основанной не на институтах, а на цифровых механизмах оценки, рейтингах и алгоритмах анализа данных.</w:t>
+      </w:r>
+    </w:p>
+    <w:p>
+      <w:r>
+        <w:t xml:space="preserve">С экономической точки зрения P2P-кредитование представляет собой форму перераспределения финансовых ресурсов между участниками с различным уровнем ликвидности. Кредиторы получают возможность инвестировать свободные средства с целью получения дохода, а заемщики </w:t>
+      </w:r>
+      <w:r>
+        <w:t>–</w:t>
+      </w:r>
+      <w:r>
+        <w:t xml:space="preserve"> доступ к финансированию на более гибких условиях. При этом процентные ставки на таких платформах формируются либо автоматически на основе алгоритмов, либо в результате взаимодействия спроса и предложения, что делает рынок более динамичным и адаптивным [</w:t>
+      </w:r>
+      <w:r>
+        <w:t>6</w:t>
+      </w:r>
+      <w:r>
+        <w:t>].</w:t>
+      </w:r>
+    </w:p>
+    <w:p>
+      <w:r>
+        <w:t>Особое значение в рамках предметной области имеет процесс жизненного цикла займа, который включает несколько последовательных этапов. На начальном этапе заемщик формирует заявку, указывая сумму, срок и дополнительные параметры. Далее система проводит первичную валидацию данных, включая проверку профиля пользователя и его характеристик. После этого заявка становится доступной для кредиторов, которые могут принять решение о финансировании. В случае одобрения происходит заключение сделки, перевод средств и дальнейший контроль выполнения обязательств. Завершающим этапом является полное погашение займа либо фиксация просрочки.</w:t>
+      </w:r>
+    </w:p>
+    <w:p>
+      <w:r>
+        <w:t>Для более детального понимания структуры жизненного цикла займа можно представить его в виде таблицы.</w:t>
+      </w:r>
+    </w:p>
+    <w:p>
+      <w:pPr>
+        <w:ind w:firstLine="0"/>
+        <w:rPr>
+          <w:lang w:val="ru-BY"/>
+        </w:rPr>
+      </w:pPr>
+    </w:p>
+    <w:p>
+      <w:pPr>
+        <w:ind w:firstLine="0"/>
+      </w:pPr>
+      <w:r>
+        <w:t>Таблица 4.2 – Этапы жизненного цикла займа</w:t>
+      </w:r>
+    </w:p>
+    <w:tbl>
+      <w:tblPr>
+        <w:tblStyle w:val="afc"/>
+        <w:tblW w:w="0" w:type="auto"/>
+        <w:tblLook w:val="04A0" w:firstRow="1" w:lastRow="0" w:firstColumn="1" w:lastColumn="0" w:noHBand="0" w:noVBand="1"/>
+      </w:tblPr>
+      <w:tblGrid>
+        <w:gridCol w:w="4672"/>
+        <w:gridCol w:w="4672"/>
+      </w:tblGrid>
+      <w:tr>
+        <w:tc>
+          <w:tcPr>
+            <w:tcW w:w="4672" w:type="dxa"/>
+          </w:tcPr>
+          <w:p>
+            <w:pPr>
+              <w:ind w:firstLine="0"/>
+            </w:pPr>
+            <w:r>
+              <w:t>Этап</w:t>
+            </w:r>
+          </w:p>
+        </w:tc>
+        <w:tc>
+          <w:tcPr>
+            <w:tcW w:w="4672" w:type="dxa"/>
+          </w:tcPr>
+          <w:p>
+            <w:pPr>
+              <w:ind w:firstLine="0"/>
+            </w:pPr>
+            <w:r>
+              <w:t>Описание</w:t>
+            </w:r>
+          </w:p>
+        </w:tc>
+      </w:tr>
+      <w:tr>
+        <w:tc>
+          <w:tcPr>
+            <w:tcW w:w="4672" w:type="dxa"/>
+          </w:tcPr>
+          <w:p>
+            <w:pPr>
+              <w:ind w:firstLine="0"/>
+            </w:pPr>
+            <w:r>
+              <w:t>Формирование заявки</w:t>
+            </w:r>
+          </w:p>
+        </w:tc>
+        <w:tc>
+          <w:tcPr>
+            <w:tcW w:w="4672" w:type="dxa"/>
+          </w:tcPr>
+          <w:p>
+            <w:pPr>
+              <w:ind w:firstLine="0"/>
+              <w:rPr>
+                <w:lang w:val="ru-BY"/>
+              </w:rPr>
+            </w:pPr>
+            <w:r>
+              <w:rPr>
+                <w:lang w:val="ru-BY"/>
+              </w:rPr>
+              <w:t>Заемщик указывает параметры займа и отправляет заявку</w:t>
+            </w:r>
+          </w:p>
+        </w:tc>
+      </w:tr>
+      <w:tr>
+        <w:tc>
+          <w:tcPr>
+            <w:tcW w:w="4672" w:type="dxa"/>
+          </w:tcPr>
+          <w:p>
+            <w:pPr>
+              <w:ind w:firstLine="0"/>
+            </w:pPr>
+            <w:r>
+              <w:t>Проверка данных</w:t>
+            </w:r>
+          </w:p>
+        </w:tc>
+        <w:tc>
+          <w:tcPr>
+            <w:tcW w:w="4672" w:type="dxa"/>
+          </w:tcPr>
+          <w:p>
+            <w:pPr>
+              <w:ind w:firstLine="0"/>
+              <w:rPr>
+                <w:lang w:val="ru-BY"/>
+              </w:rPr>
+            </w:pPr>
+            <w:r>
+              <w:rPr>
+                <w:lang w:val="ru-BY"/>
+              </w:rPr>
+              <w:t>Система анализирует профиль и дополнительные параметры пользователя</w:t>
+            </w:r>
+          </w:p>
+        </w:tc>
+      </w:tr>
+      <w:tr>
+        <w:tc>
+          <w:tcPr>
+            <w:tcW w:w="4672" w:type="dxa"/>
+          </w:tcPr>
+          <w:p>
+            <w:pPr>
+              <w:ind w:firstLine="0"/>
+            </w:pPr>
+            <w:r>
+              <w:t>Публикация заявки</w:t>
+            </w:r>
+          </w:p>
+        </w:tc>
+        <w:tc>
+          <w:tcPr>
+            <w:tcW w:w="4672" w:type="dxa"/>
+          </w:tcPr>
+          <w:p>
+            <w:pPr>
+              <w:ind w:firstLine="0"/>
+              <w:rPr>
+                <w:lang w:val="ru-BY"/>
+              </w:rPr>
+            </w:pPr>
+            <w:r>
+              <w:rPr>
+                <w:lang w:val="ru-BY"/>
+              </w:rPr>
+              <w:t>Заявка становится доступной для кредиторов</w:t>
+            </w:r>
+          </w:p>
+        </w:tc>
+      </w:tr>
+      <w:tr>
+        <w:tc>
+          <w:tcPr>
+            <w:tcW w:w="4672" w:type="dxa"/>
+          </w:tcPr>
+          <w:p>
+            <w:pPr>
+              <w:ind w:firstLine="0"/>
+            </w:pPr>
+            <w:r>
+              <w:t>Финансирование</w:t>
+            </w:r>
+          </w:p>
+        </w:tc>
+        <w:tc>
+          <w:tcPr>
+            <w:tcW w:w="4672" w:type="dxa"/>
+          </w:tcPr>
+          <w:p>
+            <w:pPr>
+              <w:ind w:firstLine="0"/>
+              <w:rPr>
+                <w:lang w:val="ru-BY"/>
+              </w:rPr>
+            </w:pPr>
+            <w:r>
+              <w:rPr>
+                <w:lang w:val="ru-BY"/>
+              </w:rPr>
+              <w:t>Кредиторы предоставляют средства</w:t>
+            </w:r>
+          </w:p>
+        </w:tc>
+      </w:tr>
+      <w:tr>
+        <w:tc>
+          <w:tcPr>
+            <w:tcW w:w="4672" w:type="dxa"/>
+          </w:tcPr>
+          <w:p>
+            <w:pPr>
+              <w:ind w:firstLine="0"/>
+            </w:pPr>
+            <w:r>
+              <w:t>Заключение сделки</w:t>
+            </w:r>
+          </w:p>
+        </w:tc>
+        <w:tc>
+          <w:tcPr>
+            <w:tcW w:w="4672" w:type="dxa"/>
+          </w:tcPr>
+          <w:p>
+            <w:pPr>
+              <w:ind w:firstLine="0"/>
+              <w:rPr>
+                <w:lang w:val="ru-BY"/>
+              </w:rPr>
+            </w:pPr>
+            <w:r>
+              <w:rPr>
+                <w:lang w:val="ru-BY"/>
+              </w:rPr>
+              <w:t>Фиксация условий займа и перевод средств</w:t>
+            </w:r>
+          </w:p>
+        </w:tc>
+      </w:tr>
+      <w:tr>
+        <w:tc>
+          <w:tcPr>
+            <w:tcW w:w="4672" w:type="dxa"/>
+          </w:tcPr>
+          <w:p>
+            <w:pPr>
+              <w:ind w:firstLine="0"/>
+            </w:pPr>
+            <w:r>
+              <w:t>Мониторинг</w:t>
+            </w:r>
+          </w:p>
+        </w:tc>
+        <w:tc>
+          <w:tcPr>
+            <w:tcW w:w="4672" w:type="dxa"/>
+          </w:tcPr>
+          <w:p>
+            <w:pPr>
+              <w:ind w:firstLine="0"/>
+              <w:rPr>
+                <w:lang w:val="ru-BY"/>
+              </w:rPr>
+            </w:pPr>
+            <w:r>
+              <w:rPr>
+                <w:lang w:val="ru-BY"/>
+              </w:rPr>
+              <w:t>Контроль возврата средств и соблюдения условий</w:t>
+            </w:r>
+          </w:p>
+        </w:tc>
+      </w:tr>
+      <w:tr>
+        <w:tc>
+          <w:tcPr>
+            <w:tcW w:w="4672" w:type="dxa"/>
+          </w:tcPr>
+          <w:p>
+            <w:pPr>
+              <w:ind w:firstLine="0"/>
+            </w:pPr>
+            <w:r>
+              <w:t>Завершение</w:t>
+            </w:r>
+          </w:p>
+        </w:tc>
+        <w:tc>
+          <w:tcPr>
+            <w:tcW w:w="4672" w:type="dxa"/>
+          </w:tcPr>
+          <w:p>
+            <w:pPr>
+              <w:ind w:firstLine="0"/>
+              <w:rPr>
+                <w:lang w:val="ru-BY"/>
+              </w:rPr>
+            </w:pPr>
+            <w:r>
+              <w:rPr>
+                <w:lang w:val="ru-BY"/>
+              </w:rPr>
+              <w:t>Полное погашение или фиксация просрочки</w:t>
+            </w:r>
+          </w:p>
+        </w:tc>
+      </w:tr>
+    </w:tbl>
+    <w:p>
+      <w:pPr>
+        <w:rPr>
+          <w:lang w:val="ru-BY"/>
+        </w:rPr>
+      </w:pPr>
+    </w:p>
+    <w:p>
+      <w:r>
+        <w:lastRenderedPageBreak/>
+        <w:t xml:space="preserve">Одной из ключевых особенностей предметной области является необходимость управления рисками. В условиях отсутствия традиционных банковских механизмов обеспечения возврата средств система должна самостоятельно реализовывать инструменты анализа и минимизации рисков. К таким инструментам относятся </w:t>
+      </w:r>
+      <w:proofErr w:type="spellStart"/>
+      <w:r>
+        <w:t>скоринговые</w:t>
+      </w:r>
+      <w:proofErr w:type="spellEnd"/>
+      <w:r>
+        <w:t xml:space="preserve"> модели, которые позволяют оценить вероятность возврата займа на основе совокупности факторов. В рамках данного проекта предлагается расширить классическую </w:t>
+      </w:r>
+      <w:proofErr w:type="spellStart"/>
+      <w:r>
+        <w:t>скоринговую</w:t>
+      </w:r>
+      <w:proofErr w:type="spellEnd"/>
+      <w:r>
+        <w:t xml:space="preserve"> модель за счет включения показателей академической успеваемости, активности пользователя в системе и его репутации.</w:t>
+      </w:r>
+    </w:p>
+    <w:p>
+      <w:r>
+        <w:t>Анализ рисков в P2P-кредитовании может быть представлен в виде классификации, отражающей основные угрозы для участников системы.</w:t>
+      </w:r>
+    </w:p>
+    <w:p/>
+    <w:p>
+      <w:pPr>
+        <w:ind w:firstLine="0"/>
+      </w:pPr>
+      <w:r>
+        <w:t>Таблица 4.3 – Основные виды рисков в P2P-кредитовании</w:t>
+      </w:r>
+    </w:p>
+    <w:tbl>
+      <w:tblPr>
+        <w:tblStyle w:val="afc"/>
+        <w:tblW w:w="0" w:type="auto"/>
+        <w:tblLook w:val="04A0" w:firstRow="1" w:lastRow="0" w:firstColumn="1" w:lastColumn="0" w:noHBand="0" w:noVBand="1"/>
+      </w:tblPr>
+      <w:tblGrid>
+        <w:gridCol w:w="4672"/>
+        <w:gridCol w:w="4672"/>
+      </w:tblGrid>
+      <w:tr>
+        <w:tc>
+          <w:tcPr>
+            <w:tcW w:w="4672" w:type="dxa"/>
+          </w:tcPr>
+          <w:p>
+            <w:pPr>
+              <w:ind w:firstLine="0"/>
+            </w:pPr>
+            <w:r>
+              <w:t>Тип риска</w:t>
+            </w:r>
+          </w:p>
+        </w:tc>
+        <w:tc>
+          <w:tcPr>
+            <w:tcW w:w="4672" w:type="dxa"/>
+          </w:tcPr>
+          <w:p>
+            <w:pPr>
+              <w:ind w:firstLine="0"/>
+            </w:pPr>
+            <w:r>
+              <w:t>Описание</w:t>
+            </w:r>
+          </w:p>
+        </w:tc>
+      </w:tr>
+      <w:tr>
+        <w:tc>
+          <w:tcPr>
+            <w:tcW w:w="4672" w:type="dxa"/>
+          </w:tcPr>
+          <w:p>
+            <w:pPr>
+              <w:ind w:firstLine="0"/>
+            </w:pPr>
+            <w:r>
+              <w:t>Кредитный риск</w:t>
+            </w:r>
+          </w:p>
+        </w:tc>
+        <w:tc>
+          <w:tcPr>
+            <w:tcW w:w="4672" w:type="dxa"/>
+          </w:tcPr>
+          <w:p>
+            <w:pPr>
+              <w:ind w:firstLine="0"/>
+            </w:pPr>
+            <w:r>
+              <w:t>Невозврат заемщиком полученных средств</w:t>
+            </w:r>
+          </w:p>
+        </w:tc>
+      </w:tr>
+      <w:tr>
+        <w:tc>
+          <w:tcPr>
+            <w:tcW w:w="4672" w:type="dxa"/>
+          </w:tcPr>
+          <w:p>
+            <w:pPr>
+              <w:ind w:firstLine="0"/>
+            </w:pPr>
+            <w:r>
+              <w:t>Операционный риск</w:t>
+            </w:r>
+          </w:p>
+        </w:tc>
+        <w:tc>
+          <w:tcPr>
+            <w:tcW w:w="4672" w:type="dxa"/>
+          </w:tcPr>
+          <w:p>
+            <w:pPr>
+              <w:ind w:firstLine="0"/>
+            </w:pPr>
+            <w:r>
+              <w:t>Сбои в работе системы или ошибки в обработке данных</w:t>
+            </w:r>
+          </w:p>
+        </w:tc>
+      </w:tr>
+      <w:tr>
+        <w:tc>
+          <w:tcPr>
+            <w:tcW w:w="4672" w:type="dxa"/>
+          </w:tcPr>
+          <w:p>
+            <w:pPr>
+              <w:ind w:firstLine="0"/>
+            </w:pPr>
+            <w:r>
+              <w:t>Информационный риск</w:t>
+            </w:r>
+          </w:p>
+        </w:tc>
+        <w:tc>
+          <w:tcPr>
+            <w:tcW w:w="4672" w:type="dxa"/>
+          </w:tcPr>
+          <w:p>
+            <w:pPr>
+              <w:ind w:firstLine="0"/>
+            </w:pPr>
+            <w:r>
+              <w:t>Утечка или компрометация персональных данных</w:t>
+            </w:r>
+          </w:p>
+        </w:tc>
+      </w:tr>
+      <w:tr>
+        <w:tc>
+          <w:tcPr>
+            <w:tcW w:w="4672" w:type="dxa"/>
+          </w:tcPr>
+          <w:p>
+            <w:pPr>
+              <w:ind w:firstLine="0"/>
+            </w:pPr>
+            <w:r>
+              <w:t>Рыночный риск</w:t>
+            </w:r>
+          </w:p>
+        </w:tc>
+        <w:tc>
+          <w:tcPr>
+            <w:tcW w:w="4672" w:type="dxa"/>
+          </w:tcPr>
+          <w:p>
+            <w:pPr>
+              <w:ind w:firstLine="0"/>
+            </w:pPr>
+            <w:r>
+              <w:t>Изменение условий рынка и процентных ставок</w:t>
+            </w:r>
+          </w:p>
+        </w:tc>
+      </w:tr>
+      <w:tr>
+        <w:tc>
+          <w:tcPr>
+            <w:tcW w:w="4672" w:type="dxa"/>
+          </w:tcPr>
+          <w:p>
+            <w:pPr>
+              <w:ind w:firstLine="0"/>
+            </w:pPr>
+            <w:r>
+              <w:t>Поведенческий риск</w:t>
+            </w:r>
+          </w:p>
+        </w:tc>
+        <w:tc>
+          <w:tcPr>
+            <w:tcW w:w="4672" w:type="dxa"/>
+          </w:tcPr>
+          <w:p>
+            <w:pPr>
+              <w:ind w:firstLine="0"/>
+            </w:pPr>
+            <w:r>
+              <w:t>Недобросовестное поведение участников системы</w:t>
+            </w:r>
+          </w:p>
+        </w:tc>
+      </w:tr>
+    </w:tbl>
+    <w:p>
+      <w:pPr>
+        <w:ind w:firstLine="0"/>
+      </w:pPr>
+    </w:p>
+    <w:p>
+      <w:pPr>
+        <w:ind w:firstLine="0"/>
+      </w:pPr>
+      <w:r>
+        <w:tab/>
+      </w:r>
+      <w:r>
+        <w:t xml:space="preserve">С точки зрения информационных систем важным аспектом является построение эффективной архитектуры, обеспечивающей масштабируемость и устойчивость к нагрузкам. Поскольку P2P-платформа предполагает одновременную работу большого количества пользователей, система должна корректно обрабатывать параллельные запросы, обеспечивать согласованность данных и минимизировать задержки. Использование современных архитектурных подходов, таких как </w:t>
+      </w:r>
+      <w:proofErr w:type="spellStart"/>
+      <w:r>
+        <w:t>микросервисная</w:t>
+      </w:r>
+      <w:proofErr w:type="spellEnd"/>
+      <w:r>
+        <w:t xml:space="preserve"> архитектура или модульный монолит, позволяет достичь необходимого уровня гибкости и надежности.</w:t>
+      </w:r>
+    </w:p>
+    <w:p>
+      <w:r>
+        <w:t xml:space="preserve">Также следует учитывать требования к пользовательскому опыту. Удобство интерфейса и простота взаимодействия с системой играют ключевую роль в привлечении и удержании пользователей. Платформа должна предоставлять интуитивно понятные механизмы подачи заявок, выбора предложений, отслеживания статуса займов и анализа финансовой информации. Визуализация данных, уведомления и персонализированные </w:t>
+      </w:r>
+      <w:r>
+        <w:lastRenderedPageBreak/>
+        <w:t>рекомендации могут значительно повысить эффективность взаимодействия пользователей с системой.</w:t>
+      </w:r>
+    </w:p>
+    <w:p>
+      <w:r>
+        <w:t xml:space="preserve">Дополнительным аспектом предметной области является правовое регулирование. В различных странах P2P-кредитование регулируется по-разному, что накладывает ограничения на реализацию определенных функций системы. Необходимо учитывать требования законодательства в области защиты персональных данных, финансового мониторинга и противодействия мошенничеству. Это требует внедрения механизмов идентификации пользователей (KYC – </w:t>
+      </w:r>
+      <w:proofErr w:type="spellStart"/>
+      <w:r>
+        <w:t>Know</w:t>
+      </w:r>
+      <w:proofErr w:type="spellEnd"/>
+      <w:r>
+        <w:t xml:space="preserve"> Your Customer) и мониторинга операций [</w:t>
+      </w:r>
+      <w:r>
+        <w:t>7</w:t>
+      </w:r>
+      <w:r>
+        <w:t>].</w:t>
+      </w:r>
+    </w:p>
+    <w:p>
+      <w:r>
+        <w:t>В контексте разрабатываемой платформы особую роль играет интеграция с внешними источниками данных. Помимо образовательных систем, предоставляющих информацию об успеваемости студентов, могут использоваться сервисы для подтверждения личности, проверки платежеспособности и анализа поведенческих характеристик пользователей. Это позволяет сформировать более полное представление о заемщике и повысить точность принимаемых решений.</w:t>
+      </w:r>
+    </w:p>
+    <w:p>
+      <w:r>
+        <w:t>Таким образом, расширенный анализ предметной области показывает, что P2P-кредитование студентов является сложной социально-экономической и технологической системой, требующей комплексного подхода к разработке. Учет особенностей пользователей, внедрение механизмов оценки надежности и обеспечение безопасности операций являются ключевыми факторами успешной реализации платформы. Предлагаемое программное средство должно объединять в себе функциональность финансового сервиса и аналитической системы, обеспечивая эффективное взаимодействие между участниками и минимизацию рисков.</w:t>
+      </w:r>
+    </w:p>
     <w:p/>
     <w:p>
       <w:r>
@@ -2154,7 +3276,7 @@
           <w:lang w:val="en-US"/>
         </w:rPr>
       </w:pPr>
-      <w:bookmarkStart w:id="2" w:name="_Toc224918861"/>
+      <w:bookmarkStart w:id="4" w:name="_Toc224919812"/>
       <w:r>
         <w:lastRenderedPageBreak/>
         <w:t>Список</w:t>
@@ -2177,7 +3299,7 @@
       <w:r>
         <w:t>источников</w:t>
       </w:r>
-      <w:bookmarkEnd w:id="2"/>
+      <w:bookmarkEnd w:id="4"/>
     </w:p>
     <w:p>
       <w:pPr>
@@ -2226,6 +3348,156 @@
       </w:r>
       <w:r>
         <w:t>.</w:t>
+      </w:r>
+    </w:p>
+    <w:p>
+      <w:pPr>
+        <w:rPr>
+          <w:lang w:val="en-US"/>
+        </w:rPr>
+      </w:pPr>
+      <w:r>
+        <w:rPr>
+          <w:lang w:val="en-US"/>
+        </w:rPr>
+        <w:t>[</w:t>
+      </w:r>
+      <w:r>
+        <w:rPr>
+          <w:lang w:val="en-US"/>
+        </w:rPr>
+        <w:t>3</w:t>
+      </w:r>
+      <w:r>
+        <w:rPr>
+          <w:lang w:val="en-US"/>
+        </w:rPr>
+        <w:t xml:space="preserve">] </w:t>
+      </w:r>
+      <w:proofErr w:type="spellStart"/>
+      <w:r>
+        <w:rPr>
+          <w:lang w:val="en-US"/>
+        </w:rPr>
+        <w:t>Claessens</w:t>
+      </w:r>
+      <w:proofErr w:type="spellEnd"/>
+      <w:r>
+        <w:rPr>
+          <w:lang w:val="en-US"/>
+        </w:rPr>
+        <w:t xml:space="preserve"> S., Frost J., Turner G., Zhu F. Fintech credit markets around the world: size, drivers and policy issues // BIS Quarterly Review. – 2018.</w:t>
+      </w:r>
+    </w:p>
+    <w:p>
+      <w:pPr>
+        <w:rPr>
+          <w:lang w:val="en-US"/>
+        </w:rPr>
+      </w:pPr>
+      <w:r>
+        <w:rPr>
+          <w:lang w:val="en-US"/>
+        </w:rPr>
+        <w:t>[</w:t>
+      </w:r>
+      <w:r>
+        <w:rPr>
+          <w:lang w:val="en-US"/>
+        </w:rPr>
+        <w:t>4</w:t>
+      </w:r>
+      <w:r>
+        <w:rPr>
+          <w:lang w:val="en-US"/>
+        </w:rPr>
+        <w:t>] Morse A. Peer-to-peer crowdfunding: Information and the potential for disruption in consumer lending // Annual Review of Financial Economics. – 2015.</w:t>
+      </w:r>
+    </w:p>
+    <w:p>
+      <w:pPr>
+        <w:rPr>
+          <w:lang w:val="en-US"/>
+        </w:rPr>
+      </w:pPr>
+      <w:r>
+        <w:rPr>
+          <w:lang w:val="en-US"/>
+        </w:rPr>
+        <w:t>[</w:t>
+      </w:r>
+      <w:r>
+        <w:rPr>
+          <w:lang w:val="en-US"/>
+        </w:rPr>
+        <w:t>5</w:t>
+      </w:r>
+      <w:r>
+        <w:rPr>
+          <w:lang w:val="en-US"/>
+        </w:rPr>
+        <w:t>] Stallings W. Cryptography and Network Security: Principles and Practice. – Pearson, 2017.</w:t>
+      </w:r>
+    </w:p>
+    <w:p>
+      <w:pPr>
+        <w:rPr>
+          <w:lang w:val="en-US"/>
+        </w:rPr>
+      </w:pPr>
+      <w:r>
+        <w:rPr>
+          <w:lang w:val="en-US"/>
+        </w:rPr>
+        <w:t>[</w:t>
+      </w:r>
+      <w:r>
+        <w:rPr>
+          <w:lang w:val="en-US"/>
+        </w:rPr>
+        <w:t>6</w:t>
+      </w:r>
+      <w:r>
+        <w:rPr>
+          <w:lang w:val="en-US"/>
+        </w:rPr>
+        <w:t xml:space="preserve">] Milne A., </w:t>
+      </w:r>
+      <w:proofErr w:type="spellStart"/>
+      <w:r>
+        <w:rPr>
+          <w:lang w:val="en-US"/>
+        </w:rPr>
+        <w:t>Parboteeah</w:t>
+      </w:r>
+      <w:proofErr w:type="spellEnd"/>
+      <w:r>
+        <w:rPr>
+          <w:lang w:val="en-US"/>
+        </w:rPr>
+        <w:t xml:space="preserve"> P. The business models and economics of peer-to-peer lending // European Credit Research Institute. – 2016.</w:t>
+      </w:r>
+    </w:p>
+    <w:p>
+      <w:pPr>
+        <w:rPr>
+          <w:lang w:val="en-US"/>
+        </w:rPr>
+      </w:pPr>
+      <w:r>
+        <w:rPr>
+          <w:lang w:val="en-US"/>
+        </w:rPr>
+        <w:t>[</w:t>
+      </w:r>
+      <w:r>
+        <w:t>7</w:t>
+      </w:r>
+      <w:r>
+        <w:rPr>
+          <w:lang w:val="en-US"/>
+        </w:rPr>
+        <w:t>] European Banking Authority. Opinion on lending-based crowdfunding. – 2015.</w:t>
       </w:r>
     </w:p>
     <w:sectPr>
@@ -3361,7 +4633,6 @@
   <w:style w:type="character" w:default="1" w:styleId="a1">
     <w:name w:val="Default Paragraph Font"/>
     <w:uiPriority w:val="1"/>
-    <w:semiHidden/>
     <w:unhideWhenUsed/>
   </w:style>
   <w:style w:type="table" w:default="1" w:styleId="a2">

</xml_diff>

<commit_message>
The first chapter is completed:the second subchapter is implemented
</commit_message>
<xml_diff>
--- a/docs/Note.docx
+++ b/docs/Note.docx
@@ -1611,7 +1611,7 @@
       <w:r>
         <w:fldChar w:fldCharType="separate"/>
       </w:r>
-      <w:hyperlink w:anchor="_Toc224919809" w:history="1">
+      <w:hyperlink w:anchor="_Toc224921131" w:history="1">
         <w:r>
           <w:rPr>
             <w:rStyle w:val="af2"/>
@@ -1638,7 +1638,7 @@
             <w:noProof/>
             <w:webHidden/>
           </w:rPr>
-          <w:instrText xml:space="preserve"> PAGEREF _Toc224919809 \h </w:instrText>
+          <w:instrText xml:space="preserve"> PAGEREF _Toc224921131 \h </w:instrText>
         </w:r>
         <w:r>
           <w:rPr>
@@ -1682,7 +1682,7 @@
           <w:lang w:val="ru-BY" w:eastAsia="ru-BY"/>
         </w:rPr>
       </w:pPr>
-      <w:hyperlink w:anchor="_Toc224919810" w:history="1">
+      <w:hyperlink w:anchor="_Toc224921132" w:history="1">
         <w:r>
           <w:rPr>
             <w:rStyle w:val="af2"/>
@@ -1709,7 +1709,7 @@
             <w:noProof/>
             <w:webHidden/>
           </w:rPr>
-          <w:instrText xml:space="preserve"> PAGEREF _Toc224919810 \h </w:instrText>
+          <w:instrText xml:space="preserve"> PAGEREF _Toc224921132 \h </w:instrText>
         </w:r>
         <w:r>
           <w:rPr>
@@ -1753,7 +1753,7 @@
           <w:lang w:val="ru-BY" w:eastAsia="ru-BY"/>
         </w:rPr>
       </w:pPr>
-      <w:hyperlink w:anchor="_Toc224919811" w:history="1">
+      <w:hyperlink w:anchor="_Toc224921133" w:history="1">
         <w:r>
           <w:rPr>
             <w:rStyle w:val="af2"/>
@@ -1780,7 +1780,7 @@
             <w:noProof/>
             <w:webHidden/>
           </w:rPr>
-          <w:instrText xml:space="preserve"> PAGEREF _Toc224919811 \h </w:instrText>
+          <w:instrText xml:space="preserve"> PAGEREF _Toc224921133 \h </w:instrText>
         </w:r>
         <w:r>
           <w:rPr>
@@ -1813,6 +1813,77 @@
     </w:p>
     <w:p>
       <w:pPr>
+        <w:pStyle w:val="21"/>
+        <w:tabs>
+          <w:tab w:val="right" w:leader="dot" w:pos="9344"/>
+        </w:tabs>
+        <w:rPr>
+          <w:rFonts w:asciiTheme="minorHAnsi" w:eastAsiaTheme="minorEastAsia" w:hAnsiTheme="minorHAnsi"/>
+          <w:noProof/>
+          <w:sz w:val="22"/>
+          <w:lang w:val="ru-BY" w:eastAsia="ru-BY"/>
+        </w:rPr>
+      </w:pPr>
+      <w:hyperlink w:anchor="_Toc224921134" w:history="1">
+        <w:r>
+          <w:rPr>
+            <w:rStyle w:val="af2"/>
+            <w:noProof/>
+          </w:rPr>
+          <w:t>1.2 Обзор функциональности аналогов программного средства</w:t>
+        </w:r>
+        <w:r>
+          <w:rPr>
+            <w:noProof/>
+            <w:webHidden/>
+          </w:rPr>
+          <w:tab/>
+        </w:r>
+        <w:r>
+          <w:rPr>
+            <w:noProof/>
+            <w:webHidden/>
+          </w:rPr>
+          <w:fldChar w:fldCharType="begin"/>
+        </w:r>
+        <w:r>
+          <w:rPr>
+            <w:noProof/>
+            <w:webHidden/>
+          </w:rPr>
+          <w:instrText xml:space="preserve"> PAGEREF _Toc224921134 \h </w:instrText>
+        </w:r>
+        <w:r>
+          <w:rPr>
+            <w:noProof/>
+            <w:webHidden/>
+          </w:rPr>
+        </w:r>
+        <w:r>
+          <w:rPr>
+            <w:noProof/>
+            <w:webHidden/>
+          </w:rPr>
+          <w:fldChar w:fldCharType="separate"/>
+        </w:r>
+        <w:r>
+          <w:rPr>
+            <w:noProof/>
+            <w:webHidden/>
+          </w:rPr>
+          <w:t>11</w:t>
+        </w:r>
+        <w:r>
+          <w:rPr>
+            <w:noProof/>
+            <w:webHidden/>
+          </w:rPr>
+          <w:fldChar w:fldCharType="end"/>
+        </w:r>
+      </w:hyperlink>
+    </w:p>
+    <w:p>
+      <w:pPr>
         <w:pStyle w:val="11"/>
         <w:tabs>
           <w:tab w:val="right" w:leader="dot" w:pos="9344"/>
@@ -1824,7 +1895,7 @@
           <w:lang w:val="ru-BY" w:eastAsia="ru-BY"/>
         </w:rPr>
       </w:pPr>
-      <w:hyperlink w:anchor="_Toc224919812" w:history="1">
+      <w:hyperlink w:anchor="_Toc224921135" w:history="1">
         <w:r>
           <w:rPr>
             <w:rStyle w:val="af2"/>
@@ -1881,7 +1952,7 @@
             <w:noProof/>
             <w:webHidden/>
           </w:rPr>
-          <w:instrText xml:space="preserve"> PAGEREF _Toc224919812 \h </w:instrText>
+          <w:instrText xml:space="preserve"> PAGEREF _Toc224921135 \h </w:instrText>
         </w:r>
         <w:r>
           <w:rPr>
@@ -1901,7 +1972,7 @@
             <w:noProof/>
             <w:webHidden/>
           </w:rPr>
-          <w:t>12</w:t>
+          <w:t>15</w:t>
         </w:r>
         <w:r>
           <w:rPr>
@@ -1937,7 +2008,7 @@
         <w:pStyle w:val="1"/>
         <w:ind w:left="0"/>
       </w:pPr>
-      <w:bookmarkStart w:id="1" w:name="_Toc224919809"/>
+      <w:bookmarkStart w:id="1" w:name="_Toc224921131"/>
       <w:r>
         <w:lastRenderedPageBreak/>
         <w:t>Введение</w:t>
@@ -2258,7 +2329,7 @@
         <w:ind w:left="720"/>
         <w:jc w:val="both"/>
       </w:pPr>
-      <w:bookmarkStart w:id="2" w:name="_Toc224919810"/>
+      <w:bookmarkStart w:id="2" w:name="_Toc224921132"/>
       <w:r>
         <w:lastRenderedPageBreak/>
         <w:t>1 Анализ литературных источников и программных решений по теме курсового проекта</w:t>
@@ -2273,7 +2344,7 @@
           <w:lang w:val="ru-RU"/>
         </w:rPr>
       </w:pPr>
-      <w:bookmarkStart w:id="3" w:name="_Toc224919811"/>
+      <w:bookmarkStart w:id="3" w:name="_Toc224921133"/>
       <w:r>
         <w:rPr>
           <w:lang w:val="ru-RU"/>
@@ -2342,7 +2413,13 @@
     </w:p>
     <w:p>
       <w:r>
-        <w:t>Для более наглядного представления характеристик участников системы приведена таблица 4.1.</w:t>
+        <w:t xml:space="preserve">Для более наглядного представления характеристик участников системы приведена таблица </w:t>
+      </w:r>
+      <w:r>
+        <w:t>1</w:t>
+      </w:r>
+      <w:r>
+        <w:t>.1.</w:t>
       </w:r>
     </w:p>
     <w:p>
@@ -2355,7 +2432,13 @@
         <w:ind w:firstLine="0"/>
       </w:pPr>
       <w:r>
-        <w:t>Таблица 4.1 – Характеристика участников P2P-платформы</w:t>
+        <w:t xml:space="preserve">Таблица </w:t>
+      </w:r>
+      <w:r>
+        <w:t>1</w:t>
+      </w:r>
+      <w:r>
+        <w:t>.1 – Характеристика участников P2P-платформы</w:t>
       </w:r>
     </w:p>
     <w:tbl>
@@ -2698,7 +2781,13 @@
         <w:ind w:firstLine="0"/>
       </w:pPr>
       <w:r>
-        <w:t>Таблица 4.2 – Этапы жизненного цикла займа</w:t>
+        <w:t xml:space="preserve">Таблица </w:t>
+      </w:r>
+      <w:r>
+        <w:t>1</w:t>
+      </w:r>
+      <w:r>
+        <w:t>.2 – Этапы жизненного цикла займа</w:t>
       </w:r>
     </w:p>
     <w:tbl>
@@ -3018,7 +3107,13 @@
         <w:ind w:firstLine="0"/>
       </w:pPr>
       <w:r>
-        <w:t>Таблица 4.3 – Основные виды рисков в P2P-кредитовании</w:t>
+        <w:t xml:space="preserve">Таблица </w:t>
+      </w:r>
+      <w:r>
+        <w:t>1</w:t>
+      </w:r>
+      <w:r>
+        <w:t>.3 – Основные виды рисков в P2P-кредитовании</w:t>
       </w:r>
     </w:p>
     <w:tbl>
@@ -3262,7 +3357,827 @@
         <w:t>Таким образом, расширенный анализ предметной области показывает, что P2P-кредитование студентов является сложной социально-экономической и технологической системой, требующей комплексного подхода к разработке. Учет особенностей пользователей, внедрение механизмов оценки надежности и обеспечение безопасности операций являются ключевыми факторами успешной реализации платформы. Предлагаемое программное средство должно объединять в себе функциональность финансового сервиса и аналитической системы, обеспечивая эффективное взаимодействие между участниками и минимизацию рисков.</w:t>
       </w:r>
     </w:p>
+    <w:p>
+      <w:pPr>
+        <w:ind w:firstLine="0"/>
+      </w:pPr>
+    </w:p>
+    <w:p>
+      <w:pPr>
+        <w:pStyle w:val="2"/>
+        <w:rPr>
+          <w:lang w:val="ru-RU"/>
+        </w:rPr>
+      </w:pPr>
+      <w:r>
+        <w:rPr>
+          <w:lang w:val="ru-RU"/>
+        </w:rPr>
+        <w:tab/>
+      </w:r>
+      <w:bookmarkStart w:id="4" w:name="_Toc224921134"/>
+      <w:r>
+        <w:rPr>
+          <w:lang w:val="ru-RU"/>
+        </w:rPr>
+        <w:t>Обзор функциональности аналогов программного средства</w:t>
+      </w:r>
+      <w:bookmarkEnd w:id="4"/>
+    </w:p>
     <w:p/>
+    <w:p>
+      <w:r>
+        <w:t>В условиях активного развития финансовых технологий рынок P2P-кредитования представлен значительным количеством онлайн-платформ, каждая из которых реализует собственный подход к организации взаимодействия между заемщиками и кредиторами. Анализ существующих решений позволяет выявить ключевые тенденции развития данной области, определить сильные и слабые стороны аналогов, а также сформировать требования к разрабатываемому программному средству.</w:t>
+      </w:r>
+    </w:p>
+    <w:p>
+      <w:r>
+        <w:t xml:space="preserve">Одними из наиболее известных и широко используемых платформ в сфере P2P-кредитования являются международные сервисы, такие как </w:t>
+      </w:r>
+      <w:proofErr w:type="spellStart"/>
+      <w:r>
+        <w:t>LendingClub</w:t>
+      </w:r>
+      <w:proofErr w:type="spellEnd"/>
+      <w:r>
+        <w:t xml:space="preserve">, </w:t>
+      </w:r>
+      <w:proofErr w:type="spellStart"/>
+      <w:r>
+        <w:t>Prosper</w:t>
+      </w:r>
+      <w:proofErr w:type="spellEnd"/>
+      <w:r>
+        <w:t xml:space="preserve"> и </w:t>
+      </w:r>
+      <w:proofErr w:type="spellStart"/>
+      <w:r>
+        <w:t>Funding</w:t>
+      </w:r>
+      <w:proofErr w:type="spellEnd"/>
+      <w:r>
+        <w:t xml:space="preserve"> </w:t>
+      </w:r>
+      <w:proofErr w:type="spellStart"/>
+      <w:r>
+        <w:t>Circle</w:t>
+      </w:r>
+      <w:proofErr w:type="spellEnd"/>
+      <w:r>
+        <w:t xml:space="preserve">. Эти платформы предоставляют пользователям возможность получать и предоставлять займы через интернет, </w:t>
+      </w:r>
+      <w:r>
+        <w:lastRenderedPageBreak/>
+        <w:t>используя различные механизмы оценки кредитоспособности и управления рисками.</w:t>
+      </w:r>
+    </w:p>
+    <w:p>
+      <w:r>
+        <w:t xml:space="preserve">Платформа </w:t>
+      </w:r>
+      <w:proofErr w:type="spellStart"/>
+      <w:r>
+        <w:t>LendingClub</w:t>
+      </w:r>
+      <w:proofErr w:type="spellEnd"/>
+      <w:r>
+        <w:t xml:space="preserve"> является одной из крупнейших в мире систем P2P-кредитования. Она предлагает автоматизированный процесс оценки заемщиков на основе кредитной истории, доходов и других финансовых показателей. Система использует внутренние алгоритмы скоринга, присваивая заемщикам рейтинги, которые влияют на процентную ставку по займу. Однако данный подход ориентирован преимущественно на пользователей с уже сформированной кредитной историей, что делает платформу менее доступной для студентов.</w:t>
+      </w:r>
+    </w:p>
+    <w:p>
+      <w:r>
+        <w:t xml:space="preserve">Сервис </w:t>
+      </w:r>
+      <w:proofErr w:type="spellStart"/>
+      <w:r>
+        <w:t>Prosper</w:t>
+      </w:r>
+      <w:proofErr w:type="spellEnd"/>
+      <w:r>
+        <w:t xml:space="preserve"> реализует схожую модель, предоставляя пользователям возможность инвестировать средства в заявки заемщиков. Особенностью платформы является наличие аукционного механизма, при котором процентная ставка может формироваться в зависимости от предложений кредиторов. Тем не менее, как и в предыдущем случае, основное внимание уделяется финансовым показателям заемщика, без учета альтернативных факторов, таких как образовательные достижения.</w:t>
+      </w:r>
+    </w:p>
+    <w:p>
+      <w:r>
+        <w:t xml:space="preserve">Платформа </w:t>
+      </w:r>
+      <w:proofErr w:type="spellStart"/>
+      <w:r>
+        <w:t>Funding</w:t>
+      </w:r>
+      <w:proofErr w:type="spellEnd"/>
+      <w:r>
+        <w:t xml:space="preserve"> </w:t>
+      </w:r>
+      <w:proofErr w:type="spellStart"/>
+      <w:r>
+        <w:t>Circle</w:t>
+      </w:r>
+      <w:proofErr w:type="spellEnd"/>
+      <w:r>
+        <w:t xml:space="preserve"> ориентирована на кредитование малого и среднего бизнеса. Она использует более строгие процедуры проверки заемщиков, включая анализ финансовой отчетности и кредитной истории компаний. Несмотря на высокую надежность, данный подход не применим напрямую к студенческой аудитории, что ограничивает возможность использования подобных решений в рамках рассматриваемой предметной области.</w:t>
+      </w:r>
+    </w:p>
+    <w:p>
+      <w:r>
+        <w:t>Помимо международных платформ, существуют региональные решения, адаптированные под особенности локальных рынков. Такие системы могут учитывать национальные законодательные требования, особенности платежных систем и поведенческие характеристики пользователей. Однако большинство из них также не ориентированы на узкоспециализированные категории пользователей, такие как студенты.</w:t>
+      </w:r>
+    </w:p>
+    <w:p>
+      <w:r>
+        <w:t>Для более детального анализа функциональности существующих решений приведена сравнительная таблица.</w:t>
+      </w:r>
+    </w:p>
+    <w:p>
+      <w:pPr>
+        <w:ind w:firstLine="0"/>
+      </w:pPr>
+    </w:p>
+    <w:p>
+      <w:pPr>
+        <w:ind w:firstLine="0"/>
+      </w:pPr>
+      <w:r>
+        <w:t xml:space="preserve">Таблица </w:t>
+      </w:r>
+      <w:r>
+        <w:t>1</w:t>
+      </w:r>
+      <w:r>
+        <w:t>.4 – Сравнение функциональности P2P-платформ</w:t>
+      </w:r>
+    </w:p>
+    <w:tbl>
+      <w:tblPr>
+        <w:tblStyle w:val="afc"/>
+        <w:tblW w:w="0" w:type="auto"/>
+        <w:tblLook w:val="04A0" w:firstRow="1" w:lastRow="0" w:firstColumn="1" w:lastColumn="0" w:noHBand="0" w:noVBand="1"/>
+      </w:tblPr>
+      <w:tblGrid>
+        <w:gridCol w:w="2336"/>
+        <w:gridCol w:w="2336"/>
+        <w:gridCol w:w="2336"/>
+        <w:gridCol w:w="2336"/>
+      </w:tblGrid>
+      <w:tr>
+        <w:tc>
+          <w:tcPr>
+            <w:tcW w:w="2336" w:type="dxa"/>
+          </w:tcPr>
+          <w:p>
+            <w:pPr>
+              <w:ind w:firstLine="0"/>
+            </w:pPr>
+            <w:r>
+              <w:t>Платформа</w:t>
+            </w:r>
+          </w:p>
+        </w:tc>
+        <w:tc>
+          <w:tcPr>
+            <w:tcW w:w="2336" w:type="dxa"/>
+          </w:tcPr>
+          <w:p>
+            <w:pPr>
+              <w:ind w:firstLine="0"/>
+            </w:pPr>
+            <w:proofErr w:type="spellStart"/>
+            <w:r>
+              <w:t>LendingClub</w:t>
+            </w:r>
+            <w:proofErr w:type="spellEnd"/>
+          </w:p>
+        </w:tc>
+        <w:tc>
+          <w:tcPr>
+            <w:tcW w:w="2336" w:type="dxa"/>
+          </w:tcPr>
+          <w:p>
+            <w:pPr>
+              <w:ind w:firstLine="0"/>
+            </w:pPr>
+            <w:proofErr w:type="spellStart"/>
+            <w:r>
+              <w:t>Prosper</w:t>
+            </w:r>
+            <w:proofErr w:type="spellEnd"/>
+          </w:p>
+        </w:tc>
+        <w:tc>
+          <w:tcPr>
+            <w:tcW w:w="2336" w:type="dxa"/>
+          </w:tcPr>
+          <w:p>
+            <w:pPr>
+              <w:ind w:firstLine="0"/>
+            </w:pPr>
+            <w:proofErr w:type="spellStart"/>
+            <w:r>
+              <w:t>Funding</w:t>
+            </w:r>
+            <w:proofErr w:type="spellEnd"/>
+            <w:r>
+              <w:t xml:space="preserve"> </w:t>
+            </w:r>
+            <w:proofErr w:type="spellStart"/>
+            <w:r>
+              <w:t>Circle</w:t>
+            </w:r>
+            <w:proofErr w:type="spellEnd"/>
+          </w:p>
+        </w:tc>
+      </w:tr>
+      <w:tr>
+        <w:tc>
+          <w:tcPr>
+            <w:tcW w:w="2336" w:type="dxa"/>
+          </w:tcPr>
+          <w:p>
+            <w:pPr>
+              <w:ind w:firstLine="0"/>
+            </w:pPr>
+            <w:r>
+              <w:t>Регистрация и профиль</w:t>
+            </w:r>
+          </w:p>
+        </w:tc>
+        <w:tc>
+          <w:tcPr>
+            <w:tcW w:w="2336" w:type="dxa"/>
+          </w:tcPr>
+          <w:p>
+            <w:pPr>
+              <w:ind w:firstLine="0"/>
+            </w:pPr>
+            <w:r>
+              <w:t>Да</w:t>
+            </w:r>
+          </w:p>
+        </w:tc>
+        <w:tc>
+          <w:tcPr>
+            <w:tcW w:w="2336" w:type="dxa"/>
+          </w:tcPr>
+          <w:p>
+            <w:pPr>
+              <w:ind w:firstLine="0"/>
+            </w:pPr>
+            <w:r>
+              <w:t>Да</w:t>
+            </w:r>
+          </w:p>
+        </w:tc>
+        <w:tc>
+          <w:tcPr>
+            <w:tcW w:w="2336" w:type="dxa"/>
+          </w:tcPr>
+          <w:p>
+            <w:pPr>
+              <w:ind w:firstLine="0"/>
+            </w:pPr>
+            <w:r>
+              <w:t>Да</w:t>
+            </w:r>
+          </w:p>
+        </w:tc>
+      </w:tr>
+      <w:tr>
+        <w:tc>
+          <w:tcPr>
+            <w:tcW w:w="2336" w:type="dxa"/>
+          </w:tcPr>
+          <w:p>
+            <w:pPr>
+              <w:ind w:firstLine="0"/>
+            </w:pPr>
+            <w:r>
+              <w:t>Скоринг заемщика</w:t>
+            </w:r>
+          </w:p>
+        </w:tc>
+        <w:tc>
+          <w:tcPr>
+            <w:tcW w:w="2336" w:type="dxa"/>
+          </w:tcPr>
+          <w:p>
+            <w:pPr>
+              <w:ind w:firstLine="0"/>
+            </w:pPr>
+            <w:r>
+              <w:t>Кредитный</w:t>
+            </w:r>
+          </w:p>
+        </w:tc>
+        <w:tc>
+          <w:tcPr>
+            <w:tcW w:w="2336" w:type="dxa"/>
+          </w:tcPr>
+          <w:p>
+            <w:pPr>
+              <w:ind w:firstLine="0"/>
+            </w:pPr>
+            <w:r>
+              <w:t>Кредитный</w:t>
+            </w:r>
+          </w:p>
+        </w:tc>
+        <w:tc>
+          <w:tcPr>
+            <w:tcW w:w="2336" w:type="dxa"/>
+          </w:tcPr>
+          <w:p>
+            <w:pPr>
+              <w:ind w:firstLine="0"/>
+            </w:pPr>
+            <w:r>
+              <w:t>Финансовый</w:t>
+            </w:r>
+          </w:p>
+        </w:tc>
+      </w:tr>
+      <w:tr>
+        <w:tc>
+          <w:tcPr>
+            <w:tcW w:w="2336" w:type="dxa"/>
+          </w:tcPr>
+          <w:p>
+            <w:pPr>
+              <w:ind w:firstLine="0"/>
+            </w:pPr>
+            <w:r>
+              <w:t>Инвестирование</w:t>
+            </w:r>
+          </w:p>
+        </w:tc>
+        <w:tc>
+          <w:tcPr>
+            <w:tcW w:w="2336" w:type="dxa"/>
+          </w:tcPr>
+          <w:p>
+            <w:pPr>
+              <w:ind w:firstLine="0"/>
+            </w:pPr>
+            <w:r>
+              <w:t>Да</w:t>
+            </w:r>
+          </w:p>
+        </w:tc>
+        <w:tc>
+          <w:tcPr>
+            <w:tcW w:w="2336" w:type="dxa"/>
+          </w:tcPr>
+          <w:p>
+            <w:pPr>
+              <w:ind w:firstLine="0"/>
+            </w:pPr>
+            <w:r>
+              <w:t>Да</w:t>
+            </w:r>
+          </w:p>
+        </w:tc>
+        <w:tc>
+          <w:tcPr>
+            <w:tcW w:w="2336" w:type="dxa"/>
+          </w:tcPr>
+          <w:p>
+            <w:pPr>
+              <w:ind w:firstLine="0"/>
+            </w:pPr>
+            <w:r>
+              <w:t>Да</w:t>
+            </w:r>
+          </w:p>
+        </w:tc>
+      </w:tr>
+    </w:tbl>
+    <w:p>
+      <w:pPr>
+        <w:ind w:firstLine="0"/>
+      </w:pPr>
+    </w:p>
+    <w:p>
+      <w:pPr>
+        <w:ind w:firstLine="0"/>
+      </w:pPr>
+      <w:r>
+        <w:lastRenderedPageBreak/>
+        <w:t>Продолжение таблицы 1.4</w:t>
+      </w:r>
+    </w:p>
+    <w:tbl>
+      <w:tblPr>
+        <w:tblStyle w:val="afc"/>
+        <w:tblW w:w="0" w:type="auto"/>
+        <w:tblLook w:val="04A0" w:firstRow="1" w:lastRow="0" w:firstColumn="1" w:lastColumn="0" w:noHBand="0" w:noVBand="1"/>
+      </w:tblPr>
+      <w:tblGrid>
+        <w:gridCol w:w="2336"/>
+        <w:gridCol w:w="2336"/>
+        <w:gridCol w:w="2336"/>
+        <w:gridCol w:w="2336"/>
+      </w:tblGrid>
+      <w:tr>
+        <w:tc>
+          <w:tcPr>
+            <w:tcW w:w="2336" w:type="dxa"/>
+          </w:tcPr>
+          <w:p>
+            <w:pPr>
+              <w:ind w:firstLine="0"/>
+            </w:pPr>
+            <w:r>
+              <w:t>Платформа</w:t>
+            </w:r>
+          </w:p>
+        </w:tc>
+        <w:tc>
+          <w:tcPr>
+            <w:tcW w:w="2336" w:type="dxa"/>
+          </w:tcPr>
+          <w:p>
+            <w:pPr>
+              <w:ind w:firstLine="0"/>
+            </w:pPr>
+            <w:proofErr w:type="spellStart"/>
+            <w:r>
+              <w:t>LendingClub</w:t>
+            </w:r>
+            <w:proofErr w:type="spellEnd"/>
+          </w:p>
+        </w:tc>
+        <w:tc>
+          <w:tcPr>
+            <w:tcW w:w="2336" w:type="dxa"/>
+          </w:tcPr>
+          <w:p>
+            <w:pPr>
+              <w:ind w:firstLine="0"/>
+            </w:pPr>
+            <w:proofErr w:type="spellStart"/>
+            <w:r>
+              <w:t>Prosper</w:t>
+            </w:r>
+            <w:proofErr w:type="spellEnd"/>
+          </w:p>
+        </w:tc>
+        <w:tc>
+          <w:tcPr>
+            <w:tcW w:w="2336" w:type="dxa"/>
+          </w:tcPr>
+          <w:p>
+            <w:pPr>
+              <w:ind w:firstLine="0"/>
+            </w:pPr>
+            <w:proofErr w:type="spellStart"/>
+            <w:r>
+              <w:t>Funding</w:t>
+            </w:r>
+            <w:proofErr w:type="spellEnd"/>
+            <w:r>
+              <w:t xml:space="preserve"> </w:t>
+            </w:r>
+            <w:proofErr w:type="spellStart"/>
+            <w:r>
+              <w:t>Circle</w:t>
+            </w:r>
+            <w:proofErr w:type="spellEnd"/>
+          </w:p>
+        </w:tc>
+      </w:tr>
+      <w:tr>
+        <w:tc>
+          <w:tcPr>
+            <w:tcW w:w="2336" w:type="dxa"/>
+          </w:tcPr>
+          <w:p>
+            <w:pPr>
+              <w:ind w:firstLine="0"/>
+            </w:pPr>
+            <w:r>
+              <w:t>Рейтинг пользователей</w:t>
+            </w:r>
+          </w:p>
+        </w:tc>
+        <w:tc>
+          <w:tcPr>
+            <w:tcW w:w="2336" w:type="dxa"/>
+          </w:tcPr>
+          <w:p>
+            <w:pPr>
+              <w:ind w:firstLine="0"/>
+            </w:pPr>
+            <w:r>
+              <w:t>Да</w:t>
+            </w:r>
+          </w:p>
+        </w:tc>
+        <w:tc>
+          <w:tcPr>
+            <w:tcW w:w="2336" w:type="dxa"/>
+          </w:tcPr>
+          <w:p>
+            <w:pPr>
+              <w:ind w:firstLine="0"/>
+            </w:pPr>
+            <w:r>
+              <w:t>Да</w:t>
+            </w:r>
+          </w:p>
+        </w:tc>
+        <w:tc>
+          <w:tcPr>
+            <w:tcW w:w="2336" w:type="dxa"/>
+          </w:tcPr>
+          <w:p>
+            <w:pPr>
+              <w:ind w:firstLine="0"/>
+            </w:pPr>
+            <w:r>
+              <w:t>Да</w:t>
+            </w:r>
+          </w:p>
+        </w:tc>
+      </w:tr>
+      <w:tr>
+        <w:tc>
+          <w:tcPr>
+            <w:tcW w:w="2336" w:type="dxa"/>
+          </w:tcPr>
+          <w:p>
+            <w:pPr>
+              <w:ind w:firstLine="0"/>
+            </w:pPr>
+            <w:r>
+              <w:t>Дополнительные данные</w:t>
+            </w:r>
+          </w:p>
+        </w:tc>
+        <w:tc>
+          <w:tcPr>
+            <w:tcW w:w="2336" w:type="dxa"/>
+          </w:tcPr>
+          <w:p>
+            <w:pPr>
+              <w:ind w:firstLine="0"/>
+            </w:pPr>
+            <w:r>
+              <w:t>Финансовые данные</w:t>
+            </w:r>
+          </w:p>
+        </w:tc>
+        <w:tc>
+          <w:tcPr>
+            <w:tcW w:w="2336" w:type="dxa"/>
+          </w:tcPr>
+          <w:p>
+            <w:pPr>
+              <w:ind w:firstLine="0"/>
+            </w:pPr>
+            <w:r>
+              <w:t>Финансовые данные</w:t>
+            </w:r>
+          </w:p>
+        </w:tc>
+        <w:tc>
+          <w:tcPr>
+            <w:tcW w:w="2336" w:type="dxa"/>
+          </w:tcPr>
+          <w:p>
+            <w:pPr>
+              <w:ind w:firstLine="0"/>
+            </w:pPr>
+            <w:r>
+              <w:t>Отчетность бизнеса</w:t>
+            </w:r>
+          </w:p>
+        </w:tc>
+      </w:tr>
+      <w:tr>
+        <w:tc>
+          <w:tcPr>
+            <w:tcW w:w="2336" w:type="dxa"/>
+          </w:tcPr>
+          <w:p>
+            <w:pPr>
+              <w:ind w:firstLine="0"/>
+            </w:pPr>
+            <w:r>
+              <w:t>Ориентация на студентов</w:t>
+            </w:r>
+          </w:p>
+        </w:tc>
+        <w:tc>
+          <w:tcPr>
+            <w:tcW w:w="2336" w:type="dxa"/>
+          </w:tcPr>
+          <w:p>
+            <w:pPr>
+              <w:ind w:firstLine="0"/>
+            </w:pPr>
+            <w:r>
+              <w:t>Нет</w:t>
+            </w:r>
+          </w:p>
+        </w:tc>
+        <w:tc>
+          <w:tcPr>
+            <w:tcW w:w="2336" w:type="dxa"/>
+          </w:tcPr>
+          <w:p>
+            <w:pPr>
+              <w:ind w:firstLine="0"/>
+            </w:pPr>
+            <w:r>
+              <w:t>Нет</w:t>
+            </w:r>
+          </w:p>
+        </w:tc>
+        <w:tc>
+          <w:tcPr>
+            <w:tcW w:w="2336" w:type="dxa"/>
+          </w:tcPr>
+          <w:p>
+            <w:pPr>
+              <w:ind w:firstLine="0"/>
+            </w:pPr>
+            <w:r>
+              <w:t>Нет</w:t>
+            </w:r>
+          </w:p>
+        </w:tc>
+      </w:tr>
+    </w:tbl>
+    <w:p>
+      <w:pPr>
+        <w:ind w:firstLine="0"/>
+      </w:pPr>
+    </w:p>
+    <w:p>
+      <w:pPr>
+        <w:ind w:firstLine="0"/>
+      </w:pPr>
+      <w:r>
+        <w:tab/>
+      </w:r>
+      <w:r>
+        <w:t>Анализ таблицы показывает, что существующие платформы в основном используют традиционные методы оценки заемщиков, основанные на финансовых показателях. Это ограничивает их применимость для пользователей без кредитной истории, таких как студенты. Таким образом, можно сделать вывод о наличии незанятой ниши, связанной с разработкой специализированных решений для данной категории пользователей.</w:t>
+      </w:r>
+    </w:p>
+    <w:p>
+      <w:r>
+        <w:t>Отдельного внимания заслуживают платформы, реализующие элементы социальной оценки и альтернативного скоринга. В некоторых системах используются данные о поведении пользователей, их активности в социальных сетях или истории взаимодействия с платформой. Такие подходы позволяют повысить точность оценки рисков, однако они не получили широкого распространения из-за сложности реализации и вопросов, связанных с конфиденциальностью данных.</w:t>
+      </w:r>
+    </w:p>
+    <w:p>
+      <w:r>
+        <w:t>В контексте разрабатываемого программного средства особый интерес представляет возможность интеграции с образовательными системами для получения данных об успеваемости студентов. На сегодняшний день подобные решения практически отсутствуют на рынке, что делает данный подход инновационным и перспективным. Использование академических показателей в качестве одного из факторов скоринга позволяет сформировать более объективную оценку заемщика и снизить риски невозврата средств.</w:t>
+      </w:r>
+    </w:p>
+    <w:p>
+      <w:r>
+        <w:t>Кроме того, анализ существующих платформ показывает, что большинство из них реализует базовые механизмы обеспечения возврата займов, такие как рейтинговые системы и диверсификация инвестиций. Однако более сложные механизмы, включая гарантийные фонды или коллективное страхование займов, используются ограниченно. Это открывает дополнительные возможности для совершенствования разрабатываемой системы.</w:t>
+      </w:r>
+    </w:p>
+    <w:p>
+      <w:r>
+        <w:t xml:space="preserve">С точки зрения пользовательского интерфейса современные P2P-платформы стремятся обеспечить максимальную простоту и удобство взаимодействия. Они используют веб-интерфейсы с адаптивным дизайном, обеспечивают доступ к системе с различных устройств и предоставляют пользователям инструменты для анализа данных. Однако в ряде случаев </w:t>
+      </w:r>
+      <w:r>
+        <w:lastRenderedPageBreak/>
+        <w:t>интерфейсы перегружены информацией, что может затруднять использование системы неопытными пользователями.</w:t>
+      </w:r>
+    </w:p>
+    <w:p>
+      <w:r>
+        <w:t xml:space="preserve">Также следует отметить, что большинство существующих решений реализовано в виде распределенных веб-приложений, использующих клиент-серверную архитектуру и </w:t>
+      </w:r>
+      <w:proofErr w:type="spellStart"/>
+      <w:r>
+        <w:t>RESTful</w:t>
+      </w:r>
+      <w:proofErr w:type="spellEnd"/>
+      <w:r>
+        <w:t xml:space="preserve"> API. Это обеспечивает масштабируемость и возможность интеграции с внешними сервисами. Однако не все платформы реализуют современные архитектурные подходы, такие как </w:t>
+      </w:r>
+      <w:proofErr w:type="spellStart"/>
+      <w:r>
+        <w:t>микросервисная</w:t>
+      </w:r>
+      <w:proofErr w:type="spellEnd"/>
+      <w:r>
+        <w:t xml:space="preserve"> архитектура, что может ограничивать их гибкость и возможности развития.</w:t>
+      </w:r>
+    </w:p>
+    <w:p>
+      <w:r>
+        <w:t>Для обобщения результатов анализа можно выделить основные недостатки существующих решений:</w:t>
+      </w:r>
+    </w:p>
+    <w:p>
+      <w:pPr>
+        <w:pStyle w:val="a9"/>
+        <w:numPr>
+          <w:ilvl w:val="0"/>
+          <w:numId w:val="6"/>
+        </w:numPr>
+      </w:pPr>
+      <w:r>
+        <w:t xml:space="preserve"> </w:t>
+      </w:r>
+      <w:r>
+        <w:t>отсутствие ориентации на студентов как отдельную категорию пользователей;</w:t>
+      </w:r>
+    </w:p>
+    <w:p>
+      <w:pPr>
+        <w:pStyle w:val="a9"/>
+        <w:numPr>
+          <w:ilvl w:val="0"/>
+          <w:numId w:val="6"/>
+        </w:numPr>
+      </w:pPr>
+      <w:r>
+        <w:t xml:space="preserve"> </w:t>
+      </w:r>
+      <w:r>
+        <w:t>использование ограниченного набора факторов при оценке заемщиков;</w:t>
+      </w:r>
+    </w:p>
+    <w:p>
+      <w:pPr>
+        <w:pStyle w:val="a9"/>
+        <w:numPr>
+          <w:ilvl w:val="0"/>
+          <w:numId w:val="6"/>
+        </w:numPr>
+      </w:pPr>
+      <w:r>
+        <w:t xml:space="preserve"> </w:t>
+      </w:r>
+      <w:r>
+        <w:t>недостаточная проработка механизмов гарантии возврата средств;</w:t>
+      </w:r>
+    </w:p>
+    <w:p>
+      <w:pPr>
+        <w:pStyle w:val="a9"/>
+        <w:numPr>
+          <w:ilvl w:val="0"/>
+          <w:numId w:val="6"/>
+        </w:numPr>
+      </w:pPr>
+      <w:r>
+        <w:t xml:space="preserve"> </w:t>
+      </w:r>
+      <w:r>
+        <w:t>ограниченное использование альтернативных источников данных;</w:t>
+      </w:r>
+    </w:p>
+    <w:p>
+      <w:pPr>
+        <w:pStyle w:val="a9"/>
+        <w:numPr>
+          <w:ilvl w:val="0"/>
+          <w:numId w:val="6"/>
+        </w:numPr>
+      </w:pPr>
+      <w:r>
+        <w:t xml:space="preserve"> </w:t>
+      </w:r>
+      <w:r>
+        <w:softHyphen/>
+      </w:r>
+      <w:r>
+        <w:t>отсутствие интеграции с образовательными системами.</w:t>
+      </w:r>
+    </w:p>
+    <w:p>
+      <w:pPr>
+        <w:ind w:firstLine="709"/>
+      </w:pPr>
+      <w:r>
+        <w:t>П</w:t>
+      </w:r>
+      <w:r>
+        <w:t>роведенный анализ аналогов показывает, что, несмотря на высокий уровень развития P2P-кредитования, существующие решения не в полной мере учитывают особенности студенческой аудитории. Это подтверждает актуальность разработки специализированной платформы, которая будет учитывать академические показатели пользователей, обеспечивать более гибкие механизмы оценки рисков и предоставлять дополнительные гарантии возврата займов. Реализация такого подхода позволит повысить доступность финансовых ресурсов для студентов и создать более эффективную и безопасную систему кредитования.</w:t>
+      </w:r>
+    </w:p>
+    <w:p>
+      <w:pPr>
+        <w:ind w:firstLine="0"/>
+      </w:pPr>
+      <w:r>
+        <w:tab/>
+      </w:r>
+      <w:r>
+        <w:t>Таким образом, можно сделать вывод, что современные P2P-платформы в основном ориентированы на массового пользователя с уже сформированной финансовой историей и стабильным доходом, что ограничивает их применимость для студенческой аудитории. При этом наблюдается явный потенциал для развития специализированных решений, учитывающих особенности данной категории пользователей. Разработка платформы, ориентированной на студентов, с использованием альтернативных методов оценки надежности, таких как анализ академической успеваемости, а также внедрение расширенных механизмов гарантий возврата средств, позволит не только повысить доступность финансовых услуг, но и сформировать более устойчивую и сбалансированную экосистему P2P-кредитования. Это делает выбранное направление разработки актуальным и перспективным с точки зрения как научных исследований, так и практического применения.</w:t>
+      </w:r>
+    </w:p>
+    <w:p>
+      <w:pPr>
+        <w:ind w:firstLine="0"/>
+      </w:pPr>
+    </w:p>
     <w:p>
       <w:r>
         <w:br w:type="page"/>
@@ -3276,7 +4191,7 @@
           <w:lang w:val="en-US"/>
         </w:rPr>
       </w:pPr>
-      <w:bookmarkStart w:id="4" w:name="_Toc224919812"/>
+      <w:bookmarkStart w:id="5" w:name="_Toc224921135"/>
       <w:r>
         <w:lastRenderedPageBreak/>
         <w:t>Список</w:t>
@@ -3299,7 +4214,7 @@
       <w:r>
         <w:t>источников</w:t>
       </w:r>
-      <w:bookmarkEnd w:id="4"/>
+      <w:bookmarkEnd w:id="5"/>
     </w:p>
     <w:p>
       <w:pPr>
@@ -3498,6 +4413,257 @@
           <w:lang w:val="en-US"/>
         </w:rPr>
         <w:t>] European Banking Authority. Opinion on lending-based crowdfunding. – 2015.</w:t>
+      </w:r>
+    </w:p>
+    <w:p>
+      <w:pPr>
+        <w:rPr>
+          <w:lang w:val="en-US"/>
+        </w:rPr>
+      </w:pPr>
+      <w:r>
+        <w:rPr>
+          <w:lang w:val="en-US"/>
+        </w:rPr>
+        <w:t>[</w:t>
+      </w:r>
+      <w:r>
+        <w:rPr>
+          <w:lang w:val="en-US"/>
+        </w:rPr>
+        <w:t>8</w:t>
+      </w:r>
+      <w:r>
+        <w:rPr>
+          <w:lang w:val="en-US"/>
+        </w:rPr>
+        <w:t xml:space="preserve">] </w:t>
+      </w:r>
+      <w:proofErr w:type="spellStart"/>
+      <w:r>
+        <w:rPr>
+          <w:lang w:val="en-US"/>
+        </w:rPr>
+        <w:t>LendingClub</w:t>
+      </w:r>
+      <w:proofErr w:type="spellEnd"/>
+      <w:r>
+        <w:rPr>
+          <w:lang w:val="en-US"/>
+        </w:rPr>
+        <w:t xml:space="preserve"> Corporation. Official website. – </w:t>
+      </w:r>
+      <w:proofErr w:type="spellStart"/>
+      <w:r>
+        <w:rPr>
+          <w:lang w:val="en-US"/>
+        </w:rPr>
+        <w:t>Режим</w:t>
+      </w:r>
+      <w:proofErr w:type="spellEnd"/>
+      <w:r>
+        <w:rPr>
+          <w:lang w:val="en-US"/>
+        </w:rPr>
+        <w:t xml:space="preserve"> </w:t>
+      </w:r>
+      <w:proofErr w:type="spellStart"/>
+      <w:r>
+        <w:rPr>
+          <w:lang w:val="en-US"/>
+        </w:rPr>
+        <w:t>доступа</w:t>
+      </w:r>
+      <w:proofErr w:type="spellEnd"/>
+      <w:r>
+        <w:rPr>
+          <w:lang w:val="en-US"/>
+        </w:rPr>
+        <w:t xml:space="preserve">: https://www.lendingclub.com – </w:t>
+      </w:r>
+      <w:proofErr w:type="spellStart"/>
+      <w:r>
+        <w:rPr>
+          <w:lang w:val="en-US"/>
+        </w:rPr>
+        <w:t>Дата</w:t>
+      </w:r>
+      <w:proofErr w:type="spellEnd"/>
+      <w:r>
+        <w:rPr>
+          <w:lang w:val="en-US"/>
+        </w:rPr>
+        <w:t xml:space="preserve"> </w:t>
+      </w:r>
+      <w:proofErr w:type="spellStart"/>
+      <w:r>
+        <w:rPr>
+          <w:lang w:val="en-US"/>
+        </w:rPr>
+        <w:t>обращения</w:t>
+      </w:r>
+      <w:proofErr w:type="spellEnd"/>
+      <w:r>
+        <w:rPr>
+          <w:lang w:val="en-US"/>
+        </w:rPr>
+        <w:t>: 20.03.2026.</w:t>
+      </w:r>
+    </w:p>
+    <w:p>
+      <w:pPr>
+        <w:rPr>
+          <w:lang w:val="en-US"/>
+        </w:rPr>
+      </w:pPr>
+      <w:r>
+        <w:rPr>
+          <w:lang w:val="en-US"/>
+        </w:rPr>
+        <w:t>[</w:t>
+      </w:r>
+      <w:r>
+        <w:rPr>
+          <w:lang w:val="en-US"/>
+        </w:rPr>
+        <w:t>9</w:t>
+      </w:r>
+      <w:r>
+        <w:rPr>
+          <w:lang w:val="en-US"/>
+        </w:rPr>
+        <w:t xml:space="preserve">] Prosper Marketplace. Official website. – </w:t>
+      </w:r>
+      <w:proofErr w:type="spellStart"/>
+      <w:r>
+        <w:rPr>
+          <w:lang w:val="en-US"/>
+        </w:rPr>
+        <w:t>Режим</w:t>
+      </w:r>
+      <w:proofErr w:type="spellEnd"/>
+      <w:r>
+        <w:rPr>
+          <w:lang w:val="en-US"/>
+        </w:rPr>
+        <w:t xml:space="preserve"> </w:t>
+      </w:r>
+      <w:proofErr w:type="spellStart"/>
+      <w:r>
+        <w:rPr>
+          <w:lang w:val="en-US"/>
+        </w:rPr>
+        <w:t>доступа</w:t>
+      </w:r>
+      <w:proofErr w:type="spellEnd"/>
+      <w:r>
+        <w:rPr>
+          <w:lang w:val="en-US"/>
+        </w:rPr>
+        <w:t xml:space="preserve">: https://www.prosper.com – </w:t>
+      </w:r>
+      <w:r>
+        <w:t>Дата</w:t>
+      </w:r>
+      <w:r>
+        <w:rPr>
+          <w:lang w:val="en-US"/>
+        </w:rPr>
+        <w:t xml:space="preserve"> </w:t>
+      </w:r>
+      <w:r>
+        <w:t>обращения</w:t>
+      </w:r>
+      <w:r>
+        <w:rPr>
+          <w:lang w:val="en-US"/>
+        </w:rPr>
+        <w:t>: 20.03.2026.</w:t>
+      </w:r>
+    </w:p>
+    <w:p>
+      <w:r>
+        <w:t>[</w:t>
+      </w:r>
+      <w:r>
+        <w:t>10</w:t>
+      </w:r>
+      <w:r>
+        <w:t xml:space="preserve">] </w:t>
+      </w:r>
+      <w:r>
+        <w:rPr>
+          <w:lang w:val="en-US"/>
+        </w:rPr>
+        <w:t>Funding</w:t>
+      </w:r>
+      <w:r>
+        <w:t xml:space="preserve"> </w:t>
+      </w:r>
+      <w:r>
+        <w:rPr>
+          <w:lang w:val="en-US"/>
+        </w:rPr>
+        <w:t>Circle</w:t>
+      </w:r>
+      <w:r>
+        <w:t xml:space="preserve">. </w:t>
+      </w:r>
+      <w:r>
+        <w:rPr>
+          <w:lang w:val="en-US"/>
+        </w:rPr>
+        <w:t>Official</w:t>
+      </w:r>
+      <w:r>
+        <w:t xml:space="preserve"> </w:t>
+      </w:r>
+      <w:r>
+        <w:rPr>
+          <w:lang w:val="en-US"/>
+        </w:rPr>
+        <w:t>website</w:t>
+      </w:r>
+      <w:r>
+        <w:t xml:space="preserve">. – Режим доступа: </w:t>
+      </w:r>
+      <w:r>
+        <w:rPr>
+          <w:lang w:val="en-US"/>
+        </w:rPr>
+        <w:t>https</w:t>
+      </w:r>
+      <w:r>
+        <w:t>://</w:t>
+      </w:r>
+      <w:r>
+        <w:rPr>
+          <w:lang w:val="en-US"/>
+        </w:rPr>
+        <w:t>www</w:t>
+      </w:r>
+      <w:r>
+        <w:t>.</w:t>
+      </w:r>
+      <w:proofErr w:type="spellStart"/>
+      <w:r>
+        <w:rPr>
+          <w:lang w:val="en-US"/>
+        </w:rPr>
+        <w:t>fundingcircle</w:t>
+      </w:r>
+      <w:proofErr w:type="spellEnd"/>
+      <w:r>
+        <w:t>.</w:t>
+      </w:r>
+      <w:r>
+        <w:rPr>
+          <w:lang w:val="en-US"/>
+        </w:rPr>
+        <w:t>com</w:t>
+      </w:r>
+      <w:r>
+        <w:t xml:space="preserve"> – Дата обращения: 20.03.2026.</w:t>
       </w:r>
     </w:p>
     <w:sectPr>
@@ -3869,6 +5035,233 @@
     </w:lvl>
   </w:abstractNum>
   <w:abstractNum w:abstractNumId="2" w15:restartNumberingAfterBreak="0">
+    <w:nsid w:val="1E376B7C"/>
+    <w:multiLevelType w:val="hybridMultilevel"/>
+    <w:tmpl w:val="7C4622DC"/>
+    <w:lvl w:ilvl="0" w:tplc="3FB6A8C6">
+      <w:start w:val="1"/>
+      <w:numFmt w:val="bullet"/>
+      <w:lvlText w:val="̶"/>
+      <w:lvlJc w:val="left"/>
+      <w:pPr>
+        <w:ind w:left="720" w:hanging="360"/>
+      </w:pPr>
+      <w:rPr>
+        <w:rFonts w:ascii="Times New Roman" w:hAnsi="Times New Roman" w:cs="Times New Roman" w:hint="default"/>
+      </w:rPr>
+    </w:lvl>
+    <w:lvl w:ilvl="1" w:tplc="20000003" w:tentative="1">
+      <w:start w:val="1"/>
+      <w:numFmt w:val="bullet"/>
+      <w:lvlText w:val="o"/>
+      <w:lvlJc w:val="left"/>
+      <w:pPr>
+        <w:ind w:left="1440" w:hanging="360"/>
+      </w:pPr>
+      <w:rPr>
+        <w:rFonts w:ascii="Courier New" w:hAnsi="Courier New" w:cs="Courier New" w:hint="default"/>
+      </w:rPr>
+    </w:lvl>
+    <w:lvl w:ilvl="2" w:tplc="20000005" w:tentative="1">
+      <w:start w:val="1"/>
+      <w:numFmt w:val="bullet"/>
+      <w:lvlText w:val=""/>
+      <w:lvlJc w:val="left"/>
+      <w:pPr>
+        <w:ind w:left="2160" w:hanging="360"/>
+      </w:pPr>
+      <w:rPr>
+        <w:rFonts w:ascii="Wingdings" w:hAnsi="Wingdings" w:hint="default"/>
+      </w:rPr>
+    </w:lvl>
+    <w:lvl w:ilvl="3" w:tplc="20000001" w:tentative="1">
+      <w:start w:val="1"/>
+      <w:numFmt w:val="bullet"/>
+      <w:lvlText w:val=""/>
+      <w:lvlJc w:val="left"/>
+      <w:pPr>
+        <w:ind w:left="2880" w:hanging="360"/>
+      </w:pPr>
+      <w:rPr>
+        <w:rFonts w:ascii="Symbol" w:hAnsi="Symbol" w:hint="default"/>
+      </w:rPr>
+    </w:lvl>
+    <w:lvl w:ilvl="4" w:tplc="20000003" w:tentative="1">
+      <w:start w:val="1"/>
+      <w:numFmt w:val="bullet"/>
+      <w:lvlText w:val="o"/>
+      <w:lvlJc w:val="left"/>
+      <w:pPr>
+        <w:ind w:left="3600" w:hanging="360"/>
+      </w:pPr>
+      <w:rPr>
+        <w:rFonts w:ascii="Courier New" w:hAnsi="Courier New" w:cs="Courier New" w:hint="default"/>
+      </w:rPr>
+    </w:lvl>
+    <w:lvl w:ilvl="5" w:tplc="20000005" w:tentative="1">
+      <w:start w:val="1"/>
+      <w:numFmt w:val="bullet"/>
+      <w:lvlText w:val=""/>
+      <w:lvlJc w:val="left"/>
+      <w:pPr>
+        <w:ind w:left="4320" w:hanging="360"/>
+      </w:pPr>
+      <w:rPr>
+        <w:rFonts w:ascii="Wingdings" w:hAnsi="Wingdings" w:hint="default"/>
+      </w:rPr>
+    </w:lvl>
+    <w:lvl w:ilvl="6" w:tplc="20000001" w:tentative="1">
+      <w:start w:val="1"/>
+      <w:numFmt w:val="bullet"/>
+      <w:lvlText w:val=""/>
+      <w:lvlJc w:val="left"/>
+      <w:pPr>
+        <w:ind w:left="5040" w:hanging="360"/>
+      </w:pPr>
+      <w:rPr>
+        <w:rFonts w:ascii="Symbol" w:hAnsi="Symbol" w:hint="default"/>
+      </w:rPr>
+    </w:lvl>
+    <w:lvl w:ilvl="7" w:tplc="20000003" w:tentative="1">
+      <w:start w:val="1"/>
+      <w:numFmt w:val="bullet"/>
+      <w:lvlText w:val="o"/>
+      <w:lvlJc w:val="left"/>
+      <w:pPr>
+        <w:ind w:left="5760" w:hanging="360"/>
+      </w:pPr>
+      <w:rPr>
+        <w:rFonts w:ascii="Courier New" w:hAnsi="Courier New" w:cs="Courier New" w:hint="default"/>
+      </w:rPr>
+    </w:lvl>
+    <w:lvl w:ilvl="8" w:tplc="20000005" w:tentative="1">
+      <w:start w:val="1"/>
+      <w:numFmt w:val="bullet"/>
+      <w:lvlText w:val=""/>
+      <w:lvlJc w:val="left"/>
+      <w:pPr>
+        <w:ind w:left="6480" w:hanging="360"/>
+      </w:pPr>
+      <w:rPr>
+        <w:rFonts w:ascii="Wingdings" w:hAnsi="Wingdings" w:hint="default"/>
+      </w:rPr>
+    </w:lvl>
+  </w:abstractNum>
+  <w:abstractNum w:abstractNumId="3" w15:restartNumberingAfterBreak="0">
+    <w:nsid w:val="5ED7282E"/>
+    <w:multiLevelType w:val="hybridMultilevel"/>
+    <w:tmpl w:val="3CF0542A"/>
+    <w:lvl w:ilvl="0" w:tplc="7BF84404">
+      <w:start w:val="1"/>
+      <w:numFmt w:val="bullet"/>
+      <w:suff w:val="space"/>
+      <w:lvlText w:val="̶"/>
+      <w:lvlJc w:val="left"/>
+      <w:pPr>
+        <w:ind w:left="0" w:firstLine="720"/>
+      </w:pPr>
+      <w:rPr>
+        <w:rFonts w:ascii="Times New Roman" w:hAnsi="Times New Roman" w:cs="Times New Roman" w:hint="default"/>
+      </w:rPr>
+    </w:lvl>
+    <w:lvl w:ilvl="1" w:tplc="20000003" w:tentative="1">
+      <w:start w:val="1"/>
+      <w:numFmt w:val="bullet"/>
+      <w:lvlText w:val="o"/>
+      <w:lvlJc w:val="left"/>
+      <w:pPr>
+        <w:ind w:left="1800" w:hanging="360"/>
+      </w:pPr>
+      <w:rPr>
+        <w:rFonts w:ascii="Courier New" w:hAnsi="Courier New" w:cs="Courier New" w:hint="default"/>
+      </w:rPr>
+    </w:lvl>
+    <w:lvl w:ilvl="2" w:tplc="20000005" w:tentative="1">
+      <w:start w:val="1"/>
+      <w:numFmt w:val="bullet"/>
+      <w:lvlText w:val=""/>
+      <w:lvlJc w:val="left"/>
+      <w:pPr>
+        <w:ind w:left="2520" w:hanging="360"/>
+      </w:pPr>
+      <w:rPr>
+        <w:rFonts w:ascii="Wingdings" w:hAnsi="Wingdings" w:hint="default"/>
+      </w:rPr>
+    </w:lvl>
+    <w:lvl w:ilvl="3" w:tplc="20000001" w:tentative="1">
+      <w:start w:val="1"/>
+      <w:numFmt w:val="bullet"/>
+      <w:lvlText w:val=""/>
+      <w:lvlJc w:val="left"/>
+      <w:pPr>
+        <w:ind w:left="3240" w:hanging="360"/>
+      </w:pPr>
+      <w:rPr>
+        <w:rFonts w:ascii="Symbol" w:hAnsi="Symbol" w:hint="default"/>
+      </w:rPr>
+    </w:lvl>
+    <w:lvl w:ilvl="4" w:tplc="20000003" w:tentative="1">
+      <w:start w:val="1"/>
+      <w:numFmt w:val="bullet"/>
+      <w:lvlText w:val="o"/>
+      <w:lvlJc w:val="left"/>
+      <w:pPr>
+        <w:ind w:left="3960" w:hanging="360"/>
+      </w:pPr>
+      <w:rPr>
+        <w:rFonts w:ascii="Courier New" w:hAnsi="Courier New" w:cs="Courier New" w:hint="default"/>
+      </w:rPr>
+    </w:lvl>
+    <w:lvl w:ilvl="5" w:tplc="20000005" w:tentative="1">
+      <w:start w:val="1"/>
+      <w:numFmt w:val="bullet"/>
+      <w:lvlText w:val=""/>
+      <w:lvlJc w:val="left"/>
+      <w:pPr>
+        <w:ind w:left="4680" w:hanging="360"/>
+      </w:pPr>
+      <w:rPr>
+        <w:rFonts w:ascii="Wingdings" w:hAnsi="Wingdings" w:hint="default"/>
+      </w:rPr>
+    </w:lvl>
+    <w:lvl w:ilvl="6" w:tplc="20000001" w:tentative="1">
+      <w:start w:val="1"/>
+      <w:numFmt w:val="bullet"/>
+      <w:lvlText w:val=""/>
+      <w:lvlJc w:val="left"/>
+      <w:pPr>
+        <w:ind w:left="5400" w:hanging="360"/>
+      </w:pPr>
+      <w:rPr>
+        <w:rFonts w:ascii="Symbol" w:hAnsi="Symbol" w:hint="default"/>
+      </w:rPr>
+    </w:lvl>
+    <w:lvl w:ilvl="7" w:tplc="20000003" w:tentative="1">
+      <w:start w:val="1"/>
+      <w:numFmt w:val="bullet"/>
+      <w:lvlText w:val="o"/>
+      <w:lvlJc w:val="left"/>
+      <w:pPr>
+        <w:ind w:left="6120" w:hanging="360"/>
+      </w:pPr>
+      <w:rPr>
+        <w:rFonts w:ascii="Courier New" w:hAnsi="Courier New" w:cs="Courier New" w:hint="default"/>
+      </w:rPr>
+    </w:lvl>
+    <w:lvl w:ilvl="8" w:tplc="20000005" w:tentative="1">
+      <w:start w:val="1"/>
+      <w:numFmt w:val="bullet"/>
+      <w:lvlText w:val=""/>
+      <w:lvlJc w:val="left"/>
+      <w:pPr>
+        <w:ind w:left="6840" w:hanging="360"/>
+      </w:pPr>
+      <w:rPr>
+        <w:rFonts w:ascii="Wingdings" w:hAnsi="Wingdings" w:hint="default"/>
+      </w:rPr>
+    </w:lvl>
+  </w:abstractNum>
+  <w:abstractNum w:abstractNumId="4" w15:restartNumberingAfterBreak="0">
     <w:nsid w:val="6911797D"/>
     <w:multiLevelType w:val="hybridMultilevel"/>
     <w:tmpl w:val="4984A070"/>
@@ -3970,6 +5363,120 @@
       </w:rPr>
     </w:lvl>
     <w:lvl w:ilvl="8" w:tplc="04190005" w:tentative="1">
+      <w:start w:val="1"/>
+      <w:numFmt w:val="bullet"/>
+      <w:lvlText w:val=""/>
+      <w:lvlJc w:val="left"/>
+      <w:pPr>
+        <w:ind w:left="6840" w:hanging="360"/>
+      </w:pPr>
+      <w:rPr>
+        <w:rFonts w:ascii="Wingdings" w:hAnsi="Wingdings" w:hint="default"/>
+      </w:rPr>
+    </w:lvl>
+  </w:abstractNum>
+  <w:abstractNum w:abstractNumId="5" w15:restartNumberingAfterBreak="0">
+    <w:nsid w:val="7E085CD2"/>
+    <w:multiLevelType w:val="hybridMultilevel"/>
+    <w:tmpl w:val="7C2C176A"/>
+    <w:lvl w:ilvl="0" w:tplc="71E033AE">
+      <w:start w:val="1"/>
+      <w:numFmt w:val="bullet"/>
+      <w:suff w:val="space"/>
+      <w:lvlText w:val="̶"/>
+      <w:lvlJc w:val="left"/>
+      <w:pPr>
+        <w:ind w:left="360" w:firstLine="360"/>
+      </w:pPr>
+      <w:rPr>
+        <w:rFonts w:ascii="Times New Roman" w:hAnsi="Times New Roman" w:cs="Times New Roman" w:hint="default"/>
+      </w:rPr>
+    </w:lvl>
+    <w:lvl w:ilvl="1" w:tplc="20000003" w:tentative="1">
+      <w:start w:val="1"/>
+      <w:numFmt w:val="bullet"/>
+      <w:lvlText w:val="o"/>
+      <w:lvlJc w:val="left"/>
+      <w:pPr>
+        <w:ind w:left="1800" w:hanging="360"/>
+      </w:pPr>
+      <w:rPr>
+        <w:rFonts w:ascii="Courier New" w:hAnsi="Courier New" w:cs="Courier New" w:hint="default"/>
+      </w:rPr>
+    </w:lvl>
+    <w:lvl w:ilvl="2" w:tplc="20000005" w:tentative="1">
+      <w:start w:val="1"/>
+      <w:numFmt w:val="bullet"/>
+      <w:lvlText w:val=""/>
+      <w:lvlJc w:val="left"/>
+      <w:pPr>
+        <w:ind w:left="2520" w:hanging="360"/>
+      </w:pPr>
+      <w:rPr>
+        <w:rFonts w:ascii="Wingdings" w:hAnsi="Wingdings" w:hint="default"/>
+      </w:rPr>
+    </w:lvl>
+    <w:lvl w:ilvl="3" w:tplc="20000001" w:tentative="1">
+      <w:start w:val="1"/>
+      <w:numFmt w:val="bullet"/>
+      <w:lvlText w:val=""/>
+      <w:lvlJc w:val="left"/>
+      <w:pPr>
+        <w:ind w:left="3240" w:hanging="360"/>
+      </w:pPr>
+      <w:rPr>
+        <w:rFonts w:ascii="Symbol" w:hAnsi="Symbol" w:hint="default"/>
+      </w:rPr>
+    </w:lvl>
+    <w:lvl w:ilvl="4" w:tplc="20000003" w:tentative="1">
+      <w:start w:val="1"/>
+      <w:numFmt w:val="bullet"/>
+      <w:lvlText w:val="o"/>
+      <w:lvlJc w:val="left"/>
+      <w:pPr>
+        <w:ind w:left="3960" w:hanging="360"/>
+      </w:pPr>
+      <w:rPr>
+        <w:rFonts w:ascii="Courier New" w:hAnsi="Courier New" w:cs="Courier New" w:hint="default"/>
+      </w:rPr>
+    </w:lvl>
+    <w:lvl w:ilvl="5" w:tplc="20000005" w:tentative="1">
+      <w:start w:val="1"/>
+      <w:numFmt w:val="bullet"/>
+      <w:lvlText w:val=""/>
+      <w:lvlJc w:val="left"/>
+      <w:pPr>
+        <w:ind w:left="4680" w:hanging="360"/>
+      </w:pPr>
+      <w:rPr>
+        <w:rFonts w:ascii="Wingdings" w:hAnsi="Wingdings" w:hint="default"/>
+      </w:rPr>
+    </w:lvl>
+    <w:lvl w:ilvl="6" w:tplc="20000001" w:tentative="1">
+      <w:start w:val="1"/>
+      <w:numFmt w:val="bullet"/>
+      <w:lvlText w:val=""/>
+      <w:lvlJc w:val="left"/>
+      <w:pPr>
+        <w:ind w:left="5400" w:hanging="360"/>
+      </w:pPr>
+      <w:rPr>
+        <w:rFonts w:ascii="Symbol" w:hAnsi="Symbol" w:hint="default"/>
+      </w:rPr>
+    </w:lvl>
+    <w:lvl w:ilvl="7" w:tplc="20000003" w:tentative="1">
+      <w:start w:val="1"/>
+      <w:numFmt w:val="bullet"/>
+      <w:lvlText w:val="o"/>
+      <w:lvlJc w:val="left"/>
+      <w:pPr>
+        <w:ind w:left="6120" w:hanging="360"/>
+      </w:pPr>
+      <w:rPr>
+        <w:rFonts w:ascii="Courier New" w:hAnsi="Courier New" w:cs="Courier New" w:hint="default"/>
+      </w:rPr>
+    </w:lvl>
+    <w:lvl w:ilvl="8" w:tplc="20000005" w:tentative="1">
       <w:start w:val="1"/>
       <w:numFmt w:val="bullet"/>
       <w:lvlText w:val=""/>
@@ -3989,7 +5496,16 @@
     <w:abstractNumId w:val="1"/>
   </w:num>
   <w:num w:numId="3">
+    <w:abstractNumId w:val="4"/>
+  </w:num>
+  <w:num w:numId="4">
     <w:abstractNumId w:val="2"/>
+  </w:num>
+  <w:num w:numId="5">
+    <w:abstractNumId w:val="5"/>
+  </w:num>
+  <w:num w:numId="6">
+    <w:abstractNumId w:val="3"/>
   </w:num>
   <w:numIdMacAtCleanup w:val="1"/>
 </w:numbering>

</xml_diff>

<commit_message>
The second chapter is started:the first subchapter is implemented
</commit_message>
<xml_diff>
--- a/docs/Note.docx
+++ b/docs/Note.docx
@@ -359,7 +359,21 @@
               <w:rPr>
                 <w:szCs w:val="28"/>
               </w:rPr>
-              <w:t>___.____.20</w:t>
+              <w:t>__</w:t>
+            </w:r>
+            <w:proofErr w:type="gramStart"/>
+            <w:r>
+              <w:rPr>
+                <w:szCs w:val="28"/>
+              </w:rPr>
+              <w:t>_._</w:t>
+            </w:r>
+            <w:proofErr w:type="gramEnd"/>
+            <w:r>
+              <w:rPr>
+                <w:szCs w:val="28"/>
+              </w:rPr>
+              <w:t>___.20</w:t>
             </w:r>
             <w:r>
               <w:rPr>
@@ -874,7 +888,23 @@
                 <w:color w:val="000000"/>
                 <w:szCs w:val="28"/>
               </w:rPr>
-              <w:t>___.____.202</w:t>
+              <w:t>__</w:t>
+            </w:r>
+            <w:proofErr w:type="gramStart"/>
+            <w:r>
+              <w:rPr>
+                <w:color w:val="000000"/>
+                <w:szCs w:val="28"/>
+              </w:rPr>
+              <w:t>_._</w:t>
+            </w:r>
+            <w:proofErr w:type="gramEnd"/>
+            <w:r>
+              <w:rPr>
+                <w:color w:val="000000"/>
+                <w:szCs w:val="28"/>
+              </w:rPr>
+              <w:t>___.202</w:t>
             </w:r>
             <w:r>
               <w:rPr>
@@ -1366,23 +1396,7 @@
           <w:rFonts w:eastAsia="Times New Roman" w:cs="Times New Roman"/>
           <w:szCs w:val="28"/>
         </w:rPr>
-        <w:t xml:space="preserve">Ключевые слова: P2P-кредитование, веб-приложение, студенты заем, </w:t>
-      </w:r>
-      <w:proofErr w:type="spellStart"/>
-      <w:r>
-        <w:rPr>
-          <w:rFonts w:eastAsia="Times New Roman" w:cs="Times New Roman"/>
-          <w:szCs w:val="28"/>
-        </w:rPr>
-        <w:t>микросервисная</w:t>
-      </w:r>
-      <w:proofErr w:type="spellEnd"/>
-      <w:r>
-        <w:rPr>
-          <w:rFonts w:eastAsia="Times New Roman" w:cs="Times New Roman"/>
-          <w:szCs w:val="28"/>
-        </w:rPr>
-        <w:t xml:space="preserve"> архитектура, REST API, финансовые технологии.</w:t>
+        <w:t>Ключевые слова: P2P-кредитование, веб-приложение, студенты заем, микросервисная архитектура, REST API, финансовые технологии.</w:t>
       </w:r>
     </w:p>
     <w:p>
@@ -1407,23 +1421,7 @@
           <w:rFonts w:eastAsia="Times New Roman" w:cs="Times New Roman"/>
           <w:szCs w:val="28"/>
         </w:rPr>
-        <w:t xml:space="preserve"> является разработка платформы для </w:t>
-      </w:r>
-      <w:proofErr w:type="spellStart"/>
-      <w:r>
-        <w:rPr>
-          <w:rFonts w:eastAsia="Times New Roman" w:cs="Times New Roman"/>
-          <w:szCs w:val="28"/>
-        </w:rPr>
-        <w:t>peer-to-peer</w:t>
-      </w:r>
-      <w:proofErr w:type="spellEnd"/>
-      <w:r>
-        <w:rPr>
-          <w:rFonts w:eastAsia="Times New Roman" w:cs="Times New Roman"/>
-          <w:szCs w:val="28"/>
-        </w:rPr>
-        <w:t xml:space="preserve"> кредитования студентов с модулем проверки успеваемости и системой гарантий возврата займов. Разрабатываемое программное средство представляет собой веб-приложение, обеспечивающее взаимодействие между заемщиками и кредиторами без участия традиционных финансовых организаций. Система позволяет пользователям регистрироваться, подавать заявки на получение займов, инвестировать средства</w:t>
+        <w:t xml:space="preserve"> является разработка платформы для peer-to-peer кредитования студентов с модулем проверки успеваемости и системой гарантий возврата займов. Разрабатываемое программное средство представляет собой веб-приложение, обеспечивающее взаимодействие между заемщиками и кредиторами без участия традиционных финансовых организаций. Система позволяет пользователям регистрироваться, подавать заявки на получение займов, инвестировать средства</w:t>
       </w:r>
       <w:r>
         <w:rPr>
@@ -1611,7 +1609,7 @@
       <w:r>
         <w:fldChar w:fldCharType="separate"/>
       </w:r>
-      <w:hyperlink w:anchor="_Toc224921131" w:history="1">
+      <w:hyperlink w:anchor="_Toc223367489" w:history="1">
         <w:r>
           <w:rPr>
             <w:rStyle w:val="af2"/>
@@ -1638,7 +1636,7 @@
             <w:noProof/>
             <w:webHidden/>
           </w:rPr>
-          <w:instrText xml:space="preserve"> PAGEREF _Toc224921131 \h </w:instrText>
+          <w:instrText xml:space="preserve"> PAGEREF _Toc223367489 \h </w:instrText>
         </w:r>
         <w:r>
           <w:rPr>
@@ -1682,7 +1680,7 @@
           <w:lang w:val="ru-BY" w:eastAsia="ru-BY"/>
         </w:rPr>
       </w:pPr>
-      <w:hyperlink w:anchor="_Toc224921132" w:history="1">
+      <w:hyperlink w:anchor="_Toc223367490" w:history="1">
         <w:r>
           <w:rPr>
             <w:rStyle w:val="af2"/>
@@ -1709,7 +1707,7 @@
             <w:noProof/>
             <w:webHidden/>
           </w:rPr>
-          <w:instrText xml:space="preserve"> PAGEREF _Toc224921132 \h </w:instrText>
+          <w:instrText xml:space="preserve"> PAGEREF _Toc223367490 \h </w:instrText>
         </w:r>
         <w:r>
           <w:rPr>
@@ -1753,7 +1751,7 @@
           <w:lang w:val="ru-BY" w:eastAsia="ru-BY"/>
         </w:rPr>
       </w:pPr>
-      <w:hyperlink w:anchor="_Toc224921133" w:history="1">
+      <w:hyperlink w:anchor="_Toc223367491" w:history="1">
         <w:r>
           <w:rPr>
             <w:rStyle w:val="af2"/>
@@ -1780,7 +1778,7 @@
             <w:noProof/>
             <w:webHidden/>
           </w:rPr>
-          <w:instrText xml:space="preserve"> PAGEREF _Toc224921133 \h </w:instrText>
+          <w:instrText xml:space="preserve"> PAGEREF _Toc223367491 \h </w:instrText>
         </w:r>
         <w:r>
           <w:rPr>
@@ -1824,7 +1822,7 @@
           <w:lang w:val="ru-BY" w:eastAsia="ru-BY"/>
         </w:rPr>
       </w:pPr>
-      <w:hyperlink w:anchor="_Toc224921134" w:history="1">
+      <w:hyperlink w:anchor="_Toc223367492" w:history="1">
         <w:r>
           <w:rPr>
             <w:rStyle w:val="af2"/>
@@ -1851,7 +1849,7 @@
             <w:noProof/>
             <w:webHidden/>
           </w:rPr>
-          <w:instrText xml:space="preserve"> PAGEREF _Toc224921134 \h </w:instrText>
+          <w:instrText xml:space="preserve"> PAGEREF _Toc223367492 \h </w:instrText>
         </w:r>
         <w:r>
           <w:rPr>
@@ -1895,43 +1893,13 @@
           <w:lang w:val="ru-BY" w:eastAsia="ru-BY"/>
         </w:rPr>
       </w:pPr>
-      <w:hyperlink w:anchor="_Toc224921135" w:history="1">
+      <w:hyperlink w:anchor="_Toc223367493" w:history="1">
         <w:r>
           <w:rPr>
             <w:rStyle w:val="af2"/>
             <w:noProof/>
           </w:rPr>
-          <w:t>Список</w:t>
-        </w:r>
-        <w:r>
-          <w:rPr>
-            <w:rStyle w:val="af2"/>
-            <w:noProof/>
-            <w:lang w:val="en-US"/>
-          </w:rPr>
-          <w:t xml:space="preserve"> </w:t>
-        </w:r>
-        <w:r>
-          <w:rPr>
-            <w:rStyle w:val="af2"/>
-            <w:noProof/>
-          </w:rPr>
-          <w:t>использованных</w:t>
-        </w:r>
-        <w:r>
-          <w:rPr>
-            <w:rStyle w:val="af2"/>
-            <w:noProof/>
-            <w:lang w:val="en-US"/>
-          </w:rPr>
-          <w:t xml:space="preserve"> </w:t>
-        </w:r>
-        <w:r>
-          <w:rPr>
-            <w:rStyle w:val="af2"/>
-            <w:noProof/>
-          </w:rPr>
-          <w:t>источников</w:t>
+          <w:t>2 Моделирование предметной области и разработка требований к программному средству</w:t>
         </w:r>
         <w:r>
           <w:rPr>
@@ -1952,7 +1920,7 @@
             <w:noProof/>
             <w:webHidden/>
           </w:rPr>
-          <w:instrText xml:space="preserve"> PAGEREF _Toc224921135 \h </w:instrText>
+          <w:instrText xml:space="preserve"> PAGEREF _Toc223367493 \h </w:instrText>
         </w:r>
         <w:r>
           <w:rPr>
@@ -1985,6 +1953,290 @@
     </w:p>
     <w:p>
       <w:pPr>
+        <w:pStyle w:val="21"/>
+        <w:tabs>
+          <w:tab w:val="right" w:leader="dot" w:pos="9344"/>
+        </w:tabs>
+        <w:rPr>
+          <w:rFonts w:asciiTheme="minorHAnsi" w:eastAsiaTheme="minorEastAsia" w:hAnsiTheme="minorHAnsi"/>
+          <w:noProof/>
+          <w:sz w:val="22"/>
+          <w:lang w:val="ru-BY" w:eastAsia="ru-BY"/>
+        </w:rPr>
+      </w:pPr>
+      <w:hyperlink w:anchor="_Toc223367494" w:history="1">
+        <w:r>
+          <w:rPr>
+            <w:rStyle w:val="af2"/>
+            <w:noProof/>
+          </w:rPr>
+          <w:t>2.1 Анализ и формализация бизнес-процессов предметной области</w:t>
+        </w:r>
+        <w:r>
+          <w:rPr>
+            <w:noProof/>
+            <w:webHidden/>
+          </w:rPr>
+          <w:tab/>
+        </w:r>
+        <w:r>
+          <w:rPr>
+            <w:noProof/>
+            <w:webHidden/>
+          </w:rPr>
+          <w:fldChar w:fldCharType="begin"/>
+        </w:r>
+        <w:r>
+          <w:rPr>
+            <w:noProof/>
+            <w:webHidden/>
+          </w:rPr>
+          <w:instrText xml:space="preserve"> PAGEREF _Toc223367494 \h </w:instrText>
+        </w:r>
+        <w:r>
+          <w:rPr>
+            <w:noProof/>
+            <w:webHidden/>
+          </w:rPr>
+        </w:r>
+        <w:r>
+          <w:rPr>
+            <w:noProof/>
+            <w:webHidden/>
+          </w:rPr>
+          <w:fldChar w:fldCharType="separate"/>
+        </w:r>
+        <w:r>
+          <w:rPr>
+            <w:noProof/>
+            <w:webHidden/>
+          </w:rPr>
+          <w:t>15</w:t>
+        </w:r>
+        <w:r>
+          <w:rPr>
+            <w:noProof/>
+            <w:webHidden/>
+          </w:rPr>
+          <w:fldChar w:fldCharType="end"/>
+        </w:r>
+      </w:hyperlink>
+    </w:p>
+    <w:p>
+      <w:pPr>
+        <w:pStyle w:val="21"/>
+        <w:tabs>
+          <w:tab w:val="right" w:leader="dot" w:pos="9344"/>
+        </w:tabs>
+        <w:rPr>
+          <w:rFonts w:asciiTheme="minorHAnsi" w:eastAsiaTheme="minorEastAsia" w:hAnsiTheme="minorHAnsi"/>
+          <w:noProof/>
+          <w:sz w:val="22"/>
+          <w:lang w:val="ru-BY" w:eastAsia="ru-BY"/>
+        </w:rPr>
+      </w:pPr>
+      <w:hyperlink w:anchor="_Toc223367495" w:history="1">
+        <w:r>
+          <w:rPr>
+            <w:rStyle w:val="af2"/>
+            <w:noProof/>
+          </w:rPr>
+          <w:t>2.2 Разработка спецификации требований к программному продукту</w:t>
+        </w:r>
+        <w:r>
+          <w:rPr>
+            <w:noProof/>
+            <w:webHidden/>
+          </w:rPr>
+          <w:tab/>
+        </w:r>
+        <w:r>
+          <w:rPr>
+            <w:noProof/>
+            <w:webHidden/>
+          </w:rPr>
+          <w:fldChar w:fldCharType="begin"/>
+        </w:r>
+        <w:r>
+          <w:rPr>
+            <w:noProof/>
+            <w:webHidden/>
+          </w:rPr>
+          <w:instrText xml:space="preserve"> PAGEREF _Toc223367495 \h </w:instrText>
+        </w:r>
+        <w:r>
+          <w:rPr>
+            <w:noProof/>
+            <w:webHidden/>
+          </w:rPr>
+        </w:r>
+        <w:r>
+          <w:rPr>
+            <w:noProof/>
+            <w:webHidden/>
+          </w:rPr>
+          <w:fldChar w:fldCharType="separate"/>
+        </w:r>
+        <w:r>
+          <w:rPr>
+            <w:noProof/>
+            <w:webHidden/>
+          </w:rPr>
+          <w:t>18</w:t>
+        </w:r>
+        <w:r>
+          <w:rPr>
+            <w:noProof/>
+            <w:webHidden/>
+          </w:rPr>
+          <w:fldChar w:fldCharType="end"/>
+        </w:r>
+      </w:hyperlink>
+    </w:p>
+    <w:p>
+      <w:pPr>
+        <w:pStyle w:val="21"/>
+        <w:tabs>
+          <w:tab w:val="right" w:leader="dot" w:pos="9344"/>
+        </w:tabs>
+        <w:rPr>
+          <w:rFonts w:asciiTheme="minorHAnsi" w:eastAsiaTheme="minorEastAsia" w:hAnsiTheme="minorHAnsi"/>
+          <w:noProof/>
+          <w:sz w:val="22"/>
+          <w:lang w:val="ru-BY" w:eastAsia="ru-BY"/>
+        </w:rPr>
+      </w:pPr>
+      <w:hyperlink w:anchor="_Toc223367496" w:history="1">
+        <w:r>
+          <w:rPr>
+            <w:rStyle w:val="af2"/>
+            <w:noProof/>
+          </w:rPr>
+          <w:t>2.3 Образ предлагаемого решения</w:t>
+        </w:r>
+        <w:r>
+          <w:rPr>
+            <w:noProof/>
+            <w:webHidden/>
+          </w:rPr>
+          <w:tab/>
+        </w:r>
+        <w:r>
+          <w:rPr>
+            <w:noProof/>
+            <w:webHidden/>
+          </w:rPr>
+          <w:fldChar w:fldCharType="begin"/>
+        </w:r>
+        <w:r>
+          <w:rPr>
+            <w:noProof/>
+            <w:webHidden/>
+          </w:rPr>
+          <w:instrText xml:space="preserve"> PAGEREF _Toc223367496 \h </w:instrText>
+        </w:r>
+        <w:r>
+          <w:rPr>
+            <w:noProof/>
+            <w:webHidden/>
+          </w:rPr>
+        </w:r>
+        <w:r>
+          <w:rPr>
+            <w:noProof/>
+            <w:webHidden/>
+          </w:rPr>
+          <w:fldChar w:fldCharType="separate"/>
+        </w:r>
+        <w:r>
+          <w:rPr>
+            <w:noProof/>
+            <w:webHidden/>
+          </w:rPr>
+          <w:t>20</w:t>
+        </w:r>
+        <w:r>
+          <w:rPr>
+            <w:noProof/>
+            <w:webHidden/>
+          </w:rPr>
+          <w:fldChar w:fldCharType="end"/>
+        </w:r>
+      </w:hyperlink>
+    </w:p>
+    <w:p>
+      <w:pPr>
+        <w:pStyle w:val="11"/>
+        <w:tabs>
+          <w:tab w:val="right" w:leader="dot" w:pos="9344"/>
+        </w:tabs>
+        <w:rPr>
+          <w:rFonts w:asciiTheme="minorHAnsi" w:eastAsiaTheme="minorEastAsia" w:hAnsiTheme="minorHAnsi"/>
+          <w:noProof/>
+          <w:sz w:val="22"/>
+          <w:lang w:val="ru-BY" w:eastAsia="ru-BY"/>
+        </w:rPr>
+      </w:pPr>
+      <w:hyperlink w:anchor="_Toc223367497" w:history="1">
+        <w:r>
+          <w:rPr>
+            <w:rStyle w:val="af2"/>
+            <w:noProof/>
+          </w:rPr>
+          <w:t>Список использованных источников</w:t>
+        </w:r>
+        <w:r>
+          <w:rPr>
+            <w:noProof/>
+            <w:webHidden/>
+          </w:rPr>
+          <w:tab/>
+        </w:r>
+        <w:r>
+          <w:rPr>
+            <w:noProof/>
+            <w:webHidden/>
+          </w:rPr>
+          <w:fldChar w:fldCharType="begin"/>
+        </w:r>
+        <w:r>
+          <w:rPr>
+            <w:noProof/>
+            <w:webHidden/>
+          </w:rPr>
+          <w:instrText xml:space="preserve"> PAGEREF _Toc223367497 \h </w:instrText>
+        </w:r>
+        <w:r>
+          <w:rPr>
+            <w:noProof/>
+            <w:webHidden/>
+          </w:rPr>
+        </w:r>
+        <w:r>
+          <w:rPr>
+            <w:noProof/>
+            <w:webHidden/>
+          </w:rPr>
+          <w:fldChar w:fldCharType="separate"/>
+        </w:r>
+        <w:r>
+          <w:rPr>
+            <w:noProof/>
+            <w:webHidden/>
+          </w:rPr>
+          <w:t>22</w:t>
+        </w:r>
+        <w:r>
+          <w:rPr>
+            <w:noProof/>
+            <w:webHidden/>
+          </w:rPr>
+          <w:fldChar w:fldCharType="end"/>
+        </w:r>
+      </w:hyperlink>
+    </w:p>
+    <w:p>
+      <w:pPr>
         <w:spacing w:line="21" w:lineRule="atLeast"/>
         <w:ind w:firstLine="0"/>
         <w:jc w:val="center"/>
@@ -2008,7 +2260,7 @@
         <w:pStyle w:val="1"/>
         <w:ind w:left="0"/>
       </w:pPr>
-      <w:bookmarkStart w:id="1" w:name="_Toc224921131"/>
+      <w:bookmarkStart w:id="1" w:name="_Toc223367489"/>
       <w:r>
         <w:lastRenderedPageBreak/>
         <w:t>Введение</w:t>
@@ -2036,87 +2288,86 @@
           <w:rFonts w:eastAsia="Times New Roman" w:cs="Times New Roman"/>
           <w:szCs w:val="28"/>
         </w:rPr>
-        <w:t xml:space="preserve">В условиях активного развития цифровой экономики и финансовых технологий особую значимость приобретают инновационные подходы к организации финансовых взаимодействий между пользователями. Одним из таких направлений является </w:t>
-      </w:r>
-      <w:proofErr w:type="spellStart"/>
+        <w:t>В условиях активного развития цифровой экономики и финансовых технологий особую значимость приобретают инновационные подходы к организации финансовых взаимодействий между пользователями. Одним из таких направлений является peer-to-peer (P2P) кредитование, представляющее собой модель прямого взаимодействия между заемщиками и кредиторами без участия традиционных финансовых посредников, таких как банки</w:t>
+      </w:r>
       <w:r>
         <w:rPr>
           <w:rFonts w:eastAsia="Times New Roman" w:cs="Times New Roman"/>
           <w:szCs w:val="28"/>
         </w:rPr>
-        <w:t>peer-to-peer</w:t>
-      </w:r>
-      <w:proofErr w:type="spellEnd"/>
+        <w:t xml:space="preserve"> </w:t>
+      </w:r>
       <w:r>
         <w:rPr>
           <w:rFonts w:eastAsia="Times New Roman" w:cs="Times New Roman"/>
           <w:szCs w:val="28"/>
         </w:rPr>
-        <w:t xml:space="preserve"> (P2P) кредитование, представляющее собой модель прямого взаимодействия между заемщиками и кредиторами без участия традиционных финансовых посредников, таких как банки</w:t>
+        <w:t>[1</w:t>
       </w:r>
       <w:r>
         <w:rPr>
           <w:rFonts w:eastAsia="Times New Roman" w:cs="Times New Roman"/>
           <w:szCs w:val="28"/>
         </w:rPr>
-        <w:t xml:space="preserve"> </w:t>
+        <w:t>]</w:t>
       </w:r>
       <w:r>
         <w:rPr>
           <w:rFonts w:eastAsia="Times New Roman" w:cs="Times New Roman"/>
           <w:szCs w:val="28"/>
         </w:rPr>
-        <w:t>[1</w:t>
+        <w:t>. Данная модель позволяет существенно упростить процесс получения и предоставления займов, снизить транзакционные издержки и повысить доступность финансовых ресурсов для различных категорий пользователей</w:t>
       </w:r>
       <w:r>
         <w:rPr>
           <w:rFonts w:eastAsia="Times New Roman" w:cs="Times New Roman"/>
           <w:szCs w:val="28"/>
         </w:rPr>
-        <w:t>]</w:t>
-      </w:r>
-      <w:r>
+        <w:t>.</w:t>
+      </w:r>
+    </w:p>
+    <w:p>
+      <w:pPr>
         <w:rPr>
           <w:rFonts w:eastAsia="Times New Roman" w:cs="Times New Roman"/>
           <w:szCs w:val="28"/>
         </w:rPr>
-        <w:t>. Данная модель позволяет существенно упростить процесс получения и предоставления займов, снизить транзакционные издержки и повысить доступность финансовых ресурсов для различных категорий пользователей</w:t>
-      </w:r>
+      </w:pPr>
       <w:r>
         <w:rPr>
           <w:rFonts w:eastAsia="Times New Roman" w:cs="Times New Roman"/>
           <w:szCs w:val="28"/>
         </w:rPr>
-        <w:t>.</w:t>
-      </w:r>
-    </w:p>
-    <w:p>
-      <w:pPr>
+        <w:t xml:space="preserve">Студенты являются особой социальной группой, которая зачастую сталкивается с ограниченным доступом к традиционным финансовым инструментам. Это обусловлено отсутствием стабильного дохода, кредитной истории или достаточных гарантий возврата заемных средств. В то же время потребность в финансовой поддержке у студентов остается высокой, что делает актуальной задачу создания специализированных цифровых платформ, ориентированных на данную категорию пользователей. </w:t>
+      </w:r>
+      <w:r>
         <w:rPr>
           <w:rFonts w:eastAsia="Times New Roman" w:cs="Times New Roman"/>
           <w:szCs w:val="28"/>
         </w:rPr>
-      </w:pPr>
+        <w:t>Р</w:t>
+      </w:r>
       <w:r>
         <w:rPr>
           <w:rFonts w:eastAsia="Times New Roman" w:cs="Times New Roman"/>
           <w:szCs w:val="28"/>
         </w:rPr>
-        <w:t xml:space="preserve">Студенты являются особой социальной группой, которая зачастую сталкивается с ограниченным доступом к традиционным финансовым инструментам. Это обусловлено отсутствием стабильного дохода, кредитной истории или достаточных гарантий возврата заемных средств. В то же время потребность в финансовой поддержке у студентов остается высокой, что делает актуальной задачу создания специализированных цифровых платформ, ориентированных на данную категорию пользователей. </w:t>
-      </w:r>
-      <w:r>
+        <w:t>азработка платформы P2P-кредитования студентов становится важным направлением, способствующим решению проблемы доступности финансовых ресурсов.</w:t>
+      </w:r>
+    </w:p>
+    <w:p>
+      <w:pPr>
         <w:rPr>
           <w:rFonts w:eastAsia="Times New Roman" w:cs="Times New Roman"/>
           <w:szCs w:val="28"/>
         </w:rPr>
-        <w:t>Р</w:t>
-      </w:r>
+      </w:pPr>
       <w:r>
         <w:rPr>
           <w:rFonts w:eastAsia="Times New Roman" w:cs="Times New Roman"/>
           <w:szCs w:val="28"/>
         </w:rPr>
-        <w:t>азработка платформы P2P-кредитования студентов становится важным направлением, способствующим решению проблемы доступности финансовых ресурсов.</w:t>
+        <w:t>Информационная работа в сфере P2P-кредитования включает в себя выполнение комплекса задач, направленных на обеспечение эффективного и безопасного взаимодействия между участниками платформы. К таким задачам относятся регистрация и аутентификация пользователей, обработка заявок на получение займов, управление предложениями кредиторов, а также контроль за выполнением обязательств по возврату средств. Особую роль играет механизм оценки надежности заемщиков, который позволяет минимизировать риски невозврата средств и повысить доверие между участниками системы.</w:t>
       </w:r>
     </w:p>
     <w:p>
@@ -2131,7 +2382,7 @@
           <w:rFonts w:eastAsia="Times New Roman" w:cs="Times New Roman"/>
           <w:szCs w:val="28"/>
         </w:rPr>
-        <w:t>Информационная работа в сфере P2P-кредитования включает в себя выполнение комплекса задач, направленных на обеспечение эффективного и безопасного взаимодействия между участниками платформы. К таким задачам относятся регистрация и аутентификация пользователей, обработка заявок на получение займов, управление предложениями кредиторов, а также контроль за выполнением обязательств по возврату средств. Особую роль играет механизм оценки надежности заемщиков, который позволяет минимизировать риски невозврата средств и повысить доверие между участниками системы.</w:t>
+        <w:t>Кроме того, важным элементом предлагаемого решения является разработка системы гарантий возврата займов. Она может включать в себя различные механизмы, такие как рейтинговая система пользователей, формирование резервных фондов, привлечение поручителей или использование алгоритмов скоринга. Внедрение подобных инструментов позволит повысить уровень безопасности платформы и снизить вероятность финансовых потерь для кредиторов, что, в свою очередь, будет способствовать росту доверия к системе и увеличению числа ее пользователей.</w:t>
       </w:r>
     </w:p>
     <w:p>
@@ -2146,54 +2397,7 @@
           <w:rFonts w:eastAsia="Times New Roman" w:cs="Times New Roman"/>
           <w:szCs w:val="28"/>
         </w:rPr>
-        <w:t>Кроме того, важным элементом предлагаемого решения является разработка системы гарантий возврата займов. Она может включать в себя различные механизмы, такие как рейтинговая система пользователей, формирование резервных фондов, привлечение поручителей или использование алгоритмов скоринга. Внедрение подобных инструментов позволит повысить уровень безопасности платформы и снизить вероятность финансовых потерь для кредиторов, что, в свою очередь, будет способствовать росту доверия к системе и увеличению числа ее пользователей.</w:t>
-      </w:r>
-    </w:p>
-    <w:p>
-      <w:pPr>
-        <w:rPr>
-          <w:rFonts w:eastAsia="Times New Roman" w:cs="Times New Roman"/>
-          <w:szCs w:val="28"/>
-        </w:rPr>
-      </w:pPr>
-      <w:r>
-        <w:rPr>
-          <w:rFonts w:eastAsia="Times New Roman" w:cs="Times New Roman"/>
-          <w:szCs w:val="28"/>
-        </w:rPr>
-        <w:t xml:space="preserve">Использование современных веб-технологий и архитектурных подходов, таких как </w:t>
-      </w:r>
-      <w:proofErr w:type="spellStart"/>
-      <w:r>
-        <w:rPr>
-          <w:rFonts w:eastAsia="Times New Roman" w:cs="Times New Roman"/>
-          <w:szCs w:val="28"/>
-        </w:rPr>
-        <w:t>микросервисная</w:t>
-      </w:r>
-      <w:proofErr w:type="spellEnd"/>
-      <w:r>
-        <w:rPr>
-          <w:rFonts w:eastAsia="Times New Roman" w:cs="Times New Roman"/>
-          <w:szCs w:val="28"/>
-        </w:rPr>
-        <w:t xml:space="preserve"> архитектура, </w:t>
-      </w:r>
-      <w:proofErr w:type="spellStart"/>
-      <w:r>
-        <w:rPr>
-          <w:rFonts w:eastAsia="Times New Roman" w:cs="Times New Roman"/>
-          <w:szCs w:val="28"/>
-        </w:rPr>
-        <w:t>RESTful</w:t>
-      </w:r>
-      <w:proofErr w:type="spellEnd"/>
-      <w:r>
-        <w:rPr>
-          <w:rFonts w:eastAsia="Times New Roman" w:cs="Times New Roman"/>
-          <w:szCs w:val="28"/>
-        </w:rPr>
-        <w:t xml:space="preserve"> API и клиент-серверное взаимодействие, позволяет создать масштабируемое и надежное программное средство, способное обрабатывать большое количество запросов </w:t>
+        <w:t xml:space="preserve">Использование современных веб-технологий и архитектурных подходов, таких как микросервисная архитектура, RESTful API и клиент-серверное взаимодействие, позволяет создать масштабируемое и надежное программное средство, способное обрабатывать большое количество запросов </w:t>
       </w:r>
       <w:r>
         <w:rPr>
@@ -2329,7 +2533,7 @@
         <w:ind w:left="720"/>
         <w:jc w:val="both"/>
       </w:pPr>
-      <w:bookmarkStart w:id="2" w:name="_Toc224921132"/>
+      <w:bookmarkStart w:id="2" w:name="_Toc223367490"/>
       <w:r>
         <w:lastRenderedPageBreak/>
         <w:t>1 Анализ литературных источников и программных решений по теме курсового проекта</w:t>
@@ -2344,7 +2548,7 @@
           <w:lang w:val="ru-RU"/>
         </w:rPr>
       </w:pPr>
-      <w:bookmarkStart w:id="3" w:name="_Toc224921133"/>
+      <w:bookmarkStart w:id="3" w:name="_Toc223367491"/>
       <w:r>
         <w:rPr>
           <w:lang w:val="ru-RU"/>
@@ -2356,15 +2560,7 @@
     <w:p/>
     <w:p>
       <w:r>
-        <w:t xml:space="preserve">В современных условиях развития цифровых технологий и финансовых инструментов наблюдается активное распространение альтернативных моделей кредитования, среди которых особое место занимает </w:t>
-      </w:r>
-      <w:proofErr w:type="spellStart"/>
-      <w:r>
-        <w:t>peer-to-peer</w:t>
-      </w:r>
-      <w:proofErr w:type="spellEnd"/>
-      <w:r>
-        <w:t xml:space="preserve"> (P2P) кредитование. Данная модель представляет собой способ организации финансовых отношений, при котором заемщики и кредиторы взаимодействуют напрямую через специализированные онлайн-платформы, минуя традиционные финансовые учреждения. Это позволяет снизить транзакционные издержки, повысить доступность заемных средств и обеспечить более гибкие условия взаимодействия участников рынка [</w:t>
+        <w:t>В современных условиях развития цифровых технологий и финансовых инструментов наблюдается активное распространение альтернативных моделей кредитования, среди которых особое место занимает peer-to-peer (P2P) кредитование. Данная модель представляет собой способ организации финансовых отношений, при котором заемщики и кредиторы взаимодействуют напрямую через специализированные онлайн-платформы, минуя традиционные финансовые учреждения. Это позволяет снизить транзакционные издержки, повысить доступность заемных средств и обеспечить более гибкие условия взаимодействия участников рынка [</w:t>
       </w:r>
       <w:r>
         <w:t>3</w:t>
@@ -2703,28 +2899,12 @@
     </w:p>
     <w:p>
       <w:r>
-        <w:t xml:space="preserve">Также важным аспектом является интеграция с внешними системами. Для реализации модуля проверки успеваемости может потребоваться взаимодействие с образовательными платформами или внутренними системами учебных заведений. Кроме того, возможно использование сторонних сервисов для аутентификации пользователей (например, через </w:t>
-      </w:r>
-      <w:proofErr w:type="spellStart"/>
-      <w:r>
-        <w:t>OAuth</w:t>
-      </w:r>
-      <w:proofErr w:type="spellEnd"/>
-      <w:r>
-        <w:t xml:space="preserve"> 2.0), что упрощает процесс регистрации и повышает удобство использования системы.</w:t>
-      </w:r>
-    </w:p>
-    <w:p>
-      <w:r>
-        <w:t xml:space="preserve">С точки зрения архитектуры, разрабатываемое программное средство относится к классу распределенных информационных систем. Оно включает в себя серверную часть, реализующую бизнес-логику и обработку данных, и клиентскую часть, обеспечивающую взаимодействие с пользователем. Использование </w:t>
-      </w:r>
-      <w:proofErr w:type="spellStart"/>
-      <w:r>
-        <w:t>RESTful</w:t>
-      </w:r>
-      <w:proofErr w:type="spellEnd"/>
-      <w:r>
-        <w:t xml:space="preserve"> API и формата данных JSON позволяет обеспечить гибкость и масштабируемость системы, а также упростить интеграцию с другими сервисами.</w:t>
+        <w:t>Также важным аспектом является интеграция с внешними системами. Для реализации модуля проверки успеваемости может потребоваться взаимодействие с образовательными платформами или внутренними системами учебных заведений. Кроме того, возможно использование сторонних сервисов для аутентификации пользователей (например, через OAuth 2.0), что упрощает процесс регистрации и повышает удобство использования системы.</w:t>
+      </w:r>
+    </w:p>
+    <w:p>
+      <w:r>
+        <w:t>С точки зрения архитектуры, разрабатываемое программное средство относится к классу распределенных информационных систем. Оно включает в себя серверную часть, реализующую бизнес-логику и обработку данных, и клиентскую часть, обеспечивающую взаимодействие с пользователем. Использование RESTful API и формата данных JSON позволяет обеспечить гибкость и масштабируемость системы, а также упростить интеграцию с другими сервисами.</w:t>
       </w:r>
     </w:p>
     <w:p>
@@ -3077,23 +3257,7 @@
     <w:p>
       <w:r>
         <w:lastRenderedPageBreak/>
-        <w:t xml:space="preserve">Одной из ключевых особенностей предметной области является необходимость управления рисками. В условиях отсутствия традиционных банковских механизмов обеспечения возврата средств система должна самостоятельно реализовывать инструменты анализа и минимизации рисков. К таким инструментам относятся </w:t>
-      </w:r>
-      <w:proofErr w:type="spellStart"/>
-      <w:r>
-        <w:t>скоринговые</w:t>
-      </w:r>
-      <w:proofErr w:type="spellEnd"/>
-      <w:r>
-        <w:t xml:space="preserve"> модели, которые позволяют оценить вероятность возврата займа на основе совокупности факторов. В рамках данного проекта предлагается расширить классическую </w:t>
-      </w:r>
-      <w:proofErr w:type="spellStart"/>
-      <w:r>
-        <w:t>скоринговую</w:t>
-      </w:r>
-      <w:proofErr w:type="spellEnd"/>
-      <w:r>
-        <w:t xml:space="preserve"> модель за счет включения показателей академической успеваемости, активности пользователя в системе и его репутации.</w:t>
+        <w:t>Одной из ключевых особенностей предметной области является необходимость управления рисками. В условиях отсутствия традиционных банковских механизмов обеспечения возврата средств система должна самостоятельно реализовывать инструменты анализа и минимизации рисков. К таким инструментам относятся скоринговые модели, которые позволяют оценить вероятность возврата займа на основе совокупности факторов. В рамках данного проекта предлагается расширить классическую скоринговую модель за счет включения показателей академической успеваемости, активности пользователя в системе и его репутации.</w:t>
       </w:r>
     </w:p>
     <w:p>
@@ -3308,15 +3472,7 @@
         <w:tab/>
       </w:r>
       <w:r>
-        <w:t xml:space="preserve">С точки зрения информационных систем важным аспектом является построение эффективной архитектуры, обеспечивающей масштабируемость и устойчивость к нагрузкам. Поскольку P2P-платформа предполагает одновременную работу большого количества пользователей, система должна корректно обрабатывать параллельные запросы, обеспечивать согласованность данных и минимизировать задержки. Использование современных архитектурных подходов, таких как </w:t>
-      </w:r>
-      <w:proofErr w:type="spellStart"/>
-      <w:r>
-        <w:t>микросервисная</w:t>
-      </w:r>
-      <w:proofErr w:type="spellEnd"/>
-      <w:r>
-        <w:t xml:space="preserve"> архитектура или модульный монолит, позволяет достичь необходимого уровня гибкости и надежности.</w:t>
+        <w:t>С точки зрения информационных систем важным аспектом является построение эффективной архитектуры, обеспечивающей масштабируемость и устойчивость к нагрузкам. Поскольку P2P-платформа предполагает одновременную работу большого количества пользователей, система должна корректно обрабатывать параллельные запросы, обеспечивать согласованность данных и минимизировать задержки. Использование современных архитектурных подходов, таких как микросервисная архитектура или модульный монолит, позволяет достичь необходимого уровня гибкости и надежности.</w:t>
       </w:r>
     </w:p>
     <w:p>
@@ -3330,15 +3486,7 @@
     </w:p>
     <w:p>
       <w:r>
-        <w:t xml:space="preserve">Дополнительным аспектом предметной области является правовое регулирование. В различных странах P2P-кредитование регулируется по-разному, что накладывает ограничения на реализацию определенных функций системы. Необходимо учитывать требования законодательства в области защиты персональных данных, финансового мониторинга и противодействия мошенничеству. Это требует внедрения механизмов идентификации пользователей (KYC – </w:t>
-      </w:r>
-      <w:proofErr w:type="spellStart"/>
-      <w:r>
-        <w:t>Know</w:t>
-      </w:r>
-      <w:proofErr w:type="spellEnd"/>
-      <w:r>
-        <w:t xml:space="preserve"> Your Customer) и мониторинга операций [</w:t>
+        <w:t>Дополнительным аспектом предметной области является правовое регулирование. В различных странах P2P-кредитование регулируется по-разному, что накладывает ограничения на реализацию определенных функций системы. Необходимо учитывать требования законодательства в области защиты персональных данных, финансового мониторинга и противодействия мошенничеству. Это требует внедрения механизмов идентификации пользователей (KYC – Know Your Customer) и мониторинга операций [</w:t>
       </w:r>
       <w:r>
         <w:t>7</w:t>
@@ -3375,7 +3523,7 @@
         </w:rPr>
         <w:tab/>
       </w:r>
-      <w:bookmarkStart w:id="4" w:name="_Toc224921134"/>
+      <w:bookmarkStart w:id="4" w:name="_Toc223367492"/>
       <w:r>
         <w:rPr>
           <w:lang w:val="ru-RU"/>
@@ -3392,39 +3540,7 @@
     </w:p>
     <w:p>
       <w:r>
-        <w:t xml:space="preserve">Одними из наиболее известных и широко используемых платформ в сфере P2P-кредитования являются международные сервисы, такие как </w:t>
-      </w:r>
-      <w:proofErr w:type="spellStart"/>
-      <w:r>
-        <w:t>LendingClub</w:t>
-      </w:r>
-      <w:proofErr w:type="spellEnd"/>
-      <w:r>
-        <w:t xml:space="preserve">, </w:t>
-      </w:r>
-      <w:proofErr w:type="spellStart"/>
-      <w:r>
-        <w:t>Prosper</w:t>
-      </w:r>
-      <w:proofErr w:type="spellEnd"/>
-      <w:r>
-        <w:t xml:space="preserve"> и </w:t>
-      </w:r>
-      <w:proofErr w:type="spellStart"/>
-      <w:r>
-        <w:t>Funding</w:t>
-      </w:r>
-      <w:proofErr w:type="spellEnd"/>
-      <w:r>
-        <w:t xml:space="preserve"> </w:t>
-      </w:r>
-      <w:proofErr w:type="spellStart"/>
-      <w:r>
-        <w:t>Circle</w:t>
-      </w:r>
-      <w:proofErr w:type="spellEnd"/>
-      <w:r>
-        <w:t xml:space="preserve">. Эти платформы предоставляют пользователям возможность получать и предоставлять займы через интернет, </w:t>
+        <w:t xml:space="preserve">Одними из наиболее известных и широко используемых платформ в сфере P2P-кредитования являются международные сервисы, такие как LendingClub, Prosper и Funding Circle. Эти платформы предоставляют пользователям возможность получать и предоставлять займы через интернет, </w:t>
       </w:r>
       <w:r>
         <w:lastRenderedPageBreak/>
@@ -3433,49 +3549,17 @@
     </w:p>
     <w:p>
       <w:r>
-        <w:t xml:space="preserve">Платформа </w:t>
-      </w:r>
-      <w:proofErr w:type="spellStart"/>
-      <w:r>
-        <w:t>LendingClub</w:t>
-      </w:r>
-      <w:proofErr w:type="spellEnd"/>
-      <w:r>
-        <w:t xml:space="preserve"> является одной из крупнейших в мире систем P2P-кредитования. Она предлагает автоматизированный процесс оценки заемщиков на основе кредитной истории, доходов и других финансовых показателей. Система использует внутренние алгоритмы скоринга, присваивая заемщикам рейтинги, которые влияют на процентную ставку по займу. Однако данный подход ориентирован преимущественно на пользователей с уже сформированной кредитной историей, что делает платформу менее доступной для студентов.</w:t>
-      </w:r>
-    </w:p>
-    <w:p>
-      <w:r>
-        <w:t xml:space="preserve">Сервис </w:t>
-      </w:r>
-      <w:proofErr w:type="spellStart"/>
-      <w:r>
-        <w:t>Prosper</w:t>
-      </w:r>
-      <w:proofErr w:type="spellEnd"/>
-      <w:r>
-        <w:t xml:space="preserve"> реализует схожую модель, предоставляя пользователям возможность инвестировать средства в заявки заемщиков. Особенностью платформы является наличие аукционного механизма, при котором процентная ставка может формироваться в зависимости от предложений кредиторов. Тем не менее, как и в предыдущем случае, основное внимание уделяется финансовым показателям заемщика, без учета альтернативных факторов, таких как образовательные достижения.</w:t>
-      </w:r>
-    </w:p>
-    <w:p>
-      <w:r>
-        <w:t xml:space="preserve">Платформа </w:t>
-      </w:r>
-      <w:proofErr w:type="spellStart"/>
-      <w:r>
-        <w:t>Funding</w:t>
-      </w:r>
-      <w:proofErr w:type="spellEnd"/>
-      <w:r>
-        <w:t xml:space="preserve"> </w:t>
-      </w:r>
-      <w:proofErr w:type="spellStart"/>
-      <w:r>
-        <w:t>Circle</w:t>
-      </w:r>
-      <w:proofErr w:type="spellEnd"/>
-      <w:r>
-        <w:t xml:space="preserve"> ориентирована на кредитование малого и среднего бизнеса. Она использует более строгие процедуры проверки заемщиков, включая анализ финансовой отчетности и кредитной истории компаний. Несмотря на высокую надежность, данный подход не применим напрямую к студенческой аудитории, что ограничивает возможность использования подобных решений в рамках рассматриваемой предметной области.</w:t>
+        <w:t>Платформа LendingClub является одной из крупнейших в мире систем P2P-кредитования. Она предлагает автоматизированный процесс оценки заемщиков на основе кредитной истории, доходов и других финансовых показателей. Система использует внутренние алгоритмы скоринга, присваивая заемщикам рейтинги, которые влияют на процентную ставку по займу. Однако данный подход ориентирован преимущественно на пользователей с уже сформированной кредитной историей, что делает платформу менее доступной для студентов.</w:t>
+      </w:r>
+    </w:p>
+    <w:p>
+      <w:r>
+        <w:t>Сервис Prosper реализует схожую модель, предоставляя пользователям возможность инвестировать средства в заявки заемщиков. Особенностью платформы является наличие аукционного механизма, при котором процентная ставка может формироваться в зависимости от предложений кредиторов. Тем не менее, как и в предыдущем случае, основное внимание уделяется финансовым показателям заемщика, без учета альтернативных факторов, таких как образовательные достижения.</w:t>
+      </w:r>
+    </w:p>
+    <w:p>
+      <w:r>
+        <w:t>Платформа Funding Circle ориентирована на кредитование малого и среднего бизнеса. Она использует более строгие процедуры проверки заемщиков, включая анализ финансовой отчетности и кредитной истории компаний. Несмотря на высокую надежность, данный подход не применим напрямую к студенческой аудитории, что ограничивает возможность использования подобных решений в рамках рассматриваемой предметной области.</w:t>
       </w:r>
     </w:p>
     <w:p>
@@ -3541,11 +3625,9 @@
             <w:pPr>
               <w:ind w:firstLine="0"/>
             </w:pPr>
-            <w:proofErr w:type="spellStart"/>
             <w:r>
               <w:t>LendingClub</w:t>
             </w:r>
-            <w:proofErr w:type="spellEnd"/>
           </w:p>
         </w:tc>
         <w:tc>
@@ -3556,11 +3638,9 @@
             <w:pPr>
               <w:ind w:firstLine="0"/>
             </w:pPr>
-            <w:proofErr w:type="spellStart"/>
             <w:r>
               <w:t>Prosper</w:t>
             </w:r>
-            <w:proofErr w:type="spellEnd"/>
           </w:p>
         </w:tc>
         <w:tc>
@@ -3571,19 +3651,9 @@
             <w:pPr>
               <w:ind w:firstLine="0"/>
             </w:pPr>
-            <w:proofErr w:type="spellStart"/>
-            <w:r>
-              <w:t>Funding</w:t>
-            </w:r>
-            <w:proofErr w:type="spellEnd"/>
-            <w:r>
-              <w:t xml:space="preserve"> </w:t>
-            </w:r>
-            <w:proofErr w:type="spellStart"/>
-            <w:r>
-              <w:t>Circle</w:t>
-            </w:r>
-            <w:proofErr w:type="spellEnd"/>
+            <w:r>
+              <w:t>Funding Circle</w:t>
+            </w:r>
           </w:p>
         </w:tc>
       </w:tr>
@@ -3798,11 +3868,9 @@
             <w:pPr>
               <w:ind w:firstLine="0"/>
             </w:pPr>
-            <w:proofErr w:type="spellStart"/>
             <w:r>
               <w:t>LendingClub</w:t>
             </w:r>
-            <w:proofErr w:type="spellEnd"/>
           </w:p>
         </w:tc>
         <w:tc>
@@ -3813,11 +3881,9 @@
             <w:pPr>
               <w:ind w:firstLine="0"/>
             </w:pPr>
-            <w:proofErr w:type="spellStart"/>
             <w:r>
               <w:t>Prosper</w:t>
             </w:r>
-            <w:proofErr w:type="spellEnd"/>
           </w:p>
         </w:tc>
         <w:tc>
@@ -3828,19 +3894,9 @@
             <w:pPr>
               <w:ind w:firstLine="0"/>
             </w:pPr>
-            <w:proofErr w:type="spellStart"/>
-            <w:r>
-              <w:t>Funding</w:t>
-            </w:r>
-            <w:proofErr w:type="spellEnd"/>
-            <w:r>
-              <w:t xml:space="preserve"> </w:t>
-            </w:r>
-            <w:proofErr w:type="spellStart"/>
-            <w:r>
-              <w:t>Circle</w:t>
-            </w:r>
-            <w:proofErr w:type="spellEnd"/>
+            <w:r>
+              <w:t>Funding Circle</w:t>
+            </w:r>
           </w:p>
         </w:tc>
       </w:tr>
@@ -4049,23 +4105,7 @@
     </w:p>
     <w:p>
       <w:r>
-        <w:t xml:space="preserve">Также следует отметить, что большинство существующих решений реализовано в виде распределенных веб-приложений, использующих клиент-серверную архитектуру и </w:t>
-      </w:r>
-      <w:proofErr w:type="spellStart"/>
-      <w:r>
-        <w:t>RESTful</w:t>
-      </w:r>
-      <w:proofErr w:type="spellEnd"/>
-      <w:r>
-        <w:t xml:space="preserve"> API. Это обеспечивает масштабируемость и возможность интеграции с внешними сервисами. Однако не все платформы реализуют современные архитектурные подходы, такие как </w:t>
-      </w:r>
-      <w:proofErr w:type="spellStart"/>
-      <w:r>
-        <w:t>микросервисная</w:t>
-      </w:r>
-      <w:proofErr w:type="spellEnd"/>
-      <w:r>
-        <w:t xml:space="preserve"> архитектура, что может ограничивать их гибкость и возможности развития.</w:t>
+        <w:t>Также следует отметить, что большинство существующих решений реализовано в виде распределенных веб-приложений, использующих клиент-серверную архитектуру и RESTful API. Это обеспечивает масштабируемость и возможность интеграции с внешними сервисами. Однако не все платформы реализуют современные архитектурные подходы, такие как микросервисная архитектура, что может ограничивать их гибкость и возможности развития.</w:t>
       </w:r>
     </w:p>
     <w:p>
@@ -4174,9 +4214,330 @@
       </w:r>
     </w:p>
     <w:p>
+      <w:r>
+        <w:br w:type="page"/>
+      </w:r>
+    </w:p>
+    <w:p>
+      <w:pPr>
+        <w:pStyle w:val="1"/>
+        <w:numPr>
+          <w:ilvl w:val="0"/>
+          <w:numId w:val="1"/>
+        </w:numPr>
+        <w:ind w:left="709" w:firstLine="11"/>
+        <w:jc w:val="both"/>
+      </w:pPr>
+      <w:bookmarkStart w:id="5" w:name="_Toc223367493"/>
+      <w:r>
+        <w:lastRenderedPageBreak/>
+        <w:t>Моделирование предметной области и разработка требований к программному средству</w:t>
+      </w:r>
+      <w:bookmarkEnd w:id="5"/>
+    </w:p>
+    <w:p>
+      <w:pPr>
+        <w:ind w:left="720" w:firstLine="0"/>
+      </w:pPr>
+    </w:p>
+    <w:p>
+      <w:pPr>
+        <w:pStyle w:val="2"/>
+        <w:rPr>
+          <w:lang w:val="ru-RU"/>
+        </w:rPr>
+      </w:pPr>
+      <w:bookmarkStart w:id="6" w:name="_Toc223367494"/>
+      <w:r>
+        <w:rPr>
+          <w:lang w:val="ru-RU"/>
+        </w:rPr>
+        <w:t>Анализ и формализация бизнес-процессов предметной области</w:t>
+      </w:r>
+      <w:bookmarkEnd w:id="6"/>
+    </w:p>
+    <w:p/>
+    <w:p>
+      <w:r>
+        <w:t>В рамках разработки программного средства важным этапом является анализ и формализация бизнес-процессов предметной области. Это позволяет структурировать взаимодействие участников системы, выявить узкие места текущих процессов и определить направления их оптимизации. Для моделирования бизнес-процессов используется нотация BPMN (Business Process Model and Notation), которая обеспечивает наглядное представление последовательности действий, событий и взаимодействий между участниками системы [1</w:t>
+      </w:r>
+      <w:r>
+        <w:t>1</w:t>
+      </w:r>
+      <w:r>
+        <w:t>].</w:t>
+      </w:r>
+    </w:p>
+    <w:p>
+      <w:r>
+        <w:t>BPMN является общепринятым стандартом моделирования бизнес-процессов, позволяющим описывать как простые, так и сложные распределенные системы. Использование данной нотации обеспечивает единое понимание процессов всеми участниками разработки, включая аналитиков, разработчиков и заказчиков, а также упрощает дальнейшее проектирование архитектуры программного средства.</w:t>
+      </w:r>
+    </w:p>
+    <w:p>
+      <w:r>
+        <w:t>В рамках данного курсового проекта моделирование бизнес-процессов выполнено в двух вариантах: AS-IS (текущее состояние) и TO-BE (целевое состояние). Такой подход позволяет не только зафиксировать существующие процессы, но и наглядно продемонстрировать преимущества предлагаемого решения.</w:t>
+      </w:r>
+    </w:p>
+    <w:p>
+      <w:r>
+        <w:t>Модель AS-IS отражает текущий процесс взаимодействия заемщиков и кредиторов в условиях упрощенной P2P-системы, в которой отсутствуют специализированные механизмы оценки надежности студентов и гарантии возврата займов.</w:t>
+      </w:r>
+    </w:p>
+    <w:p>
+      <w:r>
+        <w:t xml:space="preserve">Данная модель представлена на рисунке </w:t>
+      </w:r>
+      <w:r>
+        <w:t>2</w:t>
+      </w:r>
+      <w:r>
+        <w:t>.1.</w:t>
+      </w:r>
+    </w:p>
+    <w:p>
       <w:pPr>
         <w:ind w:firstLine="0"/>
       </w:pPr>
+      <w:r>
+        <w:rPr>
+          <w:noProof/>
+        </w:rPr>
+        <w:lastRenderedPageBreak/>
+        <w:drawing>
+          <wp:inline distT="0" distB="0" distL="0" distR="0" wp14:anchorId="0828A81A" wp14:editId="1BC9E80F">
+            <wp:extent cx="5935980" cy="2842260"/>
+            <wp:effectExtent l="19050" t="19050" r="26670" b="15240"/>
+            <wp:docPr id="4" name="Рисунок 4"/>
+            <wp:cNvGraphicFramePr>
+              <a:graphicFrameLocks xmlns:a="http://schemas.openxmlformats.org/drawingml/2006/main" noChangeAspect="1"/>
+            </wp:cNvGraphicFramePr>
+            <a:graphic xmlns:a="http://schemas.openxmlformats.org/drawingml/2006/main">
+              <a:graphicData uri="http://schemas.openxmlformats.org/drawingml/2006/picture">
+                <pic:pic xmlns:pic="http://schemas.openxmlformats.org/drawingml/2006/picture">
+                  <pic:nvPicPr>
+                    <pic:cNvPr id="0" name="Picture 2"/>
+                    <pic:cNvPicPr>
+                      <a:picLocks noChangeAspect="1" noChangeArrowheads="1"/>
+                    </pic:cNvPicPr>
+                  </pic:nvPicPr>
+                  <pic:blipFill>
+                    <a:blip r:embed="rId8">
+                      <a:extLst>
+                        <a:ext uri="{28A0092B-C50C-407E-A947-70E740481C1C}">
+                          <a14:useLocalDpi xmlns:a14="http://schemas.microsoft.com/office/drawing/2010/main" val="0"/>
+                        </a:ext>
+                      </a:extLst>
+                    </a:blip>
+                    <a:srcRect/>
+                    <a:stretch>
+                      <a:fillRect/>
+                    </a:stretch>
+                  </pic:blipFill>
+                  <pic:spPr bwMode="auto">
+                    <a:xfrm>
+                      <a:off x="0" y="0"/>
+                      <a:ext cx="5935980" cy="2842260"/>
+                    </a:xfrm>
+                    <a:prstGeom prst="rect">
+                      <a:avLst/>
+                    </a:prstGeom>
+                    <a:noFill/>
+                    <a:ln>
+                      <a:solidFill>
+                        <a:schemeClr val="tx1"/>
+                      </a:solidFill>
+                    </a:ln>
+                  </pic:spPr>
+                </pic:pic>
+              </a:graphicData>
+            </a:graphic>
+          </wp:inline>
+        </w:drawing>
+      </w:r>
+    </w:p>
+    <w:p>
+      <w:pPr>
+        <w:ind w:firstLine="0"/>
+      </w:pPr>
+    </w:p>
+    <w:p>
+      <w:pPr>
+        <w:ind w:firstLine="0"/>
+        <w:jc w:val="center"/>
+      </w:pPr>
+      <w:r>
+        <w:t xml:space="preserve">Рисунок 2.1 – </w:t>
+      </w:r>
+      <w:r>
+        <w:t>BPMN-модель бизнес-процесса</w:t>
+      </w:r>
+      <w:r>
+        <w:t xml:space="preserve"> платформы </w:t>
+      </w:r>
+      <w:r>
+        <w:rPr>
+          <w:lang w:val="en-US"/>
+        </w:rPr>
+        <w:t>P</w:t>
+      </w:r>
+      <w:r>
+        <w:t>2</w:t>
+      </w:r>
+      <w:r>
+        <w:rPr>
+          <w:lang w:val="en-US"/>
+        </w:rPr>
+        <w:t>P</w:t>
+      </w:r>
+      <w:r>
+        <w:t>-</w:t>
+      </w:r>
+      <w:r>
+        <w:t>кредитования студентов (AS IS)</w:t>
+      </w:r>
+    </w:p>
+    <w:p/>
+    <w:p>
+      <w:r>
+        <w:t>В рамках модели AS-IS основными участниками процесса являются заемщик и кредитор, взаимодействующие через платформу. Процесс начинается с возникновения потребности заемщика в получении финансовых средств, после чего он формирует и отправляет заявку. Кредитор получает данную заявку, выполняет ее анализ на основе ограниченного набора данных и принимает решение о предоставлении или отказе в займе. В случае одобрения осуществляется передача средств, после чего заемщик обязан выполнить возврат средств в установленный срок. Контроль возврата осуществляется в упрощенной форме и не предусматривает сложных механизмов управления рисками.</w:t>
+      </w:r>
+    </w:p>
+    <w:p>
+      <w:r>
+        <w:t>Анализ модели AS-IS показывает, что данный процесс обладает рядом недостатков. В частности, отсутствует глубокая проверка заемщика, не используются дополнительные источники данных для оценки его надежности, а также не реализованы механизмы снижения рисков для кредитора. Это приводит к повышенной вероятности невозврата средств и снижению доверия к системе.</w:t>
+      </w:r>
+    </w:p>
+    <w:p>
+      <w:r>
+        <w:t>С целью устранения выявленных недостатков разработана модель TO-BE, отражающая целевое состояние бизнес-процессов с учетом внедрения дополнительных функциональных возможностей.</w:t>
+      </w:r>
+    </w:p>
+    <w:p>
+      <w:r>
+        <w:t xml:space="preserve">Данная модель представлена на рисунке </w:t>
+      </w:r>
+      <w:r>
+        <w:t>2</w:t>
+      </w:r>
+      <w:r>
+        <w:t>.2.</w:t>
+      </w:r>
+    </w:p>
+    <w:p>
+      <w:pPr>
+        <w:ind w:firstLine="0"/>
+      </w:pPr>
+      <w:r>
+        <w:rPr>
+          <w:noProof/>
+        </w:rPr>
+        <w:lastRenderedPageBreak/>
+        <w:drawing>
+          <wp:inline distT="0" distB="0" distL="0" distR="0" wp14:anchorId="54A543DC" wp14:editId="288BE49A">
+            <wp:extent cx="5928360" cy="2743200"/>
+            <wp:effectExtent l="0" t="0" r="0" b="0"/>
+            <wp:docPr id="5" name="Рисунок 5"/>
+            <wp:cNvGraphicFramePr>
+              <a:graphicFrameLocks xmlns:a="http://schemas.openxmlformats.org/drawingml/2006/main" noChangeAspect="1"/>
+            </wp:cNvGraphicFramePr>
+            <a:graphic xmlns:a="http://schemas.openxmlformats.org/drawingml/2006/main">
+              <a:graphicData uri="http://schemas.openxmlformats.org/drawingml/2006/picture">
+                <pic:pic xmlns:pic="http://schemas.openxmlformats.org/drawingml/2006/picture">
+                  <pic:nvPicPr>
+                    <pic:cNvPr id="0" name="Picture 3"/>
+                    <pic:cNvPicPr>
+                      <a:picLocks noChangeAspect="1" noChangeArrowheads="1"/>
+                    </pic:cNvPicPr>
+                  </pic:nvPicPr>
+                  <pic:blipFill>
+                    <a:blip r:embed="rId9" cstate="print">
+                      <a:extLst>
+                        <a:ext uri="{28A0092B-C50C-407E-A947-70E740481C1C}">
+                          <a14:useLocalDpi xmlns:a14="http://schemas.microsoft.com/office/drawing/2010/main" val="0"/>
+                        </a:ext>
+                      </a:extLst>
+                    </a:blip>
+                    <a:srcRect/>
+                    <a:stretch>
+                      <a:fillRect/>
+                    </a:stretch>
+                  </pic:blipFill>
+                  <pic:spPr bwMode="auto">
+                    <a:xfrm>
+                      <a:off x="0" y="0"/>
+                      <a:ext cx="5928360" cy="2743200"/>
+                    </a:xfrm>
+                    <a:prstGeom prst="rect">
+                      <a:avLst/>
+                    </a:prstGeom>
+                    <a:noFill/>
+                    <a:ln>
+                      <a:noFill/>
+                    </a:ln>
+                  </pic:spPr>
+                </pic:pic>
+              </a:graphicData>
+            </a:graphic>
+          </wp:inline>
+        </w:drawing>
+      </w:r>
+    </w:p>
+    <w:p>
+      <w:pPr>
+        <w:ind w:firstLine="0"/>
+      </w:pPr>
+    </w:p>
+    <w:p>
+      <w:pPr>
+        <w:ind w:firstLine="0"/>
+        <w:jc w:val="center"/>
+      </w:pPr>
+      <w:r>
+        <w:t>Рисунок 2.1 – BPMN-модель бизнес-процесса платформы P2P-кредитования студентов (</w:t>
+      </w:r>
+      <w:r>
+        <w:rPr>
+          <w:lang w:val="en-US"/>
+        </w:rPr>
+        <w:t>TO</w:t>
+      </w:r>
+      <w:r>
+        <w:t xml:space="preserve"> </w:t>
+      </w:r>
+      <w:r>
+        <w:rPr>
+          <w:lang w:val="en-US"/>
+        </w:rPr>
+        <w:t>BE</w:t>
+      </w:r>
+      <w:r>
+        <w:t>)</w:t>
+      </w:r>
+    </w:p>
+    <w:p/>
+    <w:p>
+      <w:r>
+        <w:t>В отличие от текущего состояния, модель TO-BE включает в себя расширенный набор участников и процессов. Помимо заемщика и кредитора, в системе выделяется активная роль платформы как самостоятельного участника, выполняющего функции анализа данных, проверки пользователей и управления рисками. Процесс начинается с регистрации пользователя и заполнения профиля, включая данные об академической успеваемости. После отправки заявки система выполняет комплексную проверку, включающую анализ предоставленных данных и расчет скорингового показателя.</w:t>
+      </w:r>
+    </w:p>
+    <w:p>
+      <w:r>
+        <w:t>На основании результатов скоринга принимается решение о возможности публикации заявки. В случае положительного результата заявка становится доступной для кредиторов, которые получают уведомления и могут принять решение о финансировании. Дополнительно система формирует механизмы гарантий возврата, такие как рейтинги пользователей или резервные фонды. После предоставления средств осуществляется постоянный мониторинг выполнения обязательств заемщиком, включая контроль сроков и обработку возможных просрочек.</w:t>
+      </w:r>
+    </w:p>
+    <w:p>
+      <w:r>
+        <w:t>Таким образом, модель TO-BE демонстрирует более сложную, но при этом значительно более эффективную организацию бизнес-процессов. Внедрение модуля проверки успеваемости позволяет учитывать дополнительные характеристики заемщика, что повышает точность оценки его надежности. Реализация механизмов гарантий возврата средств снижает риски для кредиторов и способствует повышению доверия к платформе.</w:t>
+      </w:r>
+    </w:p>
+    <w:p>
+      <w:r>
+        <w:t xml:space="preserve">Сравнительный анализ моделей AS-IS и TO-BE позволяет сделать вывод о целесообразности внедрения предлагаемых изменений. Переход к целевой </w:t>
+      </w:r>
+      <w:r>
+        <w:lastRenderedPageBreak/>
+        <w:t>модели обеспечивает повышение прозрачности процессов, снижение уровня рисков и улучшение качества взаимодействия между участниками системы. Это, в свою очередь, создает предпосылки для успешной реализации платформы P2P-кредитования студентов и ее эффективного функционирования в условиях реальной эксплуатации.</w:t>
+      </w:r>
     </w:p>
     <w:p>
       <w:r>
@@ -4191,7 +4552,7 @@
           <w:lang w:val="en-US"/>
         </w:rPr>
       </w:pPr>
-      <w:bookmarkStart w:id="5" w:name="_Toc224921135"/>
+      <w:bookmarkStart w:id="7" w:name="_Toc223367497"/>
       <w:r>
         <w:lastRenderedPageBreak/>
         <w:t>Список</w:t>
@@ -4214,7 +4575,7 @@
       <w:r>
         <w:t>источников</w:t>
       </w:r>
-      <w:bookmarkEnd w:id="5"/>
+      <w:bookmarkEnd w:id="7"/>
     </w:p>
     <w:p>
       <w:pPr>
@@ -4234,440 +4595,323 @@
         <w:rPr>
           <w:lang w:val="en-US"/>
         </w:rPr>
-        <w:t xml:space="preserve">[1] Lin M., Viswanathan S., </w:t>
-      </w:r>
-      <w:proofErr w:type="spellStart"/>
-      <w:r>
+        <w:t xml:space="preserve">[1] Lin M., Viswanathan S., Prabhala N. Judging Borrowers by the Company They Keep: Friendship Networks and Information Asymmetry in Online Peer-to-Peer Lending // Management Science. – 2013. – Vol. 59, No. 1. – P. 17–35. </w:t>
+      </w:r>
+    </w:p>
+    <w:p>
+      <w:r>
+        <w:t xml:space="preserve">[2] Антиплагиат [Электронный ресурс]. – Режим доступа: https://antiplagiat.ru – Дата обращения: </w:t>
+      </w:r>
+      <w:r>
+        <w:rPr>
+          <w:highlight w:val="yellow"/>
+        </w:rPr>
+        <w:t>ХХ.ХХ.ХХХХ</w:t>
+      </w:r>
+      <w:r>
+        <w:t>.</w:t>
+      </w:r>
+    </w:p>
+    <w:p>
+      <w:pPr>
         <w:rPr>
           <w:lang w:val="en-US"/>
         </w:rPr>
-        <w:t>Prabhala</w:t>
-      </w:r>
-      <w:proofErr w:type="spellEnd"/>
+      </w:pPr>
       <w:r>
         <w:rPr>
           <w:lang w:val="en-US"/>
         </w:rPr>
-        <w:t xml:space="preserve"> N. Judging Borrowers by the Company They Keep: Friendship Networks and Information Asymmetry in Online Peer-to-Peer Lending // Management Science. – 2013. – Vol. 59, No. 1. – P. 17–35. </w:t>
-      </w:r>
-    </w:p>
-    <w:p>
-      <w:r>
-        <w:t xml:space="preserve">[2] Антиплагиат [Электронный ресурс]. – Режим доступа: https://antiplagiat.ru – Дата обращения: </w:t>
-      </w:r>
-      <w:r>
-        <w:rPr>
-          <w:highlight w:val="yellow"/>
-        </w:rPr>
-        <w:t>ХХ.ХХ.ХХХХ</w:t>
+        <w:t>[</w:t>
+      </w:r>
+      <w:r>
+        <w:rPr>
+          <w:lang w:val="en-US"/>
+        </w:rPr>
+        <w:t>3</w:t>
+      </w:r>
+      <w:r>
+        <w:rPr>
+          <w:lang w:val="en-US"/>
+        </w:rPr>
+        <w:t>] Claessens S., Frost J., Turner G., Zhu F. Fintech credit markets around the world: size, drivers and policy issues // BIS Quarterly Review. – 2018.</w:t>
+      </w:r>
+    </w:p>
+    <w:p>
+      <w:pPr>
+        <w:rPr>
+          <w:lang w:val="en-US"/>
+        </w:rPr>
+      </w:pPr>
+      <w:r>
+        <w:rPr>
+          <w:lang w:val="en-US"/>
+        </w:rPr>
+        <w:t>[</w:t>
+      </w:r>
+      <w:r>
+        <w:rPr>
+          <w:lang w:val="en-US"/>
+        </w:rPr>
+        <w:t>4</w:t>
+      </w:r>
+      <w:r>
+        <w:rPr>
+          <w:lang w:val="en-US"/>
+        </w:rPr>
+        <w:t>] Morse A. Peer-to-peer crowdfunding: Information and the potential for disruption in consumer lending // Annual Review of Financial Economics. – 2015.</w:t>
+      </w:r>
+    </w:p>
+    <w:p>
+      <w:pPr>
+        <w:rPr>
+          <w:lang w:val="en-US"/>
+        </w:rPr>
+      </w:pPr>
+      <w:r>
+        <w:rPr>
+          <w:lang w:val="en-US"/>
+        </w:rPr>
+        <w:t>[</w:t>
+      </w:r>
+      <w:r>
+        <w:rPr>
+          <w:lang w:val="en-US"/>
+        </w:rPr>
+        <w:t>5</w:t>
+      </w:r>
+      <w:r>
+        <w:rPr>
+          <w:lang w:val="en-US"/>
+        </w:rPr>
+        <w:t>] Stallings W. Cryptography and Network Security: Principles and Practice. – Pearson, 2017.</w:t>
+      </w:r>
+    </w:p>
+    <w:p>
+      <w:pPr>
+        <w:rPr>
+          <w:lang w:val="en-US"/>
+        </w:rPr>
+      </w:pPr>
+      <w:r>
+        <w:rPr>
+          <w:lang w:val="en-US"/>
+        </w:rPr>
+        <w:t>[</w:t>
+      </w:r>
+      <w:r>
+        <w:rPr>
+          <w:lang w:val="en-US"/>
+        </w:rPr>
+        <w:t>6</w:t>
+      </w:r>
+      <w:r>
+        <w:rPr>
+          <w:lang w:val="en-US"/>
+        </w:rPr>
+        <w:t>] Milne A., Parboteeah P. The business models and economics of peer-to-peer lending // European Credit Research Institute. – 2016.</w:t>
+      </w:r>
+    </w:p>
+    <w:p>
+      <w:pPr>
+        <w:rPr>
+          <w:lang w:val="en-US"/>
+        </w:rPr>
+      </w:pPr>
+      <w:r>
+        <w:rPr>
+          <w:lang w:val="en-US"/>
+        </w:rPr>
+        <w:t>[</w:t>
+      </w:r>
+      <w:r>
+        <w:t>7</w:t>
+      </w:r>
+      <w:r>
+        <w:rPr>
+          <w:lang w:val="en-US"/>
+        </w:rPr>
+        <w:t>] European Banking Authority. Opinion on lending-based crowdfunding. – 2015.</w:t>
+      </w:r>
+    </w:p>
+    <w:p>
+      <w:pPr>
+        <w:rPr>
+          <w:lang w:val="en-US"/>
+        </w:rPr>
+      </w:pPr>
+      <w:r>
+        <w:rPr>
+          <w:lang w:val="en-US"/>
+        </w:rPr>
+        <w:t>[</w:t>
+      </w:r>
+      <w:r>
+        <w:rPr>
+          <w:lang w:val="en-US"/>
+        </w:rPr>
+        <w:t>8</w:t>
+      </w:r>
+      <w:r>
+        <w:rPr>
+          <w:lang w:val="en-US"/>
+        </w:rPr>
+        <w:t>] LendingClub Corporation. Official website. – Режим доступа: https://www.lendingclub.com – Дата обращения: 20.03.2026.</w:t>
+      </w:r>
+    </w:p>
+    <w:p>
+      <w:pPr>
+        <w:rPr>
+          <w:lang w:val="en-US"/>
+        </w:rPr>
+      </w:pPr>
+      <w:r>
+        <w:rPr>
+          <w:lang w:val="en-US"/>
+        </w:rPr>
+        <w:t>[</w:t>
+      </w:r>
+      <w:r>
+        <w:rPr>
+          <w:lang w:val="en-US"/>
+        </w:rPr>
+        <w:t>9</w:t>
+      </w:r>
+      <w:r>
+        <w:rPr>
+          <w:lang w:val="en-US"/>
+        </w:rPr>
+        <w:t xml:space="preserve">] Prosper Marketplace. Official website. – Режим доступа: https://www.prosper.com – </w:t>
+      </w:r>
+      <w:r>
+        <w:t>Дата</w:t>
+      </w:r>
+      <w:r>
+        <w:rPr>
+          <w:lang w:val="en-US"/>
+        </w:rPr>
+        <w:t xml:space="preserve"> </w:t>
+      </w:r>
+      <w:r>
+        <w:t>обращения</w:t>
+      </w:r>
+      <w:r>
+        <w:rPr>
+          <w:lang w:val="en-US"/>
+        </w:rPr>
+        <w:t>: 20.03.2026.</w:t>
+      </w:r>
+    </w:p>
+    <w:p>
+      <w:r>
+        <w:t>[</w:t>
+      </w:r>
+      <w:r>
+        <w:t>10</w:t>
+      </w:r>
+      <w:r>
+        <w:t xml:space="preserve">] </w:t>
+      </w:r>
+      <w:r>
+        <w:rPr>
+          <w:lang w:val="en-US"/>
+        </w:rPr>
+        <w:t>Funding</w:t>
+      </w:r>
+      <w:r>
+        <w:t xml:space="preserve"> </w:t>
+      </w:r>
+      <w:r>
+        <w:rPr>
+          <w:lang w:val="en-US"/>
+        </w:rPr>
+        <w:t>Circle</w:t>
+      </w:r>
+      <w:r>
+        <w:t xml:space="preserve">. </w:t>
+      </w:r>
+      <w:r>
+        <w:rPr>
+          <w:lang w:val="en-US"/>
+        </w:rPr>
+        <w:t>Official</w:t>
+      </w:r>
+      <w:r>
+        <w:t xml:space="preserve"> </w:t>
+      </w:r>
+      <w:r>
+        <w:rPr>
+          <w:lang w:val="en-US"/>
+        </w:rPr>
+        <w:t>website</w:t>
+      </w:r>
+      <w:r>
+        <w:t xml:space="preserve">. – Режим доступа: </w:t>
+      </w:r>
+      <w:r>
+        <w:rPr>
+          <w:lang w:val="en-US"/>
+        </w:rPr>
+        <w:t>https</w:t>
+      </w:r>
+      <w:r>
+        <w:t>://</w:t>
+      </w:r>
+      <w:r>
+        <w:rPr>
+          <w:lang w:val="en-US"/>
+        </w:rPr>
+        <w:t>www</w:t>
       </w:r>
       <w:r>
         <w:t>.</w:t>
       </w:r>
-    </w:p>
-    <w:p>
-      <w:pPr>
+      <w:r>
         <w:rPr>
           <w:lang w:val="en-US"/>
         </w:rPr>
-      </w:pPr>
+        <w:t>fundingcircle</w:t>
+      </w:r>
+      <w:r>
+        <w:t>.</w:t>
+      </w:r>
       <w:r>
         <w:rPr>
           <w:lang w:val="en-US"/>
         </w:rPr>
-        <w:t>[</w:t>
-      </w:r>
-      <w:r>
+        <w:t>com</w:t>
+      </w:r>
+      <w:r>
+        <w:t xml:space="preserve"> – Дата обращения: 20.03.2026.</w:t>
+      </w:r>
+    </w:p>
+    <w:p>
+      <w:pPr>
         <w:rPr>
           <w:lang w:val="en-US"/>
         </w:rPr>
-        <w:t>3</w:t>
-      </w:r>
+      </w:pPr>
       <w:r>
         <w:rPr>
           <w:lang w:val="en-US"/>
         </w:rPr>
-        <w:t xml:space="preserve">] </w:t>
-      </w:r>
-      <w:proofErr w:type="spellStart"/>
+        <w:t>[1</w:t>
+      </w:r>
       <w:r>
         <w:rPr>
           <w:lang w:val="en-US"/>
         </w:rPr>
-        <w:t>Claessens</w:t>
-      </w:r>
-      <w:proofErr w:type="spellEnd"/>
+        <w:t>1</w:t>
+      </w:r>
       <w:r>
         <w:rPr>
           <w:lang w:val="en-US"/>
         </w:rPr>
-        <w:t xml:space="preserve"> S., Frost J., Turner G., Zhu F. Fintech credit markets around the world: size, drivers and policy issues // BIS Quarterly Review. – 2018.</w:t>
-      </w:r>
-    </w:p>
-    <w:p>
-      <w:pPr>
-        <w:rPr>
-          <w:lang w:val="en-US"/>
-        </w:rPr>
-      </w:pPr>
-      <w:r>
-        <w:rPr>
-          <w:lang w:val="en-US"/>
-        </w:rPr>
-        <w:t>[</w:t>
-      </w:r>
-      <w:r>
-        <w:rPr>
-          <w:lang w:val="en-US"/>
-        </w:rPr>
-        <w:t>4</w:t>
-      </w:r>
-      <w:r>
-        <w:rPr>
-          <w:lang w:val="en-US"/>
-        </w:rPr>
-        <w:t>] Morse A. Peer-to-peer crowdfunding: Information and the potential for disruption in consumer lending // Annual Review of Financial Economics. – 2015.</w:t>
-      </w:r>
-    </w:p>
-    <w:p>
-      <w:pPr>
-        <w:rPr>
-          <w:lang w:val="en-US"/>
-        </w:rPr>
-      </w:pPr>
-      <w:r>
-        <w:rPr>
-          <w:lang w:val="en-US"/>
-        </w:rPr>
-        <w:t>[</w:t>
-      </w:r>
-      <w:r>
-        <w:rPr>
-          <w:lang w:val="en-US"/>
-        </w:rPr>
-        <w:t>5</w:t>
-      </w:r>
-      <w:r>
-        <w:rPr>
-          <w:lang w:val="en-US"/>
-        </w:rPr>
-        <w:t>] Stallings W. Cryptography and Network Security: Principles and Practice. – Pearson, 2017.</w:t>
-      </w:r>
-    </w:p>
-    <w:p>
-      <w:pPr>
-        <w:rPr>
-          <w:lang w:val="en-US"/>
-        </w:rPr>
-      </w:pPr>
-      <w:r>
-        <w:rPr>
-          <w:lang w:val="en-US"/>
-        </w:rPr>
-        <w:t>[</w:t>
-      </w:r>
-      <w:r>
-        <w:rPr>
-          <w:lang w:val="en-US"/>
-        </w:rPr>
-        <w:t>6</w:t>
-      </w:r>
-      <w:r>
-        <w:rPr>
-          <w:lang w:val="en-US"/>
-        </w:rPr>
-        <w:t xml:space="preserve">] Milne A., </w:t>
-      </w:r>
-      <w:proofErr w:type="spellStart"/>
-      <w:r>
-        <w:rPr>
-          <w:lang w:val="en-US"/>
-        </w:rPr>
-        <w:t>Parboteeah</w:t>
-      </w:r>
-      <w:proofErr w:type="spellEnd"/>
-      <w:r>
-        <w:rPr>
-          <w:lang w:val="en-US"/>
-        </w:rPr>
-        <w:t xml:space="preserve"> P. The business models and economics of peer-to-peer lending // European Credit Research Institute. – 2016.</w:t>
-      </w:r>
-    </w:p>
-    <w:p>
-      <w:pPr>
-        <w:rPr>
-          <w:lang w:val="en-US"/>
-        </w:rPr>
-      </w:pPr>
-      <w:r>
-        <w:rPr>
-          <w:lang w:val="en-US"/>
-        </w:rPr>
-        <w:t>[</w:t>
-      </w:r>
-      <w:r>
-        <w:t>7</w:t>
-      </w:r>
-      <w:r>
-        <w:rPr>
-          <w:lang w:val="en-US"/>
-        </w:rPr>
-        <w:t>] European Banking Authority. Opinion on lending-based crowdfunding. – 2015.</w:t>
-      </w:r>
-    </w:p>
-    <w:p>
-      <w:pPr>
-        <w:rPr>
-          <w:lang w:val="en-US"/>
-        </w:rPr>
-      </w:pPr>
-      <w:r>
-        <w:rPr>
-          <w:lang w:val="en-US"/>
-        </w:rPr>
-        <w:t>[</w:t>
-      </w:r>
-      <w:r>
-        <w:rPr>
-          <w:lang w:val="en-US"/>
-        </w:rPr>
-        <w:t>8</w:t>
-      </w:r>
-      <w:r>
-        <w:rPr>
-          <w:lang w:val="en-US"/>
-        </w:rPr>
-        <w:t xml:space="preserve">] </w:t>
-      </w:r>
-      <w:proofErr w:type="spellStart"/>
-      <w:r>
-        <w:rPr>
-          <w:lang w:val="en-US"/>
-        </w:rPr>
-        <w:t>LendingClub</w:t>
-      </w:r>
-      <w:proofErr w:type="spellEnd"/>
-      <w:r>
-        <w:rPr>
-          <w:lang w:val="en-US"/>
-        </w:rPr>
-        <w:t xml:space="preserve"> Corporation. Official website. – </w:t>
-      </w:r>
-      <w:proofErr w:type="spellStart"/>
-      <w:r>
-        <w:rPr>
-          <w:lang w:val="en-US"/>
-        </w:rPr>
-        <w:t>Режим</w:t>
-      </w:r>
-      <w:proofErr w:type="spellEnd"/>
-      <w:r>
-        <w:rPr>
-          <w:lang w:val="en-US"/>
-        </w:rPr>
-        <w:t xml:space="preserve"> </w:t>
-      </w:r>
-      <w:proofErr w:type="spellStart"/>
-      <w:r>
-        <w:rPr>
-          <w:lang w:val="en-US"/>
-        </w:rPr>
-        <w:t>доступа</w:t>
-      </w:r>
-      <w:proofErr w:type="spellEnd"/>
-      <w:r>
-        <w:rPr>
-          <w:lang w:val="en-US"/>
-        </w:rPr>
-        <w:t xml:space="preserve">: https://www.lendingclub.com – </w:t>
-      </w:r>
-      <w:proofErr w:type="spellStart"/>
-      <w:r>
-        <w:rPr>
-          <w:lang w:val="en-US"/>
-        </w:rPr>
-        <w:t>Дата</w:t>
-      </w:r>
-      <w:proofErr w:type="spellEnd"/>
-      <w:r>
-        <w:rPr>
-          <w:lang w:val="en-US"/>
-        </w:rPr>
-        <w:t xml:space="preserve"> </w:t>
-      </w:r>
-      <w:proofErr w:type="spellStart"/>
-      <w:r>
-        <w:rPr>
-          <w:lang w:val="en-US"/>
-        </w:rPr>
-        <w:t>обращения</w:t>
-      </w:r>
-      <w:proofErr w:type="spellEnd"/>
-      <w:r>
-        <w:rPr>
-          <w:lang w:val="en-US"/>
-        </w:rPr>
-        <w:t>: 20.03.2026.</w:t>
-      </w:r>
-    </w:p>
-    <w:p>
-      <w:pPr>
-        <w:rPr>
-          <w:lang w:val="en-US"/>
-        </w:rPr>
-      </w:pPr>
-      <w:r>
-        <w:rPr>
-          <w:lang w:val="en-US"/>
-        </w:rPr>
-        <w:t>[</w:t>
-      </w:r>
-      <w:r>
-        <w:rPr>
-          <w:lang w:val="en-US"/>
-        </w:rPr>
-        <w:t>9</w:t>
-      </w:r>
-      <w:r>
-        <w:rPr>
-          <w:lang w:val="en-US"/>
-        </w:rPr>
-        <w:t xml:space="preserve">] Prosper Marketplace. Official website. – </w:t>
-      </w:r>
-      <w:proofErr w:type="spellStart"/>
-      <w:r>
-        <w:rPr>
-          <w:lang w:val="en-US"/>
-        </w:rPr>
-        <w:t>Режим</w:t>
-      </w:r>
-      <w:proofErr w:type="spellEnd"/>
-      <w:r>
-        <w:rPr>
-          <w:lang w:val="en-US"/>
-        </w:rPr>
-        <w:t xml:space="preserve"> </w:t>
-      </w:r>
-      <w:proofErr w:type="spellStart"/>
-      <w:r>
-        <w:rPr>
-          <w:lang w:val="en-US"/>
-        </w:rPr>
-        <w:t>доступа</w:t>
-      </w:r>
-      <w:proofErr w:type="spellEnd"/>
-      <w:r>
-        <w:rPr>
-          <w:lang w:val="en-US"/>
-        </w:rPr>
-        <w:t xml:space="preserve">: https://www.prosper.com – </w:t>
-      </w:r>
-      <w:r>
-        <w:t>Дата</w:t>
-      </w:r>
-      <w:r>
-        <w:rPr>
-          <w:lang w:val="en-US"/>
-        </w:rPr>
-        <w:t xml:space="preserve"> </w:t>
-      </w:r>
-      <w:r>
-        <w:t>обращения</w:t>
-      </w:r>
-      <w:r>
-        <w:rPr>
-          <w:lang w:val="en-US"/>
-        </w:rPr>
-        <w:t>: 20.03.2026.</w:t>
-      </w:r>
-    </w:p>
-    <w:p>
-      <w:r>
-        <w:t>[</w:t>
-      </w:r>
-      <w:r>
-        <w:t>10</w:t>
-      </w:r>
-      <w:r>
-        <w:t xml:space="preserve">] </w:t>
-      </w:r>
-      <w:r>
-        <w:rPr>
-          <w:lang w:val="en-US"/>
-        </w:rPr>
-        <w:t>Funding</w:t>
-      </w:r>
-      <w:r>
-        <w:t xml:space="preserve"> </w:t>
-      </w:r>
-      <w:r>
-        <w:rPr>
-          <w:lang w:val="en-US"/>
-        </w:rPr>
-        <w:t>Circle</w:t>
-      </w:r>
-      <w:r>
-        <w:t xml:space="preserve">. </w:t>
-      </w:r>
-      <w:r>
-        <w:rPr>
-          <w:lang w:val="en-US"/>
-        </w:rPr>
-        <w:t>Official</w:t>
-      </w:r>
-      <w:r>
-        <w:t xml:space="preserve"> </w:t>
-      </w:r>
-      <w:r>
-        <w:rPr>
-          <w:lang w:val="en-US"/>
-        </w:rPr>
-        <w:t>website</w:t>
-      </w:r>
-      <w:r>
-        <w:t xml:space="preserve">. – Режим доступа: </w:t>
-      </w:r>
-      <w:r>
-        <w:rPr>
-          <w:lang w:val="en-US"/>
-        </w:rPr>
-        <w:t>https</w:t>
-      </w:r>
-      <w:r>
-        <w:t>://</w:t>
-      </w:r>
-      <w:r>
-        <w:rPr>
-          <w:lang w:val="en-US"/>
-        </w:rPr>
-        <w:t>www</w:t>
-      </w:r>
-      <w:r>
-        <w:t>.</w:t>
-      </w:r>
-      <w:proofErr w:type="spellStart"/>
-      <w:r>
-        <w:rPr>
-          <w:lang w:val="en-US"/>
-        </w:rPr>
-        <w:t>fundingcircle</w:t>
-      </w:r>
-      <w:proofErr w:type="spellEnd"/>
-      <w:r>
-        <w:t>.</w:t>
-      </w:r>
-      <w:r>
-        <w:rPr>
-          <w:lang w:val="en-US"/>
-        </w:rPr>
-        <w:t>com</w:t>
-      </w:r>
-      <w:r>
-        <w:t xml:space="preserve"> – Дата обращения: 20.03.2026.</w:t>
+        <w:t>] White S. Business Process Model and Notation (BPMN), Version 2.0. – Object Management Group, 2011.</w:t>
       </w:r>
     </w:p>
     <w:sectPr>
-      <w:footerReference w:type="default" r:id="rId8"/>
+      <w:footerReference w:type="default" r:id="rId10"/>
       <w:pgSz w:w="11906" w:h="16838" w:code="9"/>
       <w:pgMar w:top="1134" w:right="851" w:bottom="1531" w:left="1701" w:header="720" w:footer="964" w:gutter="0"/>
       <w:cols w:space="720"/>

</xml_diff>

<commit_message>
The second chapter: the second subchapter is implemented
</commit_message>
<xml_diff>
--- a/docs/Note.docx
+++ b/docs/Note.docx
@@ -4539,6 +4539,1191 @@
         <w:t>модели обеспечивает повышение прозрачности процессов, снижение уровня рисков и улучшение качества взаимодействия между участниками системы. Это, в свою очередь, создает предпосылки для успешной реализации платформы P2P-кредитования студентов и ее эффективного функционирования в условиях реальной эксплуатации.</w:t>
       </w:r>
     </w:p>
+    <w:p/>
+    <w:p>
+      <w:pPr>
+        <w:pStyle w:val="2"/>
+        <w:rPr>
+          <w:lang w:val="ru-RU"/>
+        </w:rPr>
+      </w:pPr>
+      <w:bookmarkStart w:id="7" w:name="_Toc223367495"/>
+      <w:r>
+        <w:rPr>
+          <w:lang w:val="ru-RU"/>
+        </w:rPr>
+        <w:t>Разработка спецификации требований к программному продукту</w:t>
+      </w:r>
+      <w:bookmarkEnd w:id="7"/>
+    </w:p>
+    <w:p>
+      <w:pPr>
+        <w:ind w:left="720" w:firstLine="0"/>
+      </w:pPr>
+    </w:p>
+    <w:p>
+      <w:r>
+        <w:t>Разработка спецификации требований является ключевым этапом проектирования программного средства, так как именно на данном этапе формируются основные характеристики системы, определяющие ее функциональность, производительность, безопасность и удобство использования. Спецификация требований позволяет формализовать ожидания пользователей и определить границы разрабатываемого решения, что в дальнейшем способствует снижению количества ошибок на этапе реализации и тестирования.</w:t>
+      </w:r>
+    </w:p>
+    <w:p>
+      <w:r>
+        <w:t xml:space="preserve">В рамках данного курсового проекта разрабатывается платформа </w:t>
+      </w:r>
+      <w:r>
+        <w:rPr>
+          <w:lang w:val="en-US"/>
+        </w:rPr>
+        <w:t>P</w:t>
+      </w:r>
+      <w:r>
+        <w:t>2</w:t>
+      </w:r>
+      <w:r>
+        <w:rPr>
+          <w:lang w:val="en-US"/>
+        </w:rPr>
+        <w:t>P</w:t>
+      </w:r>
+      <w:r>
+        <w:t>-кредитования студентов, предназначенная для организации взаимодействия между заемщиками и кредиторами с использованием современных веб-технологий. Система должна обеспечивать полный цикл работы с займами — от подачи заявки до полного возврата средств, а также реализовывать механизмы оценки надежности пользователей и гарантии возврата средств.</w:t>
+      </w:r>
+    </w:p>
+    <w:p>
+      <w:r>
+        <w:t>Функциональные требования определяют перечень возможностей, которые должна предоставлять система пользователям. В рамках разрабатываемого программного средства можно выделить несколько ключевых групп функциональности, связанных с управлением пользователями, обработкой заявок, взаимодействием между участниками и обеспечением безопасности.</w:t>
+      </w:r>
+    </w:p>
+    <w:p>
+      <w:pPr>
+        <w:ind w:left="720" w:firstLine="0"/>
+      </w:pPr>
+      <w:r>
+        <w:t>Для структурирования функциональных требований приведена таблица.</w:t>
+      </w:r>
+    </w:p>
+    <w:p>
+      <w:pPr>
+        <w:ind w:firstLine="0"/>
+      </w:pPr>
+    </w:p>
+    <w:p>
+      <w:pPr>
+        <w:ind w:firstLine="0"/>
+        <w:rPr>
+          <w:lang w:val="en-US"/>
+        </w:rPr>
+      </w:pPr>
+      <w:r>
+        <w:rPr>
+          <w:lang w:val="en-US"/>
+        </w:rPr>
+        <w:t xml:space="preserve">Таблица </w:t>
+      </w:r>
+      <w:r>
+        <w:rPr>
+          <w:lang w:val="en-US"/>
+        </w:rPr>
+        <w:t>2</w:t>
+      </w:r>
+      <w:r>
+        <w:rPr>
+          <w:lang w:val="en-US"/>
+        </w:rPr>
+        <w:t>.</w:t>
+      </w:r>
+      <w:r>
+        <w:rPr>
+          <w:lang w:val="en-US"/>
+        </w:rPr>
+        <w:t>1</w:t>
+      </w:r>
+      <w:r>
+        <w:rPr>
+          <w:lang w:val="en-US"/>
+        </w:rPr>
+        <w:t xml:space="preserve"> – Основные функциональные требования</w:t>
+      </w:r>
+    </w:p>
+    <w:tbl>
+      <w:tblPr>
+        <w:tblStyle w:val="afc"/>
+        <w:tblW w:w="0" w:type="auto"/>
+        <w:tblLook w:val="04A0" w:firstRow="1" w:lastRow="0" w:firstColumn="1" w:lastColumn="0" w:noHBand="0" w:noVBand="1"/>
+      </w:tblPr>
+      <w:tblGrid>
+        <w:gridCol w:w="3114"/>
+        <w:gridCol w:w="3115"/>
+        <w:gridCol w:w="3115"/>
+      </w:tblGrid>
+      <w:tr>
+        <w:tc>
+          <w:tcPr>
+            <w:tcW w:w="3114" w:type="dxa"/>
+          </w:tcPr>
+          <w:p>
+            <w:pPr>
+              <w:ind w:firstLine="0"/>
+              <w:rPr>
+                <w:lang w:val="en-US"/>
+              </w:rPr>
+            </w:pPr>
+            <w:r>
+              <w:rPr>
+                <w:lang w:val="en-US"/>
+              </w:rPr>
+              <w:t>№</w:t>
+            </w:r>
+          </w:p>
+        </w:tc>
+        <w:tc>
+          <w:tcPr>
+            <w:tcW w:w="3115" w:type="dxa"/>
+          </w:tcPr>
+          <w:p>
+            <w:pPr>
+              <w:ind w:firstLine="0"/>
+              <w:rPr>
+                <w:lang w:val="en-US"/>
+              </w:rPr>
+            </w:pPr>
+            <w:r>
+              <w:rPr>
+                <w:lang w:val="en-US"/>
+              </w:rPr>
+              <w:t>Наименование требования</w:t>
+            </w:r>
+          </w:p>
+        </w:tc>
+        <w:tc>
+          <w:tcPr>
+            <w:tcW w:w="3115" w:type="dxa"/>
+          </w:tcPr>
+          <w:p>
+            <w:pPr>
+              <w:ind w:firstLine="0"/>
+              <w:rPr>
+                <w:lang w:val="en-US"/>
+              </w:rPr>
+            </w:pPr>
+            <w:r>
+              <w:rPr>
+                <w:lang w:val="en-US"/>
+              </w:rPr>
+              <w:t>Описание</w:t>
+            </w:r>
+          </w:p>
+        </w:tc>
+      </w:tr>
+      <w:tr>
+        <w:tc>
+          <w:tcPr>
+            <w:tcW w:w="3114" w:type="dxa"/>
+          </w:tcPr>
+          <w:p>
+            <w:pPr>
+              <w:ind w:firstLine="0"/>
+              <w:rPr>
+                <w:lang w:val="en-US"/>
+              </w:rPr>
+            </w:pPr>
+            <w:r>
+              <w:rPr>
+                <w:lang w:val="en-US"/>
+              </w:rPr>
+              <w:t>1</w:t>
+            </w:r>
+          </w:p>
+        </w:tc>
+        <w:tc>
+          <w:tcPr>
+            <w:tcW w:w="3115" w:type="dxa"/>
+          </w:tcPr>
+          <w:p>
+            <w:pPr>
+              <w:ind w:firstLine="0"/>
+              <w:rPr>
+                <w:lang w:val="en-US"/>
+              </w:rPr>
+            </w:pPr>
+            <w:r>
+              <w:rPr>
+                <w:lang w:val="en-US"/>
+              </w:rPr>
+              <w:t>Регистрация пользователей</w:t>
+            </w:r>
+          </w:p>
+        </w:tc>
+        <w:tc>
+          <w:tcPr>
+            <w:tcW w:w="3115" w:type="dxa"/>
+          </w:tcPr>
+          <w:p>
+            <w:pPr>
+              <w:ind w:firstLine="0"/>
+              <w:rPr>
+                <w:lang w:val="en-US"/>
+              </w:rPr>
+            </w:pPr>
+            <w:r>
+              <w:rPr>
+                <w:lang w:val="en-US"/>
+              </w:rPr>
+              <w:t>Возможность создания учетной записи</w:t>
+            </w:r>
+          </w:p>
+        </w:tc>
+      </w:tr>
+      <w:tr>
+        <w:tc>
+          <w:tcPr>
+            <w:tcW w:w="3114" w:type="dxa"/>
+          </w:tcPr>
+          <w:p>
+            <w:pPr>
+              <w:ind w:firstLine="0"/>
+              <w:rPr>
+                <w:lang w:val="en-US"/>
+              </w:rPr>
+            </w:pPr>
+            <w:r>
+              <w:rPr>
+                <w:lang w:val="en-US"/>
+              </w:rPr>
+              <w:t>2</w:t>
+            </w:r>
+          </w:p>
+        </w:tc>
+        <w:tc>
+          <w:tcPr>
+            <w:tcW w:w="3115" w:type="dxa"/>
+          </w:tcPr>
+          <w:p>
+            <w:pPr>
+              <w:ind w:firstLine="0"/>
+              <w:rPr>
+                <w:lang w:val="en-US"/>
+              </w:rPr>
+            </w:pPr>
+            <w:r>
+              <w:rPr>
+                <w:lang w:val="en-US"/>
+              </w:rPr>
+              <w:t>Аутентификация</w:t>
+            </w:r>
+          </w:p>
+        </w:tc>
+        <w:tc>
+          <w:tcPr>
+            <w:tcW w:w="3115" w:type="dxa"/>
+          </w:tcPr>
+          <w:p>
+            <w:pPr>
+              <w:ind w:firstLine="0"/>
+            </w:pPr>
+            <w:r>
+              <w:t>Вход в систему с использованием логина и пароля</w:t>
+            </w:r>
+          </w:p>
+        </w:tc>
+      </w:tr>
+      <w:tr>
+        <w:tc>
+          <w:tcPr>
+            <w:tcW w:w="3114" w:type="dxa"/>
+          </w:tcPr>
+          <w:p>
+            <w:pPr>
+              <w:ind w:firstLine="0"/>
+              <w:rPr>
+                <w:lang w:val="en-US"/>
+              </w:rPr>
+            </w:pPr>
+            <w:r>
+              <w:rPr>
+                <w:lang w:val="en-US"/>
+              </w:rPr>
+              <w:t>3</w:t>
+            </w:r>
+          </w:p>
+        </w:tc>
+        <w:tc>
+          <w:tcPr>
+            <w:tcW w:w="3115" w:type="dxa"/>
+          </w:tcPr>
+          <w:p>
+            <w:pPr>
+              <w:ind w:firstLine="0"/>
+              <w:rPr>
+                <w:lang w:val="en-US"/>
+              </w:rPr>
+            </w:pPr>
+            <w:r>
+              <w:rPr>
+                <w:lang w:val="en-US"/>
+              </w:rPr>
+              <w:t>Управление профилем</w:t>
+            </w:r>
+          </w:p>
+        </w:tc>
+        <w:tc>
+          <w:tcPr>
+            <w:tcW w:w="3115" w:type="dxa"/>
+          </w:tcPr>
+          <w:p>
+            <w:pPr>
+              <w:ind w:firstLine="0"/>
+              <w:rPr>
+                <w:lang w:val="en-US"/>
+              </w:rPr>
+            </w:pPr>
+            <w:r>
+              <w:rPr>
+                <w:lang w:val="en-US"/>
+              </w:rPr>
+              <w:t>Редактирование личных данных</w:t>
+            </w:r>
+          </w:p>
+        </w:tc>
+      </w:tr>
+    </w:tbl>
+    <w:p>
+      <w:pPr>
+        <w:ind w:firstLine="0"/>
+      </w:pPr>
+      <w:r>
+        <w:lastRenderedPageBreak/>
+        <w:t>Продолжение таблицы 2.1</w:t>
+      </w:r>
+    </w:p>
+    <w:tbl>
+      <w:tblPr>
+        <w:tblStyle w:val="afc"/>
+        <w:tblW w:w="0" w:type="auto"/>
+        <w:tblLook w:val="04A0" w:firstRow="1" w:lastRow="0" w:firstColumn="1" w:lastColumn="0" w:noHBand="0" w:noVBand="1"/>
+      </w:tblPr>
+      <w:tblGrid>
+        <w:gridCol w:w="3114"/>
+        <w:gridCol w:w="3115"/>
+        <w:gridCol w:w="3115"/>
+      </w:tblGrid>
+      <w:tr>
+        <w:tc>
+          <w:tcPr>
+            <w:tcW w:w="3114" w:type="dxa"/>
+          </w:tcPr>
+          <w:p>
+            <w:pPr>
+              <w:ind w:firstLine="0"/>
+            </w:pPr>
+            <w:r>
+              <w:t>№</w:t>
+            </w:r>
+          </w:p>
+        </w:tc>
+        <w:tc>
+          <w:tcPr>
+            <w:tcW w:w="3115" w:type="dxa"/>
+          </w:tcPr>
+          <w:p>
+            <w:pPr>
+              <w:ind w:firstLine="0"/>
+              <w:rPr>
+                <w:lang w:val="en-US"/>
+              </w:rPr>
+            </w:pPr>
+            <w:r>
+              <w:rPr>
+                <w:lang w:val="en-US"/>
+              </w:rPr>
+              <w:t>Наименование требования</w:t>
+            </w:r>
+          </w:p>
+        </w:tc>
+        <w:tc>
+          <w:tcPr>
+            <w:tcW w:w="3115" w:type="dxa"/>
+          </w:tcPr>
+          <w:p>
+            <w:pPr>
+              <w:ind w:firstLine="0"/>
+              <w:rPr>
+                <w:lang w:val="en-US"/>
+              </w:rPr>
+            </w:pPr>
+            <w:r>
+              <w:rPr>
+                <w:lang w:val="en-US"/>
+              </w:rPr>
+              <w:t>Описание</w:t>
+            </w:r>
+          </w:p>
+        </w:tc>
+      </w:tr>
+      <w:tr>
+        <w:tc>
+          <w:tcPr>
+            <w:tcW w:w="3114" w:type="dxa"/>
+          </w:tcPr>
+          <w:p>
+            <w:pPr>
+              <w:ind w:firstLine="0"/>
+            </w:pPr>
+            <w:r>
+              <w:t>4</w:t>
+            </w:r>
+          </w:p>
+        </w:tc>
+        <w:tc>
+          <w:tcPr>
+            <w:tcW w:w="3115" w:type="dxa"/>
+          </w:tcPr>
+          <w:p>
+            <w:pPr>
+              <w:ind w:firstLine="0"/>
+              <w:rPr>
+                <w:lang w:val="en-US"/>
+              </w:rPr>
+            </w:pPr>
+            <w:r>
+              <w:rPr>
+                <w:lang w:val="en-US"/>
+              </w:rPr>
+              <w:t>Ввод данных об успеваемости</w:t>
+            </w:r>
+          </w:p>
+        </w:tc>
+        <w:tc>
+          <w:tcPr>
+            <w:tcW w:w="3115" w:type="dxa"/>
+          </w:tcPr>
+          <w:p>
+            <w:pPr>
+              <w:ind w:firstLine="0"/>
+            </w:pPr>
+            <w:r>
+              <w:t>Добавление информации об академической успеваемости</w:t>
+            </w:r>
+          </w:p>
+        </w:tc>
+      </w:tr>
+      <w:tr>
+        <w:tc>
+          <w:tcPr>
+            <w:tcW w:w="3114" w:type="dxa"/>
+          </w:tcPr>
+          <w:p>
+            <w:pPr>
+              <w:ind w:firstLine="0"/>
+            </w:pPr>
+            <w:r>
+              <w:t>5</w:t>
+            </w:r>
+          </w:p>
+        </w:tc>
+        <w:tc>
+          <w:tcPr>
+            <w:tcW w:w="3115" w:type="dxa"/>
+          </w:tcPr>
+          <w:p>
+            <w:pPr>
+              <w:ind w:firstLine="0"/>
+            </w:pPr>
+            <w:r>
+              <w:t>Подача заявки на заем</w:t>
+            </w:r>
+          </w:p>
+        </w:tc>
+        <w:tc>
+          <w:tcPr>
+            <w:tcW w:w="3115" w:type="dxa"/>
+          </w:tcPr>
+          <w:p>
+            <w:pPr>
+              <w:ind w:firstLine="0"/>
+            </w:pPr>
+            <w:r>
+              <w:t>Создание заявки с указанием параметров</w:t>
+            </w:r>
+          </w:p>
+        </w:tc>
+      </w:tr>
+      <w:tr>
+        <w:tc>
+          <w:tcPr>
+            <w:tcW w:w="3114" w:type="dxa"/>
+          </w:tcPr>
+          <w:p>
+            <w:pPr>
+              <w:ind w:firstLine="0"/>
+            </w:pPr>
+            <w:r>
+              <w:t>6</w:t>
+            </w:r>
+          </w:p>
+        </w:tc>
+        <w:tc>
+          <w:tcPr>
+            <w:tcW w:w="3115" w:type="dxa"/>
+          </w:tcPr>
+          <w:p>
+            <w:pPr>
+              <w:ind w:firstLine="0"/>
+            </w:pPr>
+            <w:r>
+              <w:t>Просмотр заявок</w:t>
+            </w:r>
+          </w:p>
+        </w:tc>
+        <w:tc>
+          <w:tcPr>
+            <w:tcW w:w="3115" w:type="dxa"/>
+          </w:tcPr>
+          <w:p>
+            <w:pPr>
+              <w:ind w:firstLine="0"/>
+            </w:pPr>
+            <w:r>
+              <w:t>Отображение доступных заявок для кредиторов</w:t>
+            </w:r>
+          </w:p>
+        </w:tc>
+      </w:tr>
+      <w:tr>
+        <w:tc>
+          <w:tcPr>
+            <w:tcW w:w="3114" w:type="dxa"/>
+          </w:tcPr>
+          <w:p>
+            <w:pPr>
+              <w:ind w:firstLine="0"/>
+            </w:pPr>
+            <w:r>
+              <w:t>7</w:t>
+            </w:r>
+          </w:p>
+        </w:tc>
+        <w:tc>
+          <w:tcPr>
+            <w:tcW w:w="3115" w:type="dxa"/>
+          </w:tcPr>
+          <w:p>
+            <w:pPr>
+              <w:ind w:firstLine="0"/>
+            </w:pPr>
+            <w:r>
+              <w:t>Оценка заемщика</w:t>
+            </w:r>
+          </w:p>
+        </w:tc>
+        <w:tc>
+          <w:tcPr>
+            <w:tcW w:w="3115" w:type="dxa"/>
+          </w:tcPr>
+          <w:p>
+            <w:pPr>
+              <w:ind w:firstLine="0"/>
+            </w:pPr>
+            <w:r>
+              <w:t>Расчет скоринга на основе различных параметров</w:t>
+            </w:r>
+          </w:p>
+        </w:tc>
+      </w:tr>
+      <w:tr>
+        <w:tc>
+          <w:tcPr>
+            <w:tcW w:w="3114" w:type="dxa"/>
+          </w:tcPr>
+          <w:p>
+            <w:pPr>
+              <w:ind w:firstLine="0"/>
+            </w:pPr>
+            <w:r>
+              <w:t>8</w:t>
+            </w:r>
+          </w:p>
+        </w:tc>
+        <w:tc>
+          <w:tcPr>
+            <w:tcW w:w="3115" w:type="dxa"/>
+          </w:tcPr>
+          <w:p>
+            <w:pPr>
+              <w:ind w:firstLine="0"/>
+            </w:pPr>
+            <w:r>
+              <w:t>Инвестирование</w:t>
+            </w:r>
+          </w:p>
+        </w:tc>
+        <w:tc>
+          <w:tcPr>
+            <w:tcW w:w="3115" w:type="dxa"/>
+          </w:tcPr>
+          <w:p>
+            <w:pPr>
+              <w:ind w:firstLine="0"/>
+            </w:pPr>
+            <w:r>
+              <w:t>Возможность предоставления средств</w:t>
+            </w:r>
+          </w:p>
+        </w:tc>
+      </w:tr>
+      <w:tr>
+        <w:tc>
+          <w:tcPr>
+            <w:tcW w:w="3114" w:type="dxa"/>
+          </w:tcPr>
+          <w:p>
+            <w:pPr>
+              <w:ind w:firstLine="0"/>
+            </w:pPr>
+            <w:r>
+              <w:t>9</w:t>
+            </w:r>
+          </w:p>
+        </w:tc>
+        <w:tc>
+          <w:tcPr>
+            <w:tcW w:w="3115" w:type="dxa"/>
+          </w:tcPr>
+          <w:p>
+            <w:pPr>
+              <w:ind w:firstLine="0"/>
+            </w:pPr>
+            <w:r>
+              <w:t>Управление займами</w:t>
+            </w:r>
+          </w:p>
+        </w:tc>
+        <w:tc>
+          <w:tcPr>
+            <w:tcW w:w="3115" w:type="dxa"/>
+          </w:tcPr>
+          <w:p>
+            <w:pPr>
+              <w:ind w:firstLine="0"/>
+            </w:pPr>
+            <w:r>
+              <w:t>Отслеживание статуса займов</w:t>
+            </w:r>
+          </w:p>
+        </w:tc>
+      </w:tr>
+      <w:tr>
+        <w:tc>
+          <w:tcPr>
+            <w:tcW w:w="3114" w:type="dxa"/>
+          </w:tcPr>
+          <w:p>
+            <w:pPr>
+              <w:ind w:firstLine="0"/>
+            </w:pPr>
+            <w:r>
+              <w:t>10</w:t>
+            </w:r>
+          </w:p>
+        </w:tc>
+        <w:tc>
+          <w:tcPr>
+            <w:tcW w:w="3115" w:type="dxa"/>
+          </w:tcPr>
+          <w:p>
+            <w:pPr>
+              <w:ind w:firstLine="0"/>
+            </w:pPr>
+            <w:r>
+              <w:t>Возврат средств</w:t>
+            </w:r>
+          </w:p>
+        </w:tc>
+        <w:tc>
+          <w:tcPr>
+            <w:tcW w:w="3115" w:type="dxa"/>
+          </w:tcPr>
+          <w:p>
+            <w:pPr>
+              <w:ind w:firstLine="0"/>
+            </w:pPr>
+            <w:r>
+              <w:t>Реализация механизма погашения займа</w:t>
+            </w:r>
+          </w:p>
+        </w:tc>
+      </w:tr>
+      <w:tr>
+        <w:tc>
+          <w:tcPr>
+            <w:tcW w:w="3114" w:type="dxa"/>
+          </w:tcPr>
+          <w:p>
+            <w:pPr>
+              <w:ind w:firstLine="0"/>
+            </w:pPr>
+            <w:r>
+              <w:t>11</w:t>
+            </w:r>
+          </w:p>
+        </w:tc>
+        <w:tc>
+          <w:tcPr>
+            <w:tcW w:w="3115" w:type="dxa"/>
+          </w:tcPr>
+          <w:p>
+            <w:pPr>
+              <w:ind w:firstLine="0"/>
+            </w:pPr>
+            <w:r>
+              <w:t>Рейтинговая система</w:t>
+            </w:r>
+          </w:p>
+        </w:tc>
+        <w:tc>
+          <w:tcPr>
+            <w:tcW w:w="3115" w:type="dxa"/>
+          </w:tcPr>
+          <w:p>
+            <w:pPr>
+              <w:ind w:firstLine="0"/>
+            </w:pPr>
+            <w:r>
+              <w:t>Формирование рейтинга пользователей</w:t>
+            </w:r>
+          </w:p>
+        </w:tc>
+      </w:tr>
+      <w:tr>
+        <w:tc>
+          <w:tcPr>
+            <w:tcW w:w="3114" w:type="dxa"/>
+          </w:tcPr>
+          <w:p>
+            <w:pPr>
+              <w:ind w:firstLine="0"/>
+            </w:pPr>
+            <w:r>
+              <w:t>12</w:t>
+            </w:r>
+          </w:p>
+        </w:tc>
+        <w:tc>
+          <w:tcPr>
+            <w:tcW w:w="3115" w:type="dxa"/>
+          </w:tcPr>
+          <w:p>
+            <w:pPr>
+              <w:ind w:firstLine="0"/>
+            </w:pPr>
+            <w:r>
+              <w:t>Уведомления</w:t>
+            </w:r>
+          </w:p>
+        </w:tc>
+        <w:tc>
+          <w:tcPr>
+            <w:tcW w:w="3115" w:type="dxa"/>
+          </w:tcPr>
+          <w:p>
+            <w:pPr>
+              <w:ind w:firstLine="0"/>
+            </w:pPr>
+            <w:r>
+              <w:t>Информирование пользователей о событиях</w:t>
+            </w:r>
+          </w:p>
+        </w:tc>
+      </w:tr>
+      <w:tr>
+        <w:tc>
+          <w:tcPr>
+            <w:tcW w:w="3114" w:type="dxa"/>
+          </w:tcPr>
+          <w:p>
+            <w:pPr>
+              <w:ind w:firstLine="0"/>
+            </w:pPr>
+            <w:r>
+              <w:t>13</w:t>
+            </w:r>
+          </w:p>
+        </w:tc>
+        <w:tc>
+          <w:tcPr>
+            <w:tcW w:w="3115" w:type="dxa"/>
+          </w:tcPr>
+          <w:p>
+            <w:pPr>
+              <w:ind w:firstLine="0"/>
+            </w:pPr>
+            <w:r>
+              <w:t>Администрирование</w:t>
+            </w:r>
+          </w:p>
+        </w:tc>
+        <w:tc>
+          <w:tcPr>
+            <w:tcW w:w="3115" w:type="dxa"/>
+          </w:tcPr>
+          <w:p>
+            <w:pPr>
+              <w:ind w:firstLine="0"/>
+            </w:pPr>
+            <w:r>
+              <w:t>Управление системой и пользователями</w:t>
+            </w:r>
+          </w:p>
+        </w:tc>
+      </w:tr>
+      <w:tr>
+        <w:tc>
+          <w:tcPr>
+            <w:tcW w:w="3114" w:type="dxa"/>
+          </w:tcPr>
+          <w:p>
+            <w:pPr>
+              <w:ind w:firstLine="0"/>
+            </w:pPr>
+            <w:r>
+              <w:t>14</w:t>
+            </w:r>
+          </w:p>
+        </w:tc>
+        <w:tc>
+          <w:tcPr>
+            <w:tcW w:w="3115" w:type="dxa"/>
+          </w:tcPr>
+          <w:p>
+            <w:pPr>
+              <w:ind w:firstLine="0"/>
+            </w:pPr>
+            <w:r>
+              <w:t>Интеграция с внешними API</w:t>
+            </w:r>
+          </w:p>
+        </w:tc>
+        <w:tc>
+          <w:tcPr>
+            <w:tcW w:w="3115" w:type="dxa"/>
+          </w:tcPr>
+          <w:p>
+            <w:pPr>
+              <w:ind w:firstLine="0"/>
+            </w:pPr>
+            <w:r>
+              <w:t>Получение данных из сторонних сервисов</w:t>
+            </w:r>
+          </w:p>
+        </w:tc>
+      </w:tr>
+      <w:tr>
+        <w:tc>
+          <w:tcPr>
+            <w:tcW w:w="3114" w:type="dxa"/>
+          </w:tcPr>
+          <w:p>
+            <w:pPr>
+              <w:ind w:firstLine="0"/>
+            </w:pPr>
+            <w:r>
+              <w:t>15</w:t>
+            </w:r>
+          </w:p>
+        </w:tc>
+        <w:tc>
+          <w:tcPr>
+            <w:tcW w:w="3115" w:type="dxa"/>
+          </w:tcPr>
+          <w:p>
+            <w:pPr>
+              <w:ind w:firstLine="0"/>
+            </w:pPr>
+            <w:r>
+              <w:t>Обработка просрочек</w:t>
+            </w:r>
+          </w:p>
+        </w:tc>
+        <w:tc>
+          <w:tcPr>
+            <w:tcW w:w="3115" w:type="dxa"/>
+          </w:tcPr>
+          <w:p>
+            <w:pPr>
+              <w:ind w:firstLine="0"/>
+            </w:pPr>
+            <w:r>
+              <w:t>Работа с невыполненными обязательствами</w:t>
+            </w:r>
+          </w:p>
+        </w:tc>
+      </w:tr>
+    </w:tbl>
+    <w:p>
+      <w:pPr>
+        <w:ind w:firstLine="0"/>
+      </w:pPr>
+    </w:p>
+    <w:p>
+      <w:pPr>
+        <w:ind w:firstLine="0"/>
+      </w:pPr>
+      <w:r>
+        <w:tab/>
+      </w:r>
+      <w:r>
+        <w:t>Как видно из таблицы, система должна поддерживать не менее пятнадцати вариантов использования, что соответствует требованиям задания. При этом особое внимание уделяется таким функциям, как анализ данных пользователя и формирование рейтинга, поскольку именно они являются ключевыми элементами, обеспечивающими надежность системы.</w:t>
+      </w:r>
+    </w:p>
+    <w:p>
+      <w:r>
+        <w:t xml:space="preserve">Наряду с функциональными требованиями важную роль играют нефункциональные требования, определяющие качество работы системы. К </w:t>
+      </w:r>
+      <w:r>
+        <w:lastRenderedPageBreak/>
+        <w:t>ним относятся требования к производительности, безопасности, надежности, масштабируемости и удобству использования.</w:t>
+      </w:r>
+    </w:p>
+    <w:p>
+      <w:r>
+        <w:t>Производительность системы должна обеспечивать быстрое выполнение основных операций, включая обработку запросов пользователей, расчет скоринговых показателей и взаимодействие с базой данных. Время отклика системы должно быть минимальным, что особенно важно при работе с большим количеством пользователей.</w:t>
+      </w:r>
+    </w:p>
+    <w:p>
+      <w:r>
+        <w:t>Безопасность является критически важным аспектом, так как система обрабатывает персональные и финансовые данные пользователей. В рамках разрабатываемого программного средства должны быть реализованы механизмы аутентификации и авторизации, защита данных с использованием шифрования, а также контроль доступа к различным функциям системы.</w:t>
+      </w:r>
+    </w:p>
+    <w:p>
+      <w:r>
+        <w:t>Для более детального представления нефункциональных требований приведена таблица.</w:t>
+      </w:r>
+    </w:p>
+    <w:p>
+      <w:pPr>
+        <w:ind w:firstLine="0"/>
+      </w:pPr>
+    </w:p>
+    <w:p>
+      <w:pPr>
+        <w:ind w:firstLine="0"/>
+      </w:pPr>
+      <w:r>
+        <w:t xml:space="preserve">Таблица </w:t>
+      </w:r>
+      <w:r>
+        <w:t>2</w:t>
+      </w:r>
+      <w:r>
+        <w:t>.</w:t>
+      </w:r>
+      <w:r>
+        <w:t>2</w:t>
+      </w:r>
+      <w:r>
+        <w:t xml:space="preserve"> – Нефункциональные требования</w:t>
+      </w:r>
+    </w:p>
+    <w:tbl>
+      <w:tblPr>
+        <w:tblStyle w:val="afc"/>
+        <w:tblW w:w="0" w:type="auto"/>
+        <w:tblLook w:val="04A0" w:firstRow="1" w:lastRow="0" w:firstColumn="1" w:lastColumn="0" w:noHBand="0" w:noVBand="1"/>
+      </w:tblPr>
+      <w:tblGrid>
+        <w:gridCol w:w="4672"/>
+        <w:gridCol w:w="4672"/>
+      </w:tblGrid>
+      <w:tr>
+        <w:tc>
+          <w:tcPr>
+            <w:tcW w:w="4672" w:type="dxa"/>
+          </w:tcPr>
+          <w:p>
+            <w:pPr>
+              <w:ind w:firstLine="0"/>
+            </w:pPr>
+            <w:r>
+              <w:t>Категория</w:t>
+            </w:r>
+          </w:p>
+        </w:tc>
+        <w:tc>
+          <w:tcPr>
+            <w:tcW w:w="4672" w:type="dxa"/>
+          </w:tcPr>
+          <w:p>
+            <w:pPr>
+              <w:ind w:firstLine="0"/>
+            </w:pPr>
+            <w:r>
+              <w:t>Требование</w:t>
+            </w:r>
+          </w:p>
+        </w:tc>
+      </w:tr>
+      <w:tr>
+        <w:tc>
+          <w:tcPr>
+            <w:tcW w:w="4672" w:type="dxa"/>
+          </w:tcPr>
+          <w:p>
+            <w:pPr>
+              <w:ind w:firstLine="0"/>
+            </w:pPr>
+            <w:r>
+              <w:t>Производительность</w:t>
+            </w:r>
+          </w:p>
+        </w:tc>
+        <w:tc>
+          <w:tcPr>
+            <w:tcW w:w="4672" w:type="dxa"/>
+          </w:tcPr>
+          <w:p>
+            <w:pPr>
+              <w:ind w:firstLine="0"/>
+            </w:pPr>
+            <w:r>
+              <w:t>Время отклика системы не более 200 мс для большинства операций</w:t>
+            </w:r>
+          </w:p>
+        </w:tc>
+      </w:tr>
+      <w:tr>
+        <w:tc>
+          <w:tcPr>
+            <w:tcW w:w="4672" w:type="dxa"/>
+          </w:tcPr>
+          <w:p>
+            <w:pPr>
+              <w:ind w:firstLine="0"/>
+            </w:pPr>
+            <w:r>
+              <w:t>Безопасность</w:t>
+            </w:r>
+          </w:p>
+        </w:tc>
+        <w:tc>
+          <w:tcPr>
+            <w:tcW w:w="4672" w:type="dxa"/>
+          </w:tcPr>
+          <w:p>
+            <w:pPr>
+              <w:ind w:firstLine="0"/>
+            </w:pPr>
+            <w:r>
+              <w:t>Использование JWT-аутентификации и шифрования данных</w:t>
+            </w:r>
+          </w:p>
+        </w:tc>
+      </w:tr>
+      <w:tr>
+        <w:tc>
+          <w:tcPr>
+            <w:tcW w:w="4672" w:type="dxa"/>
+          </w:tcPr>
+          <w:p>
+            <w:pPr>
+              <w:ind w:firstLine="0"/>
+            </w:pPr>
+            <w:r>
+              <w:t>Надежность</w:t>
+            </w:r>
+          </w:p>
+        </w:tc>
+        <w:tc>
+          <w:tcPr>
+            <w:tcW w:w="4672" w:type="dxa"/>
+          </w:tcPr>
+          <w:p>
+            <w:pPr>
+              <w:ind w:firstLine="0"/>
+            </w:pPr>
+            <w:r>
+              <w:t>Обеспечение устойчивой работы при сбоях</w:t>
+            </w:r>
+          </w:p>
+        </w:tc>
+      </w:tr>
+      <w:tr>
+        <w:tc>
+          <w:tcPr>
+            <w:tcW w:w="4672" w:type="dxa"/>
+          </w:tcPr>
+          <w:p>
+            <w:pPr>
+              <w:ind w:firstLine="0"/>
+            </w:pPr>
+            <w:r>
+              <w:t>Масштабируемость</w:t>
+            </w:r>
+          </w:p>
+        </w:tc>
+        <w:tc>
+          <w:tcPr>
+            <w:tcW w:w="4672" w:type="dxa"/>
+          </w:tcPr>
+          <w:p>
+            <w:pPr>
+              <w:ind w:firstLine="0"/>
+            </w:pPr>
+            <w:r>
+              <w:t>Возможность увеличения нагрузки без потери производительности</w:t>
+            </w:r>
+          </w:p>
+        </w:tc>
+      </w:tr>
+      <w:tr>
+        <w:tc>
+          <w:tcPr>
+            <w:tcW w:w="4672" w:type="dxa"/>
+          </w:tcPr>
+          <w:p>
+            <w:pPr>
+              <w:ind w:firstLine="0"/>
+            </w:pPr>
+            <w:r>
+              <w:t>Удобство</w:t>
+            </w:r>
+          </w:p>
+        </w:tc>
+        <w:tc>
+          <w:tcPr>
+            <w:tcW w:w="4672" w:type="dxa"/>
+          </w:tcPr>
+          <w:p>
+            <w:pPr>
+              <w:ind w:firstLine="0"/>
+            </w:pPr>
+            <w:r>
+              <w:t>Интуитивно понятный интерфейс</w:t>
+            </w:r>
+          </w:p>
+        </w:tc>
+      </w:tr>
+    </w:tbl>
+    <w:p>
+      <w:pPr>
+        <w:ind w:firstLine="0"/>
+      </w:pPr>
+    </w:p>
+    <w:p>
+      <w:pPr>
+        <w:ind w:firstLine="0"/>
+      </w:pPr>
+      <w:r>
+        <w:tab/>
+      </w:r>
+      <w:r>
+        <w:t>В рамках данного проекта можно выделить основные сценарии: регистрация пользователя, подача заявки на заем, анализ заявки кредитором, предоставление средств, возврат займа и обработка просрочек. Эти сценарии формируют основу бизнес-логики системы и должны быть реализованы с учетом требований безопасности и удобства использования.</w:t>
+      </w:r>
+    </w:p>
+    <w:p>
+      <w:r>
+        <w:t>Таким образом, разработанная спецификация требований определяет ключевые характеристики программного средства и служит основой для дальнейшего проектирования и реализации системы. Четкое формулирование требований позволяет обеспечить соответствие разрабатываемого решения поставленным задачам и повысить качество конечного продукта.</w:t>
+      </w:r>
+    </w:p>
     <w:p>
       <w:r>
         <w:br w:type="page"/>
@@ -4552,7 +5737,7 @@
           <w:lang w:val="en-US"/>
         </w:rPr>
       </w:pPr>
-      <w:bookmarkStart w:id="7" w:name="_Toc223367497"/>
+      <w:bookmarkStart w:id="8" w:name="_Toc223367497"/>
       <w:r>
         <w:lastRenderedPageBreak/>
         <w:t>Список</w:t>
@@ -4575,7 +5760,7 @@
       <w:r>
         <w:t>источников</w:t>
       </w:r>
-      <w:bookmarkEnd w:id="7"/>
+      <w:bookmarkEnd w:id="8"/>
     </w:p>
     <w:p>
       <w:pPr>

</xml_diff>

<commit_message>
The second chapter is completed:the thirdd subchapter is implemented
</commit_message>
<xml_diff>
--- a/docs/Note.docx
+++ b/docs/Note.docx
@@ -1611,7 +1611,7 @@
       <w:r>
         <w:fldChar w:fldCharType="separate"/>
       </w:r>
-      <w:hyperlink w:anchor="_Toc224921131" w:history="1">
+      <w:hyperlink w:anchor="_Toc223367489" w:history="1">
         <w:r>
           <w:rPr>
             <w:rStyle w:val="af2"/>
@@ -1638,7 +1638,7 @@
             <w:noProof/>
             <w:webHidden/>
           </w:rPr>
-          <w:instrText xml:space="preserve"> PAGEREF _Toc224921131 \h </w:instrText>
+          <w:instrText xml:space="preserve"> PAGEREF _Toc223367489 \h </w:instrText>
         </w:r>
         <w:r>
           <w:rPr>
@@ -1682,7 +1682,7 @@
           <w:lang w:val="ru-BY" w:eastAsia="ru-BY"/>
         </w:rPr>
       </w:pPr>
-      <w:hyperlink w:anchor="_Toc224921132" w:history="1">
+      <w:hyperlink w:anchor="_Toc223367490" w:history="1">
         <w:r>
           <w:rPr>
             <w:rStyle w:val="af2"/>
@@ -1709,7 +1709,7 @@
             <w:noProof/>
             <w:webHidden/>
           </w:rPr>
-          <w:instrText xml:space="preserve"> PAGEREF _Toc224921132 \h </w:instrText>
+          <w:instrText xml:space="preserve"> PAGEREF _Toc223367490 \h </w:instrText>
         </w:r>
         <w:r>
           <w:rPr>
@@ -1753,7 +1753,7 @@
           <w:lang w:val="ru-BY" w:eastAsia="ru-BY"/>
         </w:rPr>
       </w:pPr>
-      <w:hyperlink w:anchor="_Toc224921133" w:history="1">
+      <w:hyperlink w:anchor="_Toc223367491" w:history="1">
         <w:r>
           <w:rPr>
             <w:rStyle w:val="af2"/>
@@ -1780,7 +1780,7 @@
             <w:noProof/>
             <w:webHidden/>
           </w:rPr>
-          <w:instrText xml:space="preserve"> PAGEREF _Toc224921133 \h </w:instrText>
+          <w:instrText xml:space="preserve"> PAGEREF _Toc223367491 \h </w:instrText>
         </w:r>
         <w:r>
           <w:rPr>
@@ -1824,7 +1824,7 @@
           <w:lang w:val="ru-BY" w:eastAsia="ru-BY"/>
         </w:rPr>
       </w:pPr>
-      <w:hyperlink w:anchor="_Toc224921134" w:history="1">
+      <w:hyperlink w:anchor="_Toc223367492" w:history="1">
         <w:r>
           <w:rPr>
             <w:rStyle w:val="af2"/>
@@ -1851,7 +1851,7 @@
             <w:noProof/>
             <w:webHidden/>
           </w:rPr>
-          <w:instrText xml:space="preserve"> PAGEREF _Toc224921134 \h </w:instrText>
+          <w:instrText xml:space="preserve"> PAGEREF _Toc223367492 \h </w:instrText>
         </w:r>
         <w:r>
           <w:rPr>
@@ -1895,43 +1895,13 @@
           <w:lang w:val="ru-BY" w:eastAsia="ru-BY"/>
         </w:rPr>
       </w:pPr>
-      <w:hyperlink w:anchor="_Toc224921135" w:history="1">
+      <w:hyperlink w:anchor="_Toc223367493" w:history="1">
         <w:r>
           <w:rPr>
             <w:rStyle w:val="af2"/>
             <w:noProof/>
           </w:rPr>
-          <w:t>Список</w:t>
-        </w:r>
-        <w:r>
-          <w:rPr>
-            <w:rStyle w:val="af2"/>
-            <w:noProof/>
-            <w:lang w:val="en-US"/>
-          </w:rPr>
-          <w:t xml:space="preserve"> </w:t>
-        </w:r>
-        <w:r>
-          <w:rPr>
-            <w:rStyle w:val="af2"/>
-            <w:noProof/>
-          </w:rPr>
-          <w:t>использованных</w:t>
-        </w:r>
-        <w:r>
-          <w:rPr>
-            <w:rStyle w:val="af2"/>
-            <w:noProof/>
-            <w:lang w:val="en-US"/>
-          </w:rPr>
-          <w:t xml:space="preserve"> </w:t>
-        </w:r>
-        <w:r>
-          <w:rPr>
-            <w:rStyle w:val="af2"/>
-            <w:noProof/>
-          </w:rPr>
-          <w:t>источников</w:t>
+          <w:t>2 Моделирование предметной области и разработка требований к программному средству</w:t>
         </w:r>
         <w:r>
           <w:rPr>
@@ -1952,7 +1922,7 @@
             <w:noProof/>
             <w:webHidden/>
           </w:rPr>
-          <w:instrText xml:space="preserve"> PAGEREF _Toc224921135 \h </w:instrText>
+          <w:instrText xml:space="preserve"> PAGEREF _Toc223367493 \h </w:instrText>
         </w:r>
         <w:r>
           <w:rPr>
@@ -1985,6 +1955,290 @@
     </w:p>
     <w:p>
       <w:pPr>
+        <w:pStyle w:val="21"/>
+        <w:tabs>
+          <w:tab w:val="right" w:leader="dot" w:pos="9344"/>
+        </w:tabs>
+        <w:rPr>
+          <w:rFonts w:asciiTheme="minorHAnsi" w:eastAsiaTheme="minorEastAsia" w:hAnsiTheme="minorHAnsi"/>
+          <w:noProof/>
+          <w:sz w:val="22"/>
+          <w:lang w:val="ru-BY" w:eastAsia="ru-BY"/>
+        </w:rPr>
+      </w:pPr>
+      <w:hyperlink w:anchor="_Toc223367494" w:history="1">
+        <w:r>
+          <w:rPr>
+            <w:rStyle w:val="af2"/>
+            <w:noProof/>
+          </w:rPr>
+          <w:t>2.1 Анализ и формализация бизнес-процессов предметной области</w:t>
+        </w:r>
+        <w:r>
+          <w:rPr>
+            <w:noProof/>
+            <w:webHidden/>
+          </w:rPr>
+          <w:tab/>
+        </w:r>
+        <w:r>
+          <w:rPr>
+            <w:noProof/>
+            <w:webHidden/>
+          </w:rPr>
+          <w:fldChar w:fldCharType="begin"/>
+        </w:r>
+        <w:r>
+          <w:rPr>
+            <w:noProof/>
+            <w:webHidden/>
+          </w:rPr>
+          <w:instrText xml:space="preserve"> PAGEREF _Toc223367494 \h </w:instrText>
+        </w:r>
+        <w:r>
+          <w:rPr>
+            <w:noProof/>
+            <w:webHidden/>
+          </w:rPr>
+        </w:r>
+        <w:r>
+          <w:rPr>
+            <w:noProof/>
+            <w:webHidden/>
+          </w:rPr>
+          <w:fldChar w:fldCharType="separate"/>
+        </w:r>
+        <w:r>
+          <w:rPr>
+            <w:noProof/>
+            <w:webHidden/>
+          </w:rPr>
+          <w:t>15</w:t>
+        </w:r>
+        <w:r>
+          <w:rPr>
+            <w:noProof/>
+            <w:webHidden/>
+          </w:rPr>
+          <w:fldChar w:fldCharType="end"/>
+        </w:r>
+      </w:hyperlink>
+    </w:p>
+    <w:p>
+      <w:pPr>
+        <w:pStyle w:val="21"/>
+        <w:tabs>
+          <w:tab w:val="right" w:leader="dot" w:pos="9344"/>
+        </w:tabs>
+        <w:rPr>
+          <w:rFonts w:asciiTheme="minorHAnsi" w:eastAsiaTheme="minorEastAsia" w:hAnsiTheme="minorHAnsi"/>
+          <w:noProof/>
+          <w:sz w:val="22"/>
+          <w:lang w:val="ru-BY" w:eastAsia="ru-BY"/>
+        </w:rPr>
+      </w:pPr>
+      <w:hyperlink w:anchor="_Toc223367495" w:history="1">
+        <w:r>
+          <w:rPr>
+            <w:rStyle w:val="af2"/>
+            <w:noProof/>
+          </w:rPr>
+          <w:t>2.2 Разработка спецификации требований к программному продукту</w:t>
+        </w:r>
+        <w:r>
+          <w:rPr>
+            <w:noProof/>
+            <w:webHidden/>
+          </w:rPr>
+          <w:tab/>
+        </w:r>
+        <w:r>
+          <w:rPr>
+            <w:noProof/>
+            <w:webHidden/>
+          </w:rPr>
+          <w:fldChar w:fldCharType="begin"/>
+        </w:r>
+        <w:r>
+          <w:rPr>
+            <w:noProof/>
+            <w:webHidden/>
+          </w:rPr>
+          <w:instrText xml:space="preserve"> PAGEREF _Toc223367495 \h </w:instrText>
+        </w:r>
+        <w:r>
+          <w:rPr>
+            <w:noProof/>
+            <w:webHidden/>
+          </w:rPr>
+        </w:r>
+        <w:r>
+          <w:rPr>
+            <w:noProof/>
+            <w:webHidden/>
+          </w:rPr>
+          <w:fldChar w:fldCharType="separate"/>
+        </w:r>
+        <w:r>
+          <w:rPr>
+            <w:noProof/>
+            <w:webHidden/>
+          </w:rPr>
+          <w:t>18</w:t>
+        </w:r>
+        <w:r>
+          <w:rPr>
+            <w:noProof/>
+            <w:webHidden/>
+          </w:rPr>
+          <w:fldChar w:fldCharType="end"/>
+        </w:r>
+      </w:hyperlink>
+    </w:p>
+    <w:p>
+      <w:pPr>
+        <w:pStyle w:val="21"/>
+        <w:tabs>
+          <w:tab w:val="right" w:leader="dot" w:pos="9344"/>
+        </w:tabs>
+        <w:rPr>
+          <w:rFonts w:asciiTheme="minorHAnsi" w:eastAsiaTheme="minorEastAsia" w:hAnsiTheme="minorHAnsi"/>
+          <w:noProof/>
+          <w:sz w:val="22"/>
+          <w:lang w:val="ru-BY" w:eastAsia="ru-BY"/>
+        </w:rPr>
+      </w:pPr>
+      <w:hyperlink w:anchor="_Toc223367496" w:history="1">
+        <w:r>
+          <w:rPr>
+            <w:rStyle w:val="af2"/>
+            <w:noProof/>
+          </w:rPr>
+          <w:t>2.3 Образ предлагаемого решения</w:t>
+        </w:r>
+        <w:r>
+          <w:rPr>
+            <w:noProof/>
+            <w:webHidden/>
+          </w:rPr>
+          <w:tab/>
+        </w:r>
+        <w:r>
+          <w:rPr>
+            <w:noProof/>
+            <w:webHidden/>
+          </w:rPr>
+          <w:fldChar w:fldCharType="begin"/>
+        </w:r>
+        <w:r>
+          <w:rPr>
+            <w:noProof/>
+            <w:webHidden/>
+          </w:rPr>
+          <w:instrText xml:space="preserve"> PAGEREF _Toc223367496 \h </w:instrText>
+        </w:r>
+        <w:r>
+          <w:rPr>
+            <w:noProof/>
+            <w:webHidden/>
+          </w:rPr>
+        </w:r>
+        <w:r>
+          <w:rPr>
+            <w:noProof/>
+            <w:webHidden/>
+          </w:rPr>
+          <w:fldChar w:fldCharType="separate"/>
+        </w:r>
+        <w:r>
+          <w:rPr>
+            <w:noProof/>
+            <w:webHidden/>
+          </w:rPr>
+          <w:t>20</w:t>
+        </w:r>
+        <w:r>
+          <w:rPr>
+            <w:noProof/>
+            <w:webHidden/>
+          </w:rPr>
+          <w:fldChar w:fldCharType="end"/>
+        </w:r>
+      </w:hyperlink>
+    </w:p>
+    <w:p>
+      <w:pPr>
+        <w:pStyle w:val="11"/>
+        <w:tabs>
+          <w:tab w:val="right" w:leader="dot" w:pos="9344"/>
+        </w:tabs>
+        <w:rPr>
+          <w:rFonts w:asciiTheme="minorHAnsi" w:eastAsiaTheme="minorEastAsia" w:hAnsiTheme="minorHAnsi"/>
+          <w:noProof/>
+          <w:sz w:val="22"/>
+          <w:lang w:val="ru-BY" w:eastAsia="ru-BY"/>
+        </w:rPr>
+      </w:pPr>
+      <w:hyperlink w:anchor="_Toc223367497" w:history="1">
+        <w:r>
+          <w:rPr>
+            <w:rStyle w:val="af2"/>
+            <w:noProof/>
+          </w:rPr>
+          <w:t>Список использованных источников</w:t>
+        </w:r>
+        <w:r>
+          <w:rPr>
+            <w:noProof/>
+            <w:webHidden/>
+          </w:rPr>
+          <w:tab/>
+        </w:r>
+        <w:r>
+          <w:rPr>
+            <w:noProof/>
+            <w:webHidden/>
+          </w:rPr>
+          <w:fldChar w:fldCharType="begin"/>
+        </w:r>
+        <w:r>
+          <w:rPr>
+            <w:noProof/>
+            <w:webHidden/>
+          </w:rPr>
+          <w:instrText xml:space="preserve"> PAGEREF _Toc223367497 \h </w:instrText>
+        </w:r>
+        <w:r>
+          <w:rPr>
+            <w:noProof/>
+            <w:webHidden/>
+          </w:rPr>
+        </w:r>
+        <w:r>
+          <w:rPr>
+            <w:noProof/>
+            <w:webHidden/>
+          </w:rPr>
+          <w:fldChar w:fldCharType="separate"/>
+        </w:r>
+        <w:r>
+          <w:rPr>
+            <w:noProof/>
+            <w:webHidden/>
+          </w:rPr>
+          <w:t>22</w:t>
+        </w:r>
+        <w:r>
+          <w:rPr>
+            <w:noProof/>
+            <w:webHidden/>
+          </w:rPr>
+          <w:fldChar w:fldCharType="end"/>
+        </w:r>
+      </w:hyperlink>
+    </w:p>
+    <w:p>
+      <w:pPr>
         <w:spacing w:line="21" w:lineRule="atLeast"/>
         <w:ind w:firstLine="0"/>
         <w:jc w:val="center"/>
@@ -2008,7 +2262,7 @@
         <w:pStyle w:val="1"/>
         <w:ind w:left="0"/>
       </w:pPr>
-      <w:bookmarkStart w:id="1" w:name="_Toc224921131"/>
+      <w:bookmarkStart w:id="1" w:name="_Toc223367489"/>
       <w:r>
         <w:lastRenderedPageBreak/>
         <w:t>Введение</w:t>
@@ -2329,7 +2583,7 @@
         <w:ind w:left="720"/>
         <w:jc w:val="both"/>
       </w:pPr>
-      <w:bookmarkStart w:id="2" w:name="_Toc224921132"/>
+      <w:bookmarkStart w:id="2" w:name="_Toc223367490"/>
       <w:r>
         <w:lastRenderedPageBreak/>
         <w:t>1 Анализ литературных источников и программных решений по теме курсового проекта</w:t>
@@ -2344,7 +2598,7 @@
           <w:lang w:val="ru-RU"/>
         </w:rPr>
       </w:pPr>
-      <w:bookmarkStart w:id="3" w:name="_Toc224921133"/>
+      <w:bookmarkStart w:id="3" w:name="_Toc223367491"/>
       <w:r>
         <w:rPr>
           <w:lang w:val="ru-RU"/>
@@ -2364,13 +2618,7 @@
       </w:r>
       <w:proofErr w:type="spellEnd"/>
       <w:r>
-        <w:t xml:space="preserve"> (P2P) кредитование. Данная модель представляет собой способ организации финансовых отношений, при котором заемщики и кредиторы взаимодействуют напрямую через специализированные онлайн-платформы, минуя традиционные финансовые учреждения. Это позволяет снизить транзакционные издержки, повысить доступность заемных средств и обеспечить более гибкие условия взаимодействия участников рынка [</w:t>
-      </w:r>
-      <w:r>
-        <w:t>3</w:t>
-      </w:r>
-      <w:r>
-        <w:t>].</w:t>
+        <w:t xml:space="preserve"> (P2P) кредитование. Данная модель представляет собой способ организации финансовых отношений, при котором заемщики и кредиторы взаимодействуют напрямую через специализированные онлайн-платформы, минуя традиционные финансовые учреждения. Это позволяет снизить транзакционные издержки, повысить доступность заемных средств и обеспечить более гибкие условия взаимодействия участников рынка [3].</w:t>
       </w:r>
     </w:p>
     <w:p>
@@ -2397,13 +2645,7 @@
     <w:p>
       <w:r>
         <w:lastRenderedPageBreak/>
-        <w:t>Кроме того, важной задачей является обеспечение возврата заемных средств. В условиях отсутствия банковских гарантий необходимо реализовать дополнительные механизмы защиты интересов кредиторов. К таким механизмам могут относиться системы рейтингов пользователей, формирование резервных фондов, использование поручительства, а также применение алгоритмов скоринга, учитывающих различные параметры поведения пользователя на платформе [</w:t>
-      </w:r>
-      <w:r>
-        <w:t>4</w:t>
-      </w:r>
-      <w:r>
-        <w:t>].</w:t>
+        <w:t>Кроме того, важной задачей является обеспечение возврата заемных средств. В условиях отсутствия банковских гарантий необходимо реализовать дополнительные механизмы защиты интересов кредиторов. К таким механизмам могут относиться системы рейтингов пользователей, формирование резервных фондов, использование поручительства, а также применение алгоритмов скоринга, учитывающих различные параметры поведения пользователя на платформе [4].</w:t>
       </w:r>
     </w:p>
     <w:p>
@@ -2692,13 +2934,7 @@
     </w:p>
     <w:p>
       <w:r>
-        <w:t>Особое внимание в предметной области уделяется вопросам информационной безопасности. Поскольку система работает с персональными и финансовыми данными пользователей, необходимо обеспечить защиту информации от несанкционированного доступа, а также реализовать механизмы аутентификации и авторизации. Использование современных технологий, таких как JWT-аутентификация, шифрование данных и контроль доступа, позволяет значительно повысить уровень безопасности системы [</w:t>
-      </w:r>
-      <w:r>
-        <w:t>5</w:t>
-      </w:r>
-      <w:r>
-        <w:t>].</w:t>
+        <w:t>Особое внимание в предметной области уделяется вопросам информационной безопасности. Поскольку система работает с персональными и финансовыми данными пользователей, необходимо обеспечить защиту информации от несанкционированного доступа, а также реализовать механизмы аутентификации и авторизации. Использование современных технологий, таких как JWT-аутентификация, шифрование данных и контроль доступа, позволяет значительно повысить уровень безопасности системы [5].</w:t>
       </w:r>
     </w:p>
     <w:p>
@@ -2749,13 +2985,7 @@
         <w:t>–</w:t>
       </w:r>
       <w:r>
-        <w:t xml:space="preserve"> доступ к финансированию на более гибких условиях. При этом процентные ставки на таких платформах формируются либо автоматически на основе алгоритмов, либо в результате взаимодействия спроса и предложения, что делает рынок более динамичным и адаптивным [</w:t>
-      </w:r>
-      <w:r>
-        <w:t>6</w:t>
-      </w:r>
-      <w:r>
-        <w:t>].</w:t>
+        <w:t xml:space="preserve"> доступ к финансированию на более гибких условиях. При этом процентные ставки на таких платформах формируются либо автоматически на основе алгоритмов, либо в результате взаимодействия спроса и предложения, что делает рынок более динамичным и адаптивным [6].</w:t>
       </w:r>
     </w:p>
     <w:p>
@@ -3306,8 +3536,6 @@
       </w:pPr>
       <w:r>
         <w:tab/>
-      </w:r>
-      <w:r>
         <w:t xml:space="preserve">С точки зрения информационных систем важным аспектом является построение эффективной архитектуры, обеспечивающей масштабируемость и устойчивость к нагрузкам. Поскольку P2P-платформа предполагает одновременную работу большого количества пользователей, система должна корректно обрабатывать параллельные запросы, обеспечивать согласованность данных и минимизировать задержки. Использование современных архитектурных подходов, таких как </w:t>
       </w:r>
       <w:proofErr w:type="spellStart"/>
@@ -3338,13 +3566,7 @@
       </w:r>
       <w:proofErr w:type="spellEnd"/>
       <w:r>
-        <w:t xml:space="preserve"> Your Customer) и мониторинга операций [</w:t>
-      </w:r>
-      <w:r>
-        <w:t>7</w:t>
-      </w:r>
-      <w:r>
-        <w:t>].</w:t>
+        <w:t xml:space="preserve"> Your Customer) и мониторинга операций [7].</w:t>
       </w:r>
     </w:p>
     <w:p>
@@ -3375,7 +3597,7 @@
         </w:rPr>
         <w:tab/>
       </w:r>
-      <w:bookmarkStart w:id="4" w:name="_Toc224921134"/>
+      <w:bookmarkStart w:id="4" w:name="_Toc223367492"/>
       <w:r>
         <w:rPr>
           <w:lang w:val="ru-RU"/>
@@ -3498,13 +3720,7 @@
         <w:ind w:firstLine="0"/>
       </w:pPr>
       <w:r>
-        <w:t xml:space="preserve">Таблица </w:t>
-      </w:r>
-      <w:r>
-        <w:t>1</w:t>
-      </w:r>
-      <w:r>
-        <w:t>.4 – Сравнение функциональности P2P-платформ</w:t>
+        <w:t>Таблица 1.4 – Сравнение функциональности P2P-платформ</w:t>
       </w:r>
     </w:p>
     <w:tbl>
@@ -4018,8 +4234,6 @@
       </w:pPr>
       <w:r>
         <w:tab/>
-      </w:r>
-      <w:r>
         <w:t>Анализ таблицы показывает, что существующие платформы в основном используют традиционные методы оценки заемщиков, основанные на финансовых показателях. Это ограничивает их применимость для пользователей без кредитной истории, таких как студенты. Таким образом, можно сделать вывод о наличии незанятой ниши, связанной с разработкой специализированных решений для данной категории пользователей.</w:t>
       </w:r>
     </w:p>
@@ -4082,10 +4296,7 @@
         </w:numPr>
       </w:pPr>
       <w:r>
-        <w:t xml:space="preserve"> </w:t>
-      </w:r>
-      <w:r>
-        <w:t>отсутствие ориентации на студентов как отдельную категорию пользователей;</w:t>
+        <w:t xml:space="preserve"> отсутствие ориентации на студентов как отдельную категорию пользователей;</w:t>
       </w:r>
     </w:p>
     <w:p>
@@ -4097,10 +4308,7 @@
         </w:numPr>
       </w:pPr>
       <w:r>
-        <w:t xml:space="preserve"> </w:t>
-      </w:r>
-      <w:r>
-        <w:t>использование ограниченного набора факторов при оценке заемщиков;</w:t>
+        <w:t xml:space="preserve"> использование ограниченного набора факторов при оценке заемщиков;</w:t>
       </w:r>
     </w:p>
     <w:p>
@@ -4112,10 +4320,7 @@
         </w:numPr>
       </w:pPr>
       <w:r>
-        <w:t xml:space="preserve"> </w:t>
-      </w:r>
-      <w:r>
-        <w:t>недостаточная проработка механизмов гарантии возврата средств;</w:t>
+        <w:t xml:space="preserve"> недостаточная проработка механизмов гарантии возврата средств;</w:t>
       </w:r>
     </w:p>
     <w:p>
@@ -4127,10 +4332,7 @@
         </w:numPr>
       </w:pPr>
       <w:r>
-        <w:t xml:space="preserve"> </w:t>
-      </w:r>
-      <w:r>
-        <w:t>ограниченное использование альтернативных источников данных;</w:t>
+        <w:t xml:space="preserve"> ограниченное использование альтернативных источников данных;</w:t>
       </w:r>
     </w:p>
     <w:p>
@@ -4146,8 +4348,6 @@
       </w:r>
       <w:r>
         <w:softHyphen/>
-      </w:r>
-      <w:r>
         <w:t>отсутствие интеграции с образовательными системами.</w:t>
       </w:r>
     </w:p>
@@ -4174,9 +4374,2134 @@
       </w:r>
     </w:p>
     <w:p>
+      <w:r>
+        <w:br w:type="page"/>
+      </w:r>
+    </w:p>
+    <w:p>
+      <w:pPr>
+        <w:pStyle w:val="1"/>
+        <w:numPr>
+          <w:ilvl w:val="0"/>
+          <w:numId w:val="1"/>
+        </w:numPr>
+        <w:ind w:left="709" w:firstLine="11"/>
+        <w:jc w:val="both"/>
+      </w:pPr>
+      <w:bookmarkStart w:id="5" w:name="_Toc223367493"/>
+      <w:r>
+        <w:lastRenderedPageBreak/>
+        <w:t>Моделирование предметной области и разработка требований к программному средству</w:t>
+      </w:r>
+      <w:bookmarkEnd w:id="5"/>
+    </w:p>
+    <w:p>
+      <w:pPr>
+        <w:ind w:left="720" w:firstLine="0"/>
+      </w:pPr>
+    </w:p>
+    <w:p>
+      <w:pPr>
+        <w:pStyle w:val="2"/>
+        <w:rPr>
+          <w:lang w:val="ru-RU"/>
+        </w:rPr>
+      </w:pPr>
+      <w:bookmarkStart w:id="6" w:name="_Toc223367494"/>
+      <w:r>
+        <w:rPr>
+          <w:lang w:val="ru-RU"/>
+        </w:rPr>
+        <w:t>Анализ и формализация бизнес-процессов предметной области</w:t>
+      </w:r>
+      <w:bookmarkEnd w:id="6"/>
+    </w:p>
+    <w:p/>
+    <w:p>
+      <w:r>
+        <w:t xml:space="preserve">В рамках разработки программного средства важным этапом является анализ и формализация бизнес-процессов предметной области. Это позволяет структурировать взаимодействие участников системы, выявить узкие места текущих процессов и определить направления их оптимизации. Для моделирования бизнес-процессов используется нотация BPMN (Business Process Model </w:t>
+      </w:r>
+      <w:proofErr w:type="spellStart"/>
+      <w:r>
+        <w:t>and</w:t>
+      </w:r>
+      <w:proofErr w:type="spellEnd"/>
+      <w:r>
+        <w:t xml:space="preserve"> </w:t>
+      </w:r>
+      <w:proofErr w:type="spellStart"/>
+      <w:r>
+        <w:t>Notation</w:t>
+      </w:r>
+      <w:proofErr w:type="spellEnd"/>
+      <w:r>
+        <w:t>), которая обеспечивает наглядное представление последовательности действий, событий и взаимодействий между участниками системы [11].</w:t>
+      </w:r>
+    </w:p>
+    <w:p>
+      <w:r>
+        <w:t>BPMN является общепринятым стандартом моделирования бизнес-процессов, позволяющим описывать как простые, так и сложные распределенные системы. Использование данной нотации обеспечивает единое понимание процессов всеми участниками разработки, включая аналитиков, разработчиков и заказчиков, а также упрощает дальнейшее проектирование архитектуры программного средства.</w:t>
+      </w:r>
+    </w:p>
+    <w:p>
+      <w:r>
+        <w:t>В рамках данного курсового проекта моделирование бизнес-процессов выполнено в двух вариантах: AS-IS (текущее состояние) и TO-BE (целевое состояние). Такой подход позволяет не только зафиксировать существующие процессы, но и наглядно продемонстрировать преимущества предлагаемого решения.</w:t>
+      </w:r>
+    </w:p>
+    <w:p>
+      <w:r>
+        <w:t>Модель AS-IS отражает текущий процесс взаимодействия заемщиков и кредиторов в условиях упрощенной P2P-системы, в которой отсутствуют специализированные механизмы оценки надежности студентов и гарантии возврата займов.</w:t>
+      </w:r>
+    </w:p>
+    <w:p>
+      <w:r>
+        <w:t xml:space="preserve">Данная модель представлена на рисунке </w:t>
+      </w:r>
+      <w:r>
+        <w:t>2</w:t>
+      </w:r>
+      <w:r>
+        <w:t>.1.</w:t>
+      </w:r>
+    </w:p>
+    <w:p>
       <w:pPr>
         <w:ind w:firstLine="0"/>
       </w:pPr>
+      <w:r>
+        <w:rPr>
+          <w:noProof/>
+        </w:rPr>
+        <w:lastRenderedPageBreak/>
+        <w:drawing>
+          <wp:inline distT="0" distB="0" distL="0" distR="0" wp14:anchorId="0828A81A" wp14:editId="1BC9E80F">
+            <wp:extent cx="5935980" cy="2842260"/>
+            <wp:effectExtent l="19050" t="19050" r="26670" b="15240"/>
+            <wp:docPr id="4" name="Рисунок 4"/>
+            <wp:cNvGraphicFramePr>
+              <a:graphicFrameLocks xmlns:a="http://schemas.openxmlformats.org/drawingml/2006/main" noChangeAspect="1"/>
+            </wp:cNvGraphicFramePr>
+            <a:graphic xmlns:a="http://schemas.openxmlformats.org/drawingml/2006/main">
+              <a:graphicData uri="http://schemas.openxmlformats.org/drawingml/2006/picture">
+                <pic:pic xmlns:pic="http://schemas.openxmlformats.org/drawingml/2006/picture">
+                  <pic:nvPicPr>
+                    <pic:cNvPr id="0" name="Picture 2"/>
+                    <pic:cNvPicPr>
+                      <a:picLocks noChangeAspect="1" noChangeArrowheads="1"/>
+                    </pic:cNvPicPr>
+                  </pic:nvPicPr>
+                  <pic:blipFill>
+                    <a:blip r:embed="rId8">
+                      <a:extLst>
+                        <a:ext uri="{28A0092B-C50C-407E-A947-70E740481C1C}">
+                          <a14:useLocalDpi xmlns:a14="http://schemas.microsoft.com/office/drawing/2010/main" val="0"/>
+                        </a:ext>
+                      </a:extLst>
+                    </a:blip>
+                    <a:srcRect/>
+                    <a:stretch>
+                      <a:fillRect/>
+                    </a:stretch>
+                  </pic:blipFill>
+                  <pic:spPr bwMode="auto">
+                    <a:xfrm>
+                      <a:off x="0" y="0"/>
+                      <a:ext cx="5935980" cy="2842260"/>
+                    </a:xfrm>
+                    <a:prstGeom prst="rect">
+                      <a:avLst/>
+                    </a:prstGeom>
+                    <a:noFill/>
+                    <a:ln>
+                      <a:solidFill>
+                        <a:schemeClr val="tx1"/>
+                      </a:solidFill>
+                    </a:ln>
+                  </pic:spPr>
+                </pic:pic>
+              </a:graphicData>
+            </a:graphic>
+          </wp:inline>
+        </w:drawing>
+      </w:r>
+    </w:p>
+    <w:p>
+      <w:pPr>
+        <w:ind w:firstLine="0"/>
+      </w:pPr>
+    </w:p>
+    <w:p>
+      <w:pPr>
+        <w:ind w:firstLine="0"/>
+        <w:jc w:val="center"/>
+      </w:pPr>
+      <w:r>
+        <w:t xml:space="preserve">Рисунок 2.1 – </w:t>
+      </w:r>
+      <w:r>
+        <w:t>BPMN-модель бизнес-процесса</w:t>
+      </w:r>
+      <w:r>
+        <w:t xml:space="preserve"> платформы </w:t>
+      </w:r>
+      <w:r>
+        <w:rPr>
+          <w:lang w:val="en-US"/>
+        </w:rPr>
+        <w:t>P</w:t>
+      </w:r>
+      <w:r>
+        <w:t>2</w:t>
+      </w:r>
+      <w:r>
+        <w:rPr>
+          <w:lang w:val="en-US"/>
+        </w:rPr>
+        <w:t>P</w:t>
+      </w:r>
+      <w:r>
+        <w:t>-кредитования студентов (AS IS)</w:t>
+      </w:r>
+    </w:p>
+    <w:p/>
+    <w:p>
+      <w:r>
+        <w:t>В рамках модели AS-IS основными участниками процесса являются заемщик и кредитор, взаимодействующие через платформу. Процесс начинается с возникновения потребности заемщика в получении финансовых средств, после чего он формирует и отправляет заявку. Кредитор получает данную заявку, выполняет ее анализ на основе ограниченного набора данных и принимает решение о предоставлении или отказе в займе. В случае одобрения осуществляется передача средств, после чего заемщик обязан выполнить возврат средств в установленный срок. Контроль возврата осуществляется в упрощенной форме и не предусматривает сложных механизмов управления рисками.</w:t>
+      </w:r>
+    </w:p>
+    <w:p>
+      <w:r>
+        <w:t>Анализ модели AS-IS показывает, что данный процесс обладает рядом недостатков. В частности, отсутствует глубокая проверка заемщика, не используются дополнительные источники данных для оценки его надежности, а также не реализованы механизмы снижения рисков для кредитора. Это приводит к повышенной вероятности невозврата средств и снижению доверия к системе.</w:t>
+      </w:r>
+    </w:p>
+    <w:p>
+      <w:r>
+        <w:t>С целью устранения выявленных недостатков разработана модель TO-BE, отражающая целевое состояние бизнес-процессов с учетом внедрения дополнительных функциональных возможностей.</w:t>
+      </w:r>
+    </w:p>
+    <w:p>
+      <w:r>
+        <w:t xml:space="preserve">Данная модель представлена на рисунке </w:t>
+      </w:r>
+      <w:r>
+        <w:t>2</w:t>
+      </w:r>
+      <w:r>
+        <w:t>.2.</w:t>
+      </w:r>
+    </w:p>
+    <w:p>
+      <w:pPr>
+        <w:ind w:firstLine="0"/>
+      </w:pPr>
+      <w:r>
+        <w:rPr>
+          <w:noProof/>
+        </w:rPr>
+        <w:lastRenderedPageBreak/>
+        <w:drawing>
+          <wp:inline distT="0" distB="0" distL="0" distR="0" wp14:anchorId="54A543DC" wp14:editId="288BE49A">
+            <wp:extent cx="5928360" cy="2743200"/>
+            <wp:effectExtent l="0" t="0" r="0" b="0"/>
+            <wp:docPr id="5" name="Рисунок 5"/>
+            <wp:cNvGraphicFramePr>
+              <a:graphicFrameLocks xmlns:a="http://schemas.openxmlformats.org/drawingml/2006/main" noChangeAspect="1"/>
+            </wp:cNvGraphicFramePr>
+            <a:graphic xmlns:a="http://schemas.openxmlformats.org/drawingml/2006/main">
+              <a:graphicData uri="http://schemas.openxmlformats.org/drawingml/2006/picture">
+                <pic:pic xmlns:pic="http://schemas.openxmlformats.org/drawingml/2006/picture">
+                  <pic:nvPicPr>
+                    <pic:cNvPr id="0" name="Picture 3"/>
+                    <pic:cNvPicPr>
+                      <a:picLocks noChangeAspect="1" noChangeArrowheads="1"/>
+                    </pic:cNvPicPr>
+                  </pic:nvPicPr>
+                  <pic:blipFill>
+                    <a:blip r:embed="rId9" cstate="print">
+                      <a:extLst>
+                        <a:ext uri="{28A0092B-C50C-407E-A947-70E740481C1C}">
+                          <a14:useLocalDpi xmlns:a14="http://schemas.microsoft.com/office/drawing/2010/main" val="0"/>
+                        </a:ext>
+                      </a:extLst>
+                    </a:blip>
+                    <a:srcRect/>
+                    <a:stretch>
+                      <a:fillRect/>
+                    </a:stretch>
+                  </pic:blipFill>
+                  <pic:spPr bwMode="auto">
+                    <a:xfrm>
+                      <a:off x="0" y="0"/>
+                      <a:ext cx="5928360" cy="2743200"/>
+                    </a:xfrm>
+                    <a:prstGeom prst="rect">
+                      <a:avLst/>
+                    </a:prstGeom>
+                    <a:noFill/>
+                    <a:ln>
+                      <a:noFill/>
+                    </a:ln>
+                  </pic:spPr>
+                </pic:pic>
+              </a:graphicData>
+            </a:graphic>
+          </wp:inline>
+        </w:drawing>
+      </w:r>
+    </w:p>
+    <w:p>
+      <w:pPr>
+        <w:ind w:firstLine="0"/>
+      </w:pPr>
+    </w:p>
+    <w:p>
+      <w:pPr>
+        <w:ind w:firstLine="0"/>
+        <w:jc w:val="center"/>
+      </w:pPr>
+      <w:r>
+        <w:t>Рисунок 2.1 – BPMN-модель бизнес-процесса платформы P2P-кредитования студентов (</w:t>
+      </w:r>
+      <w:r>
+        <w:rPr>
+          <w:lang w:val="en-US"/>
+        </w:rPr>
+        <w:t>TO</w:t>
+      </w:r>
+      <w:r>
+        <w:t xml:space="preserve"> </w:t>
+      </w:r>
+      <w:r>
+        <w:rPr>
+          <w:lang w:val="en-US"/>
+        </w:rPr>
+        <w:t>BE</w:t>
+      </w:r>
+      <w:r>
+        <w:t>)</w:t>
+      </w:r>
+    </w:p>
+    <w:p/>
+    <w:p>
+      <w:r>
+        <w:t xml:space="preserve">В отличие от текущего состояния, модель TO-BE включает в себя расширенный набор участников и процессов. Помимо заемщика и кредитора, в системе выделяется активная роль платформы как самостоятельного участника, выполняющего функции анализа данных, проверки пользователей и управления рисками. Процесс начинается с регистрации пользователя и заполнения профиля, включая данные об академической успеваемости. После отправки заявки система выполняет комплексную проверку, включающую анализ предоставленных данных и расчет </w:t>
+      </w:r>
+      <w:proofErr w:type="spellStart"/>
+      <w:r>
+        <w:t>скорингового</w:t>
+      </w:r>
+      <w:proofErr w:type="spellEnd"/>
+      <w:r>
+        <w:t xml:space="preserve"> показателя.</w:t>
+      </w:r>
+    </w:p>
+    <w:p>
+      <w:r>
+        <w:t>На основании результатов скоринга принимается решение о возможности публикации заявки. В случае положительного результата заявка становится доступной для кредиторов, которые получают уведомления и могут принять решение о финансировании. Дополнительно система формирует механизмы гарантий возврата, такие как рейтинги пользователей или резервные фонды. После предоставления средств осуществляется постоянный мониторинг выполнения обязательств заемщиком, включая контроль сроков и обработку возможных просрочек.</w:t>
+      </w:r>
+    </w:p>
+    <w:p>
+      <w:r>
+        <w:t>Таким образом, модель TO-BE демонстрирует более сложную, но при этом значительно более эффективную организацию бизнес-процессов. Внедрение модуля проверки успеваемости позволяет учитывать дополнительные характеристики заемщика, что повышает точность оценки его надежности. Реализация механизмов гарантий возврата средств снижает риски для кредиторов и способствует повышению доверия к платформе.</w:t>
+      </w:r>
+    </w:p>
+    <w:p>
+      <w:r>
+        <w:t xml:space="preserve">Сравнительный анализ моделей AS-IS и TO-BE позволяет сделать вывод о целесообразности внедрения предлагаемых изменений. Переход к целевой </w:t>
+      </w:r>
+      <w:r>
+        <w:lastRenderedPageBreak/>
+        <w:t>модели обеспечивает повышение прозрачности процессов, снижение уровня рисков и улучшение качества взаимодействия между участниками системы. Это, в свою очередь, создает предпосылки для успешной реализации платформы P2P-кредитования студентов и ее эффективного функционирования в условиях реальной эксплуатации.</w:t>
+      </w:r>
+    </w:p>
+    <w:p/>
+    <w:p>
+      <w:pPr>
+        <w:pStyle w:val="2"/>
+        <w:rPr>
+          <w:lang w:val="ru-RU"/>
+        </w:rPr>
+      </w:pPr>
+      <w:bookmarkStart w:id="7" w:name="_Toc223367495"/>
+      <w:r>
+        <w:rPr>
+          <w:lang w:val="ru-RU"/>
+        </w:rPr>
+        <w:t>Разработка спецификации требований к программному продукту</w:t>
+      </w:r>
+      <w:bookmarkEnd w:id="7"/>
+    </w:p>
+    <w:p>
+      <w:pPr>
+        <w:ind w:left="720" w:firstLine="0"/>
+      </w:pPr>
+    </w:p>
+    <w:p>
+      <w:r>
+        <w:t>Разработка спецификации требований является ключевым этапом проектирования программного средства, так как именно на данном этапе формируются основные характеристики системы, определяющие ее функциональность, производительность, безопасность и удобство использования. Спецификация требований позволяет формализовать ожидания пользователей и определить границы разрабатываемого решения, что в дальнейшем способствует снижению количества ошибок на этапе реализации и тестирования.</w:t>
+      </w:r>
+    </w:p>
+    <w:p>
+      <w:r>
+        <w:t xml:space="preserve">В рамках данного курсового проекта разрабатывается платформа </w:t>
+      </w:r>
+      <w:r>
+        <w:rPr>
+          <w:lang w:val="en-US"/>
+        </w:rPr>
+        <w:t>P</w:t>
+      </w:r>
+      <w:r>
+        <w:t>2</w:t>
+      </w:r>
+      <w:r>
+        <w:rPr>
+          <w:lang w:val="en-US"/>
+        </w:rPr>
+        <w:t>P</w:t>
+      </w:r>
+      <w:r>
+        <w:t>-кредитования студентов, предназначенная для организации взаимодействия между заемщиками и кредиторами с использованием современных веб-технологий. Система должна обеспечивать полный цикл работы с займами — от подачи заявки до полного возврата средств, а также реализовывать механизмы оценки надежности пользователей и гарантии возврата средств.</w:t>
+      </w:r>
+    </w:p>
+    <w:p>
+      <w:r>
+        <w:t>Функциональные требования определяют перечень возможностей, которые должна предоставлять система пользователям. В рамках разрабатываемого программного средства можно выделить несколько ключевых групп функциональности, связанных с управлением пользователями, обработкой заявок, взаимодействием между участниками и обеспечением безопасности.</w:t>
+      </w:r>
+    </w:p>
+    <w:p>
+      <w:pPr>
+        <w:ind w:left="720" w:firstLine="0"/>
+      </w:pPr>
+      <w:r>
+        <w:t>Для структурирования функциональных требований приведена таблица.</w:t>
+      </w:r>
+    </w:p>
+    <w:p>
+      <w:pPr>
+        <w:ind w:firstLine="0"/>
+      </w:pPr>
+    </w:p>
+    <w:p>
+      <w:pPr>
+        <w:ind w:firstLine="0"/>
+        <w:rPr>
+          <w:lang w:val="en-US"/>
+        </w:rPr>
+      </w:pPr>
+      <w:proofErr w:type="spellStart"/>
+      <w:r>
+        <w:rPr>
+          <w:lang w:val="en-US"/>
+        </w:rPr>
+        <w:t>Таблица</w:t>
+      </w:r>
+      <w:proofErr w:type="spellEnd"/>
+      <w:r>
+        <w:rPr>
+          <w:lang w:val="en-US"/>
+        </w:rPr>
+        <w:t xml:space="preserve"> </w:t>
+      </w:r>
+      <w:r>
+        <w:rPr>
+          <w:lang w:val="en-US"/>
+        </w:rPr>
+        <w:t>2</w:t>
+      </w:r>
+      <w:r>
+        <w:rPr>
+          <w:lang w:val="en-US"/>
+        </w:rPr>
+        <w:t>.</w:t>
+      </w:r>
+      <w:r>
+        <w:rPr>
+          <w:lang w:val="en-US"/>
+        </w:rPr>
+        <w:t>1</w:t>
+      </w:r>
+      <w:r>
+        <w:rPr>
+          <w:lang w:val="en-US"/>
+        </w:rPr>
+        <w:t xml:space="preserve"> – </w:t>
+      </w:r>
+      <w:proofErr w:type="spellStart"/>
+      <w:r>
+        <w:rPr>
+          <w:lang w:val="en-US"/>
+        </w:rPr>
+        <w:t>Основные</w:t>
+      </w:r>
+      <w:proofErr w:type="spellEnd"/>
+      <w:r>
+        <w:rPr>
+          <w:lang w:val="en-US"/>
+        </w:rPr>
+        <w:t xml:space="preserve"> </w:t>
+      </w:r>
+      <w:proofErr w:type="spellStart"/>
+      <w:r>
+        <w:rPr>
+          <w:lang w:val="en-US"/>
+        </w:rPr>
+        <w:t>функциональные</w:t>
+      </w:r>
+      <w:proofErr w:type="spellEnd"/>
+      <w:r>
+        <w:rPr>
+          <w:lang w:val="en-US"/>
+        </w:rPr>
+        <w:t xml:space="preserve"> </w:t>
+      </w:r>
+      <w:proofErr w:type="spellStart"/>
+      <w:r>
+        <w:rPr>
+          <w:lang w:val="en-US"/>
+        </w:rPr>
+        <w:t>требования</w:t>
+      </w:r>
+      <w:proofErr w:type="spellEnd"/>
+    </w:p>
+    <w:tbl>
+      <w:tblPr>
+        <w:tblStyle w:val="afc"/>
+        <w:tblW w:w="0" w:type="auto"/>
+        <w:tblLook w:val="04A0" w:firstRow="1" w:lastRow="0" w:firstColumn="1" w:lastColumn="0" w:noHBand="0" w:noVBand="1"/>
+      </w:tblPr>
+      <w:tblGrid>
+        <w:gridCol w:w="3114"/>
+        <w:gridCol w:w="3115"/>
+        <w:gridCol w:w="3115"/>
+      </w:tblGrid>
+      <w:tr>
+        <w:tc>
+          <w:tcPr>
+            <w:tcW w:w="3114" w:type="dxa"/>
+          </w:tcPr>
+          <w:p>
+            <w:pPr>
+              <w:ind w:firstLine="0"/>
+              <w:rPr>
+                <w:lang w:val="en-US"/>
+              </w:rPr>
+            </w:pPr>
+            <w:r>
+              <w:rPr>
+                <w:lang w:val="en-US"/>
+              </w:rPr>
+              <w:t>№</w:t>
+            </w:r>
+          </w:p>
+        </w:tc>
+        <w:tc>
+          <w:tcPr>
+            <w:tcW w:w="3115" w:type="dxa"/>
+          </w:tcPr>
+          <w:p>
+            <w:pPr>
+              <w:ind w:firstLine="0"/>
+              <w:rPr>
+                <w:lang w:val="en-US"/>
+              </w:rPr>
+            </w:pPr>
+            <w:proofErr w:type="spellStart"/>
+            <w:r>
+              <w:rPr>
+                <w:lang w:val="en-US"/>
+              </w:rPr>
+              <w:t>Наименование</w:t>
+            </w:r>
+            <w:proofErr w:type="spellEnd"/>
+            <w:r>
+              <w:rPr>
+                <w:lang w:val="en-US"/>
+              </w:rPr>
+              <w:t xml:space="preserve"> </w:t>
+            </w:r>
+            <w:proofErr w:type="spellStart"/>
+            <w:r>
+              <w:rPr>
+                <w:lang w:val="en-US"/>
+              </w:rPr>
+              <w:t>требования</w:t>
+            </w:r>
+            <w:proofErr w:type="spellEnd"/>
+          </w:p>
+        </w:tc>
+        <w:tc>
+          <w:tcPr>
+            <w:tcW w:w="3115" w:type="dxa"/>
+          </w:tcPr>
+          <w:p>
+            <w:pPr>
+              <w:ind w:firstLine="0"/>
+              <w:rPr>
+                <w:lang w:val="en-US"/>
+              </w:rPr>
+            </w:pPr>
+            <w:r>
+              <w:rPr>
+                <w:lang w:val="en-US"/>
+              </w:rPr>
+              <w:t>Описание</w:t>
+            </w:r>
+          </w:p>
+        </w:tc>
+      </w:tr>
+      <w:tr>
+        <w:tc>
+          <w:tcPr>
+            <w:tcW w:w="3114" w:type="dxa"/>
+          </w:tcPr>
+          <w:p>
+            <w:pPr>
+              <w:ind w:firstLine="0"/>
+              <w:rPr>
+                <w:lang w:val="en-US"/>
+              </w:rPr>
+            </w:pPr>
+            <w:r>
+              <w:rPr>
+                <w:lang w:val="en-US"/>
+              </w:rPr>
+              <w:t>1</w:t>
+            </w:r>
+          </w:p>
+        </w:tc>
+        <w:tc>
+          <w:tcPr>
+            <w:tcW w:w="3115" w:type="dxa"/>
+          </w:tcPr>
+          <w:p>
+            <w:pPr>
+              <w:ind w:firstLine="0"/>
+              <w:rPr>
+                <w:lang w:val="en-US"/>
+              </w:rPr>
+            </w:pPr>
+            <w:proofErr w:type="spellStart"/>
+            <w:r>
+              <w:rPr>
+                <w:lang w:val="en-US"/>
+              </w:rPr>
+              <w:t>Регистрация</w:t>
+            </w:r>
+            <w:proofErr w:type="spellEnd"/>
+            <w:r>
+              <w:rPr>
+                <w:lang w:val="en-US"/>
+              </w:rPr>
+              <w:t xml:space="preserve"> </w:t>
+            </w:r>
+            <w:proofErr w:type="spellStart"/>
+            <w:r>
+              <w:rPr>
+                <w:lang w:val="en-US"/>
+              </w:rPr>
+              <w:t>пользователей</w:t>
+            </w:r>
+            <w:proofErr w:type="spellEnd"/>
+          </w:p>
+        </w:tc>
+        <w:tc>
+          <w:tcPr>
+            <w:tcW w:w="3115" w:type="dxa"/>
+          </w:tcPr>
+          <w:p>
+            <w:pPr>
+              <w:ind w:firstLine="0"/>
+              <w:rPr>
+                <w:lang w:val="en-US"/>
+              </w:rPr>
+            </w:pPr>
+            <w:proofErr w:type="spellStart"/>
+            <w:r>
+              <w:rPr>
+                <w:lang w:val="en-US"/>
+              </w:rPr>
+              <w:t>Возможность</w:t>
+            </w:r>
+            <w:proofErr w:type="spellEnd"/>
+            <w:r>
+              <w:rPr>
+                <w:lang w:val="en-US"/>
+              </w:rPr>
+              <w:t xml:space="preserve"> </w:t>
+            </w:r>
+            <w:proofErr w:type="spellStart"/>
+            <w:r>
+              <w:rPr>
+                <w:lang w:val="en-US"/>
+              </w:rPr>
+              <w:t>создания</w:t>
+            </w:r>
+            <w:proofErr w:type="spellEnd"/>
+            <w:r>
+              <w:rPr>
+                <w:lang w:val="en-US"/>
+              </w:rPr>
+              <w:t xml:space="preserve"> </w:t>
+            </w:r>
+            <w:proofErr w:type="spellStart"/>
+            <w:r>
+              <w:rPr>
+                <w:lang w:val="en-US"/>
+              </w:rPr>
+              <w:t>учетной</w:t>
+            </w:r>
+            <w:proofErr w:type="spellEnd"/>
+            <w:r>
+              <w:rPr>
+                <w:lang w:val="en-US"/>
+              </w:rPr>
+              <w:t xml:space="preserve"> </w:t>
+            </w:r>
+            <w:proofErr w:type="spellStart"/>
+            <w:r>
+              <w:rPr>
+                <w:lang w:val="en-US"/>
+              </w:rPr>
+              <w:t>записи</w:t>
+            </w:r>
+            <w:proofErr w:type="spellEnd"/>
+          </w:p>
+        </w:tc>
+      </w:tr>
+      <w:tr>
+        <w:tc>
+          <w:tcPr>
+            <w:tcW w:w="3114" w:type="dxa"/>
+          </w:tcPr>
+          <w:p>
+            <w:pPr>
+              <w:ind w:firstLine="0"/>
+              <w:rPr>
+                <w:lang w:val="en-US"/>
+              </w:rPr>
+            </w:pPr>
+            <w:r>
+              <w:rPr>
+                <w:lang w:val="en-US"/>
+              </w:rPr>
+              <w:t>2</w:t>
+            </w:r>
+          </w:p>
+        </w:tc>
+        <w:tc>
+          <w:tcPr>
+            <w:tcW w:w="3115" w:type="dxa"/>
+          </w:tcPr>
+          <w:p>
+            <w:pPr>
+              <w:ind w:firstLine="0"/>
+              <w:rPr>
+                <w:lang w:val="en-US"/>
+              </w:rPr>
+            </w:pPr>
+            <w:proofErr w:type="spellStart"/>
+            <w:r>
+              <w:rPr>
+                <w:lang w:val="en-US"/>
+              </w:rPr>
+              <w:t>Аутентификация</w:t>
+            </w:r>
+            <w:proofErr w:type="spellEnd"/>
+          </w:p>
+        </w:tc>
+        <w:tc>
+          <w:tcPr>
+            <w:tcW w:w="3115" w:type="dxa"/>
+          </w:tcPr>
+          <w:p>
+            <w:pPr>
+              <w:ind w:firstLine="0"/>
+            </w:pPr>
+            <w:r>
+              <w:t>Вход в систему с использованием логина и пароля</w:t>
+            </w:r>
+          </w:p>
+        </w:tc>
+      </w:tr>
+      <w:tr>
+        <w:tc>
+          <w:tcPr>
+            <w:tcW w:w="3114" w:type="dxa"/>
+          </w:tcPr>
+          <w:p>
+            <w:pPr>
+              <w:ind w:firstLine="0"/>
+              <w:rPr>
+                <w:lang w:val="en-US"/>
+              </w:rPr>
+            </w:pPr>
+            <w:r>
+              <w:rPr>
+                <w:lang w:val="en-US"/>
+              </w:rPr>
+              <w:t>3</w:t>
+            </w:r>
+          </w:p>
+        </w:tc>
+        <w:tc>
+          <w:tcPr>
+            <w:tcW w:w="3115" w:type="dxa"/>
+          </w:tcPr>
+          <w:p>
+            <w:pPr>
+              <w:ind w:firstLine="0"/>
+              <w:rPr>
+                <w:lang w:val="en-US"/>
+              </w:rPr>
+            </w:pPr>
+            <w:proofErr w:type="spellStart"/>
+            <w:r>
+              <w:rPr>
+                <w:lang w:val="en-US"/>
+              </w:rPr>
+              <w:t>Управление</w:t>
+            </w:r>
+            <w:proofErr w:type="spellEnd"/>
+            <w:r>
+              <w:rPr>
+                <w:lang w:val="en-US"/>
+              </w:rPr>
+              <w:t xml:space="preserve"> </w:t>
+            </w:r>
+            <w:proofErr w:type="spellStart"/>
+            <w:r>
+              <w:rPr>
+                <w:lang w:val="en-US"/>
+              </w:rPr>
+              <w:t>профилем</w:t>
+            </w:r>
+            <w:proofErr w:type="spellEnd"/>
+          </w:p>
+        </w:tc>
+        <w:tc>
+          <w:tcPr>
+            <w:tcW w:w="3115" w:type="dxa"/>
+          </w:tcPr>
+          <w:p>
+            <w:pPr>
+              <w:ind w:firstLine="0"/>
+              <w:rPr>
+                <w:lang w:val="en-US"/>
+              </w:rPr>
+            </w:pPr>
+            <w:proofErr w:type="spellStart"/>
+            <w:r>
+              <w:rPr>
+                <w:lang w:val="en-US"/>
+              </w:rPr>
+              <w:t>Редактирование</w:t>
+            </w:r>
+            <w:proofErr w:type="spellEnd"/>
+            <w:r>
+              <w:rPr>
+                <w:lang w:val="en-US"/>
+              </w:rPr>
+              <w:t xml:space="preserve"> </w:t>
+            </w:r>
+            <w:proofErr w:type="spellStart"/>
+            <w:r>
+              <w:rPr>
+                <w:lang w:val="en-US"/>
+              </w:rPr>
+              <w:t>личных</w:t>
+            </w:r>
+            <w:proofErr w:type="spellEnd"/>
+            <w:r>
+              <w:rPr>
+                <w:lang w:val="en-US"/>
+              </w:rPr>
+              <w:t xml:space="preserve"> данных</w:t>
+            </w:r>
+          </w:p>
+        </w:tc>
+      </w:tr>
+    </w:tbl>
+    <w:p>
+      <w:pPr>
+        <w:ind w:firstLine="0"/>
+      </w:pPr>
+      <w:r>
+        <w:lastRenderedPageBreak/>
+        <w:t>Продолжение таблицы 2.1</w:t>
+      </w:r>
+    </w:p>
+    <w:tbl>
+      <w:tblPr>
+        <w:tblStyle w:val="afc"/>
+        <w:tblW w:w="0" w:type="auto"/>
+        <w:tblLook w:val="04A0" w:firstRow="1" w:lastRow="0" w:firstColumn="1" w:lastColumn="0" w:noHBand="0" w:noVBand="1"/>
+      </w:tblPr>
+      <w:tblGrid>
+        <w:gridCol w:w="3114"/>
+        <w:gridCol w:w="3115"/>
+        <w:gridCol w:w="3115"/>
+      </w:tblGrid>
+      <w:tr>
+        <w:tc>
+          <w:tcPr>
+            <w:tcW w:w="3114" w:type="dxa"/>
+          </w:tcPr>
+          <w:p>
+            <w:pPr>
+              <w:ind w:firstLine="0"/>
+            </w:pPr>
+            <w:r>
+              <w:t>№</w:t>
+            </w:r>
+          </w:p>
+        </w:tc>
+        <w:tc>
+          <w:tcPr>
+            <w:tcW w:w="3115" w:type="dxa"/>
+          </w:tcPr>
+          <w:p>
+            <w:pPr>
+              <w:ind w:firstLine="0"/>
+              <w:rPr>
+                <w:lang w:val="en-US"/>
+              </w:rPr>
+            </w:pPr>
+            <w:proofErr w:type="spellStart"/>
+            <w:r>
+              <w:rPr>
+                <w:lang w:val="en-US"/>
+              </w:rPr>
+              <w:t>Наименование</w:t>
+            </w:r>
+            <w:proofErr w:type="spellEnd"/>
+            <w:r>
+              <w:rPr>
+                <w:lang w:val="en-US"/>
+              </w:rPr>
+              <w:t xml:space="preserve"> </w:t>
+            </w:r>
+            <w:proofErr w:type="spellStart"/>
+            <w:r>
+              <w:rPr>
+                <w:lang w:val="en-US"/>
+              </w:rPr>
+              <w:t>требования</w:t>
+            </w:r>
+            <w:proofErr w:type="spellEnd"/>
+          </w:p>
+        </w:tc>
+        <w:tc>
+          <w:tcPr>
+            <w:tcW w:w="3115" w:type="dxa"/>
+          </w:tcPr>
+          <w:p>
+            <w:pPr>
+              <w:ind w:firstLine="0"/>
+              <w:rPr>
+                <w:lang w:val="en-US"/>
+              </w:rPr>
+            </w:pPr>
+            <w:r>
+              <w:rPr>
+                <w:lang w:val="en-US"/>
+              </w:rPr>
+              <w:t>Описание</w:t>
+            </w:r>
+          </w:p>
+        </w:tc>
+      </w:tr>
+      <w:tr>
+        <w:tc>
+          <w:tcPr>
+            <w:tcW w:w="3114" w:type="dxa"/>
+          </w:tcPr>
+          <w:p>
+            <w:pPr>
+              <w:ind w:firstLine="0"/>
+            </w:pPr>
+            <w:r>
+              <w:t>4</w:t>
+            </w:r>
+          </w:p>
+        </w:tc>
+        <w:tc>
+          <w:tcPr>
+            <w:tcW w:w="3115" w:type="dxa"/>
+          </w:tcPr>
+          <w:p>
+            <w:pPr>
+              <w:ind w:firstLine="0"/>
+              <w:rPr>
+                <w:lang w:val="en-US"/>
+              </w:rPr>
+            </w:pPr>
+            <w:proofErr w:type="spellStart"/>
+            <w:r>
+              <w:rPr>
+                <w:lang w:val="en-US"/>
+              </w:rPr>
+              <w:t>Ввод</w:t>
+            </w:r>
+            <w:proofErr w:type="spellEnd"/>
+            <w:r>
+              <w:rPr>
+                <w:lang w:val="en-US"/>
+              </w:rPr>
+              <w:t xml:space="preserve"> данных </w:t>
+            </w:r>
+            <w:proofErr w:type="spellStart"/>
+            <w:r>
+              <w:rPr>
+                <w:lang w:val="en-US"/>
+              </w:rPr>
+              <w:t>об</w:t>
+            </w:r>
+            <w:proofErr w:type="spellEnd"/>
+            <w:r>
+              <w:rPr>
+                <w:lang w:val="en-US"/>
+              </w:rPr>
+              <w:t xml:space="preserve"> </w:t>
+            </w:r>
+            <w:proofErr w:type="spellStart"/>
+            <w:r>
+              <w:rPr>
+                <w:lang w:val="en-US"/>
+              </w:rPr>
+              <w:t>успеваемости</w:t>
+            </w:r>
+            <w:proofErr w:type="spellEnd"/>
+          </w:p>
+        </w:tc>
+        <w:tc>
+          <w:tcPr>
+            <w:tcW w:w="3115" w:type="dxa"/>
+          </w:tcPr>
+          <w:p>
+            <w:pPr>
+              <w:ind w:firstLine="0"/>
+            </w:pPr>
+            <w:r>
+              <w:t>Добавление информации об академической успеваемости</w:t>
+            </w:r>
+          </w:p>
+        </w:tc>
+      </w:tr>
+      <w:tr>
+        <w:tc>
+          <w:tcPr>
+            <w:tcW w:w="3114" w:type="dxa"/>
+          </w:tcPr>
+          <w:p>
+            <w:pPr>
+              <w:ind w:firstLine="0"/>
+            </w:pPr>
+            <w:r>
+              <w:t>5</w:t>
+            </w:r>
+          </w:p>
+        </w:tc>
+        <w:tc>
+          <w:tcPr>
+            <w:tcW w:w="3115" w:type="dxa"/>
+          </w:tcPr>
+          <w:p>
+            <w:pPr>
+              <w:ind w:firstLine="0"/>
+            </w:pPr>
+            <w:r>
+              <w:t>Подача заявки на заем</w:t>
+            </w:r>
+          </w:p>
+        </w:tc>
+        <w:tc>
+          <w:tcPr>
+            <w:tcW w:w="3115" w:type="dxa"/>
+          </w:tcPr>
+          <w:p>
+            <w:pPr>
+              <w:ind w:firstLine="0"/>
+            </w:pPr>
+            <w:r>
+              <w:t>Создание заявки с указанием параметров</w:t>
+            </w:r>
+          </w:p>
+        </w:tc>
+      </w:tr>
+      <w:tr>
+        <w:tc>
+          <w:tcPr>
+            <w:tcW w:w="3114" w:type="dxa"/>
+          </w:tcPr>
+          <w:p>
+            <w:pPr>
+              <w:ind w:firstLine="0"/>
+            </w:pPr>
+            <w:r>
+              <w:t>6</w:t>
+            </w:r>
+          </w:p>
+        </w:tc>
+        <w:tc>
+          <w:tcPr>
+            <w:tcW w:w="3115" w:type="dxa"/>
+          </w:tcPr>
+          <w:p>
+            <w:pPr>
+              <w:ind w:firstLine="0"/>
+            </w:pPr>
+            <w:r>
+              <w:t>Просмотр заявок</w:t>
+            </w:r>
+          </w:p>
+        </w:tc>
+        <w:tc>
+          <w:tcPr>
+            <w:tcW w:w="3115" w:type="dxa"/>
+          </w:tcPr>
+          <w:p>
+            <w:pPr>
+              <w:ind w:firstLine="0"/>
+            </w:pPr>
+            <w:r>
+              <w:t>Отображение доступных заявок для кредиторов</w:t>
+            </w:r>
+          </w:p>
+        </w:tc>
+      </w:tr>
+      <w:tr>
+        <w:tc>
+          <w:tcPr>
+            <w:tcW w:w="3114" w:type="dxa"/>
+          </w:tcPr>
+          <w:p>
+            <w:pPr>
+              <w:ind w:firstLine="0"/>
+            </w:pPr>
+            <w:r>
+              <w:t>7</w:t>
+            </w:r>
+          </w:p>
+        </w:tc>
+        <w:tc>
+          <w:tcPr>
+            <w:tcW w:w="3115" w:type="dxa"/>
+          </w:tcPr>
+          <w:p>
+            <w:pPr>
+              <w:ind w:firstLine="0"/>
+            </w:pPr>
+            <w:r>
+              <w:t>Оценка заемщика</w:t>
+            </w:r>
+          </w:p>
+        </w:tc>
+        <w:tc>
+          <w:tcPr>
+            <w:tcW w:w="3115" w:type="dxa"/>
+          </w:tcPr>
+          <w:p>
+            <w:pPr>
+              <w:ind w:firstLine="0"/>
+            </w:pPr>
+            <w:r>
+              <w:t>Расчет скоринга на основе различных параметров</w:t>
+            </w:r>
+          </w:p>
+        </w:tc>
+      </w:tr>
+      <w:tr>
+        <w:tc>
+          <w:tcPr>
+            <w:tcW w:w="3114" w:type="dxa"/>
+          </w:tcPr>
+          <w:p>
+            <w:pPr>
+              <w:ind w:firstLine="0"/>
+            </w:pPr>
+            <w:r>
+              <w:t>8</w:t>
+            </w:r>
+          </w:p>
+        </w:tc>
+        <w:tc>
+          <w:tcPr>
+            <w:tcW w:w="3115" w:type="dxa"/>
+          </w:tcPr>
+          <w:p>
+            <w:pPr>
+              <w:ind w:firstLine="0"/>
+            </w:pPr>
+            <w:r>
+              <w:t>Инвестирование</w:t>
+            </w:r>
+          </w:p>
+        </w:tc>
+        <w:tc>
+          <w:tcPr>
+            <w:tcW w:w="3115" w:type="dxa"/>
+          </w:tcPr>
+          <w:p>
+            <w:pPr>
+              <w:ind w:firstLine="0"/>
+            </w:pPr>
+            <w:r>
+              <w:t>Возможность предоставления средств</w:t>
+            </w:r>
+          </w:p>
+        </w:tc>
+      </w:tr>
+      <w:tr>
+        <w:tc>
+          <w:tcPr>
+            <w:tcW w:w="3114" w:type="dxa"/>
+          </w:tcPr>
+          <w:p>
+            <w:pPr>
+              <w:ind w:firstLine="0"/>
+            </w:pPr>
+            <w:r>
+              <w:t>9</w:t>
+            </w:r>
+          </w:p>
+        </w:tc>
+        <w:tc>
+          <w:tcPr>
+            <w:tcW w:w="3115" w:type="dxa"/>
+          </w:tcPr>
+          <w:p>
+            <w:pPr>
+              <w:ind w:firstLine="0"/>
+            </w:pPr>
+            <w:r>
+              <w:t>Управление займами</w:t>
+            </w:r>
+          </w:p>
+        </w:tc>
+        <w:tc>
+          <w:tcPr>
+            <w:tcW w:w="3115" w:type="dxa"/>
+          </w:tcPr>
+          <w:p>
+            <w:pPr>
+              <w:ind w:firstLine="0"/>
+            </w:pPr>
+            <w:r>
+              <w:t>Отслеживание статуса займов</w:t>
+            </w:r>
+          </w:p>
+        </w:tc>
+      </w:tr>
+      <w:tr>
+        <w:tc>
+          <w:tcPr>
+            <w:tcW w:w="3114" w:type="dxa"/>
+          </w:tcPr>
+          <w:p>
+            <w:pPr>
+              <w:ind w:firstLine="0"/>
+            </w:pPr>
+            <w:r>
+              <w:t>10</w:t>
+            </w:r>
+          </w:p>
+        </w:tc>
+        <w:tc>
+          <w:tcPr>
+            <w:tcW w:w="3115" w:type="dxa"/>
+          </w:tcPr>
+          <w:p>
+            <w:pPr>
+              <w:ind w:firstLine="0"/>
+            </w:pPr>
+            <w:r>
+              <w:t>Возврат средств</w:t>
+            </w:r>
+          </w:p>
+        </w:tc>
+        <w:tc>
+          <w:tcPr>
+            <w:tcW w:w="3115" w:type="dxa"/>
+          </w:tcPr>
+          <w:p>
+            <w:pPr>
+              <w:ind w:firstLine="0"/>
+            </w:pPr>
+            <w:r>
+              <w:t>Реализация механизма погашения займа</w:t>
+            </w:r>
+          </w:p>
+        </w:tc>
+      </w:tr>
+      <w:tr>
+        <w:tc>
+          <w:tcPr>
+            <w:tcW w:w="3114" w:type="dxa"/>
+          </w:tcPr>
+          <w:p>
+            <w:pPr>
+              <w:ind w:firstLine="0"/>
+            </w:pPr>
+            <w:r>
+              <w:t>11</w:t>
+            </w:r>
+          </w:p>
+        </w:tc>
+        <w:tc>
+          <w:tcPr>
+            <w:tcW w:w="3115" w:type="dxa"/>
+          </w:tcPr>
+          <w:p>
+            <w:pPr>
+              <w:ind w:firstLine="0"/>
+            </w:pPr>
+            <w:r>
+              <w:t>Рейтинговая система</w:t>
+            </w:r>
+          </w:p>
+        </w:tc>
+        <w:tc>
+          <w:tcPr>
+            <w:tcW w:w="3115" w:type="dxa"/>
+          </w:tcPr>
+          <w:p>
+            <w:pPr>
+              <w:ind w:firstLine="0"/>
+            </w:pPr>
+            <w:r>
+              <w:t>Формирование рейтинга пользователей</w:t>
+            </w:r>
+          </w:p>
+        </w:tc>
+      </w:tr>
+      <w:tr>
+        <w:tc>
+          <w:tcPr>
+            <w:tcW w:w="3114" w:type="dxa"/>
+          </w:tcPr>
+          <w:p>
+            <w:pPr>
+              <w:ind w:firstLine="0"/>
+            </w:pPr>
+            <w:r>
+              <w:t>12</w:t>
+            </w:r>
+          </w:p>
+        </w:tc>
+        <w:tc>
+          <w:tcPr>
+            <w:tcW w:w="3115" w:type="dxa"/>
+          </w:tcPr>
+          <w:p>
+            <w:pPr>
+              <w:ind w:firstLine="0"/>
+            </w:pPr>
+            <w:r>
+              <w:t>Уведомления</w:t>
+            </w:r>
+          </w:p>
+        </w:tc>
+        <w:tc>
+          <w:tcPr>
+            <w:tcW w:w="3115" w:type="dxa"/>
+          </w:tcPr>
+          <w:p>
+            <w:pPr>
+              <w:ind w:firstLine="0"/>
+            </w:pPr>
+            <w:r>
+              <w:t>Информирование пользователей о событиях</w:t>
+            </w:r>
+          </w:p>
+        </w:tc>
+      </w:tr>
+      <w:tr>
+        <w:tc>
+          <w:tcPr>
+            <w:tcW w:w="3114" w:type="dxa"/>
+          </w:tcPr>
+          <w:p>
+            <w:pPr>
+              <w:ind w:firstLine="0"/>
+            </w:pPr>
+            <w:r>
+              <w:t>13</w:t>
+            </w:r>
+          </w:p>
+        </w:tc>
+        <w:tc>
+          <w:tcPr>
+            <w:tcW w:w="3115" w:type="dxa"/>
+          </w:tcPr>
+          <w:p>
+            <w:pPr>
+              <w:ind w:firstLine="0"/>
+            </w:pPr>
+            <w:r>
+              <w:t>Администрирование</w:t>
+            </w:r>
+          </w:p>
+        </w:tc>
+        <w:tc>
+          <w:tcPr>
+            <w:tcW w:w="3115" w:type="dxa"/>
+          </w:tcPr>
+          <w:p>
+            <w:pPr>
+              <w:ind w:firstLine="0"/>
+            </w:pPr>
+            <w:r>
+              <w:t>Управление системой и пользователями</w:t>
+            </w:r>
+          </w:p>
+        </w:tc>
+      </w:tr>
+      <w:tr>
+        <w:tc>
+          <w:tcPr>
+            <w:tcW w:w="3114" w:type="dxa"/>
+          </w:tcPr>
+          <w:p>
+            <w:pPr>
+              <w:ind w:firstLine="0"/>
+            </w:pPr>
+            <w:r>
+              <w:t>14</w:t>
+            </w:r>
+          </w:p>
+        </w:tc>
+        <w:tc>
+          <w:tcPr>
+            <w:tcW w:w="3115" w:type="dxa"/>
+          </w:tcPr>
+          <w:p>
+            <w:pPr>
+              <w:ind w:firstLine="0"/>
+            </w:pPr>
+            <w:r>
+              <w:t>Интеграция с внешними API</w:t>
+            </w:r>
+          </w:p>
+        </w:tc>
+        <w:tc>
+          <w:tcPr>
+            <w:tcW w:w="3115" w:type="dxa"/>
+          </w:tcPr>
+          <w:p>
+            <w:pPr>
+              <w:ind w:firstLine="0"/>
+            </w:pPr>
+            <w:r>
+              <w:t>Получение данных из сторонних сервисов</w:t>
+            </w:r>
+          </w:p>
+        </w:tc>
+      </w:tr>
+      <w:tr>
+        <w:tc>
+          <w:tcPr>
+            <w:tcW w:w="3114" w:type="dxa"/>
+          </w:tcPr>
+          <w:p>
+            <w:pPr>
+              <w:ind w:firstLine="0"/>
+            </w:pPr>
+            <w:r>
+              <w:t>15</w:t>
+            </w:r>
+          </w:p>
+        </w:tc>
+        <w:tc>
+          <w:tcPr>
+            <w:tcW w:w="3115" w:type="dxa"/>
+          </w:tcPr>
+          <w:p>
+            <w:pPr>
+              <w:ind w:firstLine="0"/>
+            </w:pPr>
+            <w:r>
+              <w:t>Обработка просрочек</w:t>
+            </w:r>
+          </w:p>
+        </w:tc>
+        <w:tc>
+          <w:tcPr>
+            <w:tcW w:w="3115" w:type="dxa"/>
+          </w:tcPr>
+          <w:p>
+            <w:pPr>
+              <w:ind w:firstLine="0"/>
+            </w:pPr>
+            <w:r>
+              <w:t>Работа с невыполненными обязательствами</w:t>
+            </w:r>
+          </w:p>
+        </w:tc>
+      </w:tr>
+    </w:tbl>
+    <w:p>
+      <w:pPr>
+        <w:ind w:firstLine="0"/>
+      </w:pPr>
+    </w:p>
+    <w:p>
+      <w:pPr>
+        <w:ind w:firstLine="0"/>
+      </w:pPr>
+      <w:r>
+        <w:tab/>
+        <w:t>Как видно из таблицы, система должна поддерживать не менее пятнадцати вариантов использования, что соответствует требованиям задания. При этом особое внимание уделяется таким функциям, как анализ данных пользователя и формирование рейтинга, поскольку именно они являются ключевыми элементами, обеспечивающими надежность системы.</w:t>
+      </w:r>
+    </w:p>
+    <w:p>
+      <w:r>
+        <w:t xml:space="preserve">Наряду с функциональными требованиями важную роль играют нефункциональные требования, определяющие качество работы системы. К </w:t>
+      </w:r>
+      <w:r>
+        <w:lastRenderedPageBreak/>
+        <w:t>ним относятся требования к производительности, безопасности, надежности, масштабируемости и удобству использования.</w:t>
+      </w:r>
+    </w:p>
+    <w:p>
+      <w:r>
+        <w:t xml:space="preserve">Производительность системы должна обеспечивать быстрое выполнение основных операций, включая обработку запросов пользователей, расчет </w:t>
+      </w:r>
+      <w:proofErr w:type="spellStart"/>
+      <w:r>
+        <w:t>скоринговых</w:t>
+      </w:r>
+      <w:proofErr w:type="spellEnd"/>
+      <w:r>
+        <w:t xml:space="preserve"> показателей и взаимодействие с базой данных. Время отклика системы должно быть минимальным, что особенно важно при работе с большим количеством пользователей.</w:t>
+      </w:r>
+    </w:p>
+    <w:p>
+      <w:r>
+        <w:t>Безопасность является критически важным аспектом, так как система обрабатывает персональные и финансовые данные пользователей. В рамках разрабатываемого программного средства должны быть реализованы механизмы аутентификации и авторизации, защита данных с использованием шифрования, а также контроль доступа к различным функциям системы.</w:t>
+      </w:r>
+    </w:p>
+    <w:p>
+      <w:r>
+        <w:t>Для более детального представления нефункциональных требований приведена таблица.</w:t>
+      </w:r>
+    </w:p>
+    <w:p>
+      <w:pPr>
+        <w:ind w:firstLine="0"/>
+      </w:pPr>
+    </w:p>
+    <w:p>
+      <w:pPr>
+        <w:ind w:firstLine="0"/>
+      </w:pPr>
+      <w:r>
+        <w:t>Таблица 2.2 – Нефункциональные требования</w:t>
+      </w:r>
+    </w:p>
+    <w:tbl>
+      <w:tblPr>
+        <w:tblStyle w:val="afc"/>
+        <w:tblW w:w="0" w:type="auto"/>
+        <w:tblLook w:val="04A0" w:firstRow="1" w:lastRow="0" w:firstColumn="1" w:lastColumn="0" w:noHBand="0" w:noVBand="1"/>
+      </w:tblPr>
+      <w:tblGrid>
+        <w:gridCol w:w="4672"/>
+        <w:gridCol w:w="4672"/>
+      </w:tblGrid>
+      <w:tr>
+        <w:tc>
+          <w:tcPr>
+            <w:tcW w:w="4672" w:type="dxa"/>
+          </w:tcPr>
+          <w:p>
+            <w:pPr>
+              <w:ind w:firstLine="0"/>
+            </w:pPr>
+            <w:r>
+              <w:t>Категория</w:t>
+            </w:r>
+          </w:p>
+        </w:tc>
+        <w:tc>
+          <w:tcPr>
+            <w:tcW w:w="4672" w:type="dxa"/>
+          </w:tcPr>
+          <w:p>
+            <w:pPr>
+              <w:ind w:firstLine="0"/>
+            </w:pPr>
+            <w:r>
+              <w:t>Требование</w:t>
+            </w:r>
+          </w:p>
+        </w:tc>
+      </w:tr>
+      <w:tr>
+        <w:tc>
+          <w:tcPr>
+            <w:tcW w:w="4672" w:type="dxa"/>
+          </w:tcPr>
+          <w:p>
+            <w:pPr>
+              <w:ind w:firstLine="0"/>
+            </w:pPr>
+            <w:r>
+              <w:t>Производительность</w:t>
+            </w:r>
+          </w:p>
+        </w:tc>
+        <w:tc>
+          <w:tcPr>
+            <w:tcW w:w="4672" w:type="dxa"/>
+          </w:tcPr>
+          <w:p>
+            <w:pPr>
+              <w:ind w:firstLine="0"/>
+            </w:pPr>
+            <w:r>
+              <w:t xml:space="preserve">Время отклика системы не более 200 </w:t>
+            </w:r>
+            <w:proofErr w:type="spellStart"/>
+            <w:r>
+              <w:t>мс</w:t>
+            </w:r>
+            <w:proofErr w:type="spellEnd"/>
+            <w:r>
+              <w:t xml:space="preserve"> для большинства операций</w:t>
+            </w:r>
+          </w:p>
+        </w:tc>
+      </w:tr>
+      <w:tr>
+        <w:tc>
+          <w:tcPr>
+            <w:tcW w:w="4672" w:type="dxa"/>
+          </w:tcPr>
+          <w:p>
+            <w:pPr>
+              <w:ind w:firstLine="0"/>
+            </w:pPr>
+            <w:r>
+              <w:t>Безопасность</w:t>
+            </w:r>
+          </w:p>
+        </w:tc>
+        <w:tc>
+          <w:tcPr>
+            <w:tcW w:w="4672" w:type="dxa"/>
+          </w:tcPr>
+          <w:p>
+            <w:pPr>
+              <w:ind w:firstLine="0"/>
+            </w:pPr>
+            <w:r>
+              <w:t>Использование JWT-аутентификации и шифрования данных</w:t>
+            </w:r>
+          </w:p>
+        </w:tc>
+      </w:tr>
+      <w:tr>
+        <w:tc>
+          <w:tcPr>
+            <w:tcW w:w="4672" w:type="dxa"/>
+          </w:tcPr>
+          <w:p>
+            <w:pPr>
+              <w:ind w:firstLine="0"/>
+            </w:pPr>
+            <w:r>
+              <w:t>Надежность</w:t>
+            </w:r>
+          </w:p>
+        </w:tc>
+        <w:tc>
+          <w:tcPr>
+            <w:tcW w:w="4672" w:type="dxa"/>
+          </w:tcPr>
+          <w:p>
+            <w:pPr>
+              <w:ind w:firstLine="0"/>
+            </w:pPr>
+            <w:r>
+              <w:t>Обеспечение устойчивой работы при сбоях</w:t>
+            </w:r>
+          </w:p>
+        </w:tc>
+      </w:tr>
+      <w:tr>
+        <w:tc>
+          <w:tcPr>
+            <w:tcW w:w="4672" w:type="dxa"/>
+          </w:tcPr>
+          <w:p>
+            <w:pPr>
+              <w:ind w:firstLine="0"/>
+            </w:pPr>
+            <w:r>
+              <w:t>Масштабируемость</w:t>
+            </w:r>
+          </w:p>
+        </w:tc>
+        <w:tc>
+          <w:tcPr>
+            <w:tcW w:w="4672" w:type="dxa"/>
+          </w:tcPr>
+          <w:p>
+            <w:pPr>
+              <w:ind w:firstLine="0"/>
+            </w:pPr>
+            <w:r>
+              <w:t>Возможность увеличения нагрузки без потери производительности</w:t>
+            </w:r>
+          </w:p>
+        </w:tc>
+      </w:tr>
+      <w:tr>
+        <w:tc>
+          <w:tcPr>
+            <w:tcW w:w="4672" w:type="dxa"/>
+          </w:tcPr>
+          <w:p>
+            <w:pPr>
+              <w:ind w:firstLine="0"/>
+            </w:pPr>
+            <w:r>
+              <w:t>Удобство</w:t>
+            </w:r>
+          </w:p>
+        </w:tc>
+        <w:tc>
+          <w:tcPr>
+            <w:tcW w:w="4672" w:type="dxa"/>
+          </w:tcPr>
+          <w:p>
+            <w:pPr>
+              <w:ind w:firstLine="0"/>
+            </w:pPr>
+            <w:r>
+              <w:t>Интуитивно понятный интерфейс</w:t>
+            </w:r>
+          </w:p>
+        </w:tc>
+      </w:tr>
+    </w:tbl>
+    <w:p>
+      <w:pPr>
+        <w:ind w:firstLine="0"/>
+      </w:pPr>
+    </w:p>
+    <w:p>
+      <w:pPr>
+        <w:ind w:firstLine="0"/>
+      </w:pPr>
+      <w:r>
+        <w:tab/>
+        <w:t>В рамках данного проекта можно выделить основные сценарии: регистрация пользователя, подача заявки на заем, анализ заявки кредитором, предоставление средств, возврат займа и обработка просрочек. Эти сценарии формируют основу бизнес-логики системы и должны быть реализованы с учетом требований безопасности и удобства использования.</w:t>
+      </w:r>
+    </w:p>
+    <w:p>
+      <w:r>
+        <w:t>Таким образом, разработанная спецификация требований определяет ключевые характеристики программного средства и служит основой для дальнейшего проектирования и реализации системы. Четкое формулирование требований позволяет обеспечить соответствие разрабатываемого решения поставленным задачам и повысить качество конечного продукта.</w:t>
+      </w:r>
+    </w:p>
+    <w:p>
+      <w:pPr>
+        <w:ind w:firstLine="0"/>
+      </w:pPr>
+    </w:p>
+    <w:p>
+      <w:pPr>
+        <w:ind w:firstLine="0"/>
+      </w:pPr>
+    </w:p>
+    <w:p>
+      <w:pPr>
+        <w:ind w:firstLine="0"/>
+      </w:pPr>
+    </w:p>
+    <w:p>
+      <w:pPr>
+        <w:pStyle w:val="2"/>
+        <w:rPr>
+          <w:lang w:val="ru-RU"/>
+        </w:rPr>
+      </w:pPr>
+      <w:r>
+        <w:rPr>
+          <w:lang w:val="ru-RU"/>
+        </w:rPr>
+        <w:lastRenderedPageBreak/>
+        <w:t>Образ предлагаемого решения</w:t>
+      </w:r>
+    </w:p>
+    <w:p/>
+    <w:p>
+      <w:r>
+        <w:t>Образ предлагаемого решения представляет собой концептуальную модель разрабатываемого программного средства, отражающую его структуру, основные компоненты и принципы функционирования. Данный этап направлен на формирование общего представления о системе до начала ее детального проектирования и реализации.</w:t>
+      </w:r>
+    </w:p>
+    <w:p>
+      <w:r>
+        <w:t>Разрабатываемое программное средство представляет собой веб-приложение, реализованное с использованием клиент-серверной архитектуры. Система состоит из двух основных компонентов: серверной части (</w:t>
+      </w:r>
+      <w:proofErr w:type="spellStart"/>
+      <w:r>
+        <w:t>backend</w:t>
+      </w:r>
+      <w:proofErr w:type="spellEnd"/>
+      <w:r>
+        <w:t>), реализующей бизнес-логику и обработку данных, и клиентской части (</w:t>
+      </w:r>
+      <w:proofErr w:type="spellStart"/>
+      <w:r>
+        <w:t>frontend</w:t>
+      </w:r>
+      <w:proofErr w:type="spellEnd"/>
+      <w:r>
+        <w:t>), обеспечивающей взаимодействие с пользователем. Взаимодействие между компонентами осуществляется посредством REST API с использованием формата данных JSON.</w:t>
+      </w:r>
+    </w:p>
+    <w:p>
+      <w:r>
+        <w:t>Серверная часть системы реализуется на базе современных технологий, обеспечивающих высокую производительность и масштабируемость. Она отвечает за обработку запросов пользователей, управление данными, реализацию алгоритмов скоринга и контроль выполнения финансовых операций. Клиентская часть представляет собой одностраничное приложение (SPA), обеспечивающее удобный и интуитивно понятный интерфейс для пользователей.</w:t>
+      </w:r>
+    </w:p>
+    <w:p>
+      <w:r>
+        <w:t>Ключевой особенностью предлагаемого решения является наличие модуля проверки успеваемости студентов. Данный модуль интегрируется с внешними системами или использует предоставленные пользователем данные для оценки его академической активности. Полученные данные используются в алгоритме скоринга, который формирует рейтинг заемщика.</w:t>
+      </w:r>
+    </w:p>
+    <w:p>
+      <w:r>
+        <w:t>Еще одним важным элементом системы является модуль гарантий возврата займов. Он включает в себя механизмы формирования рейтингов пользователей, мониторинга их активности и анализа поведения. В случае возникновения просрочек система может применять различные меры, направленные на минимизацию убытков кредиторов.</w:t>
+      </w:r>
+    </w:p>
+    <w:p>
+      <w:r>
+        <w:t>Для наглядного представления структуры системы приведена таблица основных компонентов.</w:t>
+      </w:r>
+    </w:p>
+    <w:p>
+      <w:pPr>
+        <w:ind w:firstLine="0"/>
+      </w:pPr>
+    </w:p>
+    <w:p>
+      <w:pPr>
+        <w:ind w:firstLine="0"/>
+      </w:pPr>
+      <w:r>
+        <w:t xml:space="preserve">Таблица </w:t>
+      </w:r>
+      <w:r>
+        <w:t>2</w:t>
+      </w:r>
+      <w:r>
+        <w:t>.</w:t>
+      </w:r>
+      <w:r>
+        <w:t>3</w:t>
+      </w:r>
+      <w:r>
+        <w:t xml:space="preserve"> – Основные компоненты системы</w:t>
+      </w:r>
+    </w:p>
+    <w:tbl>
+      <w:tblPr>
+        <w:tblStyle w:val="afc"/>
+        <w:tblW w:w="0" w:type="auto"/>
+        <w:tblLook w:val="04A0" w:firstRow="1" w:lastRow="0" w:firstColumn="1" w:lastColumn="0" w:noHBand="0" w:noVBand="1"/>
+      </w:tblPr>
+      <w:tblGrid>
+        <w:gridCol w:w="4672"/>
+        <w:gridCol w:w="4672"/>
+      </w:tblGrid>
+      <w:tr>
+        <w:tc>
+          <w:tcPr>
+            <w:tcW w:w="4672" w:type="dxa"/>
+          </w:tcPr>
+          <w:p>
+            <w:pPr>
+              <w:ind w:firstLine="0"/>
+            </w:pPr>
+            <w:r>
+              <w:t>Компонент</w:t>
+            </w:r>
+          </w:p>
+        </w:tc>
+        <w:tc>
+          <w:tcPr>
+            <w:tcW w:w="4672" w:type="dxa"/>
+          </w:tcPr>
+          <w:p>
+            <w:pPr>
+              <w:ind w:firstLine="0"/>
+            </w:pPr>
+            <w:r>
+              <w:t>Назначение</w:t>
+            </w:r>
+          </w:p>
+        </w:tc>
+      </w:tr>
+      <w:tr>
+        <w:tc>
+          <w:tcPr>
+            <w:tcW w:w="4672" w:type="dxa"/>
+          </w:tcPr>
+          <w:p>
+            <w:pPr>
+              <w:ind w:firstLine="0"/>
+              <w:rPr>
+                <w:lang w:val="en-US"/>
+              </w:rPr>
+            </w:pPr>
+            <w:r>
+              <w:rPr>
+                <w:lang w:val="en-US"/>
+              </w:rPr>
+              <w:t>Backend</w:t>
+            </w:r>
+          </w:p>
+        </w:tc>
+        <w:tc>
+          <w:tcPr>
+            <w:tcW w:w="4672" w:type="dxa"/>
+          </w:tcPr>
+          <w:p>
+            <w:pPr>
+              <w:ind w:firstLine="0"/>
+            </w:pPr>
+            <w:r>
+              <w:t>Обработка данных и бизнес-логика</w:t>
+            </w:r>
+          </w:p>
+        </w:tc>
+      </w:tr>
+      <w:tr>
+        <w:tc>
+          <w:tcPr>
+            <w:tcW w:w="4672" w:type="dxa"/>
+          </w:tcPr>
+          <w:p>
+            <w:pPr>
+              <w:ind w:firstLine="0"/>
+              <w:rPr>
+                <w:lang w:val="en-US"/>
+              </w:rPr>
+            </w:pPr>
+            <w:r>
+              <w:rPr>
+                <w:lang w:val="en-US"/>
+              </w:rPr>
+              <w:t>Frontend</w:t>
+            </w:r>
+          </w:p>
+        </w:tc>
+        <w:tc>
+          <w:tcPr>
+            <w:tcW w:w="4672" w:type="dxa"/>
+          </w:tcPr>
+          <w:p>
+            <w:pPr>
+              <w:ind w:firstLine="0"/>
+            </w:pPr>
+            <w:r>
+              <w:t>Пользовательский интерфейс</w:t>
+            </w:r>
+          </w:p>
+        </w:tc>
+      </w:tr>
+      <w:tr>
+        <w:tc>
+          <w:tcPr>
+            <w:tcW w:w="4672" w:type="dxa"/>
+          </w:tcPr>
+          <w:p>
+            <w:pPr>
+              <w:ind w:firstLine="0"/>
+            </w:pPr>
+            <w:r>
+              <w:t>База данных</w:t>
+            </w:r>
+          </w:p>
+        </w:tc>
+        <w:tc>
+          <w:tcPr>
+            <w:tcW w:w="4672" w:type="dxa"/>
+          </w:tcPr>
+          <w:p>
+            <w:pPr>
+              <w:ind w:firstLine="0"/>
+            </w:pPr>
+            <w:r>
+              <w:t>Хранение информации</w:t>
+            </w:r>
+          </w:p>
+        </w:tc>
+      </w:tr>
+      <w:tr>
+        <w:tc>
+          <w:tcPr>
+            <w:tcW w:w="4672" w:type="dxa"/>
+          </w:tcPr>
+          <w:p>
+            <w:pPr>
+              <w:ind w:firstLine="0"/>
+            </w:pPr>
+            <w:r>
+              <w:t>Модуль скоринга</w:t>
+            </w:r>
+          </w:p>
+        </w:tc>
+        <w:tc>
+          <w:tcPr>
+            <w:tcW w:w="4672" w:type="dxa"/>
+          </w:tcPr>
+          <w:p>
+            <w:pPr>
+              <w:ind w:firstLine="0"/>
+            </w:pPr>
+            <w:r>
+              <w:t>Оценка надежности заемщиков</w:t>
+            </w:r>
+          </w:p>
+        </w:tc>
+      </w:tr>
+      <w:tr>
+        <w:tc>
+          <w:tcPr>
+            <w:tcW w:w="4672" w:type="dxa"/>
+          </w:tcPr>
+          <w:p>
+            <w:pPr>
+              <w:ind w:firstLine="0"/>
+            </w:pPr>
+            <w:r>
+              <w:t>Модуль гарантий</w:t>
+            </w:r>
+          </w:p>
+        </w:tc>
+        <w:tc>
+          <w:tcPr>
+            <w:tcW w:w="4672" w:type="dxa"/>
+          </w:tcPr>
+          <w:p>
+            <w:pPr>
+              <w:ind w:firstLine="0"/>
+            </w:pPr>
+            <w:r>
+              <w:t>Обеспечение возврата средств</w:t>
+            </w:r>
+          </w:p>
+        </w:tc>
+      </w:tr>
+    </w:tbl>
+    <w:p>
+      <w:pPr>
+        <w:ind w:firstLine="0"/>
+      </w:pPr>
+      <w:r>
+        <w:lastRenderedPageBreak/>
+        <w:t>Продолжение таблицы 2.3</w:t>
+      </w:r>
+    </w:p>
+    <w:tbl>
+      <w:tblPr>
+        <w:tblStyle w:val="afc"/>
+        <w:tblW w:w="0" w:type="auto"/>
+        <w:tblLook w:val="04A0" w:firstRow="1" w:lastRow="0" w:firstColumn="1" w:lastColumn="0" w:noHBand="0" w:noVBand="1"/>
+      </w:tblPr>
+      <w:tblGrid>
+        <w:gridCol w:w="4672"/>
+        <w:gridCol w:w="4672"/>
+      </w:tblGrid>
+      <w:tr>
+        <w:tc>
+          <w:tcPr>
+            <w:tcW w:w="4672" w:type="dxa"/>
+          </w:tcPr>
+          <w:p>
+            <w:pPr>
+              <w:ind w:firstLine="0"/>
+            </w:pPr>
+            <w:r>
+              <w:t>Компонент</w:t>
+            </w:r>
+          </w:p>
+        </w:tc>
+        <w:tc>
+          <w:tcPr>
+            <w:tcW w:w="4672" w:type="dxa"/>
+          </w:tcPr>
+          <w:p>
+            <w:pPr>
+              <w:ind w:firstLine="0"/>
+            </w:pPr>
+            <w:r>
+              <w:t>Назначение</w:t>
+            </w:r>
+          </w:p>
+        </w:tc>
+      </w:tr>
+      <w:tr>
+        <w:tc>
+          <w:tcPr>
+            <w:tcW w:w="4672" w:type="dxa"/>
+          </w:tcPr>
+          <w:p>
+            <w:pPr>
+              <w:ind w:firstLine="0"/>
+            </w:pPr>
+            <w:r>
+              <w:t>API</w:t>
+            </w:r>
+          </w:p>
+        </w:tc>
+        <w:tc>
+          <w:tcPr>
+            <w:tcW w:w="4672" w:type="dxa"/>
+          </w:tcPr>
+          <w:p>
+            <w:pPr>
+              <w:ind w:firstLine="0"/>
+            </w:pPr>
+            <w:r>
+              <w:t>Взаимодействие между компонентами</w:t>
+            </w:r>
+          </w:p>
+        </w:tc>
+      </w:tr>
+    </w:tbl>
+    <w:p>
+      <w:pPr>
+        <w:ind w:firstLine="0"/>
+      </w:pPr>
+    </w:p>
+    <w:p>
+      <w:pPr>
+        <w:ind w:firstLine="0"/>
+      </w:pPr>
+      <w:r>
+        <w:tab/>
+      </w:r>
+      <w:r>
+        <w:t>Система должна обеспечивать гибкость и возможность дальнейшего расширения функциональности. Это достигается за счет использования современных архитектурных подходов и принципов разработки, таких как модульность, разделение ответственности и повторное использование компонентов</w:t>
+      </w:r>
+      <w:r>
+        <w:t>.</w:t>
+      </w:r>
+    </w:p>
+    <w:p>
+      <w:r>
+        <w:t>Особое внимание уделяется пользовательскому опыту. Интерфейс системы должен быть простым и понятным, обеспечивать быстрый доступ к основным функциям и предоставлять пользователям необходимую информацию в удобной форме. Это особенно важно для студентов, которые могут не обладать опытом работы с финансовыми системами.</w:t>
+      </w:r>
+    </w:p>
+    <w:p>
+      <w:r>
+        <w:t>Таким образом, образ предлагаемого решения представляет собой современную, масштабируемую и функциональную систему, ориентированную на обеспечение эффективного и безопасного взаимодействия между заемщиками и кредиторами. Реализация данного решения позволит создать удобную платформу для P2P-кредитования студентов с использованием инновационных подходов к оценке надежности и управлению рисками.</w:t>
+      </w:r>
     </w:p>
     <w:p>
       <w:r>
@@ -4191,7 +6516,7 @@
           <w:lang w:val="en-US"/>
         </w:rPr>
       </w:pPr>
-      <w:bookmarkStart w:id="5" w:name="_Toc224921135"/>
+      <w:bookmarkStart w:id="8" w:name="_Toc223367497"/>
       <w:r>
         <w:lastRenderedPageBreak/>
         <w:t>Список</w:t>
@@ -4214,7 +6539,7 @@
       <w:r>
         <w:t>источников</w:t>
       </w:r>
-      <w:bookmarkEnd w:id="5"/>
+      <w:bookmarkEnd w:id="8"/>
     </w:p>
     <w:p>
       <w:pPr>
@@ -4275,33 +6600,86 @@
         <w:rPr>
           <w:lang w:val="en-US"/>
         </w:rPr>
+        <w:t xml:space="preserve">[3] </w:t>
+      </w:r>
+      <w:proofErr w:type="spellStart"/>
+      <w:r>
+        <w:rPr>
+          <w:lang w:val="en-US"/>
+        </w:rPr>
+        <w:t>Claessens</w:t>
+      </w:r>
+      <w:proofErr w:type="spellEnd"/>
+      <w:r>
+        <w:rPr>
+          <w:lang w:val="en-US"/>
+        </w:rPr>
+        <w:t xml:space="preserve"> S., Frost J., Turner G., Zhu F. Fintech credit markets around the world: size, drivers and policy issues // BIS Quarterly Review. – 2018.</w:t>
+      </w:r>
+    </w:p>
+    <w:p>
+      <w:pPr>
+        <w:rPr>
+          <w:lang w:val="en-US"/>
+        </w:rPr>
+      </w:pPr>
+      <w:r>
+        <w:rPr>
+          <w:lang w:val="en-US"/>
+        </w:rPr>
+        <w:t>[4] Morse A. Peer-to-peer crowdfunding: Information and the potential for disruption in consumer lending // Annual Review of Financial Economics. – 2015.</w:t>
+      </w:r>
+    </w:p>
+    <w:p>
+      <w:pPr>
+        <w:rPr>
+          <w:lang w:val="en-US"/>
+        </w:rPr>
+      </w:pPr>
+      <w:r>
+        <w:rPr>
+          <w:lang w:val="en-US"/>
+        </w:rPr>
         <w:t>[</w:t>
       </w:r>
       <w:r>
         <w:rPr>
           <w:lang w:val="en-US"/>
         </w:rPr>
-        <w:t>3</w:t>
-      </w:r>
-      <w:r>
-        <w:rPr>
-          <w:lang w:val="en-US"/>
-        </w:rPr>
-        <w:t xml:space="preserve">] </w:t>
+        <w:t>5</w:t>
+      </w:r>
+      <w:r>
+        <w:rPr>
+          <w:lang w:val="en-US"/>
+        </w:rPr>
+        <w:t>] Stallings W. Cryptography and Network Security: Principles and Practice. – Pearson, 2017.</w:t>
+      </w:r>
+    </w:p>
+    <w:p>
+      <w:pPr>
+        <w:rPr>
+          <w:lang w:val="en-US"/>
+        </w:rPr>
+      </w:pPr>
+      <w:r>
+        <w:rPr>
+          <w:lang w:val="en-US"/>
+        </w:rPr>
+        <w:t xml:space="preserve">[6] Milne A., </w:t>
       </w:r>
       <w:proofErr w:type="spellStart"/>
       <w:r>
         <w:rPr>
           <w:lang w:val="en-US"/>
         </w:rPr>
-        <w:t>Claessens</w:t>
+        <w:t>Parboteeah</w:t>
       </w:r>
       <w:proofErr w:type="spellEnd"/>
       <w:r>
         <w:rPr>
           <w:lang w:val="en-US"/>
         </w:rPr>
-        <w:t xml:space="preserve"> S., Frost J., Turner G., Zhu F. Fintech credit markets around the world: size, drivers and policy issues // BIS Quarterly Review. – 2018.</w:t>
+        <w:t xml:space="preserve"> P. The business models and economics of peer-to-peer lending // European Credit Research Institute. – 2016.</w:t>
       </w:r>
     </w:p>
     <w:p>
@@ -4320,144 +6698,115 @@
         <w:rPr>
           <w:lang w:val="en-US"/>
         </w:rPr>
-        <w:t>4</w:t>
-      </w:r>
-      <w:r>
-        <w:rPr>
-          <w:lang w:val="en-US"/>
-        </w:rPr>
-        <w:t>] Morse A. Peer-to-peer crowdfunding: Information and the potential for disruption in consumer lending // Annual Review of Financial Economics. – 2015.</w:t>
-      </w:r>
-    </w:p>
-    <w:p>
-      <w:pPr>
-        <w:rPr>
-          <w:lang w:val="en-US"/>
-        </w:rPr>
-      </w:pPr>
-      <w:r>
-        <w:rPr>
-          <w:lang w:val="en-US"/>
-        </w:rPr>
-        <w:t>[</w:t>
-      </w:r>
-      <w:r>
-        <w:rPr>
-          <w:lang w:val="en-US"/>
-        </w:rPr>
-        <w:t>5</w:t>
-      </w:r>
-      <w:r>
-        <w:rPr>
-          <w:lang w:val="en-US"/>
-        </w:rPr>
-        <w:t>] Stallings W. Cryptography and Network Security: Principles and Practice. – Pearson, 2017.</w:t>
-      </w:r>
-    </w:p>
-    <w:p>
-      <w:pPr>
-        <w:rPr>
-          <w:lang w:val="en-US"/>
-        </w:rPr>
-      </w:pPr>
-      <w:r>
-        <w:rPr>
-          <w:lang w:val="en-US"/>
-        </w:rPr>
-        <w:t>[</w:t>
-      </w:r>
-      <w:r>
-        <w:rPr>
-          <w:lang w:val="en-US"/>
-        </w:rPr>
-        <w:t>6</w:t>
-      </w:r>
-      <w:r>
-        <w:rPr>
-          <w:lang w:val="en-US"/>
-        </w:rPr>
-        <w:t xml:space="preserve">] Milne A., </w:t>
+        <w:t>7</w:t>
+      </w:r>
+      <w:r>
+        <w:rPr>
+          <w:lang w:val="en-US"/>
+        </w:rPr>
+        <w:t>] European Banking Authority. Opinion on lending-based crowdfunding. – 2015.</w:t>
+      </w:r>
+    </w:p>
+    <w:p>
+      <w:pPr>
+        <w:rPr>
+          <w:lang w:val="en-US"/>
+        </w:rPr>
+      </w:pPr>
+      <w:r>
+        <w:rPr>
+          <w:lang w:val="en-US"/>
+        </w:rPr>
+        <w:t xml:space="preserve">[8] </w:t>
       </w:r>
       <w:proofErr w:type="spellStart"/>
       <w:r>
         <w:rPr>
           <w:lang w:val="en-US"/>
         </w:rPr>
-        <w:t>Parboteeah</w:t>
+        <w:t>LendingClub</w:t>
       </w:r>
       <w:proofErr w:type="spellEnd"/>
       <w:r>
         <w:rPr>
           <w:lang w:val="en-US"/>
         </w:rPr>
-        <w:t xml:space="preserve"> P. The business models and economics of peer-to-peer lending // European Credit Research Institute. – 2016.</w:t>
-      </w:r>
-    </w:p>
-    <w:p>
-      <w:pPr>
-        <w:rPr>
-          <w:lang w:val="en-US"/>
-        </w:rPr>
-      </w:pPr>
-      <w:r>
-        <w:rPr>
-          <w:lang w:val="en-US"/>
-        </w:rPr>
-        <w:t>[</w:t>
-      </w:r>
-      <w:r>
-        <w:t>7</w:t>
-      </w:r>
-      <w:r>
-        <w:rPr>
-          <w:lang w:val="en-US"/>
-        </w:rPr>
-        <w:t>] European Banking Authority. Opinion on lending-based crowdfunding. – 2015.</w:t>
-      </w:r>
-    </w:p>
-    <w:p>
-      <w:pPr>
-        <w:rPr>
-          <w:lang w:val="en-US"/>
-        </w:rPr>
-      </w:pPr>
-      <w:r>
-        <w:rPr>
-          <w:lang w:val="en-US"/>
-        </w:rPr>
-        <w:t>[</w:t>
-      </w:r>
-      <w:r>
-        <w:rPr>
-          <w:lang w:val="en-US"/>
-        </w:rPr>
-        <w:t>8</w:t>
-      </w:r>
-      <w:r>
-        <w:rPr>
-          <w:lang w:val="en-US"/>
-        </w:rPr>
-        <w:t xml:space="preserve">] </w:t>
+        <w:t xml:space="preserve"> Corporation. Official website. – </w:t>
       </w:r>
       <w:proofErr w:type="spellStart"/>
       <w:r>
         <w:rPr>
           <w:lang w:val="en-US"/>
         </w:rPr>
-        <w:t>LendingClub</w:t>
+        <w:t>Режим</w:t>
       </w:r>
       <w:proofErr w:type="spellEnd"/>
       <w:r>
         <w:rPr>
           <w:lang w:val="en-US"/>
         </w:rPr>
-        <w:t xml:space="preserve"> Corporation. Official website. – </w:t>
+        <w:t xml:space="preserve"> </w:t>
       </w:r>
       <w:proofErr w:type="spellStart"/>
       <w:r>
         <w:rPr>
           <w:lang w:val="en-US"/>
         </w:rPr>
+        <w:t>доступа</w:t>
+      </w:r>
+      <w:proofErr w:type="spellEnd"/>
+      <w:r>
+        <w:rPr>
+          <w:lang w:val="en-US"/>
+        </w:rPr>
+        <w:t xml:space="preserve">: https://www.lendingclub.com – </w:t>
+      </w:r>
+      <w:proofErr w:type="spellStart"/>
+      <w:r>
+        <w:rPr>
+          <w:lang w:val="en-US"/>
+        </w:rPr>
+        <w:t>Дата</w:t>
+      </w:r>
+      <w:proofErr w:type="spellEnd"/>
+      <w:r>
+        <w:rPr>
+          <w:lang w:val="en-US"/>
+        </w:rPr>
+        <w:t xml:space="preserve"> </w:t>
+      </w:r>
+      <w:proofErr w:type="spellStart"/>
+      <w:r>
+        <w:rPr>
+          <w:lang w:val="en-US"/>
+        </w:rPr>
+        <w:t>обращения</w:t>
+      </w:r>
+      <w:proofErr w:type="spellEnd"/>
+      <w:r>
+        <w:rPr>
+          <w:lang w:val="en-US"/>
+        </w:rPr>
+        <w:t>: 20.03.2026.</w:t>
+      </w:r>
+    </w:p>
+    <w:p>
+      <w:pPr>
+        <w:rPr>
+          <w:lang w:val="en-US"/>
+        </w:rPr>
+      </w:pPr>
+      <w:r>
+        <w:rPr>
+          <w:lang w:val="en-US"/>
+        </w:rPr>
+        <w:t xml:space="preserve">[9] Prosper Marketplace. Official website. – </w:t>
+      </w:r>
+      <w:proofErr w:type="spellStart"/>
+      <w:r>
+        <w:rPr>
+          <w:lang w:val="en-US"/>
+        </w:rPr>
         <w:t>Режим</w:t>
       </w:r>
       <w:proofErr w:type="spellEnd"/>
@@ -4479,30 +6828,20 @@
         <w:rPr>
           <w:lang w:val="en-US"/>
         </w:rPr>
-        <w:t xml:space="preserve">: https://www.lendingclub.com – </w:t>
-      </w:r>
-      <w:proofErr w:type="spellStart"/>
-      <w:r>
-        <w:rPr>
-          <w:lang w:val="en-US"/>
-        </w:rPr>
+        <w:t xml:space="preserve">: https://www.prosper.com – </w:t>
+      </w:r>
+      <w:r>
         <w:t>Дата</w:t>
       </w:r>
-      <w:proofErr w:type="spellEnd"/>
       <w:r>
         <w:rPr>
           <w:lang w:val="en-US"/>
         </w:rPr>
         <w:t xml:space="preserve"> </w:t>
       </w:r>
-      <w:proofErr w:type="spellStart"/>
-      <w:r>
-        <w:rPr>
-          <w:lang w:val="en-US"/>
-        </w:rPr>
+      <w:r>
         <w:t>обращения</w:t>
       </w:r>
-      <w:proofErr w:type="spellEnd"/>
       <w:r>
         <w:rPr>
           <w:lang w:val="en-US"/>
@@ -4520,47 +6859,121 @@
         <w:rPr>
           <w:lang w:val="en-US"/>
         </w:rPr>
-        <w:t>[</w:t>
-      </w:r>
-      <w:r>
-        <w:rPr>
-          <w:lang w:val="en-US"/>
-        </w:rPr>
-        <w:t>9</w:t>
-      </w:r>
-      <w:r>
-        <w:rPr>
-          <w:lang w:val="en-US"/>
-        </w:rPr>
-        <w:t xml:space="preserve">] Prosper Marketplace. Official website. – </w:t>
-      </w:r>
-      <w:proofErr w:type="spellStart"/>
-      <w:r>
-        <w:rPr>
-          <w:lang w:val="en-US"/>
-        </w:rPr>
+        <w:t xml:space="preserve">[10] </w:t>
+      </w:r>
+      <w:r>
+        <w:rPr>
+          <w:lang w:val="en-US"/>
+        </w:rPr>
+        <w:t>Funding</w:t>
+      </w:r>
+      <w:r>
+        <w:rPr>
+          <w:lang w:val="en-US"/>
+        </w:rPr>
+        <w:t xml:space="preserve"> </w:t>
+      </w:r>
+      <w:r>
+        <w:rPr>
+          <w:lang w:val="en-US"/>
+        </w:rPr>
+        <w:t>Circle</w:t>
+      </w:r>
+      <w:r>
+        <w:rPr>
+          <w:lang w:val="en-US"/>
+        </w:rPr>
+        <w:t xml:space="preserve">. </w:t>
+      </w:r>
+      <w:r>
+        <w:rPr>
+          <w:lang w:val="en-US"/>
+        </w:rPr>
+        <w:t>Official</w:t>
+      </w:r>
+      <w:r>
+        <w:rPr>
+          <w:lang w:val="en-US"/>
+        </w:rPr>
+        <w:t xml:space="preserve"> </w:t>
+      </w:r>
+      <w:r>
+        <w:rPr>
+          <w:lang w:val="en-US"/>
+        </w:rPr>
+        <w:t>website</w:t>
+      </w:r>
+      <w:r>
+        <w:rPr>
+          <w:lang w:val="en-US"/>
+        </w:rPr>
+        <w:t xml:space="preserve">. – </w:t>
+      </w:r>
+      <w:r>
         <w:t>Режим</w:t>
       </w:r>
-      <w:proofErr w:type="spellEnd"/>
       <w:r>
         <w:rPr>
           <w:lang w:val="en-US"/>
         </w:rPr>
         <w:t xml:space="preserve"> </w:t>
       </w:r>
-      <w:proofErr w:type="spellStart"/>
-      <w:r>
-        <w:rPr>
-          <w:lang w:val="en-US"/>
-        </w:rPr>
+      <w:r>
         <w:t>доступа</w:t>
       </w:r>
-      <w:proofErr w:type="spellEnd"/>
-      <w:r>
-        <w:rPr>
-          <w:lang w:val="en-US"/>
-        </w:rPr>
-        <w:t xml:space="preserve">: https://www.prosper.com – </w:t>
+      <w:r>
+        <w:rPr>
+          <w:lang w:val="en-US"/>
+        </w:rPr>
+        <w:t xml:space="preserve">: </w:t>
+      </w:r>
+      <w:r>
+        <w:rPr>
+          <w:lang w:val="en-US"/>
+        </w:rPr>
+        <w:t>https</w:t>
+      </w:r>
+      <w:r>
+        <w:rPr>
+          <w:lang w:val="en-US"/>
+        </w:rPr>
+        <w:t>://</w:t>
+      </w:r>
+      <w:r>
+        <w:rPr>
+          <w:lang w:val="en-US"/>
+        </w:rPr>
+        <w:t>www</w:t>
+      </w:r>
+      <w:r>
+        <w:rPr>
+          <w:lang w:val="en-US"/>
+        </w:rPr>
+        <w:t>.</w:t>
+      </w:r>
+      <w:r>
+        <w:rPr>
+          <w:lang w:val="en-US"/>
+        </w:rPr>
+        <w:t>fundingcircle</w:t>
+      </w:r>
+      <w:r>
+        <w:rPr>
+          <w:lang w:val="en-US"/>
+        </w:rPr>
+        <w:t>.</w:t>
+      </w:r>
+      <w:r>
+        <w:rPr>
+          <w:lang w:val="en-US"/>
+        </w:rPr>
+        <w:t>com</w:t>
+      </w:r>
+      <w:r>
+        <w:rPr>
+          <w:lang w:val="en-US"/>
+        </w:rPr>
+        <w:t xml:space="preserve"> – </w:t>
       </w:r>
       <w:r>
         <w:t>Дата</w:t>
@@ -4582,92 +6995,20 @@
       </w:r>
     </w:p>
     <w:p>
-      <w:r>
-        <w:t>[</w:t>
-      </w:r>
-      <w:r>
-        <w:t>10</w:t>
-      </w:r>
-      <w:r>
-        <w:t xml:space="preserve">] </w:t>
-      </w:r>
-      <w:r>
-        <w:rPr>
-          <w:lang w:val="en-US"/>
-        </w:rPr>
-        <w:t>Funding</w:t>
-      </w:r>
-      <w:r>
-        <w:t xml:space="preserve"> </w:t>
-      </w:r>
-      <w:r>
-        <w:rPr>
-          <w:lang w:val="en-US"/>
-        </w:rPr>
-        <w:t>Circle</w:t>
-      </w:r>
-      <w:r>
-        <w:t xml:space="preserve">. </w:t>
-      </w:r>
-      <w:r>
-        <w:rPr>
-          <w:lang w:val="en-US"/>
-        </w:rPr>
-        <w:t>Official</w:t>
-      </w:r>
-      <w:r>
-        <w:t xml:space="preserve"> </w:t>
-      </w:r>
-      <w:r>
-        <w:rPr>
-          <w:lang w:val="en-US"/>
-        </w:rPr>
-        <w:t>website</w:t>
-      </w:r>
-      <w:r>
-        <w:t xml:space="preserve">. – Режим доступа: </w:t>
-      </w:r>
-      <w:r>
-        <w:rPr>
-          <w:lang w:val="en-US"/>
-        </w:rPr>
-        <w:t>https</w:t>
-      </w:r>
-      <w:r>
-        <w:t>://</w:t>
-      </w:r>
-      <w:r>
-        <w:rPr>
-          <w:lang w:val="en-US"/>
-        </w:rPr>
-        <w:t>www</w:t>
-      </w:r>
-      <w:r>
-        <w:t>.</w:t>
-      </w:r>
-      <w:proofErr w:type="spellStart"/>
-      <w:r>
-        <w:rPr>
-          <w:lang w:val="en-US"/>
-        </w:rPr>
-        <w:t>fundingcircle</w:t>
-      </w:r>
-      <w:proofErr w:type="spellEnd"/>
-      <w:r>
-        <w:t>.</w:t>
-      </w:r>
-      <w:r>
-        <w:rPr>
-          <w:lang w:val="en-US"/>
-        </w:rPr>
-        <w:t>com</w:t>
-      </w:r>
-      <w:r>
-        <w:t xml:space="preserve"> – Дата обращения: 20.03.2026.</w:t>
+      <w:pPr>
+        <w:rPr>
+          <w:lang w:val="en-US"/>
+        </w:rPr>
+      </w:pPr>
+      <w:r>
+        <w:rPr>
+          <w:lang w:val="en-US"/>
+        </w:rPr>
+        <w:t>[11] White S. Business Process Model and Notation (BPMN), Version 2.0. – Object Management Group, 2011.</w:t>
       </w:r>
     </w:p>
     <w:sectPr>
-      <w:footerReference w:type="default" r:id="rId8"/>
+      <w:footerReference w:type="default" r:id="rId10"/>
       <w:pgSz w:w="11906" w:h="16838" w:code="9"/>
       <w:pgMar w:top="1134" w:right="851" w:bottom="1531" w:left="1701" w:header="720" w:footer="964" w:gutter="0"/>
       <w:cols w:space="720"/>
@@ -6149,6 +8490,7 @@
   <w:style w:type="character" w:default="1" w:styleId="a1">
     <w:name w:val="Default Paragraph Font"/>
     <w:uiPriority w:val="1"/>
+    <w:semiHidden/>
     <w:unhideWhenUsed/>
   </w:style>
   <w:style w:type="table" w:default="1" w:styleId="a2">

</xml_diff>